<commit_message>
Capitulo 4 updated with 4.2 unfinished section
</commit_message>
<xml_diff>
--- a/docs/Capítulo 4 - Metodología y resultados.docx
+++ b/docs/Capítulo 4 - Metodología y resultados.docx
@@ -546,25 +546,7 @@
           <w:sz w:val="24"/>
           <w:szCs w:val="24"/>
         </w:rPr>
-        <w:t xml:space="preserve">El backend se estructuró en siete fases: autenticación de usuarios, gestión de mascotas, gestión de medicación, gestión de comidas, registro de paseos, gestión de hogares y miembros, y finalmente una fase de pruebas mediante Postman para verificar el correcto funcionamiento de todos los </w:t>
-      </w:r>
-      <w:proofErr w:type="spellStart"/>
-      <w:r>
-        <w:rPr>
-          <w:rFonts w:ascii="Times New Roman" w:eastAsia="Times New Roman" w:hAnsi="Times New Roman" w:cs="Times New Roman"/>
-          <w:sz w:val="24"/>
-          <w:szCs w:val="24"/>
-        </w:rPr>
-        <w:t>endpoints</w:t>
-      </w:r>
-      <w:proofErr w:type="spellEnd"/>
-      <w:r>
-        <w:rPr>
-          <w:rFonts w:ascii="Times New Roman" w:eastAsia="Times New Roman" w:hAnsi="Times New Roman" w:cs="Times New Roman"/>
-          <w:sz w:val="24"/>
-          <w:szCs w:val="24"/>
-        </w:rPr>
-        <w:t xml:space="preserve"> implementados. Una vez completado el backend, se abordó el desarrollo del frontend en fases equivalentes, integrando progresivamente cada módulo de la interfaz con su correspondiente capa de servicios del backend.</w:t>
+        <w:t>El backend se estructuró en siete fases: autenticación de usuarios, gestión de mascotas, gestión de medicación, gestión de comidas, registro de paseos, gestión de hogares y miembros, y finalmente una fase de pruebas mediante Postman para verificar el correcto funcionamiento de todos los endpoints implementados. Una vez completado el backend, se abordó el desarrollo del frontend en fases equivalentes, integrando progresivamente cada módulo de la interfaz con su correspondiente capa de servicios del backend.</w:t>
       </w:r>
     </w:p>
     <w:p>
@@ -689,25 +671,7 @@
           <w:sz w:val="24"/>
           <w:szCs w:val="24"/>
         </w:rPr>
-        <w:t xml:space="preserve">figura muestra la distribución temporal del proyecto a lo largo de las trece semanas de desarrollo. Las semanas 1 a 7 corresponden al desarrollo del backend, que abarca desde el análisis inicial y la configuración del entorno hasta la fase de </w:t>
-      </w:r>
-      <w:proofErr w:type="spellStart"/>
-      <w:r>
-        <w:rPr>
-          <w:rFonts w:ascii="Times New Roman" w:eastAsia="Times New Roman" w:hAnsi="Times New Roman" w:cs="Times New Roman"/>
-          <w:sz w:val="24"/>
-          <w:szCs w:val="24"/>
-        </w:rPr>
-        <w:t>testing</w:t>
-      </w:r>
-      <w:proofErr w:type="spellEnd"/>
-      <w:r>
-        <w:rPr>
-          <w:rFonts w:ascii="Times New Roman" w:eastAsia="Times New Roman" w:hAnsi="Times New Roman" w:cs="Times New Roman"/>
-          <w:sz w:val="24"/>
-          <w:szCs w:val="24"/>
-        </w:rPr>
-        <w:t xml:space="preserve"> con Postman. Las semanas 8 a 11 corresponden al desarrollo del frontend, con la integración progresiva de cada módulo de la interfaz. Las semanas 12 y 13 están dedicadas a la elaboración de la memoria y a la preparación de la defensa. La documentación del código se realizó de forma transversal a lo largo de todo el proyecto, tal y como se indica en el diagrama.</w:t>
+        <w:t>figura muestra la distribución temporal del proyecto a lo largo de las trece semanas de desarrollo. Las semanas 1 a 7 corresponden al desarrollo del backend, que abarca desde el análisis inicial y la configuración del entorno hasta la fase de testing con Postman. Las semanas 8 a 11 corresponden al desarrollo del frontend, con la integración progresiva de cada módulo de la interfaz. Las semanas 12 y 13 están dedicadas a la elaboración de la memoria y a la preparación de la defensa. La documentación del código se realizó de forma transversal a lo largo de todo el proyecto, tal y como se indica en el diagrama.</w:t>
       </w:r>
     </w:p>
     <w:p>
@@ -874,89 +838,7 @@
           <w:sz w:val="24"/>
           <w:szCs w:val="24"/>
         </w:rPr>
-        <w:t>Este apartado debe contener una descripción completa de cuantos usuarios hay y que puede hacer cada uno de ellos. La descripción de todo esto debe apoyarse en las plantillas para descripción de roles de usuario y de casos de uso, así como en los diagramas de casos de usos vistos en Ingeniería del Software (</w:t>
-      </w:r>
-      <w:hyperlink r:id="rId7">
-        <w:r>
-          <w:rPr>
-            <w:rFonts w:ascii="Times New Roman" w:eastAsia="Times New Roman" w:hAnsi="Times New Roman" w:cs="Times New Roman"/>
-            <w:color w:val="1155CC"/>
-            <w:sz w:val="24"/>
-            <w:szCs w:val="24"/>
-            <w:u w:val="single"/>
-          </w:rPr>
-          <w:t>http://umh279</w:t>
-        </w:r>
-        <w:r>
-          <w:rPr>
-            <w:rFonts w:ascii="Times New Roman" w:eastAsia="Times New Roman" w:hAnsi="Times New Roman" w:cs="Times New Roman"/>
-            <w:color w:val="1155CC"/>
-            <w:sz w:val="24"/>
-            <w:szCs w:val="24"/>
-            <w:u w:val="single"/>
-          </w:rPr>
-          <w:t>2</w:t>
-        </w:r>
-        <w:r>
-          <w:rPr>
-            <w:rFonts w:ascii="Times New Roman" w:eastAsia="Times New Roman" w:hAnsi="Times New Roman" w:cs="Times New Roman"/>
-            <w:color w:val="1155CC"/>
-            <w:sz w:val="24"/>
-            <w:szCs w:val="24"/>
-            <w:u w:val="single"/>
-          </w:rPr>
-          <w:t>.edu.umh.es/material/teoria/</w:t>
-        </w:r>
-      </w:hyperlink>
-      <w:r>
-        <w:rPr>
-          <w:rFonts w:ascii="Times New Roman" w:eastAsia="Times New Roman" w:hAnsi="Times New Roman" w:cs="Times New Roman"/>
-          <w:sz w:val="24"/>
-          <w:szCs w:val="24"/>
-        </w:rPr>
-        <w:t>).</w:t>
-      </w:r>
-    </w:p>
-    <w:p>
-      <w:pPr>
-        <w:pBdr>
-          <w:top w:val="nil"/>
-          <w:left w:val="nil"/>
-          <w:bottom w:val="nil"/>
-          <w:right w:val="nil"/>
-          <w:between w:val="nil"/>
-        </w:pBdr>
-        <w:jc w:val="both"/>
-        <w:rPr>
-          <w:rFonts w:ascii="Times New Roman" w:eastAsia="Times New Roman" w:hAnsi="Times New Roman" w:cs="Times New Roman"/>
-          <w:sz w:val="24"/>
-          <w:szCs w:val="24"/>
-        </w:rPr>
-      </w:pPr>
-    </w:p>
-    <w:p>
-      <w:pPr>
-        <w:pBdr>
-          <w:top w:val="nil"/>
-          <w:left w:val="nil"/>
-          <w:bottom w:val="nil"/>
-          <w:right w:val="nil"/>
-          <w:between w:val="nil"/>
-        </w:pBdr>
-        <w:jc w:val="both"/>
-        <w:rPr>
-          <w:rFonts w:ascii="Times New Roman" w:eastAsia="Times New Roman" w:hAnsi="Times New Roman" w:cs="Times New Roman"/>
-          <w:sz w:val="24"/>
-          <w:szCs w:val="24"/>
-        </w:rPr>
-      </w:pPr>
-      <w:r>
-        <w:rPr>
-          <w:rFonts w:ascii="Times New Roman" w:eastAsia="Times New Roman" w:hAnsi="Times New Roman" w:cs="Times New Roman"/>
-          <w:sz w:val="24"/>
-          <w:szCs w:val="24"/>
-        </w:rPr>
-        <w:t>Si, además de los requisitos funcionales, la aplicación tuviera requisitos no funcionales relevantes que considerar, se deberá incorporar un subapartado para describir dichos requisitos no funcionales.</w:t>
+        <w:t>En este apartado se describen los requisitos del sistema CarePet, incluyendo los actores que interactúan con él, los requisitos funcionales y no funcionales identificados, y los casos de uso más relevantes.</w:t>
       </w:r>
     </w:p>
     <w:p>
@@ -1015,108 +897,3979 @@
           <w:sz w:val="28"/>
           <w:szCs w:val="28"/>
         </w:rPr>
-        <w:t>4.2.1.- . . . (incluir subapartados si fuera necesario)</w:t>
+        <w:t xml:space="preserve">4.2.1.- </w:t>
       </w:r>
-    </w:p>
-    <w:p>
-      <w:pPr>
-        <w:pBdr>
-          <w:top w:val="nil"/>
-          <w:left w:val="nil"/>
-          <w:bottom w:val="nil"/>
-          <w:right w:val="nil"/>
-          <w:between w:val="nil"/>
-        </w:pBdr>
-        <w:jc w:val="both"/>
-        <w:rPr>
-          <w:rFonts w:ascii="Times New Roman" w:eastAsia="Times New Roman" w:hAnsi="Times New Roman" w:cs="Times New Roman"/>
-          <w:sz w:val="24"/>
-          <w:szCs w:val="24"/>
-        </w:rPr>
-      </w:pPr>
-    </w:p>
-    <w:p>
-      <w:pPr>
-        <w:pBdr>
-          <w:top w:val="nil"/>
-          <w:left w:val="nil"/>
-          <w:bottom w:val="nil"/>
-          <w:right w:val="nil"/>
-          <w:between w:val="nil"/>
-        </w:pBdr>
-        <w:jc w:val="both"/>
-        <w:rPr>
-          <w:rFonts w:ascii="Times New Roman" w:eastAsia="Times New Roman" w:hAnsi="Times New Roman" w:cs="Times New Roman"/>
-          <w:sz w:val="24"/>
-          <w:szCs w:val="24"/>
-        </w:rPr>
-      </w:pPr>
       <w:r>
-        <w:rPr>
-          <w:rFonts w:ascii="Times New Roman" w:eastAsia="Times New Roman" w:hAnsi="Times New Roman" w:cs="Times New Roman"/>
-          <w:sz w:val="24"/>
-          <w:szCs w:val="24"/>
-        </w:rPr>
-        <w:t>---.</w:t>
-      </w:r>
-    </w:p>
-    <w:p>
-      <w:pPr>
-        <w:pBdr>
-          <w:top w:val="nil"/>
-          <w:left w:val="nil"/>
-          <w:bottom w:val="nil"/>
-          <w:right w:val="nil"/>
-          <w:between w:val="nil"/>
-        </w:pBdr>
-        <w:jc w:val="both"/>
-        <w:rPr>
-          <w:rFonts w:ascii="Times New Roman" w:eastAsia="Times New Roman" w:hAnsi="Times New Roman" w:cs="Times New Roman"/>
-          <w:sz w:val="24"/>
-          <w:szCs w:val="24"/>
-        </w:rPr>
-      </w:pPr>
-    </w:p>
-    <w:p>
-      <w:pPr>
-        <w:pBdr>
-          <w:top w:val="nil"/>
-          <w:left w:val="nil"/>
-          <w:bottom w:val="nil"/>
-          <w:right w:val="nil"/>
-          <w:between w:val="nil"/>
-        </w:pBdr>
-        <w:jc w:val="both"/>
-        <w:rPr>
-          <w:rFonts w:ascii="Times New Roman" w:eastAsia="Times New Roman" w:hAnsi="Times New Roman" w:cs="Times New Roman"/>
-          <w:sz w:val="24"/>
-          <w:szCs w:val="24"/>
-        </w:rPr>
-      </w:pPr>
-    </w:p>
-    <w:p>
-      <w:pPr>
-        <w:pBdr>
-          <w:top w:val="nil"/>
-          <w:left w:val="nil"/>
-          <w:bottom w:val="nil"/>
-          <w:right w:val="nil"/>
-          <w:between w:val="nil"/>
-        </w:pBdr>
-        <w:jc w:val="both"/>
         <w:rPr>
           <w:b/>
           <w:sz w:val="28"/>
           <w:szCs w:val="28"/>
         </w:rPr>
+        <w:t>Actores del sistema</w:t>
+      </w:r>
+    </w:p>
+    <w:p>
+      <w:pPr>
+        <w:pBdr>
+          <w:top w:val="nil"/>
+          <w:left w:val="nil"/>
+          <w:bottom w:val="nil"/>
+          <w:right w:val="nil"/>
+          <w:between w:val="nil"/>
+        </w:pBdr>
+        <w:jc w:val="both"/>
+        <w:rPr>
+          <w:rFonts w:ascii="Times New Roman" w:eastAsia="Times New Roman" w:hAnsi="Times New Roman" w:cs="Times New Roman"/>
+          <w:sz w:val="24"/>
+          <w:szCs w:val="24"/>
+        </w:rPr>
+      </w:pPr>
+    </w:p>
+    <w:tbl>
+      <w:tblPr>
+        <w:tblStyle w:val="Tablaconcuadrcula"/>
+        <w:tblW w:w="0" w:type="auto"/>
+        <w:tblLook w:val="04A0" w:firstRow="1" w:lastRow="0" w:firstColumn="1" w:lastColumn="0" w:noHBand="0" w:noVBand="1"/>
+      </w:tblPr>
+      <w:tblGrid>
+        <w:gridCol w:w="2122"/>
+        <w:gridCol w:w="6656"/>
+      </w:tblGrid>
+      <w:tr>
+        <w:tc>
+          <w:tcPr>
+            <w:tcW w:w="2122" w:type="dxa"/>
+          </w:tcPr>
+          <w:p>
+            <w:pPr>
+              <w:jc w:val="both"/>
+              <w:rPr>
+                <w:rFonts w:ascii="Times New Roman" w:eastAsia="Times New Roman" w:hAnsi="Times New Roman" w:cs="Times New Roman"/>
+                <w:sz w:val="24"/>
+                <w:szCs w:val="24"/>
+              </w:rPr>
+            </w:pPr>
+            <w:r>
+              <w:rPr>
+                <w:rFonts w:ascii="Times New Roman" w:eastAsia="Times New Roman" w:hAnsi="Times New Roman" w:cs="Times New Roman"/>
+                <w:sz w:val="24"/>
+                <w:szCs w:val="24"/>
+              </w:rPr>
+              <w:t>Actor</w:t>
+            </w:r>
+          </w:p>
+        </w:tc>
+        <w:tc>
+          <w:tcPr>
+            <w:tcW w:w="6656" w:type="dxa"/>
+          </w:tcPr>
+          <w:p>
+            <w:pPr>
+              <w:jc w:val="both"/>
+              <w:rPr>
+                <w:rFonts w:ascii="Times New Roman" w:eastAsia="Times New Roman" w:hAnsi="Times New Roman" w:cs="Times New Roman"/>
+                <w:sz w:val="24"/>
+                <w:szCs w:val="24"/>
+              </w:rPr>
+            </w:pPr>
+            <w:r>
+              <w:rPr>
+                <w:rFonts w:ascii="Times New Roman" w:eastAsia="Times New Roman" w:hAnsi="Times New Roman" w:cs="Times New Roman"/>
+                <w:sz w:val="24"/>
+                <w:szCs w:val="24"/>
+              </w:rPr>
+              <w:t>Descripción</w:t>
+            </w:r>
+          </w:p>
+        </w:tc>
+      </w:tr>
+      <w:tr>
+        <w:tc>
+          <w:tcPr>
+            <w:tcW w:w="2122" w:type="dxa"/>
+          </w:tcPr>
+          <w:p>
+            <w:pPr>
+              <w:jc w:val="both"/>
+              <w:rPr>
+                <w:rFonts w:ascii="Times New Roman" w:eastAsia="Times New Roman" w:hAnsi="Times New Roman" w:cs="Times New Roman"/>
+                <w:sz w:val="24"/>
+                <w:szCs w:val="24"/>
+              </w:rPr>
+            </w:pPr>
+            <w:r>
+              <w:rPr>
+                <w:rFonts w:ascii="Times New Roman" w:eastAsia="Times New Roman" w:hAnsi="Times New Roman" w:cs="Times New Roman"/>
+                <w:sz w:val="24"/>
+                <w:szCs w:val="24"/>
+              </w:rPr>
+              <w:t>Usuario no autenticado</w:t>
+            </w:r>
+          </w:p>
+        </w:tc>
+        <w:tc>
+          <w:tcPr>
+            <w:tcW w:w="6656" w:type="dxa"/>
+          </w:tcPr>
+          <w:p>
+            <w:pPr>
+              <w:jc w:val="both"/>
+              <w:rPr>
+                <w:rFonts w:ascii="Times New Roman" w:eastAsia="Times New Roman" w:hAnsi="Times New Roman" w:cs="Times New Roman"/>
+                <w:sz w:val="24"/>
+                <w:szCs w:val="24"/>
+              </w:rPr>
+            </w:pPr>
+            <w:r>
+              <w:rPr>
+                <w:rFonts w:ascii="Times New Roman" w:eastAsia="Times New Roman" w:hAnsi="Times New Roman" w:cs="Times New Roman"/>
+                <w:sz w:val="24"/>
+                <w:szCs w:val="24"/>
+              </w:rPr>
+              <w:t>Persona que accede a la aplicación sin haber iniciado sesión. Solo puede acceder a las páginas de registro e inicio de sesión.</w:t>
+            </w:r>
+          </w:p>
+        </w:tc>
+      </w:tr>
+      <w:tr>
+        <w:tc>
+          <w:tcPr>
+            <w:tcW w:w="2122" w:type="dxa"/>
+          </w:tcPr>
+          <w:p>
+            <w:pPr>
+              <w:jc w:val="both"/>
+              <w:rPr>
+                <w:rFonts w:ascii="Times New Roman" w:eastAsia="Times New Roman" w:hAnsi="Times New Roman" w:cs="Times New Roman"/>
+                <w:sz w:val="24"/>
+                <w:szCs w:val="24"/>
+              </w:rPr>
+            </w:pPr>
+            <w:r>
+              <w:rPr>
+                <w:rFonts w:ascii="Times New Roman" w:eastAsia="Times New Roman" w:hAnsi="Times New Roman" w:cs="Times New Roman"/>
+                <w:sz w:val="24"/>
+                <w:szCs w:val="24"/>
+              </w:rPr>
+              <w:t>Usuario autenticado</w:t>
+            </w:r>
+          </w:p>
+        </w:tc>
+        <w:tc>
+          <w:tcPr>
+            <w:tcW w:w="6656" w:type="dxa"/>
+          </w:tcPr>
+          <w:p>
+            <w:pPr>
+              <w:jc w:val="both"/>
+              <w:rPr>
+                <w:rFonts w:ascii="Times New Roman" w:eastAsia="Times New Roman" w:hAnsi="Times New Roman" w:cs="Times New Roman"/>
+                <w:sz w:val="24"/>
+                <w:szCs w:val="24"/>
+              </w:rPr>
+            </w:pPr>
+            <w:r>
+              <w:rPr>
+                <w:rFonts w:ascii="Times New Roman" w:eastAsia="Times New Roman" w:hAnsi="Times New Roman" w:cs="Times New Roman"/>
+                <w:sz w:val="24"/>
+                <w:szCs w:val="24"/>
+              </w:rPr>
+              <w:t>Persona registrada en el sistema que ha iniciado sesión. Puede gestionar hogares, mascotas y actividades de cuidado.</w:t>
+            </w:r>
+          </w:p>
+        </w:tc>
+      </w:tr>
+      <w:tr>
+        <w:tc>
+          <w:tcPr>
+            <w:tcW w:w="2122" w:type="dxa"/>
+          </w:tcPr>
+          <w:p>
+            <w:pPr>
+              <w:jc w:val="both"/>
+              <w:rPr>
+                <w:rFonts w:ascii="Times New Roman" w:eastAsia="Times New Roman" w:hAnsi="Times New Roman" w:cs="Times New Roman"/>
+                <w:sz w:val="24"/>
+                <w:szCs w:val="24"/>
+              </w:rPr>
+            </w:pPr>
+            <w:r>
+              <w:rPr>
+                <w:rFonts w:ascii="Times New Roman" w:eastAsia="Times New Roman" w:hAnsi="Times New Roman" w:cs="Times New Roman"/>
+                <w:sz w:val="24"/>
+                <w:szCs w:val="24"/>
+              </w:rPr>
+              <w:t>Propietario (OWNER)</w:t>
+            </w:r>
+          </w:p>
+        </w:tc>
+        <w:tc>
+          <w:tcPr>
+            <w:tcW w:w="6656" w:type="dxa"/>
+          </w:tcPr>
+          <w:p>
+            <w:pPr>
+              <w:jc w:val="both"/>
+              <w:rPr>
+                <w:rFonts w:ascii="Times New Roman" w:eastAsia="Times New Roman" w:hAnsi="Times New Roman" w:cs="Times New Roman"/>
+                <w:sz w:val="24"/>
+                <w:szCs w:val="24"/>
+              </w:rPr>
+            </w:pPr>
+            <w:r>
+              <w:rPr>
+                <w:rFonts w:ascii="Times New Roman" w:eastAsia="Times New Roman" w:hAnsi="Times New Roman" w:cs="Times New Roman"/>
+                <w:sz w:val="24"/>
+                <w:szCs w:val="24"/>
+              </w:rPr>
+              <w:t>Usuario que creó el hogar. Tiene control total sobre el hogar y sus miembros, incluyendo la posibilidad de eliminarlo.</w:t>
+            </w:r>
+          </w:p>
+        </w:tc>
+      </w:tr>
+      <w:tr>
+        <w:tc>
+          <w:tcPr>
+            <w:tcW w:w="2122" w:type="dxa"/>
+          </w:tcPr>
+          <w:p>
+            <w:pPr>
+              <w:jc w:val="both"/>
+              <w:rPr>
+                <w:rFonts w:ascii="Times New Roman" w:eastAsia="Times New Roman" w:hAnsi="Times New Roman" w:cs="Times New Roman"/>
+                <w:sz w:val="24"/>
+                <w:szCs w:val="24"/>
+              </w:rPr>
+            </w:pPr>
+            <w:r>
+              <w:rPr>
+                <w:rFonts w:ascii="Times New Roman" w:eastAsia="Times New Roman" w:hAnsi="Times New Roman" w:cs="Times New Roman"/>
+                <w:sz w:val="24"/>
+                <w:szCs w:val="24"/>
+              </w:rPr>
+              <w:t>Administrador (ADMIN)</w:t>
+            </w:r>
+          </w:p>
+        </w:tc>
+        <w:tc>
+          <w:tcPr>
+            <w:tcW w:w="6656" w:type="dxa"/>
+          </w:tcPr>
+          <w:p>
+            <w:pPr>
+              <w:jc w:val="both"/>
+              <w:rPr>
+                <w:rFonts w:ascii="Times New Roman" w:eastAsia="Times New Roman" w:hAnsi="Times New Roman" w:cs="Times New Roman"/>
+                <w:sz w:val="24"/>
+                <w:szCs w:val="24"/>
+              </w:rPr>
+            </w:pPr>
+            <w:r>
+              <w:rPr>
+                <w:rFonts w:ascii="Times New Roman" w:eastAsia="Times New Roman" w:hAnsi="Times New Roman" w:cs="Times New Roman"/>
+                <w:sz w:val="24"/>
+                <w:szCs w:val="24"/>
+              </w:rPr>
+              <w:t>Miembro del hogar con permisos para invitar a otros usuarios y gestionar el contenido del hogar.</w:t>
+            </w:r>
+          </w:p>
+        </w:tc>
+      </w:tr>
+      <w:tr>
+        <w:tc>
+          <w:tcPr>
+            <w:tcW w:w="2122" w:type="dxa"/>
+          </w:tcPr>
+          <w:p>
+            <w:pPr>
+              <w:jc w:val="both"/>
+              <w:rPr>
+                <w:rFonts w:ascii="Times New Roman" w:eastAsia="Times New Roman" w:hAnsi="Times New Roman" w:cs="Times New Roman"/>
+                <w:sz w:val="24"/>
+                <w:szCs w:val="24"/>
+              </w:rPr>
+            </w:pPr>
+            <w:r>
+              <w:rPr>
+                <w:rFonts w:ascii="Times New Roman" w:eastAsia="Times New Roman" w:hAnsi="Times New Roman" w:cs="Times New Roman"/>
+                <w:sz w:val="24"/>
+                <w:szCs w:val="24"/>
+              </w:rPr>
+              <w:t>Miembro (MEMBER)</w:t>
+            </w:r>
+          </w:p>
+        </w:tc>
+        <w:tc>
+          <w:tcPr>
+            <w:tcW w:w="6656" w:type="dxa"/>
+          </w:tcPr>
+          <w:p>
+            <w:pPr>
+              <w:jc w:val="both"/>
+              <w:rPr>
+                <w:rFonts w:ascii="Times New Roman" w:eastAsia="Times New Roman" w:hAnsi="Times New Roman" w:cs="Times New Roman"/>
+                <w:sz w:val="24"/>
+                <w:szCs w:val="24"/>
+              </w:rPr>
+            </w:pPr>
+            <w:r>
+              <w:rPr>
+                <w:rFonts w:ascii="Times New Roman" w:eastAsia="Times New Roman" w:hAnsi="Times New Roman" w:cs="Times New Roman"/>
+                <w:sz w:val="24"/>
+                <w:szCs w:val="24"/>
+              </w:rPr>
+              <w:t>Miembro del hogar con permisos de lectura y registro de actividades de cuidado.</w:t>
+            </w:r>
+          </w:p>
+        </w:tc>
+      </w:tr>
+    </w:tbl>
+    <w:p>
+      <w:pPr>
+        <w:pBdr>
+          <w:top w:val="nil"/>
+          <w:left w:val="nil"/>
+          <w:bottom w:val="nil"/>
+          <w:right w:val="nil"/>
+          <w:between w:val="nil"/>
+        </w:pBdr>
+        <w:jc w:val="both"/>
+        <w:rPr>
+          <w:rFonts w:ascii="Times New Roman" w:eastAsia="Times New Roman" w:hAnsi="Times New Roman" w:cs="Times New Roman"/>
+          <w:sz w:val="24"/>
+          <w:szCs w:val="24"/>
+        </w:rPr>
+      </w:pPr>
+    </w:p>
+    <w:p>
+      <w:pPr>
+        <w:pBdr>
+          <w:top w:val="nil"/>
+          <w:left w:val="nil"/>
+          <w:bottom w:val="nil"/>
+          <w:right w:val="nil"/>
+          <w:between w:val="nil"/>
+        </w:pBdr>
+        <w:jc w:val="both"/>
+        <w:rPr>
+          <w:rFonts w:ascii="Times New Roman" w:eastAsia="Times New Roman" w:hAnsi="Times New Roman" w:cs="Times New Roman"/>
+          <w:sz w:val="24"/>
+          <w:szCs w:val="24"/>
+        </w:rPr>
       </w:pPr>
       <w:r>
+        <w:rPr>
+          <w:rFonts w:ascii="Times New Roman" w:eastAsia="Times New Roman" w:hAnsi="Times New Roman" w:cs="Times New Roman"/>
+          <w:sz w:val="24"/>
+          <w:szCs w:val="24"/>
+        </w:rPr>
+        <w:t xml:space="preserve">Los roles de Propietario, Administrador y Miembro son roles dentro de un hogar concreto, por lo que un mismo usuario puede tener roles distintos en hogares diferentes. El rol de </w:t>
+      </w:r>
+      <w:r>
+        <w:rPr>
+          <w:rFonts w:ascii="Times New Roman" w:eastAsia="Times New Roman" w:hAnsi="Times New Roman" w:cs="Times New Roman"/>
+          <w:sz w:val="24"/>
+          <w:szCs w:val="24"/>
+        </w:rPr>
+        <w:lastRenderedPageBreak/>
+        <w:t>Propietario se asigna automáticamente al usuario que crea el hogar y no puede ser transferido.</w:t>
+      </w:r>
+    </w:p>
+    <w:p>
+      <w:pPr>
+        <w:pBdr>
+          <w:top w:val="nil"/>
+          <w:left w:val="nil"/>
+          <w:bottom w:val="nil"/>
+          <w:right w:val="nil"/>
+          <w:between w:val="nil"/>
+        </w:pBdr>
+        <w:jc w:val="both"/>
+        <w:rPr>
+          <w:rFonts w:ascii="Times New Roman" w:eastAsia="Times New Roman" w:hAnsi="Times New Roman" w:cs="Times New Roman"/>
+          <w:sz w:val="24"/>
+          <w:szCs w:val="24"/>
+        </w:rPr>
+      </w:pPr>
+    </w:p>
+    <w:p>
+      <w:pPr>
+        <w:pBdr>
+          <w:top w:val="nil"/>
+          <w:left w:val="nil"/>
+          <w:bottom w:val="nil"/>
+          <w:right w:val="nil"/>
+          <w:between w:val="nil"/>
+        </w:pBdr>
+        <w:jc w:val="both"/>
+        <w:rPr>
+          <w:rFonts w:ascii="Times New Roman" w:eastAsia="Times New Roman" w:hAnsi="Times New Roman" w:cs="Times New Roman"/>
+          <w:sz w:val="24"/>
+          <w:szCs w:val="24"/>
+        </w:rPr>
+      </w:pPr>
+    </w:p>
+    <w:p>
+      <w:pPr>
+        <w:pBdr>
+          <w:top w:val="nil"/>
+          <w:left w:val="nil"/>
+          <w:bottom w:val="nil"/>
+          <w:right w:val="nil"/>
+          <w:between w:val="nil"/>
+        </w:pBdr>
+        <w:jc w:val="both"/>
         <w:rPr>
           <w:b/>
           <w:sz w:val="28"/>
           <w:szCs w:val="28"/>
         </w:rPr>
-        <w:t>4.2.2.- . . . (incluir subapartados si fuera necesario)</w:t>
+      </w:pPr>
+      <w:r>
+        <w:rPr>
+          <w:b/>
+          <w:sz w:val="28"/>
+          <w:szCs w:val="28"/>
+        </w:rPr>
+        <w:t xml:space="preserve">4.2.2.- </w:t>
+      </w:r>
+      <w:r>
+        <w:rPr>
+          <w:b/>
+          <w:sz w:val="28"/>
+          <w:szCs w:val="28"/>
+        </w:rPr>
+        <w:t>Requisitos funcionales</w:t>
+      </w:r>
+    </w:p>
+    <w:p>
+      <w:pPr>
+        <w:pBdr>
+          <w:top w:val="nil"/>
+          <w:left w:val="nil"/>
+          <w:bottom w:val="nil"/>
+          <w:right w:val="nil"/>
+          <w:between w:val="nil"/>
+        </w:pBdr>
+        <w:jc w:val="both"/>
+        <w:rPr>
+          <w:rFonts w:ascii="Times New Roman" w:eastAsia="Times New Roman" w:hAnsi="Times New Roman" w:cs="Times New Roman"/>
+          <w:sz w:val="24"/>
+          <w:szCs w:val="24"/>
+        </w:rPr>
+      </w:pPr>
+    </w:p>
+    <w:p>
+      <w:pPr>
+        <w:pBdr>
+          <w:top w:val="nil"/>
+          <w:left w:val="nil"/>
+          <w:bottom w:val="nil"/>
+          <w:right w:val="nil"/>
+          <w:between w:val="nil"/>
+        </w:pBdr>
+        <w:jc w:val="both"/>
+        <w:rPr>
+          <w:rFonts w:ascii="Times New Roman" w:eastAsia="Times New Roman" w:hAnsi="Times New Roman" w:cs="Times New Roman"/>
+          <w:sz w:val="24"/>
+          <w:szCs w:val="24"/>
+        </w:rPr>
+      </w:pPr>
+      <w:r>
+        <w:rPr>
+          <w:rFonts w:ascii="Times New Roman" w:eastAsia="Times New Roman" w:hAnsi="Times New Roman" w:cs="Times New Roman"/>
+          <w:sz w:val="24"/>
+          <w:szCs w:val="24"/>
+        </w:rPr>
+        <w:t>Los requisitos funcionales describen las capacidades que el sistema debe proporcionar a sus usuarios. Se han identificado 73 requisitos funcionales, organizados en nueve áreas funcionales. Cada requisito se clasifica según su prioridad: Alta, Media o Baja.</w:t>
+      </w:r>
+    </w:p>
+    <w:p>
+      <w:pPr>
+        <w:pBdr>
+          <w:top w:val="nil"/>
+          <w:left w:val="nil"/>
+          <w:bottom w:val="nil"/>
+          <w:right w:val="nil"/>
+          <w:between w:val="nil"/>
+        </w:pBdr>
+        <w:jc w:val="both"/>
+        <w:rPr>
+          <w:rFonts w:ascii="Times New Roman" w:eastAsia="Times New Roman" w:hAnsi="Times New Roman" w:cs="Times New Roman"/>
+          <w:sz w:val="24"/>
+          <w:szCs w:val="24"/>
+        </w:rPr>
+      </w:pPr>
+    </w:p>
+    <w:tbl>
+      <w:tblPr>
+        <w:tblStyle w:val="Tablaconcuadrcula"/>
+        <w:tblW w:w="0" w:type="auto"/>
+        <w:tblLook w:val="04A0" w:firstRow="1" w:lastRow="0" w:firstColumn="1" w:lastColumn="0" w:noHBand="0" w:noVBand="1"/>
+      </w:tblPr>
+      <w:tblGrid>
+        <w:gridCol w:w="1129"/>
+        <w:gridCol w:w="3828"/>
+        <w:gridCol w:w="1626"/>
+        <w:gridCol w:w="2195"/>
+      </w:tblGrid>
+      <w:tr>
+        <w:tc>
+          <w:tcPr>
+            <w:tcW w:w="1129" w:type="dxa"/>
+          </w:tcPr>
+          <w:p>
+            <w:pPr>
+              <w:jc w:val="both"/>
+              <w:rPr>
+                <w:rFonts w:ascii="Times New Roman" w:eastAsia="Times New Roman" w:hAnsi="Times New Roman" w:cs="Times New Roman"/>
+                <w:sz w:val="24"/>
+                <w:szCs w:val="24"/>
+              </w:rPr>
+            </w:pPr>
+            <w:r>
+              <w:rPr>
+                <w:rFonts w:ascii="Times New Roman" w:eastAsia="Times New Roman" w:hAnsi="Times New Roman" w:cs="Times New Roman"/>
+                <w:sz w:val="24"/>
+                <w:szCs w:val="24"/>
+              </w:rPr>
+              <w:t>ID</w:t>
+            </w:r>
+          </w:p>
+        </w:tc>
+        <w:tc>
+          <w:tcPr>
+            <w:tcW w:w="3828" w:type="dxa"/>
+          </w:tcPr>
+          <w:p>
+            <w:pPr>
+              <w:jc w:val="both"/>
+              <w:rPr>
+                <w:rFonts w:ascii="Times New Roman" w:eastAsia="Times New Roman" w:hAnsi="Times New Roman" w:cs="Times New Roman"/>
+                <w:sz w:val="24"/>
+                <w:szCs w:val="24"/>
+              </w:rPr>
+            </w:pPr>
+            <w:r>
+              <w:rPr>
+                <w:rFonts w:ascii="Times New Roman" w:eastAsia="Times New Roman" w:hAnsi="Times New Roman" w:cs="Times New Roman"/>
+                <w:sz w:val="24"/>
+                <w:szCs w:val="24"/>
+              </w:rPr>
+              <w:t>Requisito</w:t>
+            </w:r>
+          </w:p>
+        </w:tc>
+        <w:tc>
+          <w:tcPr>
+            <w:tcW w:w="1626" w:type="dxa"/>
+          </w:tcPr>
+          <w:p>
+            <w:pPr>
+              <w:jc w:val="both"/>
+              <w:rPr>
+                <w:rFonts w:ascii="Times New Roman" w:eastAsia="Times New Roman" w:hAnsi="Times New Roman" w:cs="Times New Roman"/>
+                <w:sz w:val="24"/>
+                <w:szCs w:val="24"/>
+              </w:rPr>
+            </w:pPr>
+            <w:r>
+              <w:rPr>
+                <w:rFonts w:ascii="Times New Roman" w:eastAsia="Times New Roman" w:hAnsi="Times New Roman" w:cs="Times New Roman"/>
+                <w:sz w:val="24"/>
+                <w:szCs w:val="24"/>
+              </w:rPr>
+              <w:t>Prioridad</w:t>
+            </w:r>
+          </w:p>
+        </w:tc>
+        <w:tc>
+          <w:tcPr>
+            <w:tcW w:w="2195" w:type="dxa"/>
+          </w:tcPr>
+          <w:p>
+            <w:pPr>
+              <w:jc w:val="both"/>
+              <w:rPr>
+                <w:rFonts w:ascii="Times New Roman" w:eastAsia="Times New Roman" w:hAnsi="Times New Roman" w:cs="Times New Roman"/>
+                <w:sz w:val="24"/>
+                <w:szCs w:val="24"/>
+              </w:rPr>
+            </w:pPr>
+            <w:r>
+              <w:rPr>
+                <w:rFonts w:ascii="Times New Roman" w:eastAsia="Times New Roman" w:hAnsi="Times New Roman" w:cs="Times New Roman"/>
+                <w:sz w:val="24"/>
+                <w:szCs w:val="24"/>
+              </w:rPr>
+              <w:t>Estado</w:t>
+            </w:r>
+          </w:p>
+        </w:tc>
+      </w:tr>
+      <w:tr>
+        <w:tc>
+          <w:tcPr>
+            <w:tcW w:w="1129" w:type="dxa"/>
+          </w:tcPr>
+          <w:p>
+            <w:pPr>
+              <w:jc w:val="both"/>
+              <w:rPr>
+                <w:rFonts w:ascii="Times New Roman" w:eastAsia="Times New Roman" w:hAnsi="Times New Roman" w:cs="Times New Roman"/>
+                <w:sz w:val="24"/>
+                <w:szCs w:val="24"/>
+              </w:rPr>
+            </w:pPr>
+            <w:r>
+              <w:rPr>
+                <w:rFonts w:ascii="Times New Roman" w:eastAsia="Times New Roman" w:hAnsi="Times New Roman" w:cs="Times New Roman"/>
+                <w:sz w:val="24"/>
+                <w:szCs w:val="24"/>
+              </w:rPr>
+              <w:t>RF-001</w:t>
+            </w:r>
+          </w:p>
+        </w:tc>
+        <w:tc>
+          <w:tcPr>
+            <w:tcW w:w="3828" w:type="dxa"/>
+          </w:tcPr>
+          <w:p>
+            <w:pPr>
+              <w:jc w:val="both"/>
+              <w:rPr>
+                <w:rFonts w:ascii="Times New Roman" w:eastAsia="Times New Roman" w:hAnsi="Times New Roman" w:cs="Times New Roman"/>
+                <w:sz w:val="24"/>
+                <w:szCs w:val="24"/>
+              </w:rPr>
+            </w:pPr>
+            <w:r>
+              <w:rPr>
+                <w:rFonts w:ascii="Times New Roman" w:eastAsia="Times New Roman" w:hAnsi="Times New Roman" w:cs="Times New Roman"/>
+                <w:sz w:val="24"/>
+                <w:szCs w:val="24"/>
+              </w:rPr>
+              <w:t>Permitir el registro de nuevos usuarios con nombre, email y contraseña.</w:t>
+            </w:r>
+          </w:p>
+        </w:tc>
+        <w:tc>
+          <w:tcPr>
+            <w:tcW w:w="1626" w:type="dxa"/>
+          </w:tcPr>
+          <w:p>
+            <w:pPr>
+              <w:jc w:val="both"/>
+              <w:rPr>
+                <w:rFonts w:ascii="Times New Roman" w:eastAsia="Times New Roman" w:hAnsi="Times New Roman" w:cs="Times New Roman"/>
+                <w:sz w:val="24"/>
+                <w:szCs w:val="24"/>
+              </w:rPr>
+            </w:pPr>
+            <w:r>
+              <w:rPr>
+                <w:rFonts w:ascii="Times New Roman" w:eastAsia="Times New Roman" w:hAnsi="Times New Roman" w:cs="Times New Roman"/>
+                <w:sz w:val="24"/>
+                <w:szCs w:val="24"/>
+              </w:rPr>
+              <w:t>Alta</w:t>
+            </w:r>
+          </w:p>
+        </w:tc>
+        <w:tc>
+          <w:tcPr>
+            <w:tcW w:w="2195" w:type="dxa"/>
+          </w:tcPr>
+          <w:p>
+            <w:pPr>
+              <w:jc w:val="both"/>
+              <w:rPr>
+                <w:rFonts w:ascii="Times New Roman" w:eastAsia="Times New Roman" w:hAnsi="Times New Roman" w:cs="Times New Roman"/>
+                <w:sz w:val="24"/>
+                <w:szCs w:val="24"/>
+              </w:rPr>
+            </w:pPr>
+            <w:r>
+              <w:rPr>
+                <w:rFonts w:ascii="Times New Roman" w:eastAsia="Times New Roman" w:hAnsi="Times New Roman" w:cs="Times New Roman"/>
+                <w:sz w:val="24"/>
+                <w:szCs w:val="24"/>
+              </w:rPr>
+              <w:t>Implementado</w:t>
+            </w:r>
+          </w:p>
+        </w:tc>
+      </w:tr>
+      <w:tr>
+        <w:tc>
+          <w:tcPr>
+            <w:tcW w:w="1129" w:type="dxa"/>
+          </w:tcPr>
+          <w:p>
+            <w:pPr>
+              <w:jc w:val="both"/>
+              <w:rPr>
+                <w:rFonts w:ascii="Times New Roman" w:eastAsia="Times New Roman" w:hAnsi="Times New Roman" w:cs="Times New Roman"/>
+                <w:sz w:val="24"/>
+                <w:szCs w:val="24"/>
+              </w:rPr>
+            </w:pPr>
+            <w:r>
+              <w:rPr>
+                <w:rFonts w:ascii="Times New Roman" w:eastAsia="Times New Roman" w:hAnsi="Times New Roman" w:cs="Times New Roman"/>
+                <w:sz w:val="24"/>
+                <w:szCs w:val="24"/>
+              </w:rPr>
+              <w:t>RF-002</w:t>
+            </w:r>
+          </w:p>
+        </w:tc>
+        <w:tc>
+          <w:tcPr>
+            <w:tcW w:w="3828" w:type="dxa"/>
+          </w:tcPr>
+          <w:p>
+            <w:pPr>
+              <w:jc w:val="both"/>
+              <w:rPr>
+                <w:rFonts w:ascii="Times New Roman" w:eastAsia="Times New Roman" w:hAnsi="Times New Roman" w:cs="Times New Roman"/>
+                <w:sz w:val="24"/>
+                <w:szCs w:val="24"/>
+              </w:rPr>
+            </w:pPr>
+            <w:r>
+              <w:rPr>
+                <w:rFonts w:ascii="Times New Roman" w:eastAsia="Times New Roman" w:hAnsi="Times New Roman" w:cs="Times New Roman"/>
+                <w:sz w:val="24"/>
+                <w:szCs w:val="24"/>
+              </w:rPr>
+              <w:t>Validar que el email no esté registrado previamente durante el registro.</w:t>
+            </w:r>
+          </w:p>
+        </w:tc>
+        <w:tc>
+          <w:tcPr>
+            <w:tcW w:w="1626" w:type="dxa"/>
+          </w:tcPr>
+          <w:p>
+            <w:pPr>
+              <w:jc w:val="both"/>
+              <w:rPr>
+                <w:rFonts w:ascii="Times New Roman" w:eastAsia="Times New Roman" w:hAnsi="Times New Roman" w:cs="Times New Roman"/>
+                <w:sz w:val="24"/>
+                <w:szCs w:val="24"/>
+              </w:rPr>
+            </w:pPr>
+            <w:r>
+              <w:rPr>
+                <w:rFonts w:ascii="Times New Roman" w:eastAsia="Times New Roman" w:hAnsi="Times New Roman" w:cs="Times New Roman"/>
+                <w:sz w:val="24"/>
+                <w:szCs w:val="24"/>
+              </w:rPr>
+              <w:t>Alta</w:t>
+            </w:r>
+          </w:p>
+        </w:tc>
+        <w:tc>
+          <w:tcPr>
+            <w:tcW w:w="2195" w:type="dxa"/>
+          </w:tcPr>
+          <w:p>
+            <w:pPr>
+              <w:jc w:val="both"/>
+              <w:rPr>
+                <w:rFonts w:ascii="Times New Roman" w:eastAsia="Times New Roman" w:hAnsi="Times New Roman" w:cs="Times New Roman"/>
+                <w:sz w:val="24"/>
+                <w:szCs w:val="24"/>
+              </w:rPr>
+            </w:pPr>
+            <w:r>
+              <w:rPr>
+                <w:rFonts w:ascii="Times New Roman" w:eastAsia="Times New Roman" w:hAnsi="Times New Roman" w:cs="Times New Roman"/>
+                <w:sz w:val="24"/>
+                <w:szCs w:val="24"/>
+              </w:rPr>
+              <w:t>Implementado</w:t>
+            </w:r>
+          </w:p>
+        </w:tc>
+      </w:tr>
+      <w:tr>
+        <w:tc>
+          <w:tcPr>
+            <w:tcW w:w="1129" w:type="dxa"/>
+          </w:tcPr>
+          <w:p>
+            <w:pPr>
+              <w:jc w:val="both"/>
+              <w:rPr>
+                <w:rFonts w:ascii="Times New Roman" w:eastAsia="Times New Roman" w:hAnsi="Times New Roman" w:cs="Times New Roman"/>
+                <w:sz w:val="24"/>
+                <w:szCs w:val="24"/>
+              </w:rPr>
+            </w:pPr>
+            <w:r>
+              <w:rPr>
+                <w:rFonts w:ascii="Times New Roman" w:eastAsia="Times New Roman" w:hAnsi="Times New Roman" w:cs="Times New Roman"/>
+                <w:sz w:val="24"/>
+                <w:szCs w:val="24"/>
+              </w:rPr>
+              <w:t>RF-003</w:t>
+            </w:r>
+          </w:p>
+        </w:tc>
+        <w:tc>
+          <w:tcPr>
+            <w:tcW w:w="3828" w:type="dxa"/>
+          </w:tcPr>
+          <w:p>
+            <w:pPr>
+              <w:jc w:val="both"/>
+              <w:rPr>
+                <w:rFonts w:ascii="Times New Roman" w:eastAsia="Times New Roman" w:hAnsi="Times New Roman" w:cs="Times New Roman"/>
+                <w:sz w:val="24"/>
+                <w:szCs w:val="24"/>
+              </w:rPr>
+            </w:pPr>
+            <w:r>
+              <w:rPr>
+                <w:rFonts w:ascii="Times New Roman" w:eastAsia="Times New Roman" w:hAnsi="Times New Roman" w:cs="Times New Roman"/>
+                <w:sz w:val="24"/>
+                <w:szCs w:val="24"/>
+              </w:rPr>
+              <w:t>Almacenar las contraseñas de forma segura usando BCrypt.</w:t>
+            </w:r>
+          </w:p>
+        </w:tc>
+        <w:tc>
+          <w:tcPr>
+            <w:tcW w:w="1626" w:type="dxa"/>
+          </w:tcPr>
+          <w:p>
+            <w:pPr>
+              <w:jc w:val="both"/>
+              <w:rPr>
+                <w:rFonts w:ascii="Times New Roman" w:eastAsia="Times New Roman" w:hAnsi="Times New Roman" w:cs="Times New Roman"/>
+                <w:sz w:val="24"/>
+                <w:szCs w:val="24"/>
+              </w:rPr>
+            </w:pPr>
+            <w:r>
+              <w:rPr>
+                <w:rFonts w:ascii="Times New Roman" w:eastAsia="Times New Roman" w:hAnsi="Times New Roman" w:cs="Times New Roman"/>
+                <w:sz w:val="24"/>
+                <w:szCs w:val="24"/>
+              </w:rPr>
+              <w:t>Alta</w:t>
+            </w:r>
+          </w:p>
+        </w:tc>
+        <w:tc>
+          <w:tcPr>
+            <w:tcW w:w="2195" w:type="dxa"/>
+          </w:tcPr>
+          <w:p>
+            <w:pPr>
+              <w:jc w:val="both"/>
+              <w:rPr>
+                <w:rFonts w:ascii="Times New Roman" w:eastAsia="Times New Roman" w:hAnsi="Times New Roman" w:cs="Times New Roman"/>
+                <w:sz w:val="24"/>
+                <w:szCs w:val="24"/>
+              </w:rPr>
+            </w:pPr>
+            <w:r>
+              <w:rPr>
+                <w:rFonts w:ascii="Times New Roman" w:eastAsia="Times New Roman" w:hAnsi="Times New Roman" w:cs="Times New Roman"/>
+                <w:sz w:val="24"/>
+                <w:szCs w:val="24"/>
+              </w:rPr>
+              <w:t>Implementado</w:t>
+            </w:r>
+          </w:p>
+        </w:tc>
+      </w:tr>
+      <w:tr>
+        <w:tc>
+          <w:tcPr>
+            <w:tcW w:w="1129" w:type="dxa"/>
+          </w:tcPr>
+          <w:p>
+            <w:pPr>
+              <w:jc w:val="both"/>
+              <w:rPr>
+                <w:rFonts w:ascii="Times New Roman" w:eastAsia="Times New Roman" w:hAnsi="Times New Roman" w:cs="Times New Roman"/>
+                <w:sz w:val="24"/>
+                <w:szCs w:val="24"/>
+              </w:rPr>
+            </w:pPr>
+            <w:r>
+              <w:rPr>
+                <w:rFonts w:ascii="Times New Roman" w:eastAsia="Times New Roman" w:hAnsi="Times New Roman" w:cs="Times New Roman"/>
+                <w:sz w:val="24"/>
+                <w:szCs w:val="24"/>
+              </w:rPr>
+              <w:t>RF-004</w:t>
+            </w:r>
+          </w:p>
+        </w:tc>
+        <w:tc>
+          <w:tcPr>
+            <w:tcW w:w="3828" w:type="dxa"/>
+          </w:tcPr>
+          <w:p>
+            <w:pPr>
+              <w:jc w:val="both"/>
+              <w:rPr>
+                <w:rFonts w:ascii="Times New Roman" w:eastAsia="Times New Roman" w:hAnsi="Times New Roman" w:cs="Times New Roman"/>
+                <w:sz w:val="24"/>
+                <w:szCs w:val="24"/>
+              </w:rPr>
+            </w:pPr>
+            <w:r>
+              <w:rPr>
+                <w:rFonts w:ascii="Times New Roman" w:eastAsia="Times New Roman" w:hAnsi="Times New Roman" w:cs="Times New Roman"/>
+                <w:sz w:val="24"/>
+                <w:szCs w:val="24"/>
+              </w:rPr>
+              <w:t>Permitir el inicio de sesión con email y contraseña.</w:t>
+            </w:r>
+          </w:p>
+        </w:tc>
+        <w:tc>
+          <w:tcPr>
+            <w:tcW w:w="1626" w:type="dxa"/>
+          </w:tcPr>
+          <w:p>
+            <w:pPr>
+              <w:jc w:val="both"/>
+              <w:rPr>
+                <w:rFonts w:ascii="Times New Roman" w:eastAsia="Times New Roman" w:hAnsi="Times New Roman" w:cs="Times New Roman"/>
+                <w:sz w:val="24"/>
+                <w:szCs w:val="24"/>
+              </w:rPr>
+            </w:pPr>
+            <w:r>
+              <w:rPr>
+                <w:rFonts w:ascii="Times New Roman" w:eastAsia="Times New Roman" w:hAnsi="Times New Roman" w:cs="Times New Roman"/>
+                <w:sz w:val="24"/>
+                <w:szCs w:val="24"/>
+              </w:rPr>
+              <w:t>Alta</w:t>
+            </w:r>
+          </w:p>
+        </w:tc>
+        <w:tc>
+          <w:tcPr>
+            <w:tcW w:w="2195" w:type="dxa"/>
+          </w:tcPr>
+          <w:p>
+            <w:pPr>
+              <w:jc w:val="both"/>
+              <w:rPr>
+                <w:rFonts w:ascii="Times New Roman" w:eastAsia="Times New Roman" w:hAnsi="Times New Roman" w:cs="Times New Roman"/>
+                <w:sz w:val="24"/>
+                <w:szCs w:val="24"/>
+              </w:rPr>
+            </w:pPr>
+            <w:r>
+              <w:rPr>
+                <w:rFonts w:ascii="Times New Roman" w:eastAsia="Times New Roman" w:hAnsi="Times New Roman" w:cs="Times New Roman"/>
+                <w:sz w:val="24"/>
+                <w:szCs w:val="24"/>
+              </w:rPr>
+              <w:t>Implementado</w:t>
+            </w:r>
+          </w:p>
+        </w:tc>
+      </w:tr>
+      <w:tr>
+        <w:tc>
+          <w:tcPr>
+            <w:tcW w:w="1129" w:type="dxa"/>
+          </w:tcPr>
+          <w:p>
+            <w:pPr>
+              <w:jc w:val="both"/>
+              <w:rPr>
+                <w:rFonts w:ascii="Times New Roman" w:eastAsia="Times New Roman" w:hAnsi="Times New Roman" w:cs="Times New Roman"/>
+                <w:sz w:val="24"/>
+                <w:szCs w:val="24"/>
+              </w:rPr>
+            </w:pPr>
+            <w:r>
+              <w:rPr>
+                <w:rFonts w:ascii="Times New Roman" w:eastAsia="Times New Roman" w:hAnsi="Times New Roman" w:cs="Times New Roman"/>
+                <w:sz w:val="24"/>
+                <w:szCs w:val="24"/>
+              </w:rPr>
+              <w:t>RF-005</w:t>
+            </w:r>
+          </w:p>
+        </w:tc>
+        <w:tc>
+          <w:tcPr>
+            <w:tcW w:w="3828" w:type="dxa"/>
+          </w:tcPr>
+          <w:p>
+            <w:pPr>
+              <w:jc w:val="both"/>
+              <w:rPr>
+                <w:rFonts w:ascii="Times New Roman" w:eastAsia="Times New Roman" w:hAnsi="Times New Roman" w:cs="Times New Roman"/>
+                <w:sz w:val="24"/>
+                <w:szCs w:val="24"/>
+              </w:rPr>
+            </w:pPr>
+            <w:r>
+              <w:rPr>
+                <w:rFonts w:ascii="Times New Roman" w:eastAsia="Times New Roman" w:hAnsi="Times New Roman" w:cs="Times New Roman"/>
+                <w:sz w:val="24"/>
+                <w:szCs w:val="24"/>
+              </w:rPr>
+              <w:t>Generar un token JWT al autenticarse correctamente.</w:t>
+            </w:r>
+          </w:p>
+        </w:tc>
+        <w:tc>
+          <w:tcPr>
+            <w:tcW w:w="1626" w:type="dxa"/>
+          </w:tcPr>
+          <w:p>
+            <w:pPr>
+              <w:jc w:val="both"/>
+              <w:rPr>
+                <w:rFonts w:ascii="Times New Roman" w:eastAsia="Times New Roman" w:hAnsi="Times New Roman" w:cs="Times New Roman"/>
+                <w:sz w:val="24"/>
+                <w:szCs w:val="24"/>
+              </w:rPr>
+            </w:pPr>
+            <w:r>
+              <w:rPr>
+                <w:rFonts w:ascii="Times New Roman" w:eastAsia="Times New Roman" w:hAnsi="Times New Roman" w:cs="Times New Roman"/>
+                <w:sz w:val="24"/>
+                <w:szCs w:val="24"/>
+              </w:rPr>
+              <w:t>Alta</w:t>
+            </w:r>
+          </w:p>
+        </w:tc>
+        <w:tc>
+          <w:tcPr>
+            <w:tcW w:w="2195" w:type="dxa"/>
+          </w:tcPr>
+          <w:p>
+            <w:pPr>
+              <w:jc w:val="both"/>
+              <w:rPr>
+                <w:rFonts w:ascii="Times New Roman" w:eastAsia="Times New Roman" w:hAnsi="Times New Roman" w:cs="Times New Roman"/>
+                <w:sz w:val="24"/>
+                <w:szCs w:val="24"/>
+              </w:rPr>
+            </w:pPr>
+            <w:r>
+              <w:rPr>
+                <w:rFonts w:ascii="Times New Roman" w:eastAsia="Times New Roman" w:hAnsi="Times New Roman" w:cs="Times New Roman"/>
+                <w:sz w:val="24"/>
+                <w:szCs w:val="24"/>
+              </w:rPr>
+              <w:t>Implementado</w:t>
+            </w:r>
+          </w:p>
+        </w:tc>
+      </w:tr>
+      <w:tr>
+        <w:tc>
+          <w:tcPr>
+            <w:tcW w:w="1129" w:type="dxa"/>
+          </w:tcPr>
+          <w:p>
+            <w:pPr>
+              <w:jc w:val="both"/>
+              <w:rPr>
+                <w:rFonts w:ascii="Times New Roman" w:eastAsia="Times New Roman" w:hAnsi="Times New Roman" w:cs="Times New Roman"/>
+                <w:sz w:val="24"/>
+                <w:szCs w:val="24"/>
+              </w:rPr>
+            </w:pPr>
+            <w:r>
+              <w:rPr>
+                <w:rFonts w:ascii="Times New Roman" w:eastAsia="Times New Roman" w:hAnsi="Times New Roman" w:cs="Times New Roman"/>
+                <w:sz w:val="24"/>
+                <w:szCs w:val="24"/>
+              </w:rPr>
+              <w:t>RF-006</w:t>
+            </w:r>
+          </w:p>
+        </w:tc>
+        <w:tc>
+          <w:tcPr>
+            <w:tcW w:w="3828" w:type="dxa"/>
+          </w:tcPr>
+          <w:p>
+            <w:pPr>
+              <w:jc w:val="both"/>
+              <w:rPr>
+                <w:rFonts w:ascii="Times New Roman" w:eastAsia="Times New Roman" w:hAnsi="Times New Roman" w:cs="Times New Roman"/>
+                <w:sz w:val="24"/>
+                <w:szCs w:val="24"/>
+              </w:rPr>
+            </w:pPr>
+            <w:r>
+              <w:rPr>
+                <w:rFonts w:ascii="Times New Roman" w:eastAsia="Times New Roman" w:hAnsi="Times New Roman" w:cs="Times New Roman"/>
+                <w:sz w:val="24"/>
+                <w:szCs w:val="24"/>
+              </w:rPr>
+              <w:t>Proteger todas las rutas privadas con autenticación JWT.</w:t>
+            </w:r>
+          </w:p>
+        </w:tc>
+        <w:tc>
+          <w:tcPr>
+            <w:tcW w:w="1626" w:type="dxa"/>
+          </w:tcPr>
+          <w:p>
+            <w:pPr>
+              <w:jc w:val="both"/>
+              <w:rPr>
+                <w:rFonts w:ascii="Times New Roman" w:eastAsia="Times New Roman" w:hAnsi="Times New Roman" w:cs="Times New Roman"/>
+                <w:sz w:val="24"/>
+                <w:szCs w:val="24"/>
+              </w:rPr>
+            </w:pPr>
+            <w:r>
+              <w:rPr>
+                <w:rFonts w:ascii="Times New Roman" w:eastAsia="Times New Roman" w:hAnsi="Times New Roman" w:cs="Times New Roman"/>
+                <w:sz w:val="24"/>
+                <w:szCs w:val="24"/>
+              </w:rPr>
+              <w:t>Alta</w:t>
+            </w:r>
+          </w:p>
+        </w:tc>
+        <w:tc>
+          <w:tcPr>
+            <w:tcW w:w="2195" w:type="dxa"/>
+          </w:tcPr>
+          <w:p>
+            <w:pPr>
+              <w:jc w:val="both"/>
+              <w:rPr>
+                <w:rFonts w:ascii="Times New Roman" w:eastAsia="Times New Roman" w:hAnsi="Times New Roman" w:cs="Times New Roman"/>
+                <w:sz w:val="24"/>
+                <w:szCs w:val="24"/>
+              </w:rPr>
+            </w:pPr>
+            <w:r>
+              <w:rPr>
+                <w:rFonts w:ascii="Times New Roman" w:eastAsia="Times New Roman" w:hAnsi="Times New Roman" w:cs="Times New Roman"/>
+                <w:sz w:val="24"/>
+                <w:szCs w:val="24"/>
+              </w:rPr>
+              <w:t>Implementado</w:t>
+            </w:r>
+          </w:p>
+        </w:tc>
+      </w:tr>
+      <w:tr>
+        <w:tc>
+          <w:tcPr>
+            <w:tcW w:w="1129" w:type="dxa"/>
+          </w:tcPr>
+          <w:p>
+            <w:pPr>
+              <w:jc w:val="both"/>
+              <w:rPr>
+                <w:rFonts w:ascii="Times New Roman" w:eastAsia="Times New Roman" w:hAnsi="Times New Roman" w:cs="Times New Roman"/>
+                <w:sz w:val="24"/>
+                <w:szCs w:val="24"/>
+              </w:rPr>
+            </w:pPr>
+            <w:r>
+              <w:rPr>
+                <w:rFonts w:ascii="Times New Roman" w:eastAsia="Times New Roman" w:hAnsi="Times New Roman" w:cs="Times New Roman"/>
+                <w:sz w:val="24"/>
+                <w:szCs w:val="24"/>
+              </w:rPr>
+              <w:t>RF-007</w:t>
+            </w:r>
+          </w:p>
+        </w:tc>
+        <w:tc>
+          <w:tcPr>
+            <w:tcW w:w="3828" w:type="dxa"/>
+          </w:tcPr>
+          <w:p>
+            <w:pPr>
+              <w:jc w:val="both"/>
+              <w:rPr>
+                <w:rFonts w:ascii="Times New Roman" w:eastAsia="Times New Roman" w:hAnsi="Times New Roman" w:cs="Times New Roman"/>
+                <w:sz w:val="24"/>
+                <w:szCs w:val="24"/>
+              </w:rPr>
+            </w:pPr>
+            <w:r>
+              <w:rPr>
+                <w:rFonts w:ascii="Times New Roman" w:eastAsia="Times New Roman" w:hAnsi="Times New Roman" w:cs="Times New Roman"/>
+                <w:sz w:val="24"/>
+                <w:szCs w:val="24"/>
+              </w:rPr>
+              <w:t>Redirigir al login si el usuario intenta acceder a una ruta protegida sin autenticación.</w:t>
+            </w:r>
+          </w:p>
+        </w:tc>
+        <w:tc>
+          <w:tcPr>
+            <w:tcW w:w="1626" w:type="dxa"/>
+          </w:tcPr>
+          <w:p>
+            <w:pPr>
+              <w:jc w:val="both"/>
+              <w:rPr>
+                <w:rFonts w:ascii="Times New Roman" w:eastAsia="Times New Roman" w:hAnsi="Times New Roman" w:cs="Times New Roman"/>
+                <w:sz w:val="24"/>
+                <w:szCs w:val="24"/>
+              </w:rPr>
+            </w:pPr>
+            <w:r>
+              <w:rPr>
+                <w:rFonts w:ascii="Times New Roman" w:eastAsia="Times New Roman" w:hAnsi="Times New Roman" w:cs="Times New Roman"/>
+                <w:sz w:val="24"/>
+                <w:szCs w:val="24"/>
+              </w:rPr>
+              <w:t>Alta</w:t>
+            </w:r>
+          </w:p>
+        </w:tc>
+        <w:tc>
+          <w:tcPr>
+            <w:tcW w:w="2195" w:type="dxa"/>
+          </w:tcPr>
+          <w:p>
+            <w:pPr>
+              <w:jc w:val="both"/>
+              <w:rPr>
+                <w:rFonts w:ascii="Times New Roman" w:eastAsia="Times New Roman" w:hAnsi="Times New Roman" w:cs="Times New Roman"/>
+                <w:sz w:val="24"/>
+                <w:szCs w:val="24"/>
+              </w:rPr>
+            </w:pPr>
+            <w:r>
+              <w:rPr>
+                <w:rFonts w:ascii="Times New Roman" w:eastAsia="Times New Roman" w:hAnsi="Times New Roman" w:cs="Times New Roman"/>
+                <w:sz w:val="24"/>
+                <w:szCs w:val="24"/>
+              </w:rPr>
+              <w:t>Implementado</w:t>
+            </w:r>
+          </w:p>
+        </w:tc>
+      </w:tr>
+      <w:tr>
+        <w:tc>
+          <w:tcPr>
+            <w:tcW w:w="1129" w:type="dxa"/>
+          </w:tcPr>
+          <w:p>
+            <w:pPr>
+              <w:jc w:val="both"/>
+              <w:rPr>
+                <w:rFonts w:ascii="Times New Roman" w:eastAsia="Times New Roman" w:hAnsi="Times New Roman" w:cs="Times New Roman"/>
+                <w:sz w:val="24"/>
+                <w:szCs w:val="24"/>
+              </w:rPr>
+            </w:pPr>
+            <w:r>
+              <w:rPr>
+                <w:rFonts w:ascii="Times New Roman" w:eastAsia="Times New Roman" w:hAnsi="Times New Roman" w:cs="Times New Roman"/>
+                <w:sz w:val="24"/>
+                <w:szCs w:val="24"/>
+              </w:rPr>
+              <w:t>RF-008</w:t>
+            </w:r>
+          </w:p>
+        </w:tc>
+        <w:tc>
+          <w:tcPr>
+            <w:tcW w:w="3828" w:type="dxa"/>
+          </w:tcPr>
+          <w:p>
+            <w:pPr>
+              <w:jc w:val="both"/>
+              <w:rPr>
+                <w:rFonts w:ascii="Times New Roman" w:eastAsia="Times New Roman" w:hAnsi="Times New Roman" w:cs="Times New Roman"/>
+                <w:sz w:val="24"/>
+                <w:szCs w:val="24"/>
+              </w:rPr>
+            </w:pPr>
+            <w:r>
+              <w:rPr>
+                <w:rFonts w:ascii="Times New Roman" w:eastAsia="Times New Roman" w:hAnsi="Times New Roman" w:cs="Times New Roman"/>
+                <w:sz w:val="24"/>
+                <w:szCs w:val="24"/>
+              </w:rPr>
+              <w:t>Permitir cerrar sesión, invalidando el token localmente.</w:t>
+            </w:r>
+          </w:p>
+        </w:tc>
+        <w:tc>
+          <w:tcPr>
+            <w:tcW w:w="1626" w:type="dxa"/>
+          </w:tcPr>
+          <w:p>
+            <w:pPr>
+              <w:jc w:val="both"/>
+              <w:rPr>
+                <w:rFonts w:ascii="Times New Roman" w:eastAsia="Times New Roman" w:hAnsi="Times New Roman" w:cs="Times New Roman"/>
+                <w:sz w:val="24"/>
+                <w:szCs w:val="24"/>
+              </w:rPr>
+            </w:pPr>
+            <w:r>
+              <w:rPr>
+                <w:rFonts w:ascii="Times New Roman" w:eastAsia="Times New Roman" w:hAnsi="Times New Roman" w:cs="Times New Roman"/>
+                <w:sz w:val="24"/>
+                <w:szCs w:val="24"/>
+              </w:rPr>
+              <w:t>Alta</w:t>
+            </w:r>
+          </w:p>
+        </w:tc>
+        <w:tc>
+          <w:tcPr>
+            <w:tcW w:w="2195" w:type="dxa"/>
+          </w:tcPr>
+          <w:p>
+            <w:pPr>
+              <w:jc w:val="both"/>
+              <w:rPr>
+                <w:rFonts w:ascii="Times New Roman" w:eastAsia="Times New Roman" w:hAnsi="Times New Roman" w:cs="Times New Roman"/>
+                <w:sz w:val="24"/>
+                <w:szCs w:val="24"/>
+              </w:rPr>
+            </w:pPr>
+            <w:r>
+              <w:rPr>
+                <w:rFonts w:ascii="Times New Roman" w:eastAsia="Times New Roman" w:hAnsi="Times New Roman" w:cs="Times New Roman"/>
+                <w:sz w:val="24"/>
+                <w:szCs w:val="24"/>
+              </w:rPr>
+              <w:t>Implementado</w:t>
+            </w:r>
+          </w:p>
+        </w:tc>
+      </w:tr>
+      <w:tr>
+        <w:tc>
+          <w:tcPr>
+            <w:tcW w:w="1129" w:type="dxa"/>
+          </w:tcPr>
+          <w:p>
+            <w:pPr>
+              <w:jc w:val="both"/>
+              <w:rPr>
+                <w:rFonts w:ascii="Times New Roman" w:eastAsia="Times New Roman" w:hAnsi="Times New Roman" w:cs="Times New Roman"/>
+                <w:sz w:val="24"/>
+                <w:szCs w:val="24"/>
+              </w:rPr>
+            </w:pPr>
+            <w:r>
+              <w:rPr>
+                <w:rFonts w:ascii="Times New Roman" w:eastAsia="Times New Roman" w:hAnsi="Times New Roman" w:cs="Times New Roman"/>
+                <w:sz w:val="24"/>
+                <w:szCs w:val="24"/>
+              </w:rPr>
+              <w:t>RF-009</w:t>
+            </w:r>
+          </w:p>
+        </w:tc>
+        <w:tc>
+          <w:tcPr>
+            <w:tcW w:w="3828" w:type="dxa"/>
+          </w:tcPr>
+          <w:p>
+            <w:pPr>
+              <w:jc w:val="both"/>
+              <w:rPr>
+                <w:rFonts w:ascii="Times New Roman" w:eastAsia="Times New Roman" w:hAnsi="Times New Roman" w:cs="Times New Roman"/>
+                <w:sz w:val="24"/>
+                <w:szCs w:val="24"/>
+              </w:rPr>
+            </w:pPr>
+            <w:r>
+              <w:rPr>
+                <w:rFonts w:ascii="Times New Roman" w:eastAsia="Times New Roman" w:hAnsi="Times New Roman" w:cs="Times New Roman"/>
+                <w:sz w:val="24"/>
+                <w:szCs w:val="24"/>
+              </w:rPr>
+              <w:t>Persistir la sesión entre recargas de página mediante localStorage.</w:t>
+            </w:r>
+          </w:p>
+        </w:tc>
+        <w:tc>
+          <w:tcPr>
+            <w:tcW w:w="1626" w:type="dxa"/>
+          </w:tcPr>
+          <w:p>
+            <w:pPr>
+              <w:jc w:val="both"/>
+              <w:rPr>
+                <w:rFonts w:ascii="Times New Roman" w:eastAsia="Times New Roman" w:hAnsi="Times New Roman" w:cs="Times New Roman"/>
+                <w:sz w:val="24"/>
+                <w:szCs w:val="24"/>
+              </w:rPr>
+            </w:pPr>
+            <w:r>
+              <w:rPr>
+                <w:rFonts w:ascii="Times New Roman" w:eastAsia="Times New Roman" w:hAnsi="Times New Roman" w:cs="Times New Roman"/>
+                <w:sz w:val="24"/>
+                <w:szCs w:val="24"/>
+              </w:rPr>
+              <w:t>Media</w:t>
+            </w:r>
+          </w:p>
+        </w:tc>
+        <w:tc>
+          <w:tcPr>
+            <w:tcW w:w="2195" w:type="dxa"/>
+          </w:tcPr>
+          <w:p>
+            <w:pPr>
+              <w:jc w:val="both"/>
+              <w:rPr>
+                <w:rFonts w:ascii="Times New Roman" w:eastAsia="Times New Roman" w:hAnsi="Times New Roman" w:cs="Times New Roman"/>
+                <w:sz w:val="24"/>
+                <w:szCs w:val="24"/>
+              </w:rPr>
+            </w:pPr>
+            <w:r>
+              <w:rPr>
+                <w:rFonts w:ascii="Times New Roman" w:eastAsia="Times New Roman" w:hAnsi="Times New Roman" w:cs="Times New Roman"/>
+                <w:sz w:val="24"/>
+                <w:szCs w:val="24"/>
+              </w:rPr>
+              <w:t>Implementado</w:t>
+            </w:r>
+          </w:p>
+        </w:tc>
+      </w:tr>
+      <w:tr>
+        <w:tc>
+          <w:tcPr>
+            <w:tcW w:w="1129" w:type="dxa"/>
+          </w:tcPr>
+          <w:p>
+            <w:pPr>
+              <w:jc w:val="both"/>
+              <w:rPr>
+                <w:rFonts w:ascii="Times New Roman" w:eastAsia="Times New Roman" w:hAnsi="Times New Roman" w:cs="Times New Roman"/>
+                <w:sz w:val="24"/>
+                <w:szCs w:val="24"/>
+              </w:rPr>
+            </w:pPr>
+            <w:r>
+              <w:rPr>
+                <w:rFonts w:ascii="Times New Roman" w:eastAsia="Times New Roman" w:hAnsi="Times New Roman" w:cs="Times New Roman"/>
+                <w:sz w:val="24"/>
+                <w:szCs w:val="24"/>
+              </w:rPr>
+              <w:t>RF-010</w:t>
+            </w:r>
+          </w:p>
+        </w:tc>
+        <w:tc>
+          <w:tcPr>
+            <w:tcW w:w="3828" w:type="dxa"/>
+          </w:tcPr>
+          <w:p>
+            <w:pPr>
+              <w:jc w:val="both"/>
+              <w:rPr>
+                <w:rFonts w:ascii="Times New Roman" w:eastAsia="Times New Roman" w:hAnsi="Times New Roman" w:cs="Times New Roman"/>
+                <w:sz w:val="24"/>
+                <w:szCs w:val="24"/>
+              </w:rPr>
+            </w:pPr>
+            <w:r>
+              <w:rPr>
+                <w:rFonts w:ascii="Times New Roman" w:eastAsia="Times New Roman" w:hAnsi="Times New Roman" w:cs="Times New Roman"/>
+                <w:sz w:val="24"/>
+                <w:szCs w:val="24"/>
+              </w:rPr>
+              <w:t>Permitir al usuario ver su información de perfil.</w:t>
+            </w:r>
+          </w:p>
+        </w:tc>
+        <w:tc>
+          <w:tcPr>
+            <w:tcW w:w="1626" w:type="dxa"/>
+          </w:tcPr>
+          <w:p>
+            <w:pPr>
+              <w:jc w:val="both"/>
+              <w:rPr>
+                <w:rFonts w:ascii="Times New Roman" w:eastAsia="Times New Roman" w:hAnsi="Times New Roman" w:cs="Times New Roman"/>
+                <w:sz w:val="24"/>
+                <w:szCs w:val="24"/>
+              </w:rPr>
+            </w:pPr>
+            <w:r>
+              <w:rPr>
+                <w:rFonts w:ascii="Times New Roman" w:eastAsia="Times New Roman" w:hAnsi="Times New Roman" w:cs="Times New Roman"/>
+                <w:sz w:val="24"/>
+                <w:szCs w:val="24"/>
+              </w:rPr>
+              <w:t>Media</w:t>
+            </w:r>
+          </w:p>
+        </w:tc>
+        <w:tc>
+          <w:tcPr>
+            <w:tcW w:w="2195" w:type="dxa"/>
+          </w:tcPr>
+          <w:p>
+            <w:pPr>
+              <w:jc w:val="both"/>
+              <w:rPr>
+                <w:rFonts w:ascii="Times New Roman" w:eastAsia="Times New Roman" w:hAnsi="Times New Roman" w:cs="Times New Roman"/>
+                <w:sz w:val="24"/>
+                <w:szCs w:val="24"/>
+              </w:rPr>
+            </w:pPr>
+            <w:r>
+              <w:rPr>
+                <w:rFonts w:ascii="Times New Roman" w:eastAsia="Times New Roman" w:hAnsi="Times New Roman" w:cs="Times New Roman"/>
+                <w:sz w:val="24"/>
+                <w:szCs w:val="24"/>
+              </w:rPr>
+              <w:t>Implementado</w:t>
+            </w:r>
+          </w:p>
+        </w:tc>
+      </w:tr>
+      <w:tr>
+        <w:tc>
+          <w:tcPr>
+            <w:tcW w:w="1129" w:type="dxa"/>
+          </w:tcPr>
+          <w:p>
+            <w:pPr>
+              <w:jc w:val="both"/>
+              <w:rPr>
+                <w:rFonts w:ascii="Times New Roman" w:eastAsia="Times New Roman" w:hAnsi="Times New Roman" w:cs="Times New Roman"/>
+                <w:sz w:val="24"/>
+                <w:szCs w:val="24"/>
+              </w:rPr>
+            </w:pPr>
+            <w:r>
+              <w:rPr>
+                <w:rFonts w:ascii="Times New Roman" w:eastAsia="Times New Roman" w:hAnsi="Times New Roman" w:cs="Times New Roman"/>
+                <w:sz w:val="24"/>
+                <w:szCs w:val="24"/>
+              </w:rPr>
+              <w:t>RF-011</w:t>
+            </w:r>
+          </w:p>
+        </w:tc>
+        <w:tc>
+          <w:tcPr>
+            <w:tcW w:w="3828" w:type="dxa"/>
+          </w:tcPr>
+          <w:p>
+            <w:pPr>
+              <w:jc w:val="both"/>
+              <w:rPr>
+                <w:rFonts w:ascii="Times New Roman" w:eastAsia="Times New Roman" w:hAnsi="Times New Roman" w:cs="Times New Roman"/>
+                <w:sz w:val="24"/>
+                <w:szCs w:val="24"/>
+              </w:rPr>
+            </w:pPr>
+            <w:r>
+              <w:rPr>
+                <w:rFonts w:ascii="Times New Roman" w:eastAsia="Times New Roman" w:hAnsi="Times New Roman" w:cs="Times New Roman"/>
+                <w:sz w:val="24"/>
+                <w:szCs w:val="24"/>
+              </w:rPr>
+              <w:t>Permitir al usuario modificar su nombre.</w:t>
+            </w:r>
+          </w:p>
+        </w:tc>
+        <w:tc>
+          <w:tcPr>
+            <w:tcW w:w="1626" w:type="dxa"/>
+          </w:tcPr>
+          <w:p>
+            <w:pPr>
+              <w:jc w:val="both"/>
+              <w:rPr>
+                <w:rFonts w:ascii="Times New Roman" w:eastAsia="Times New Roman" w:hAnsi="Times New Roman" w:cs="Times New Roman"/>
+                <w:sz w:val="24"/>
+                <w:szCs w:val="24"/>
+              </w:rPr>
+            </w:pPr>
+            <w:r>
+              <w:rPr>
+                <w:rFonts w:ascii="Times New Roman" w:eastAsia="Times New Roman" w:hAnsi="Times New Roman" w:cs="Times New Roman"/>
+                <w:sz w:val="24"/>
+                <w:szCs w:val="24"/>
+              </w:rPr>
+              <w:t>Media</w:t>
+            </w:r>
+          </w:p>
+        </w:tc>
+        <w:tc>
+          <w:tcPr>
+            <w:tcW w:w="2195" w:type="dxa"/>
+          </w:tcPr>
+          <w:p>
+            <w:pPr>
+              <w:jc w:val="both"/>
+              <w:rPr>
+                <w:rFonts w:ascii="Times New Roman" w:eastAsia="Times New Roman" w:hAnsi="Times New Roman" w:cs="Times New Roman"/>
+                <w:sz w:val="24"/>
+                <w:szCs w:val="24"/>
+              </w:rPr>
+            </w:pPr>
+            <w:r>
+              <w:rPr>
+                <w:rFonts w:ascii="Times New Roman" w:eastAsia="Times New Roman" w:hAnsi="Times New Roman" w:cs="Times New Roman"/>
+                <w:sz w:val="24"/>
+                <w:szCs w:val="24"/>
+              </w:rPr>
+              <w:t>Implementado</w:t>
+            </w:r>
+          </w:p>
+        </w:tc>
+      </w:tr>
+      <w:tr>
+        <w:tc>
+          <w:tcPr>
+            <w:tcW w:w="1129" w:type="dxa"/>
+          </w:tcPr>
+          <w:p>
+            <w:pPr>
+              <w:jc w:val="both"/>
+              <w:rPr>
+                <w:rFonts w:ascii="Times New Roman" w:eastAsia="Times New Roman" w:hAnsi="Times New Roman" w:cs="Times New Roman"/>
+                <w:sz w:val="24"/>
+                <w:szCs w:val="24"/>
+              </w:rPr>
+            </w:pPr>
+            <w:r>
+              <w:rPr>
+                <w:rFonts w:ascii="Times New Roman" w:eastAsia="Times New Roman" w:hAnsi="Times New Roman" w:cs="Times New Roman"/>
+                <w:sz w:val="24"/>
+                <w:szCs w:val="24"/>
+              </w:rPr>
+              <w:t>RF-012</w:t>
+            </w:r>
+          </w:p>
+        </w:tc>
+        <w:tc>
+          <w:tcPr>
+            <w:tcW w:w="3828" w:type="dxa"/>
+          </w:tcPr>
+          <w:p>
+            <w:pPr>
+              <w:jc w:val="both"/>
+              <w:rPr>
+                <w:rFonts w:ascii="Times New Roman" w:eastAsia="Times New Roman" w:hAnsi="Times New Roman" w:cs="Times New Roman"/>
+                <w:sz w:val="24"/>
+                <w:szCs w:val="24"/>
+              </w:rPr>
+            </w:pPr>
+            <w:r>
+              <w:rPr>
+                <w:rFonts w:ascii="Times New Roman" w:eastAsia="Times New Roman" w:hAnsi="Times New Roman" w:cs="Times New Roman"/>
+                <w:sz w:val="24"/>
+                <w:szCs w:val="24"/>
+              </w:rPr>
+              <w:t>Permitir al usuario cambiar su contraseña, verificando la contraseña actual.</w:t>
+            </w:r>
+          </w:p>
+        </w:tc>
+        <w:tc>
+          <w:tcPr>
+            <w:tcW w:w="1626" w:type="dxa"/>
+          </w:tcPr>
+          <w:p>
+            <w:pPr>
+              <w:jc w:val="both"/>
+              <w:rPr>
+                <w:rFonts w:ascii="Times New Roman" w:eastAsia="Times New Roman" w:hAnsi="Times New Roman" w:cs="Times New Roman"/>
+                <w:sz w:val="24"/>
+                <w:szCs w:val="24"/>
+              </w:rPr>
+            </w:pPr>
+            <w:r>
+              <w:rPr>
+                <w:rFonts w:ascii="Times New Roman" w:eastAsia="Times New Roman" w:hAnsi="Times New Roman" w:cs="Times New Roman"/>
+                <w:sz w:val="24"/>
+                <w:szCs w:val="24"/>
+              </w:rPr>
+              <w:t>Media</w:t>
+            </w:r>
+          </w:p>
+        </w:tc>
+        <w:tc>
+          <w:tcPr>
+            <w:tcW w:w="2195" w:type="dxa"/>
+          </w:tcPr>
+          <w:p>
+            <w:pPr>
+              <w:jc w:val="both"/>
+              <w:rPr>
+                <w:rFonts w:ascii="Times New Roman" w:eastAsia="Times New Roman" w:hAnsi="Times New Roman" w:cs="Times New Roman"/>
+                <w:sz w:val="24"/>
+                <w:szCs w:val="24"/>
+              </w:rPr>
+            </w:pPr>
+            <w:r>
+              <w:rPr>
+                <w:rFonts w:ascii="Times New Roman" w:eastAsia="Times New Roman" w:hAnsi="Times New Roman" w:cs="Times New Roman"/>
+                <w:sz w:val="24"/>
+                <w:szCs w:val="24"/>
+              </w:rPr>
+              <w:t>Implementado</w:t>
+            </w:r>
+          </w:p>
+        </w:tc>
+      </w:tr>
+      <w:tr>
+        <w:tc>
+          <w:tcPr>
+            <w:tcW w:w="1129" w:type="dxa"/>
+          </w:tcPr>
+          <w:p>
+            <w:pPr>
+              <w:jc w:val="both"/>
+              <w:rPr>
+                <w:rFonts w:ascii="Times New Roman" w:eastAsia="Times New Roman" w:hAnsi="Times New Roman" w:cs="Times New Roman"/>
+                <w:sz w:val="24"/>
+                <w:szCs w:val="24"/>
+              </w:rPr>
+            </w:pPr>
+            <w:r>
+              <w:rPr>
+                <w:rFonts w:ascii="Times New Roman" w:eastAsia="Times New Roman" w:hAnsi="Times New Roman" w:cs="Times New Roman"/>
+                <w:sz w:val="24"/>
+                <w:szCs w:val="24"/>
+              </w:rPr>
+              <w:t>RF-013</w:t>
+            </w:r>
+          </w:p>
+        </w:tc>
+        <w:tc>
+          <w:tcPr>
+            <w:tcW w:w="3828" w:type="dxa"/>
+          </w:tcPr>
+          <w:p>
+            <w:pPr>
+              <w:jc w:val="both"/>
+              <w:rPr>
+                <w:rFonts w:ascii="Times New Roman" w:eastAsia="Times New Roman" w:hAnsi="Times New Roman" w:cs="Times New Roman"/>
+                <w:sz w:val="24"/>
+                <w:szCs w:val="24"/>
+              </w:rPr>
+            </w:pPr>
+            <w:r>
+              <w:rPr>
+                <w:rFonts w:ascii="Times New Roman" w:eastAsia="Times New Roman" w:hAnsi="Times New Roman" w:cs="Times New Roman"/>
+                <w:sz w:val="24"/>
+                <w:szCs w:val="24"/>
+              </w:rPr>
+              <w:t>Validar que la nueva contraseña tenga al menos 6 caracteres.</w:t>
+            </w:r>
+          </w:p>
+        </w:tc>
+        <w:tc>
+          <w:tcPr>
+            <w:tcW w:w="1626" w:type="dxa"/>
+          </w:tcPr>
+          <w:p>
+            <w:pPr>
+              <w:jc w:val="both"/>
+              <w:rPr>
+                <w:rFonts w:ascii="Times New Roman" w:eastAsia="Times New Roman" w:hAnsi="Times New Roman" w:cs="Times New Roman"/>
+                <w:sz w:val="24"/>
+                <w:szCs w:val="24"/>
+              </w:rPr>
+            </w:pPr>
+            <w:r>
+              <w:rPr>
+                <w:rFonts w:ascii="Times New Roman" w:eastAsia="Times New Roman" w:hAnsi="Times New Roman" w:cs="Times New Roman"/>
+                <w:sz w:val="24"/>
+                <w:szCs w:val="24"/>
+              </w:rPr>
+              <w:t>Media</w:t>
+            </w:r>
+          </w:p>
+        </w:tc>
+        <w:tc>
+          <w:tcPr>
+            <w:tcW w:w="2195" w:type="dxa"/>
+          </w:tcPr>
+          <w:p>
+            <w:pPr>
+              <w:jc w:val="both"/>
+              <w:rPr>
+                <w:rFonts w:ascii="Times New Roman" w:eastAsia="Times New Roman" w:hAnsi="Times New Roman" w:cs="Times New Roman"/>
+                <w:sz w:val="24"/>
+                <w:szCs w:val="24"/>
+              </w:rPr>
+            </w:pPr>
+            <w:r>
+              <w:rPr>
+                <w:rFonts w:ascii="Times New Roman" w:eastAsia="Times New Roman" w:hAnsi="Times New Roman" w:cs="Times New Roman"/>
+                <w:sz w:val="24"/>
+                <w:szCs w:val="24"/>
+              </w:rPr>
+              <w:t>Implementado</w:t>
+            </w:r>
+          </w:p>
+        </w:tc>
+      </w:tr>
+      <w:tr>
+        <w:tc>
+          <w:tcPr>
+            <w:tcW w:w="1129" w:type="dxa"/>
+          </w:tcPr>
+          <w:p>
+            <w:pPr>
+              <w:jc w:val="both"/>
+              <w:rPr>
+                <w:rFonts w:ascii="Times New Roman" w:eastAsia="Times New Roman" w:hAnsi="Times New Roman" w:cs="Times New Roman"/>
+                <w:sz w:val="24"/>
+                <w:szCs w:val="24"/>
+              </w:rPr>
+            </w:pPr>
+            <w:r>
+              <w:rPr>
+                <w:rFonts w:ascii="Times New Roman" w:eastAsia="Times New Roman" w:hAnsi="Times New Roman" w:cs="Times New Roman"/>
+                <w:sz w:val="24"/>
+                <w:szCs w:val="24"/>
+              </w:rPr>
+              <w:t>RF-014</w:t>
+            </w:r>
+          </w:p>
+        </w:tc>
+        <w:tc>
+          <w:tcPr>
+            <w:tcW w:w="3828" w:type="dxa"/>
+          </w:tcPr>
+          <w:p>
+            <w:pPr>
+              <w:jc w:val="both"/>
+              <w:rPr>
+                <w:rFonts w:ascii="Times New Roman" w:eastAsia="Times New Roman" w:hAnsi="Times New Roman" w:cs="Times New Roman"/>
+                <w:sz w:val="24"/>
+                <w:szCs w:val="24"/>
+              </w:rPr>
+            </w:pPr>
+            <w:r>
+              <w:rPr>
+                <w:rFonts w:ascii="Times New Roman" w:eastAsia="Times New Roman" w:hAnsi="Times New Roman" w:cs="Times New Roman"/>
+                <w:sz w:val="24"/>
+                <w:szCs w:val="24"/>
+              </w:rPr>
+              <w:t>Permitir al usuario crear un hogar con nombre y descripción opcional.</w:t>
+            </w:r>
+          </w:p>
+        </w:tc>
+        <w:tc>
+          <w:tcPr>
+            <w:tcW w:w="1626" w:type="dxa"/>
+          </w:tcPr>
+          <w:p>
+            <w:pPr>
+              <w:jc w:val="both"/>
+              <w:rPr>
+                <w:rFonts w:ascii="Times New Roman" w:eastAsia="Times New Roman" w:hAnsi="Times New Roman" w:cs="Times New Roman"/>
+                <w:sz w:val="24"/>
+                <w:szCs w:val="24"/>
+              </w:rPr>
+            </w:pPr>
+            <w:r>
+              <w:rPr>
+                <w:rFonts w:ascii="Times New Roman" w:eastAsia="Times New Roman" w:hAnsi="Times New Roman" w:cs="Times New Roman"/>
+                <w:sz w:val="24"/>
+                <w:szCs w:val="24"/>
+              </w:rPr>
+              <w:t>Alta</w:t>
+            </w:r>
+          </w:p>
+        </w:tc>
+        <w:tc>
+          <w:tcPr>
+            <w:tcW w:w="2195" w:type="dxa"/>
+          </w:tcPr>
+          <w:p>
+            <w:pPr>
+              <w:jc w:val="both"/>
+              <w:rPr>
+                <w:rFonts w:ascii="Times New Roman" w:eastAsia="Times New Roman" w:hAnsi="Times New Roman" w:cs="Times New Roman"/>
+                <w:sz w:val="24"/>
+                <w:szCs w:val="24"/>
+              </w:rPr>
+            </w:pPr>
+            <w:r>
+              <w:rPr>
+                <w:rFonts w:ascii="Times New Roman" w:eastAsia="Times New Roman" w:hAnsi="Times New Roman" w:cs="Times New Roman"/>
+                <w:sz w:val="24"/>
+                <w:szCs w:val="24"/>
+              </w:rPr>
+              <w:t>Implementado</w:t>
+            </w:r>
+          </w:p>
+        </w:tc>
+      </w:tr>
+      <w:tr>
+        <w:tc>
+          <w:tcPr>
+            <w:tcW w:w="1129" w:type="dxa"/>
+          </w:tcPr>
+          <w:p>
+            <w:pPr>
+              <w:jc w:val="both"/>
+              <w:rPr>
+                <w:rFonts w:ascii="Times New Roman" w:eastAsia="Times New Roman" w:hAnsi="Times New Roman" w:cs="Times New Roman"/>
+                <w:sz w:val="24"/>
+                <w:szCs w:val="24"/>
+              </w:rPr>
+            </w:pPr>
+            <w:r>
+              <w:rPr>
+                <w:rFonts w:ascii="Times New Roman" w:eastAsia="Times New Roman" w:hAnsi="Times New Roman" w:cs="Times New Roman"/>
+                <w:sz w:val="24"/>
+                <w:szCs w:val="24"/>
+              </w:rPr>
+              <w:t>RF-015</w:t>
+            </w:r>
+          </w:p>
+        </w:tc>
+        <w:tc>
+          <w:tcPr>
+            <w:tcW w:w="3828" w:type="dxa"/>
+          </w:tcPr>
+          <w:p>
+            <w:pPr>
+              <w:jc w:val="both"/>
+              <w:rPr>
+                <w:rFonts w:ascii="Times New Roman" w:eastAsia="Times New Roman" w:hAnsi="Times New Roman" w:cs="Times New Roman"/>
+                <w:sz w:val="24"/>
+                <w:szCs w:val="24"/>
+              </w:rPr>
+            </w:pPr>
+            <w:r>
+              <w:rPr>
+                <w:rFonts w:ascii="Times New Roman" w:eastAsia="Times New Roman" w:hAnsi="Times New Roman" w:cs="Times New Roman"/>
+                <w:sz w:val="24"/>
+                <w:szCs w:val="24"/>
+              </w:rPr>
+              <w:t>Permitir al usuario ver la lista de hogares a los que pertenece.</w:t>
+            </w:r>
+          </w:p>
+        </w:tc>
+        <w:tc>
+          <w:tcPr>
+            <w:tcW w:w="1626" w:type="dxa"/>
+          </w:tcPr>
+          <w:p>
+            <w:pPr>
+              <w:jc w:val="both"/>
+              <w:rPr>
+                <w:rFonts w:ascii="Times New Roman" w:eastAsia="Times New Roman" w:hAnsi="Times New Roman" w:cs="Times New Roman"/>
+                <w:sz w:val="24"/>
+                <w:szCs w:val="24"/>
+              </w:rPr>
+            </w:pPr>
+            <w:r>
+              <w:rPr>
+                <w:rFonts w:ascii="Times New Roman" w:eastAsia="Times New Roman" w:hAnsi="Times New Roman" w:cs="Times New Roman"/>
+                <w:sz w:val="24"/>
+                <w:szCs w:val="24"/>
+              </w:rPr>
+              <w:t>Alta</w:t>
+            </w:r>
+          </w:p>
+        </w:tc>
+        <w:tc>
+          <w:tcPr>
+            <w:tcW w:w="2195" w:type="dxa"/>
+          </w:tcPr>
+          <w:p>
+            <w:pPr>
+              <w:jc w:val="both"/>
+              <w:rPr>
+                <w:rFonts w:ascii="Times New Roman" w:eastAsia="Times New Roman" w:hAnsi="Times New Roman" w:cs="Times New Roman"/>
+                <w:sz w:val="24"/>
+                <w:szCs w:val="24"/>
+              </w:rPr>
+            </w:pPr>
+            <w:r>
+              <w:rPr>
+                <w:rFonts w:ascii="Times New Roman" w:eastAsia="Times New Roman" w:hAnsi="Times New Roman" w:cs="Times New Roman"/>
+                <w:sz w:val="24"/>
+                <w:szCs w:val="24"/>
+              </w:rPr>
+              <w:t>Implementado</w:t>
+            </w:r>
+          </w:p>
+        </w:tc>
+      </w:tr>
+      <w:tr>
+        <w:tc>
+          <w:tcPr>
+            <w:tcW w:w="1129" w:type="dxa"/>
+          </w:tcPr>
+          <w:p>
+            <w:pPr>
+              <w:jc w:val="both"/>
+              <w:rPr>
+                <w:rFonts w:ascii="Times New Roman" w:eastAsia="Times New Roman" w:hAnsi="Times New Roman" w:cs="Times New Roman"/>
+                <w:sz w:val="24"/>
+                <w:szCs w:val="24"/>
+              </w:rPr>
+            </w:pPr>
+            <w:r>
+              <w:rPr>
+                <w:rFonts w:ascii="Times New Roman" w:eastAsia="Times New Roman" w:hAnsi="Times New Roman" w:cs="Times New Roman"/>
+                <w:sz w:val="24"/>
+                <w:szCs w:val="24"/>
+              </w:rPr>
+              <w:t>RF-016</w:t>
+            </w:r>
+          </w:p>
+        </w:tc>
+        <w:tc>
+          <w:tcPr>
+            <w:tcW w:w="3828" w:type="dxa"/>
+          </w:tcPr>
+          <w:p>
+            <w:pPr>
+              <w:jc w:val="both"/>
+              <w:rPr>
+                <w:rFonts w:ascii="Times New Roman" w:eastAsia="Times New Roman" w:hAnsi="Times New Roman" w:cs="Times New Roman"/>
+                <w:sz w:val="24"/>
+                <w:szCs w:val="24"/>
+              </w:rPr>
+            </w:pPr>
+            <w:r>
+              <w:rPr>
+                <w:rFonts w:ascii="Times New Roman" w:eastAsia="Times New Roman" w:hAnsi="Times New Roman" w:cs="Times New Roman"/>
+                <w:sz w:val="24"/>
+                <w:szCs w:val="24"/>
+              </w:rPr>
+              <w:t>Permitir al propietario o administrador editar los datos de un hogar.</w:t>
+            </w:r>
+          </w:p>
+        </w:tc>
+        <w:tc>
+          <w:tcPr>
+            <w:tcW w:w="1626" w:type="dxa"/>
+          </w:tcPr>
+          <w:p>
+            <w:pPr>
+              <w:jc w:val="both"/>
+              <w:rPr>
+                <w:rFonts w:ascii="Times New Roman" w:eastAsia="Times New Roman" w:hAnsi="Times New Roman" w:cs="Times New Roman"/>
+                <w:sz w:val="24"/>
+                <w:szCs w:val="24"/>
+              </w:rPr>
+            </w:pPr>
+            <w:r>
+              <w:rPr>
+                <w:rFonts w:ascii="Times New Roman" w:eastAsia="Times New Roman" w:hAnsi="Times New Roman" w:cs="Times New Roman"/>
+                <w:sz w:val="24"/>
+                <w:szCs w:val="24"/>
+              </w:rPr>
+              <w:t>Alta</w:t>
+            </w:r>
+          </w:p>
+        </w:tc>
+        <w:tc>
+          <w:tcPr>
+            <w:tcW w:w="2195" w:type="dxa"/>
+          </w:tcPr>
+          <w:p>
+            <w:pPr>
+              <w:jc w:val="both"/>
+              <w:rPr>
+                <w:rFonts w:ascii="Times New Roman" w:eastAsia="Times New Roman" w:hAnsi="Times New Roman" w:cs="Times New Roman"/>
+                <w:sz w:val="24"/>
+                <w:szCs w:val="24"/>
+              </w:rPr>
+            </w:pPr>
+            <w:r>
+              <w:rPr>
+                <w:rFonts w:ascii="Times New Roman" w:eastAsia="Times New Roman" w:hAnsi="Times New Roman" w:cs="Times New Roman"/>
+                <w:sz w:val="24"/>
+                <w:szCs w:val="24"/>
+              </w:rPr>
+              <w:t>Implementado</w:t>
+            </w:r>
+          </w:p>
+        </w:tc>
+      </w:tr>
+      <w:tr>
+        <w:tc>
+          <w:tcPr>
+            <w:tcW w:w="1129" w:type="dxa"/>
+          </w:tcPr>
+          <w:p>
+            <w:pPr>
+              <w:jc w:val="both"/>
+              <w:rPr>
+                <w:rFonts w:ascii="Times New Roman" w:eastAsia="Times New Roman" w:hAnsi="Times New Roman" w:cs="Times New Roman"/>
+                <w:sz w:val="24"/>
+                <w:szCs w:val="24"/>
+              </w:rPr>
+            </w:pPr>
+            <w:r>
+              <w:rPr>
+                <w:rFonts w:ascii="Times New Roman" w:eastAsia="Times New Roman" w:hAnsi="Times New Roman" w:cs="Times New Roman"/>
+                <w:sz w:val="24"/>
+                <w:szCs w:val="24"/>
+              </w:rPr>
+              <w:lastRenderedPageBreak/>
+              <w:t>RF-017</w:t>
+            </w:r>
+          </w:p>
+        </w:tc>
+        <w:tc>
+          <w:tcPr>
+            <w:tcW w:w="3828" w:type="dxa"/>
+          </w:tcPr>
+          <w:p>
+            <w:pPr>
+              <w:jc w:val="both"/>
+              <w:rPr>
+                <w:rFonts w:ascii="Times New Roman" w:eastAsia="Times New Roman" w:hAnsi="Times New Roman" w:cs="Times New Roman"/>
+                <w:sz w:val="24"/>
+                <w:szCs w:val="24"/>
+              </w:rPr>
+            </w:pPr>
+            <w:r>
+              <w:rPr>
+                <w:rFonts w:ascii="Times New Roman" w:eastAsia="Times New Roman" w:hAnsi="Times New Roman" w:cs="Times New Roman"/>
+                <w:sz w:val="24"/>
+                <w:szCs w:val="24"/>
+              </w:rPr>
+              <w:t>Permitir al propietario eliminar un hogar.</w:t>
+            </w:r>
+          </w:p>
+        </w:tc>
+        <w:tc>
+          <w:tcPr>
+            <w:tcW w:w="1626" w:type="dxa"/>
+          </w:tcPr>
+          <w:p>
+            <w:pPr>
+              <w:jc w:val="both"/>
+              <w:rPr>
+                <w:rFonts w:ascii="Times New Roman" w:eastAsia="Times New Roman" w:hAnsi="Times New Roman" w:cs="Times New Roman"/>
+                <w:sz w:val="24"/>
+                <w:szCs w:val="24"/>
+              </w:rPr>
+            </w:pPr>
+            <w:r>
+              <w:rPr>
+                <w:rFonts w:ascii="Times New Roman" w:eastAsia="Times New Roman" w:hAnsi="Times New Roman" w:cs="Times New Roman"/>
+                <w:sz w:val="24"/>
+                <w:szCs w:val="24"/>
+              </w:rPr>
+              <w:t>Alta</w:t>
+            </w:r>
+          </w:p>
+        </w:tc>
+        <w:tc>
+          <w:tcPr>
+            <w:tcW w:w="2195" w:type="dxa"/>
+          </w:tcPr>
+          <w:p>
+            <w:pPr>
+              <w:jc w:val="both"/>
+              <w:rPr>
+                <w:rFonts w:ascii="Times New Roman" w:eastAsia="Times New Roman" w:hAnsi="Times New Roman" w:cs="Times New Roman"/>
+                <w:sz w:val="24"/>
+                <w:szCs w:val="24"/>
+              </w:rPr>
+            </w:pPr>
+            <w:r>
+              <w:rPr>
+                <w:rFonts w:ascii="Times New Roman" w:eastAsia="Times New Roman" w:hAnsi="Times New Roman" w:cs="Times New Roman"/>
+                <w:sz w:val="24"/>
+                <w:szCs w:val="24"/>
+              </w:rPr>
+              <w:t>Implementado</w:t>
+            </w:r>
+          </w:p>
+        </w:tc>
+      </w:tr>
+      <w:tr>
+        <w:tc>
+          <w:tcPr>
+            <w:tcW w:w="1129" w:type="dxa"/>
+          </w:tcPr>
+          <w:p>
+            <w:pPr>
+              <w:jc w:val="both"/>
+              <w:rPr>
+                <w:rFonts w:ascii="Times New Roman" w:eastAsia="Times New Roman" w:hAnsi="Times New Roman" w:cs="Times New Roman"/>
+                <w:sz w:val="24"/>
+                <w:szCs w:val="24"/>
+              </w:rPr>
+            </w:pPr>
+            <w:r>
+              <w:rPr>
+                <w:rFonts w:ascii="Times New Roman" w:eastAsia="Times New Roman" w:hAnsi="Times New Roman" w:cs="Times New Roman"/>
+                <w:sz w:val="24"/>
+                <w:szCs w:val="24"/>
+              </w:rPr>
+              <w:t>RF-018</w:t>
+            </w:r>
+          </w:p>
+        </w:tc>
+        <w:tc>
+          <w:tcPr>
+            <w:tcW w:w="3828" w:type="dxa"/>
+          </w:tcPr>
+          <w:p>
+            <w:pPr>
+              <w:jc w:val="both"/>
+              <w:rPr>
+                <w:rFonts w:ascii="Times New Roman" w:eastAsia="Times New Roman" w:hAnsi="Times New Roman" w:cs="Times New Roman"/>
+                <w:sz w:val="24"/>
+                <w:szCs w:val="24"/>
+              </w:rPr>
+            </w:pPr>
+            <w:r>
+              <w:rPr>
+                <w:rFonts w:ascii="Times New Roman" w:eastAsia="Times New Roman" w:hAnsi="Times New Roman" w:cs="Times New Roman"/>
+                <w:sz w:val="24"/>
+                <w:szCs w:val="24"/>
+              </w:rPr>
+              <w:t>Mostrar los miembros de un hogar con su nombre, email y rol.</w:t>
+            </w:r>
+          </w:p>
+        </w:tc>
+        <w:tc>
+          <w:tcPr>
+            <w:tcW w:w="1626" w:type="dxa"/>
+          </w:tcPr>
+          <w:p>
+            <w:pPr>
+              <w:jc w:val="both"/>
+              <w:rPr>
+                <w:rFonts w:ascii="Times New Roman" w:eastAsia="Times New Roman" w:hAnsi="Times New Roman" w:cs="Times New Roman"/>
+                <w:sz w:val="24"/>
+                <w:szCs w:val="24"/>
+              </w:rPr>
+            </w:pPr>
+            <w:r>
+              <w:rPr>
+                <w:rFonts w:ascii="Times New Roman" w:eastAsia="Times New Roman" w:hAnsi="Times New Roman" w:cs="Times New Roman"/>
+                <w:sz w:val="24"/>
+                <w:szCs w:val="24"/>
+              </w:rPr>
+              <w:t>Alta</w:t>
+            </w:r>
+          </w:p>
+        </w:tc>
+        <w:tc>
+          <w:tcPr>
+            <w:tcW w:w="2195" w:type="dxa"/>
+          </w:tcPr>
+          <w:p>
+            <w:pPr>
+              <w:jc w:val="both"/>
+              <w:rPr>
+                <w:rFonts w:ascii="Times New Roman" w:eastAsia="Times New Roman" w:hAnsi="Times New Roman" w:cs="Times New Roman"/>
+                <w:sz w:val="24"/>
+                <w:szCs w:val="24"/>
+              </w:rPr>
+            </w:pPr>
+            <w:r>
+              <w:rPr>
+                <w:rFonts w:ascii="Times New Roman" w:eastAsia="Times New Roman" w:hAnsi="Times New Roman" w:cs="Times New Roman"/>
+                <w:sz w:val="24"/>
+                <w:szCs w:val="24"/>
+              </w:rPr>
+              <w:t>Implementado</w:t>
+            </w:r>
+          </w:p>
+        </w:tc>
+      </w:tr>
+      <w:tr>
+        <w:tc>
+          <w:tcPr>
+            <w:tcW w:w="1129" w:type="dxa"/>
+          </w:tcPr>
+          <w:p>
+            <w:pPr>
+              <w:jc w:val="both"/>
+              <w:rPr>
+                <w:rFonts w:ascii="Times New Roman" w:eastAsia="Times New Roman" w:hAnsi="Times New Roman" w:cs="Times New Roman"/>
+                <w:sz w:val="24"/>
+                <w:szCs w:val="24"/>
+              </w:rPr>
+            </w:pPr>
+            <w:r>
+              <w:rPr>
+                <w:rFonts w:ascii="Times New Roman" w:eastAsia="Times New Roman" w:hAnsi="Times New Roman" w:cs="Times New Roman"/>
+                <w:sz w:val="24"/>
+                <w:szCs w:val="24"/>
+              </w:rPr>
+              <w:t>RF-019</w:t>
+            </w:r>
+          </w:p>
+        </w:tc>
+        <w:tc>
+          <w:tcPr>
+            <w:tcW w:w="3828" w:type="dxa"/>
+          </w:tcPr>
+          <w:p>
+            <w:pPr>
+              <w:jc w:val="both"/>
+              <w:rPr>
+                <w:rFonts w:ascii="Times New Roman" w:eastAsia="Times New Roman" w:hAnsi="Times New Roman" w:cs="Times New Roman"/>
+                <w:sz w:val="24"/>
+                <w:szCs w:val="24"/>
+              </w:rPr>
+            </w:pPr>
+            <w:r>
+              <w:rPr>
+                <w:rFonts w:ascii="Times New Roman" w:eastAsia="Times New Roman" w:hAnsi="Times New Roman" w:cs="Times New Roman"/>
+                <w:sz w:val="24"/>
+                <w:szCs w:val="24"/>
+              </w:rPr>
+              <w:t>Permitir al propietario o administrador invitar a otros usuarios al hogar por email.</w:t>
+            </w:r>
+          </w:p>
+        </w:tc>
+        <w:tc>
+          <w:tcPr>
+            <w:tcW w:w="1626" w:type="dxa"/>
+          </w:tcPr>
+          <w:p>
+            <w:pPr>
+              <w:jc w:val="both"/>
+              <w:rPr>
+                <w:rFonts w:ascii="Times New Roman" w:eastAsia="Times New Roman" w:hAnsi="Times New Roman" w:cs="Times New Roman"/>
+                <w:sz w:val="24"/>
+                <w:szCs w:val="24"/>
+              </w:rPr>
+            </w:pPr>
+            <w:r>
+              <w:rPr>
+                <w:rFonts w:ascii="Times New Roman" w:eastAsia="Times New Roman" w:hAnsi="Times New Roman" w:cs="Times New Roman"/>
+                <w:sz w:val="24"/>
+                <w:szCs w:val="24"/>
+              </w:rPr>
+              <w:t>Alta</w:t>
+            </w:r>
+          </w:p>
+        </w:tc>
+        <w:tc>
+          <w:tcPr>
+            <w:tcW w:w="2195" w:type="dxa"/>
+          </w:tcPr>
+          <w:p>
+            <w:pPr>
+              <w:jc w:val="both"/>
+              <w:rPr>
+                <w:rFonts w:ascii="Times New Roman" w:eastAsia="Times New Roman" w:hAnsi="Times New Roman" w:cs="Times New Roman"/>
+                <w:sz w:val="24"/>
+                <w:szCs w:val="24"/>
+              </w:rPr>
+            </w:pPr>
+            <w:r>
+              <w:rPr>
+                <w:rFonts w:ascii="Times New Roman" w:eastAsia="Times New Roman" w:hAnsi="Times New Roman" w:cs="Times New Roman"/>
+                <w:sz w:val="24"/>
+                <w:szCs w:val="24"/>
+              </w:rPr>
+              <w:t>Implementado</w:t>
+            </w:r>
+          </w:p>
+        </w:tc>
+      </w:tr>
+      <w:tr>
+        <w:tc>
+          <w:tcPr>
+            <w:tcW w:w="1129" w:type="dxa"/>
+          </w:tcPr>
+          <w:p>
+            <w:pPr>
+              <w:jc w:val="both"/>
+              <w:rPr>
+                <w:rFonts w:ascii="Times New Roman" w:eastAsia="Times New Roman" w:hAnsi="Times New Roman" w:cs="Times New Roman"/>
+                <w:sz w:val="24"/>
+                <w:szCs w:val="24"/>
+              </w:rPr>
+            </w:pPr>
+            <w:r>
+              <w:rPr>
+                <w:rFonts w:ascii="Times New Roman" w:eastAsia="Times New Roman" w:hAnsi="Times New Roman" w:cs="Times New Roman"/>
+                <w:sz w:val="24"/>
+                <w:szCs w:val="24"/>
+              </w:rPr>
+              <w:t>RF-020</w:t>
+            </w:r>
+          </w:p>
+        </w:tc>
+        <w:tc>
+          <w:tcPr>
+            <w:tcW w:w="3828" w:type="dxa"/>
+          </w:tcPr>
+          <w:p>
+            <w:pPr>
+              <w:jc w:val="both"/>
+              <w:rPr>
+                <w:rFonts w:ascii="Times New Roman" w:eastAsia="Times New Roman" w:hAnsi="Times New Roman" w:cs="Times New Roman"/>
+                <w:sz w:val="24"/>
+                <w:szCs w:val="24"/>
+              </w:rPr>
+            </w:pPr>
+            <w:r>
+              <w:rPr>
+                <w:rFonts w:ascii="Times New Roman" w:eastAsia="Times New Roman" w:hAnsi="Times New Roman" w:cs="Times New Roman"/>
+                <w:sz w:val="24"/>
+                <w:szCs w:val="24"/>
+              </w:rPr>
+              <w:t>Permitir seleccionar el rol ofrecido al invitar (ADMIN o MEMBER).</w:t>
+            </w:r>
+          </w:p>
+        </w:tc>
+        <w:tc>
+          <w:tcPr>
+            <w:tcW w:w="1626" w:type="dxa"/>
+          </w:tcPr>
+          <w:p>
+            <w:pPr>
+              <w:jc w:val="both"/>
+              <w:rPr>
+                <w:rFonts w:ascii="Times New Roman" w:eastAsia="Times New Roman" w:hAnsi="Times New Roman" w:cs="Times New Roman"/>
+                <w:sz w:val="24"/>
+                <w:szCs w:val="24"/>
+              </w:rPr>
+            </w:pPr>
+            <w:r>
+              <w:rPr>
+                <w:rFonts w:ascii="Times New Roman" w:eastAsia="Times New Roman" w:hAnsi="Times New Roman" w:cs="Times New Roman"/>
+                <w:sz w:val="24"/>
+                <w:szCs w:val="24"/>
+              </w:rPr>
+              <w:t>Media</w:t>
+            </w:r>
+          </w:p>
+        </w:tc>
+        <w:tc>
+          <w:tcPr>
+            <w:tcW w:w="2195" w:type="dxa"/>
+          </w:tcPr>
+          <w:p>
+            <w:pPr>
+              <w:jc w:val="both"/>
+              <w:rPr>
+                <w:rFonts w:ascii="Times New Roman" w:eastAsia="Times New Roman" w:hAnsi="Times New Roman" w:cs="Times New Roman"/>
+                <w:sz w:val="24"/>
+                <w:szCs w:val="24"/>
+              </w:rPr>
+            </w:pPr>
+            <w:r>
+              <w:rPr>
+                <w:rFonts w:ascii="Times New Roman" w:eastAsia="Times New Roman" w:hAnsi="Times New Roman" w:cs="Times New Roman"/>
+                <w:sz w:val="24"/>
+                <w:szCs w:val="24"/>
+              </w:rPr>
+              <w:t>Implementado</w:t>
+            </w:r>
+          </w:p>
+        </w:tc>
+      </w:tr>
+      <w:tr>
+        <w:tc>
+          <w:tcPr>
+            <w:tcW w:w="1129" w:type="dxa"/>
+          </w:tcPr>
+          <w:p>
+            <w:pPr>
+              <w:jc w:val="both"/>
+              <w:rPr>
+                <w:rFonts w:ascii="Times New Roman" w:eastAsia="Times New Roman" w:hAnsi="Times New Roman" w:cs="Times New Roman"/>
+                <w:sz w:val="24"/>
+                <w:szCs w:val="24"/>
+              </w:rPr>
+            </w:pPr>
+            <w:r>
+              <w:rPr>
+                <w:rFonts w:ascii="Times New Roman" w:eastAsia="Times New Roman" w:hAnsi="Times New Roman" w:cs="Times New Roman"/>
+                <w:sz w:val="24"/>
+                <w:szCs w:val="24"/>
+              </w:rPr>
+              <w:t>RF-021</w:t>
+            </w:r>
+          </w:p>
+        </w:tc>
+        <w:tc>
+          <w:tcPr>
+            <w:tcW w:w="3828" w:type="dxa"/>
+          </w:tcPr>
+          <w:p>
+            <w:pPr>
+              <w:jc w:val="both"/>
+              <w:rPr>
+                <w:rFonts w:ascii="Times New Roman" w:eastAsia="Times New Roman" w:hAnsi="Times New Roman" w:cs="Times New Roman"/>
+                <w:sz w:val="24"/>
+                <w:szCs w:val="24"/>
+              </w:rPr>
+            </w:pPr>
+            <w:r>
+              <w:rPr>
+                <w:rFonts w:ascii="Times New Roman" w:eastAsia="Times New Roman" w:hAnsi="Times New Roman" w:cs="Times New Roman"/>
+                <w:sz w:val="24"/>
+                <w:szCs w:val="24"/>
+              </w:rPr>
+              <w:t>Permitir añadir un mensaje personalizado a la invitación.</w:t>
+            </w:r>
+          </w:p>
+        </w:tc>
+        <w:tc>
+          <w:tcPr>
+            <w:tcW w:w="1626" w:type="dxa"/>
+          </w:tcPr>
+          <w:p>
+            <w:pPr>
+              <w:jc w:val="both"/>
+              <w:rPr>
+                <w:rFonts w:ascii="Times New Roman" w:eastAsia="Times New Roman" w:hAnsi="Times New Roman" w:cs="Times New Roman"/>
+                <w:sz w:val="24"/>
+                <w:szCs w:val="24"/>
+              </w:rPr>
+            </w:pPr>
+            <w:r>
+              <w:rPr>
+                <w:rFonts w:ascii="Times New Roman" w:eastAsia="Times New Roman" w:hAnsi="Times New Roman" w:cs="Times New Roman"/>
+                <w:sz w:val="24"/>
+                <w:szCs w:val="24"/>
+              </w:rPr>
+              <w:t>Baja</w:t>
+            </w:r>
+          </w:p>
+        </w:tc>
+        <w:tc>
+          <w:tcPr>
+            <w:tcW w:w="2195" w:type="dxa"/>
+          </w:tcPr>
+          <w:p>
+            <w:pPr>
+              <w:jc w:val="both"/>
+              <w:rPr>
+                <w:rFonts w:ascii="Times New Roman" w:eastAsia="Times New Roman" w:hAnsi="Times New Roman" w:cs="Times New Roman"/>
+                <w:sz w:val="24"/>
+                <w:szCs w:val="24"/>
+              </w:rPr>
+            </w:pPr>
+            <w:r>
+              <w:rPr>
+                <w:rFonts w:ascii="Times New Roman" w:eastAsia="Times New Roman" w:hAnsi="Times New Roman" w:cs="Times New Roman"/>
+                <w:sz w:val="24"/>
+                <w:szCs w:val="24"/>
+              </w:rPr>
+              <w:t>Implementado</w:t>
+            </w:r>
+          </w:p>
+        </w:tc>
+      </w:tr>
+      <w:tr>
+        <w:tc>
+          <w:tcPr>
+            <w:tcW w:w="1129" w:type="dxa"/>
+          </w:tcPr>
+          <w:p>
+            <w:pPr>
+              <w:jc w:val="both"/>
+              <w:rPr>
+                <w:rFonts w:ascii="Times New Roman" w:eastAsia="Times New Roman" w:hAnsi="Times New Roman" w:cs="Times New Roman"/>
+                <w:sz w:val="24"/>
+                <w:szCs w:val="24"/>
+              </w:rPr>
+            </w:pPr>
+            <w:r>
+              <w:rPr>
+                <w:rFonts w:ascii="Times New Roman" w:eastAsia="Times New Roman" w:hAnsi="Times New Roman" w:cs="Times New Roman"/>
+                <w:sz w:val="24"/>
+                <w:szCs w:val="24"/>
+              </w:rPr>
+              <w:t>RF-022</w:t>
+            </w:r>
+          </w:p>
+        </w:tc>
+        <w:tc>
+          <w:tcPr>
+            <w:tcW w:w="3828" w:type="dxa"/>
+          </w:tcPr>
+          <w:p>
+            <w:pPr>
+              <w:jc w:val="both"/>
+              <w:rPr>
+                <w:rFonts w:ascii="Times New Roman" w:eastAsia="Times New Roman" w:hAnsi="Times New Roman" w:cs="Times New Roman"/>
+                <w:sz w:val="24"/>
+                <w:szCs w:val="24"/>
+              </w:rPr>
+            </w:pPr>
+            <w:r>
+              <w:rPr>
+                <w:rFonts w:ascii="Times New Roman" w:eastAsia="Times New Roman" w:hAnsi="Times New Roman" w:cs="Times New Roman"/>
+                <w:sz w:val="24"/>
+                <w:szCs w:val="24"/>
+              </w:rPr>
+              <w:t>Mostrar al usuario las invitaciones pendientes que ha recibido.</w:t>
+            </w:r>
+          </w:p>
+        </w:tc>
+        <w:tc>
+          <w:tcPr>
+            <w:tcW w:w="1626" w:type="dxa"/>
+          </w:tcPr>
+          <w:p>
+            <w:pPr>
+              <w:jc w:val="both"/>
+              <w:rPr>
+                <w:rFonts w:ascii="Times New Roman" w:eastAsia="Times New Roman" w:hAnsi="Times New Roman" w:cs="Times New Roman"/>
+                <w:sz w:val="24"/>
+                <w:szCs w:val="24"/>
+              </w:rPr>
+            </w:pPr>
+            <w:r>
+              <w:rPr>
+                <w:rFonts w:ascii="Times New Roman" w:eastAsia="Times New Roman" w:hAnsi="Times New Roman" w:cs="Times New Roman"/>
+                <w:sz w:val="24"/>
+                <w:szCs w:val="24"/>
+              </w:rPr>
+              <w:t>Alta</w:t>
+            </w:r>
+          </w:p>
+        </w:tc>
+        <w:tc>
+          <w:tcPr>
+            <w:tcW w:w="2195" w:type="dxa"/>
+          </w:tcPr>
+          <w:p>
+            <w:pPr>
+              <w:jc w:val="both"/>
+              <w:rPr>
+                <w:rFonts w:ascii="Times New Roman" w:eastAsia="Times New Roman" w:hAnsi="Times New Roman" w:cs="Times New Roman"/>
+                <w:sz w:val="24"/>
+                <w:szCs w:val="24"/>
+              </w:rPr>
+            </w:pPr>
+            <w:r>
+              <w:rPr>
+                <w:rFonts w:ascii="Times New Roman" w:eastAsia="Times New Roman" w:hAnsi="Times New Roman" w:cs="Times New Roman"/>
+                <w:sz w:val="24"/>
+                <w:szCs w:val="24"/>
+              </w:rPr>
+              <w:t>Implementado</w:t>
+            </w:r>
+          </w:p>
+        </w:tc>
+      </w:tr>
+      <w:tr>
+        <w:tc>
+          <w:tcPr>
+            <w:tcW w:w="1129" w:type="dxa"/>
+          </w:tcPr>
+          <w:p>
+            <w:pPr>
+              <w:jc w:val="both"/>
+              <w:rPr>
+                <w:rFonts w:ascii="Times New Roman" w:eastAsia="Times New Roman" w:hAnsi="Times New Roman" w:cs="Times New Roman"/>
+                <w:sz w:val="24"/>
+                <w:szCs w:val="24"/>
+              </w:rPr>
+            </w:pPr>
+            <w:r>
+              <w:rPr>
+                <w:rFonts w:ascii="Times New Roman" w:eastAsia="Times New Roman" w:hAnsi="Times New Roman" w:cs="Times New Roman"/>
+                <w:sz w:val="24"/>
+                <w:szCs w:val="24"/>
+              </w:rPr>
+              <w:t>RF-023</w:t>
+            </w:r>
+          </w:p>
+        </w:tc>
+        <w:tc>
+          <w:tcPr>
+            <w:tcW w:w="3828" w:type="dxa"/>
+          </w:tcPr>
+          <w:p>
+            <w:pPr>
+              <w:jc w:val="both"/>
+              <w:rPr>
+                <w:rFonts w:ascii="Times New Roman" w:eastAsia="Times New Roman" w:hAnsi="Times New Roman" w:cs="Times New Roman"/>
+                <w:sz w:val="24"/>
+                <w:szCs w:val="24"/>
+              </w:rPr>
+            </w:pPr>
+            <w:r>
+              <w:rPr>
+                <w:rFonts w:ascii="Times New Roman" w:eastAsia="Times New Roman" w:hAnsi="Times New Roman" w:cs="Times New Roman"/>
+                <w:sz w:val="24"/>
+                <w:szCs w:val="24"/>
+              </w:rPr>
+              <w:t>Permitir al usuario aceptar o rechazar una invitación.</w:t>
+            </w:r>
+          </w:p>
+        </w:tc>
+        <w:tc>
+          <w:tcPr>
+            <w:tcW w:w="1626" w:type="dxa"/>
+          </w:tcPr>
+          <w:p>
+            <w:pPr>
+              <w:jc w:val="both"/>
+              <w:rPr>
+                <w:rFonts w:ascii="Times New Roman" w:eastAsia="Times New Roman" w:hAnsi="Times New Roman" w:cs="Times New Roman"/>
+                <w:sz w:val="24"/>
+                <w:szCs w:val="24"/>
+              </w:rPr>
+            </w:pPr>
+            <w:r>
+              <w:rPr>
+                <w:rFonts w:ascii="Times New Roman" w:eastAsia="Times New Roman" w:hAnsi="Times New Roman" w:cs="Times New Roman"/>
+                <w:sz w:val="24"/>
+                <w:szCs w:val="24"/>
+              </w:rPr>
+              <w:t>Alta</w:t>
+            </w:r>
+          </w:p>
+        </w:tc>
+        <w:tc>
+          <w:tcPr>
+            <w:tcW w:w="2195" w:type="dxa"/>
+          </w:tcPr>
+          <w:p>
+            <w:pPr>
+              <w:jc w:val="both"/>
+              <w:rPr>
+                <w:rFonts w:ascii="Times New Roman" w:eastAsia="Times New Roman" w:hAnsi="Times New Roman" w:cs="Times New Roman"/>
+                <w:sz w:val="24"/>
+                <w:szCs w:val="24"/>
+              </w:rPr>
+            </w:pPr>
+            <w:r>
+              <w:rPr>
+                <w:rFonts w:ascii="Times New Roman" w:eastAsia="Times New Roman" w:hAnsi="Times New Roman" w:cs="Times New Roman"/>
+                <w:sz w:val="24"/>
+                <w:szCs w:val="24"/>
+              </w:rPr>
+              <w:t>Implementado</w:t>
+            </w:r>
+          </w:p>
+        </w:tc>
+      </w:tr>
+      <w:tr>
+        <w:tc>
+          <w:tcPr>
+            <w:tcW w:w="1129" w:type="dxa"/>
+          </w:tcPr>
+          <w:p>
+            <w:pPr>
+              <w:jc w:val="both"/>
+              <w:rPr>
+                <w:rFonts w:ascii="Times New Roman" w:eastAsia="Times New Roman" w:hAnsi="Times New Roman" w:cs="Times New Roman"/>
+                <w:sz w:val="24"/>
+                <w:szCs w:val="24"/>
+              </w:rPr>
+            </w:pPr>
+          </w:p>
+        </w:tc>
+        <w:tc>
+          <w:tcPr>
+            <w:tcW w:w="3828" w:type="dxa"/>
+          </w:tcPr>
+          <w:p>
+            <w:pPr>
+              <w:jc w:val="both"/>
+              <w:rPr>
+                <w:rFonts w:ascii="Times New Roman" w:eastAsia="Times New Roman" w:hAnsi="Times New Roman" w:cs="Times New Roman"/>
+                <w:sz w:val="24"/>
+                <w:szCs w:val="24"/>
+              </w:rPr>
+            </w:pPr>
+          </w:p>
+        </w:tc>
+        <w:tc>
+          <w:tcPr>
+            <w:tcW w:w="1626" w:type="dxa"/>
+          </w:tcPr>
+          <w:p>
+            <w:pPr>
+              <w:jc w:val="both"/>
+              <w:rPr>
+                <w:rFonts w:ascii="Times New Roman" w:eastAsia="Times New Roman" w:hAnsi="Times New Roman" w:cs="Times New Roman"/>
+                <w:sz w:val="24"/>
+                <w:szCs w:val="24"/>
+              </w:rPr>
+            </w:pPr>
+          </w:p>
+        </w:tc>
+        <w:tc>
+          <w:tcPr>
+            <w:tcW w:w="2195" w:type="dxa"/>
+          </w:tcPr>
+          <w:p>
+            <w:pPr>
+              <w:jc w:val="both"/>
+              <w:rPr>
+                <w:rFonts w:ascii="Times New Roman" w:eastAsia="Times New Roman" w:hAnsi="Times New Roman" w:cs="Times New Roman"/>
+                <w:sz w:val="24"/>
+                <w:szCs w:val="24"/>
+              </w:rPr>
+            </w:pPr>
+          </w:p>
+        </w:tc>
+      </w:tr>
+      <w:tr>
+        <w:tc>
+          <w:tcPr>
+            <w:tcW w:w="1129" w:type="dxa"/>
+          </w:tcPr>
+          <w:p>
+            <w:pPr>
+              <w:jc w:val="both"/>
+              <w:rPr>
+                <w:rFonts w:ascii="Times New Roman" w:eastAsia="Times New Roman" w:hAnsi="Times New Roman" w:cs="Times New Roman"/>
+                <w:sz w:val="24"/>
+                <w:szCs w:val="24"/>
+              </w:rPr>
+            </w:pPr>
+          </w:p>
+        </w:tc>
+        <w:tc>
+          <w:tcPr>
+            <w:tcW w:w="3828" w:type="dxa"/>
+          </w:tcPr>
+          <w:p>
+            <w:pPr>
+              <w:jc w:val="both"/>
+              <w:rPr>
+                <w:rFonts w:ascii="Times New Roman" w:eastAsia="Times New Roman" w:hAnsi="Times New Roman" w:cs="Times New Roman"/>
+                <w:sz w:val="24"/>
+                <w:szCs w:val="24"/>
+              </w:rPr>
+            </w:pPr>
+          </w:p>
+        </w:tc>
+        <w:tc>
+          <w:tcPr>
+            <w:tcW w:w="1626" w:type="dxa"/>
+          </w:tcPr>
+          <w:p>
+            <w:pPr>
+              <w:jc w:val="both"/>
+              <w:rPr>
+                <w:rFonts w:ascii="Times New Roman" w:eastAsia="Times New Roman" w:hAnsi="Times New Roman" w:cs="Times New Roman"/>
+                <w:sz w:val="24"/>
+                <w:szCs w:val="24"/>
+              </w:rPr>
+            </w:pPr>
+          </w:p>
+        </w:tc>
+        <w:tc>
+          <w:tcPr>
+            <w:tcW w:w="2195" w:type="dxa"/>
+          </w:tcPr>
+          <w:p>
+            <w:pPr>
+              <w:jc w:val="both"/>
+              <w:rPr>
+                <w:rFonts w:ascii="Times New Roman" w:eastAsia="Times New Roman" w:hAnsi="Times New Roman" w:cs="Times New Roman"/>
+                <w:sz w:val="24"/>
+                <w:szCs w:val="24"/>
+              </w:rPr>
+            </w:pPr>
+          </w:p>
+        </w:tc>
+      </w:tr>
+      <w:tr>
+        <w:tc>
+          <w:tcPr>
+            <w:tcW w:w="1129" w:type="dxa"/>
+          </w:tcPr>
+          <w:p>
+            <w:pPr>
+              <w:jc w:val="both"/>
+              <w:rPr>
+                <w:rFonts w:ascii="Times New Roman" w:eastAsia="Times New Roman" w:hAnsi="Times New Roman" w:cs="Times New Roman"/>
+                <w:sz w:val="24"/>
+                <w:szCs w:val="24"/>
+              </w:rPr>
+            </w:pPr>
+          </w:p>
+        </w:tc>
+        <w:tc>
+          <w:tcPr>
+            <w:tcW w:w="3828" w:type="dxa"/>
+          </w:tcPr>
+          <w:p>
+            <w:pPr>
+              <w:jc w:val="both"/>
+              <w:rPr>
+                <w:rFonts w:ascii="Times New Roman" w:eastAsia="Times New Roman" w:hAnsi="Times New Roman" w:cs="Times New Roman"/>
+                <w:sz w:val="24"/>
+                <w:szCs w:val="24"/>
+              </w:rPr>
+            </w:pPr>
+          </w:p>
+        </w:tc>
+        <w:tc>
+          <w:tcPr>
+            <w:tcW w:w="1626" w:type="dxa"/>
+          </w:tcPr>
+          <w:p>
+            <w:pPr>
+              <w:jc w:val="both"/>
+              <w:rPr>
+                <w:rFonts w:ascii="Times New Roman" w:eastAsia="Times New Roman" w:hAnsi="Times New Roman" w:cs="Times New Roman"/>
+                <w:sz w:val="24"/>
+                <w:szCs w:val="24"/>
+              </w:rPr>
+            </w:pPr>
+          </w:p>
+        </w:tc>
+        <w:tc>
+          <w:tcPr>
+            <w:tcW w:w="2195" w:type="dxa"/>
+          </w:tcPr>
+          <w:p>
+            <w:pPr>
+              <w:jc w:val="both"/>
+              <w:rPr>
+                <w:rFonts w:ascii="Times New Roman" w:eastAsia="Times New Roman" w:hAnsi="Times New Roman" w:cs="Times New Roman"/>
+                <w:sz w:val="24"/>
+                <w:szCs w:val="24"/>
+              </w:rPr>
+            </w:pPr>
+          </w:p>
+        </w:tc>
+      </w:tr>
+      <w:tr>
+        <w:tc>
+          <w:tcPr>
+            <w:tcW w:w="1129" w:type="dxa"/>
+          </w:tcPr>
+          <w:p>
+            <w:pPr>
+              <w:jc w:val="both"/>
+              <w:rPr>
+                <w:rFonts w:ascii="Times New Roman" w:eastAsia="Times New Roman" w:hAnsi="Times New Roman" w:cs="Times New Roman"/>
+                <w:sz w:val="24"/>
+                <w:szCs w:val="24"/>
+              </w:rPr>
+            </w:pPr>
+          </w:p>
+        </w:tc>
+        <w:tc>
+          <w:tcPr>
+            <w:tcW w:w="3828" w:type="dxa"/>
+          </w:tcPr>
+          <w:p>
+            <w:pPr>
+              <w:jc w:val="both"/>
+              <w:rPr>
+                <w:rFonts w:ascii="Times New Roman" w:eastAsia="Times New Roman" w:hAnsi="Times New Roman" w:cs="Times New Roman"/>
+                <w:sz w:val="24"/>
+                <w:szCs w:val="24"/>
+              </w:rPr>
+            </w:pPr>
+          </w:p>
+        </w:tc>
+        <w:tc>
+          <w:tcPr>
+            <w:tcW w:w="1626" w:type="dxa"/>
+          </w:tcPr>
+          <w:p>
+            <w:pPr>
+              <w:jc w:val="both"/>
+              <w:rPr>
+                <w:rFonts w:ascii="Times New Roman" w:eastAsia="Times New Roman" w:hAnsi="Times New Roman" w:cs="Times New Roman"/>
+                <w:sz w:val="24"/>
+                <w:szCs w:val="24"/>
+              </w:rPr>
+            </w:pPr>
+          </w:p>
+        </w:tc>
+        <w:tc>
+          <w:tcPr>
+            <w:tcW w:w="2195" w:type="dxa"/>
+          </w:tcPr>
+          <w:p>
+            <w:pPr>
+              <w:jc w:val="both"/>
+              <w:rPr>
+                <w:rFonts w:ascii="Times New Roman" w:eastAsia="Times New Roman" w:hAnsi="Times New Roman" w:cs="Times New Roman"/>
+                <w:sz w:val="24"/>
+                <w:szCs w:val="24"/>
+              </w:rPr>
+            </w:pPr>
+          </w:p>
+        </w:tc>
+      </w:tr>
+      <w:tr>
+        <w:tc>
+          <w:tcPr>
+            <w:tcW w:w="1129" w:type="dxa"/>
+          </w:tcPr>
+          <w:p>
+            <w:pPr>
+              <w:jc w:val="both"/>
+              <w:rPr>
+                <w:rFonts w:ascii="Times New Roman" w:eastAsia="Times New Roman" w:hAnsi="Times New Roman" w:cs="Times New Roman"/>
+                <w:sz w:val="24"/>
+                <w:szCs w:val="24"/>
+              </w:rPr>
+            </w:pPr>
+          </w:p>
+        </w:tc>
+        <w:tc>
+          <w:tcPr>
+            <w:tcW w:w="3828" w:type="dxa"/>
+          </w:tcPr>
+          <w:p>
+            <w:pPr>
+              <w:jc w:val="both"/>
+              <w:rPr>
+                <w:rFonts w:ascii="Times New Roman" w:eastAsia="Times New Roman" w:hAnsi="Times New Roman" w:cs="Times New Roman"/>
+                <w:sz w:val="24"/>
+                <w:szCs w:val="24"/>
+              </w:rPr>
+            </w:pPr>
+          </w:p>
+        </w:tc>
+        <w:tc>
+          <w:tcPr>
+            <w:tcW w:w="1626" w:type="dxa"/>
+          </w:tcPr>
+          <w:p>
+            <w:pPr>
+              <w:jc w:val="both"/>
+              <w:rPr>
+                <w:rFonts w:ascii="Times New Roman" w:eastAsia="Times New Roman" w:hAnsi="Times New Roman" w:cs="Times New Roman"/>
+                <w:sz w:val="24"/>
+                <w:szCs w:val="24"/>
+              </w:rPr>
+            </w:pPr>
+          </w:p>
+        </w:tc>
+        <w:tc>
+          <w:tcPr>
+            <w:tcW w:w="2195" w:type="dxa"/>
+          </w:tcPr>
+          <w:p>
+            <w:pPr>
+              <w:jc w:val="both"/>
+              <w:rPr>
+                <w:rFonts w:ascii="Times New Roman" w:eastAsia="Times New Roman" w:hAnsi="Times New Roman" w:cs="Times New Roman"/>
+                <w:sz w:val="24"/>
+                <w:szCs w:val="24"/>
+              </w:rPr>
+            </w:pPr>
+          </w:p>
+        </w:tc>
+      </w:tr>
+      <w:tr>
+        <w:tc>
+          <w:tcPr>
+            <w:tcW w:w="1129" w:type="dxa"/>
+          </w:tcPr>
+          <w:p>
+            <w:pPr>
+              <w:jc w:val="both"/>
+              <w:rPr>
+                <w:rFonts w:ascii="Times New Roman" w:eastAsia="Times New Roman" w:hAnsi="Times New Roman" w:cs="Times New Roman"/>
+                <w:sz w:val="24"/>
+                <w:szCs w:val="24"/>
+              </w:rPr>
+            </w:pPr>
+          </w:p>
+        </w:tc>
+        <w:tc>
+          <w:tcPr>
+            <w:tcW w:w="3828" w:type="dxa"/>
+          </w:tcPr>
+          <w:p>
+            <w:pPr>
+              <w:jc w:val="both"/>
+              <w:rPr>
+                <w:rFonts w:ascii="Times New Roman" w:eastAsia="Times New Roman" w:hAnsi="Times New Roman" w:cs="Times New Roman"/>
+                <w:sz w:val="24"/>
+                <w:szCs w:val="24"/>
+              </w:rPr>
+            </w:pPr>
+          </w:p>
+        </w:tc>
+        <w:tc>
+          <w:tcPr>
+            <w:tcW w:w="1626" w:type="dxa"/>
+          </w:tcPr>
+          <w:p>
+            <w:pPr>
+              <w:jc w:val="both"/>
+              <w:rPr>
+                <w:rFonts w:ascii="Times New Roman" w:eastAsia="Times New Roman" w:hAnsi="Times New Roman" w:cs="Times New Roman"/>
+                <w:sz w:val="24"/>
+                <w:szCs w:val="24"/>
+              </w:rPr>
+            </w:pPr>
+          </w:p>
+        </w:tc>
+        <w:tc>
+          <w:tcPr>
+            <w:tcW w:w="2195" w:type="dxa"/>
+          </w:tcPr>
+          <w:p>
+            <w:pPr>
+              <w:jc w:val="both"/>
+              <w:rPr>
+                <w:rFonts w:ascii="Times New Roman" w:eastAsia="Times New Roman" w:hAnsi="Times New Roman" w:cs="Times New Roman"/>
+                <w:sz w:val="24"/>
+                <w:szCs w:val="24"/>
+              </w:rPr>
+            </w:pPr>
+          </w:p>
+        </w:tc>
+      </w:tr>
+      <w:tr>
+        <w:tc>
+          <w:tcPr>
+            <w:tcW w:w="1129" w:type="dxa"/>
+          </w:tcPr>
+          <w:p>
+            <w:pPr>
+              <w:jc w:val="both"/>
+              <w:rPr>
+                <w:rFonts w:ascii="Times New Roman" w:eastAsia="Times New Roman" w:hAnsi="Times New Roman" w:cs="Times New Roman"/>
+                <w:sz w:val="24"/>
+                <w:szCs w:val="24"/>
+              </w:rPr>
+            </w:pPr>
+          </w:p>
+        </w:tc>
+        <w:tc>
+          <w:tcPr>
+            <w:tcW w:w="3828" w:type="dxa"/>
+          </w:tcPr>
+          <w:p>
+            <w:pPr>
+              <w:jc w:val="both"/>
+              <w:rPr>
+                <w:rFonts w:ascii="Times New Roman" w:eastAsia="Times New Roman" w:hAnsi="Times New Roman" w:cs="Times New Roman"/>
+                <w:sz w:val="24"/>
+                <w:szCs w:val="24"/>
+              </w:rPr>
+            </w:pPr>
+          </w:p>
+        </w:tc>
+        <w:tc>
+          <w:tcPr>
+            <w:tcW w:w="1626" w:type="dxa"/>
+          </w:tcPr>
+          <w:p>
+            <w:pPr>
+              <w:jc w:val="both"/>
+              <w:rPr>
+                <w:rFonts w:ascii="Times New Roman" w:eastAsia="Times New Roman" w:hAnsi="Times New Roman" w:cs="Times New Roman"/>
+                <w:sz w:val="24"/>
+                <w:szCs w:val="24"/>
+              </w:rPr>
+            </w:pPr>
+          </w:p>
+        </w:tc>
+        <w:tc>
+          <w:tcPr>
+            <w:tcW w:w="2195" w:type="dxa"/>
+          </w:tcPr>
+          <w:p>
+            <w:pPr>
+              <w:jc w:val="both"/>
+              <w:rPr>
+                <w:rFonts w:ascii="Times New Roman" w:eastAsia="Times New Roman" w:hAnsi="Times New Roman" w:cs="Times New Roman"/>
+                <w:sz w:val="24"/>
+                <w:szCs w:val="24"/>
+              </w:rPr>
+            </w:pPr>
+          </w:p>
+        </w:tc>
+      </w:tr>
+      <w:tr>
+        <w:tc>
+          <w:tcPr>
+            <w:tcW w:w="1129" w:type="dxa"/>
+          </w:tcPr>
+          <w:p>
+            <w:pPr>
+              <w:jc w:val="both"/>
+              <w:rPr>
+                <w:rFonts w:ascii="Times New Roman" w:eastAsia="Times New Roman" w:hAnsi="Times New Roman" w:cs="Times New Roman"/>
+                <w:sz w:val="24"/>
+                <w:szCs w:val="24"/>
+              </w:rPr>
+            </w:pPr>
+          </w:p>
+        </w:tc>
+        <w:tc>
+          <w:tcPr>
+            <w:tcW w:w="3828" w:type="dxa"/>
+          </w:tcPr>
+          <w:p>
+            <w:pPr>
+              <w:jc w:val="both"/>
+              <w:rPr>
+                <w:rFonts w:ascii="Times New Roman" w:eastAsia="Times New Roman" w:hAnsi="Times New Roman" w:cs="Times New Roman"/>
+                <w:sz w:val="24"/>
+                <w:szCs w:val="24"/>
+              </w:rPr>
+            </w:pPr>
+          </w:p>
+        </w:tc>
+        <w:tc>
+          <w:tcPr>
+            <w:tcW w:w="1626" w:type="dxa"/>
+          </w:tcPr>
+          <w:p>
+            <w:pPr>
+              <w:jc w:val="both"/>
+              <w:rPr>
+                <w:rFonts w:ascii="Times New Roman" w:eastAsia="Times New Roman" w:hAnsi="Times New Roman" w:cs="Times New Roman"/>
+                <w:sz w:val="24"/>
+                <w:szCs w:val="24"/>
+              </w:rPr>
+            </w:pPr>
+          </w:p>
+        </w:tc>
+        <w:tc>
+          <w:tcPr>
+            <w:tcW w:w="2195" w:type="dxa"/>
+          </w:tcPr>
+          <w:p>
+            <w:pPr>
+              <w:jc w:val="both"/>
+              <w:rPr>
+                <w:rFonts w:ascii="Times New Roman" w:eastAsia="Times New Roman" w:hAnsi="Times New Roman" w:cs="Times New Roman"/>
+                <w:sz w:val="24"/>
+                <w:szCs w:val="24"/>
+              </w:rPr>
+            </w:pPr>
+          </w:p>
+        </w:tc>
+      </w:tr>
+      <w:tr>
+        <w:tc>
+          <w:tcPr>
+            <w:tcW w:w="1129" w:type="dxa"/>
+          </w:tcPr>
+          <w:p>
+            <w:pPr>
+              <w:jc w:val="both"/>
+              <w:rPr>
+                <w:rFonts w:ascii="Times New Roman" w:eastAsia="Times New Roman" w:hAnsi="Times New Roman" w:cs="Times New Roman"/>
+                <w:sz w:val="24"/>
+                <w:szCs w:val="24"/>
+              </w:rPr>
+            </w:pPr>
+          </w:p>
+        </w:tc>
+        <w:tc>
+          <w:tcPr>
+            <w:tcW w:w="3828" w:type="dxa"/>
+          </w:tcPr>
+          <w:p>
+            <w:pPr>
+              <w:jc w:val="both"/>
+              <w:rPr>
+                <w:rFonts w:ascii="Times New Roman" w:eastAsia="Times New Roman" w:hAnsi="Times New Roman" w:cs="Times New Roman"/>
+                <w:sz w:val="24"/>
+                <w:szCs w:val="24"/>
+              </w:rPr>
+            </w:pPr>
+          </w:p>
+        </w:tc>
+        <w:tc>
+          <w:tcPr>
+            <w:tcW w:w="1626" w:type="dxa"/>
+          </w:tcPr>
+          <w:p>
+            <w:pPr>
+              <w:jc w:val="both"/>
+              <w:rPr>
+                <w:rFonts w:ascii="Times New Roman" w:eastAsia="Times New Roman" w:hAnsi="Times New Roman" w:cs="Times New Roman"/>
+                <w:sz w:val="24"/>
+                <w:szCs w:val="24"/>
+              </w:rPr>
+            </w:pPr>
+          </w:p>
+        </w:tc>
+        <w:tc>
+          <w:tcPr>
+            <w:tcW w:w="2195" w:type="dxa"/>
+          </w:tcPr>
+          <w:p>
+            <w:pPr>
+              <w:jc w:val="both"/>
+              <w:rPr>
+                <w:rFonts w:ascii="Times New Roman" w:eastAsia="Times New Roman" w:hAnsi="Times New Roman" w:cs="Times New Roman"/>
+                <w:sz w:val="24"/>
+                <w:szCs w:val="24"/>
+              </w:rPr>
+            </w:pPr>
+          </w:p>
+        </w:tc>
+      </w:tr>
+      <w:tr>
+        <w:tc>
+          <w:tcPr>
+            <w:tcW w:w="1129" w:type="dxa"/>
+          </w:tcPr>
+          <w:p>
+            <w:pPr>
+              <w:jc w:val="both"/>
+              <w:rPr>
+                <w:rFonts w:ascii="Times New Roman" w:eastAsia="Times New Roman" w:hAnsi="Times New Roman" w:cs="Times New Roman"/>
+                <w:sz w:val="24"/>
+                <w:szCs w:val="24"/>
+              </w:rPr>
+            </w:pPr>
+          </w:p>
+        </w:tc>
+        <w:tc>
+          <w:tcPr>
+            <w:tcW w:w="3828" w:type="dxa"/>
+          </w:tcPr>
+          <w:p>
+            <w:pPr>
+              <w:jc w:val="both"/>
+              <w:rPr>
+                <w:rFonts w:ascii="Times New Roman" w:eastAsia="Times New Roman" w:hAnsi="Times New Roman" w:cs="Times New Roman"/>
+                <w:sz w:val="24"/>
+                <w:szCs w:val="24"/>
+              </w:rPr>
+            </w:pPr>
+          </w:p>
+        </w:tc>
+        <w:tc>
+          <w:tcPr>
+            <w:tcW w:w="1626" w:type="dxa"/>
+          </w:tcPr>
+          <w:p>
+            <w:pPr>
+              <w:jc w:val="both"/>
+              <w:rPr>
+                <w:rFonts w:ascii="Times New Roman" w:eastAsia="Times New Roman" w:hAnsi="Times New Roman" w:cs="Times New Roman"/>
+                <w:sz w:val="24"/>
+                <w:szCs w:val="24"/>
+              </w:rPr>
+            </w:pPr>
+          </w:p>
+        </w:tc>
+        <w:tc>
+          <w:tcPr>
+            <w:tcW w:w="2195" w:type="dxa"/>
+          </w:tcPr>
+          <w:p>
+            <w:pPr>
+              <w:jc w:val="both"/>
+              <w:rPr>
+                <w:rFonts w:ascii="Times New Roman" w:eastAsia="Times New Roman" w:hAnsi="Times New Roman" w:cs="Times New Roman"/>
+                <w:sz w:val="24"/>
+                <w:szCs w:val="24"/>
+              </w:rPr>
+            </w:pPr>
+          </w:p>
+        </w:tc>
+      </w:tr>
+      <w:tr>
+        <w:tc>
+          <w:tcPr>
+            <w:tcW w:w="1129" w:type="dxa"/>
+          </w:tcPr>
+          <w:p>
+            <w:pPr>
+              <w:jc w:val="both"/>
+              <w:rPr>
+                <w:rFonts w:ascii="Times New Roman" w:eastAsia="Times New Roman" w:hAnsi="Times New Roman" w:cs="Times New Roman"/>
+                <w:sz w:val="24"/>
+                <w:szCs w:val="24"/>
+              </w:rPr>
+            </w:pPr>
+          </w:p>
+        </w:tc>
+        <w:tc>
+          <w:tcPr>
+            <w:tcW w:w="3828" w:type="dxa"/>
+          </w:tcPr>
+          <w:p>
+            <w:pPr>
+              <w:jc w:val="both"/>
+              <w:rPr>
+                <w:rFonts w:ascii="Times New Roman" w:eastAsia="Times New Roman" w:hAnsi="Times New Roman" w:cs="Times New Roman"/>
+                <w:sz w:val="24"/>
+                <w:szCs w:val="24"/>
+              </w:rPr>
+            </w:pPr>
+          </w:p>
+        </w:tc>
+        <w:tc>
+          <w:tcPr>
+            <w:tcW w:w="1626" w:type="dxa"/>
+          </w:tcPr>
+          <w:p>
+            <w:pPr>
+              <w:jc w:val="both"/>
+              <w:rPr>
+                <w:rFonts w:ascii="Times New Roman" w:eastAsia="Times New Roman" w:hAnsi="Times New Roman" w:cs="Times New Roman"/>
+                <w:sz w:val="24"/>
+                <w:szCs w:val="24"/>
+              </w:rPr>
+            </w:pPr>
+          </w:p>
+        </w:tc>
+        <w:tc>
+          <w:tcPr>
+            <w:tcW w:w="2195" w:type="dxa"/>
+          </w:tcPr>
+          <w:p>
+            <w:pPr>
+              <w:jc w:val="both"/>
+              <w:rPr>
+                <w:rFonts w:ascii="Times New Roman" w:eastAsia="Times New Roman" w:hAnsi="Times New Roman" w:cs="Times New Roman"/>
+                <w:sz w:val="24"/>
+                <w:szCs w:val="24"/>
+              </w:rPr>
+            </w:pPr>
+          </w:p>
+        </w:tc>
+      </w:tr>
+      <w:tr>
+        <w:tc>
+          <w:tcPr>
+            <w:tcW w:w="1129" w:type="dxa"/>
+          </w:tcPr>
+          <w:p>
+            <w:pPr>
+              <w:jc w:val="both"/>
+              <w:rPr>
+                <w:rFonts w:ascii="Times New Roman" w:eastAsia="Times New Roman" w:hAnsi="Times New Roman" w:cs="Times New Roman"/>
+                <w:sz w:val="24"/>
+                <w:szCs w:val="24"/>
+              </w:rPr>
+            </w:pPr>
+          </w:p>
+        </w:tc>
+        <w:tc>
+          <w:tcPr>
+            <w:tcW w:w="3828" w:type="dxa"/>
+          </w:tcPr>
+          <w:p>
+            <w:pPr>
+              <w:jc w:val="both"/>
+              <w:rPr>
+                <w:rFonts w:ascii="Times New Roman" w:eastAsia="Times New Roman" w:hAnsi="Times New Roman" w:cs="Times New Roman"/>
+                <w:sz w:val="24"/>
+                <w:szCs w:val="24"/>
+              </w:rPr>
+            </w:pPr>
+          </w:p>
+        </w:tc>
+        <w:tc>
+          <w:tcPr>
+            <w:tcW w:w="1626" w:type="dxa"/>
+          </w:tcPr>
+          <w:p>
+            <w:pPr>
+              <w:jc w:val="both"/>
+              <w:rPr>
+                <w:rFonts w:ascii="Times New Roman" w:eastAsia="Times New Roman" w:hAnsi="Times New Roman" w:cs="Times New Roman"/>
+                <w:sz w:val="24"/>
+                <w:szCs w:val="24"/>
+              </w:rPr>
+            </w:pPr>
+          </w:p>
+        </w:tc>
+        <w:tc>
+          <w:tcPr>
+            <w:tcW w:w="2195" w:type="dxa"/>
+          </w:tcPr>
+          <w:p>
+            <w:pPr>
+              <w:jc w:val="both"/>
+              <w:rPr>
+                <w:rFonts w:ascii="Times New Roman" w:eastAsia="Times New Roman" w:hAnsi="Times New Roman" w:cs="Times New Roman"/>
+                <w:sz w:val="24"/>
+                <w:szCs w:val="24"/>
+              </w:rPr>
+            </w:pPr>
+          </w:p>
+        </w:tc>
+      </w:tr>
+      <w:tr>
+        <w:tc>
+          <w:tcPr>
+            <w:tcW w:w="1129" w:type="dxa"/>
+          </w:tcPr>
+          <w:p>
+            <w:pPr>
+              <w:jc w:val="both"/>
+              <w:rPr>
+                <w:rFonts w:ascii="Times New Roman" w:eastAsia="Times New Roman" w:hAnsi="Times New Roman" w:cs="Times New Roman"/>
+                <w:sz w:val="24"/>
+                <w:szCs w:val="24"/>
+              </w:rPr>
+            </w:pPr>
+          </w:p>
+        </w:tc>
+        <w:tc>
+          <w:tcPr>
+            <w:tcW w:w="3828" w:type="dxa"/>
+          </w:tcPr>
+          <w:p>
+            <w:pPr>
+              <w:jc w:val="both"/>
+              <w:rPr>
+                <w:rFonts w:ascii="Times New Roman" w:eastAsia="Times New Roman" w:hAnsi="Times New Roman" w:cs="Times New Roman"/>
+                <w:sz w:val="24"/>
+                <w:szCs w:val="24"/>
+              </w:rPr>
+            </w:pPr>
+          </w:p>
+        </w:tc>
+        <w:tc>
+          <w:tcPr>
+            <w:tcW w:w="1626" w:type="dxa"/>
+          </w:tcPr>
+          <w:p>
+            <w:pPr>
+              <w:jc w:val="both"/>
+              <w:rPr>
+                <w:rFonts w:ascii="Times New Roman" w:eastAsia="Times New Roman" w:hAnsi="Times New Roman" w:cs="Times New Roman"/>
+                <w:sz w:val="24"/>
+                <w:szCs w:val="24"/>
+              </w:rPr>
+            </w:pPr>
+          </w:p>
+        </w:tc>
+        <w:tc>
+          <w:tcPr>
+            <w:tcW w:w="2195" w:type="dxa"/>
+          </w:tcPr>
+          <w:p>
+            <w:pPr>
+              <w:jc w:val="both"/>
+              <w:rPr>
+                <w:rFonts w:ascii="Times New Roman" w:eastAsia="Times New Roman" w:hAnsi="Times New Roman" w:cs="Times New Roman"/>
+                <w:sz w:val="24"/>
+                <w:szCs w:val="24"/>
+              </w:rPr>
+            </w:pPr>
+          </w:p>
+        </w:tc>
+      </w:tr>
+      <w:tr>
+        <w:tc>
+          <w:tcPr>
+            <w:tcW w:w="1129" w:type="dxa"/>
+          </w:tcPr>
+          <w:p>
+            <w:pPr>
+              <w:jc w:val="both"/>
+              <w:rPr>
+                <w:rFonts w:ascii="Times New Roman" w:eastAsia="Times New Roman" w:hAnsi="Times New Roman" w:cs="Times New Roman"/>
+                <w:sz w:val="24"/>
+                <w:szCs w:val="24"/>
+              </w:rPr>
+            </w:pPr>
+          </w:p>
+        </w:tc>
+        <w:tc>
+          <w:tcPr>
+            <w:tcW w:w="3828" w:type="dxa"/>
+          </w:tcPr>
+          <w:p>
+            <w:pPr>
+              <w:jc w:val="both"/>
+              <w:rPr>
+                <w:rFonts w:ascii="Times New Roman" w:eastAsia="Times New Roman" w:hAnsi="Times New Roman" w:cs="Times New Roman"/>
+                <w:sz w:val="24"/>
+                <w:szCs w:val="24"/>
+              </w:rPr>
+            </w:pPr>
+          </w:p>
+        </w:tc>
+        <w:tc>
+          <w:tcPr>
+            <w:tcW w:w="1626" w:type="dxa"/>
+          </w:tcPr>
+          <w:p>
+            <w:pPr>
+              <w:jc w:val="both"/>
+              <w:rPr>
+                <w:rFonts w:ascii="Times New Roman" w:eastAsia="Times New Roman" w:hAnsi="Times New Roman" w:cs="Times New Roman"/>
+                <w:sz w:val="24"/>
+                <w:szCs w:val="24"/>
+              </w:rPr>
+            </w:pPr>
+          </w:p>
+        </w:tc>
+        <w:tc>
+          <w:tcPr>
+            <w:tcW w:w="2195" w:type="dxa"/>
+          </w:tcPr>
+          <w:p>
+            <w:pPr>
+              <w:jc w:val="both"/>
+              <w:rPr>
+                <w:rFonts w:ascii="Times New Roman" w:eastAsia="Times New Roman" w:hAnsi="Times New Roman" w:cs="Times New Roman"/>
+                <w:sz w:val="24"/>
+                <w:szCs w:val="24"/>
+              </w:rPr>
+            </w:pPr>
+          </w:p>
+        </w:tc>
+      </w:tr>
+      <w:tr>
+        <w:tc>
+          <w:tcPr>
+            <w:tcW w:w="1129" w:type="dxa"/>
+          </w:tcPr>
+          <w:p>
+            <w:pPr>
+              <w:jc w:val="both"/>
+              <w:rPr>
+                <w:rFonts w:ascii="Times New Roman" w:eastAsia="Times New Roman" w:hAnsi="Times New Roman" w:cs="Times New Roman"/>
+                <w:sz w:val="24"/>
+                <w:szCs w:val="24"/>
+              </w:rPr>
+            </w:pPr>
+          </w:p>
+        </w:tc>
+        <w:tc>
+          <w:tcPr>
+            <w:tcW w:w="3828" w:type="dxa"/>
+          </w:tcPr>
+          <w:p>
+            <w:pPr>
+              <w:jc w:val="both"/>
+              <w:rPr>
+                <w:rFonts w:ascii="Times New Roman" w:eastAsia="Times New Roman" w:hAnsi="Times New Roman" w:cs="Times New Roman"/>
+                <w:sz w:val="24"/>
+                <w:szCs w:val="24"/>
+              </w:rPr>
+            </w:pPr>
+          </w:p>
+        </w:tc>
+        <w:tc>
+          <w:tcPr>
+            <w:tcW w:w="1626" w:type="dxa"/>
+          </w:tcPr>
+          <w:p>
+            <w:pPr>
+              <w:jc w:val="both"/>
+              <w:rPr>
+                <w:rFonts w:ascii="Times New Roman" w:eastAsia="Times New Roman" w:hAnsi="Times New Roman" w:cs="Times New Roman"/>
+                <w:sz w:val="24"/>
+                <w:szCs w:val="24"/>
+              </w:rPr>
+            </w:pPr>
+          </w:p>
+        </w:tc>
+        <w:tc>
+          <w:tcPr>
+            <w:tcW w:w="2195" w:type="dxa"/>
+          </w:tcPr>
+          <w:p>
+            <w:pPr>
+              <w:jc w:val="both"/>
+              <w:rPr>
+                <w:rFonts w:ascii="Times New Roman" w:eastAsia="Times New Roman" w:hAnsi="Times New Roman" w:cs="Times New Roman"/>
+                <w:sz w:val="24"/>
+                <w:szCs w:val="24"/>
+              </w:rPr>
+            </w:pPr>
+          </w:p>
+        </w:tc>
+      </w:tr>
+      <w:tr>
+        <w:tc>
+          <w:tcPr>
+            <w:tcW w:w="1129" w:type="dxa"/>
+          </w:tcPr>
+          <w:p>
+            <w:pPr>
+              <w:jc w:val="both"/>
+              <w:rPr>
+                <w:rFonts w:ascii="Times New Roman" w:eastAsia="Times New Roman" w:hAnsi="Times New Roman" w:cs="Times New Roman"/>
+                <w:sz w:val="24"/>
+                <w:szCs w:val="24"/>
+              </w:rPr>
+            </w:pPr>
+          </w:p>
+        </w:tc>
+        <w:tc>
+          <w:tcPr>
+            <w:tcW w:w="3828" w:type="dxa"/>
+          </w:tcPr>
+          <w:p>
+            <w:pPr>
+              <w:jc w:val="both"/>
+              <w:rPr>
+                <w:rFonts w:ascii="Times New Roman" w:eastAsia="Times New Roman" w:hAnsi="Times New Roman" w:cs="Times New Roman"/>
+                <w:sz w:val="24"/>
+                <w:szCs w:val="24"/>
+              </w:rPr>
+            </w:pPr>
+          </w:p>
+        </w:tc>
+        <w:tc>
+          <w:tcPr>
+            <w:tcW w:w="1626" w:type="dxa"/>
+          </w:tcPr>
+          <w:p>
+            <w:pPr>
+              <w:jc w:val="both"/>
+              <w:rPr>
+                <w:rFonts w:ascii="Times New Roman" w:eastAsia="Times New Roman" w:hAnsi="Times New Roman" w:cs="Times New Roman"/>
+                <w:sz w:val="24"/>
+                <w:szCs w:val="24"/>
+              </w:rPr>
+            </w:pPr>
+          </w:p>
+        </w:tc>
+        <w:tc>
+          <w:tcPr>
+            <w:tcW w:w="2195" w:type="dxa"/>
+          </w:tcPr>
+          <w:p>
+            <w:pPr>
+              <w:jc w:val="both"/>
+              <w:rPr>
+                <w:rFonts w:ascii="Times New Roman" w:eastAsia="Times New Roman" w:hAnsi="Times New Roman" w:cs="Times New Roman"/>
+                <w:sz w:val="24"/>
+                <w:szCs w:val="24"/>
+              </w:rPr>
+            </w:pPr>
+          </w:p>
+        </w:tc>
+      </w:tr>
+    </w:tbl>
+    <w:p>
+      <w:pPr>
+        <w:pBdr>
+          <w:top w:val="nil"/>
+          <w:left w:val="nil"/>
+          <w:bottom w:val="nil"/>
+          <w:right w:val="nil"/>
+          <w:between w:val="nil"/>
+        </w:pBdr>
+        <w:jc w:val="both"/>
+        <w:rPr>
+          <w:rFonts w:ascii="Times New Roman" w:eastAsia="Times New Roman" w:hAnsi="Times New Roman" w:cs="Times New Roman"/>
+          <w:sz w:val="24"/>
+          <w:szCs w:val="24"/>
+        </w:rPr>
+      </w:pPr>
+    </w:p>
+    <w:p>
+      <w:pPr>
+        <w:pBdr>
+          <w:top w:val="nil"/>
+          <w:left w:val="nil"/>
+          <w:bottom w:val="nil"/>
+          <w:right w:val="nil"/>
+          <w:between w:val="nil"/>
+        </w:pBdr>
+        <w:jc w:val="both"/>
+        <w:rPr>
+          <w:rFonts w:ascii="Times New Roman" w:eastAsia="Times New Roman" w:hAnsi="Times New Roman" w:cs="Times New Roman"/>
+          <w:sz w:val="24"/>
+          <w:szCs w:val="24"/>
+        </w:rPr>
+      </w:pPr>
+    </w:p>
+    <w:p>
+      <w:pPr>
+        <w:pBdr>
+          <w:top w:val="nil"/>
+          <w:left w:val="nil"/>
+          <w:bottom w:val="nil"/>
+          <w:right w:val="nil"/>
+          <w:between w:val="nil"/>
+        </w:pBdr>
+        <w:jc w:val="both"/>
+        <w:rPr>
+          <w:rFonts w:ascii="Times New Roman" w:eastAsia="Times New Roman" w:hAnsi="Times New Roman" w:cs="Times New Roman"/>
+          <w:sz w:val="24"/>
+          <w:szCs w:val="24"/>
+        </w:rPr>
+      </w:pPr>
+    </w:p>
+    <w:p>
+      <w:pPr>
+        <w:pBdr>
+          <w:top w:val="nil"/>
+          <w:left w:val="nil"/>
+          <w:bottom w:val="nil"/>
+          <w:right w:val="nil"/>
+          <w:between w:val="nil"/>
+        </w:pBdr>
+        <w:jc w:val="both"/>
+        <w:rPr>
+          <w:b/>
+          <w:sz w:val="28"/>
+          <w:szCs w:val="28"/>
+        </w:rPr>
+      </w:pPr>
+      <w:r>
+        <w:rPr>
+          <w:b/>
+          <w:sz w:val="28"/>
+          <w:szCs w:val="28"/>
+        </w:rPr>
+        <w:t>4.2.</w:t>
+      </w:r>
+      <w:r>
+        <w:rPr>
+          <w:b/>
+          <w:sz w:val="28"/>
+          <w:szCs w:val="28"/>
+        </w:rPr>
+        <w:t>3</w:t>
+      </w:r>
+      <w:r>
+        <w:rPr>
+          <w:b/>
+          <w:sz w:val="28"/>
+          <w:szCs w:val="28"/>
+        </w:rPr>
+        <w:t>.- . . . (incluir subapartados si fuera necesario)</w:t>
+      </w:r>
+    </w:p>
+    <w:p>
+      <w:pPr>
+        <w:pBdr>
+          <w:top w:val="nil"/>
+          <w:left w:val="nil"/>
+          <w:bottom w:val="nil"/>
+          <w:right w:val="nil"/>
+          <w:between w:val="nil"/>
+        </w:pBdr>
+        <w:jc w:val="both"/>
+        <w:rPr>
+          <w:rFonts w:ascii="Times New Roman" w:eastAsia="Times New Roman" w:hAnsi="Times New Roman" w:cs="Times New Roman"/>
+          <w:sz w:val="24"/>
+          <w:szCs w:val="24"/>
+        </w:rPr>
+      </w:pPr>
+    </w:p>
+    <w:p>
+      <w:pPr>
+        <w:pBdr>
+          <w:top w:val="nil"/>
+          <w:left w:val="nil"/>
+          <w:bottom w:val="nil"/>
+          <w:right w:val="nil"/>
+          <w:between w:val="nil"/>
+        </w:pBdr>
+        <w:jc w:val="both"/>
+        <w:rPr>
+          <w:rFonts w:ascii="Times New Roman" w:eastAsia="Times New Roman" w:hAnsi="Times New Roman" w:cs="Times New Roman"/>
+          <w:sz w:val="24"/>
+          <w:szCs w:val="24"/>
+        </w:rPr>
+      </w:pPr>
+      <w:r>
+        <w:rPr>
+          <w:rFonts w:ascii="Times New Roman" w:eastAsia="Times New Roman" w:hAnsi="Times New Roman" w:cs="Times New Roman"/>
+          <w:sz w:val="24"/>
+          <w:szCs w:val="24"/>
+        </w:rPr>
+        <w:t>---.</w:t>
+      </w:r>
+    </w:p>
+    <w:p>
+      <w:pPr>
+        <w:pBdr>
+          <w:top w:val="nil"/>
+          <w:left w:val="nil"/>
+          <w:bottom w:val="nil"/>
+          <w:right w:val="nil"/>
+          <w:between w:val="nil"/>
+        </w:pBdr>
+        <w:jc w:val="both"/>
+        <w:rPr>
+          <w:rFonts w:ascii="Times New Roman" w:eastAsia="Times New Roman" w:hAnsi="Times New Roman" w:cs="Times New Roman"/>
+          <w:sz w:val="24"/>
+          <w:szCs w:val="24"/>
+        </w:rPr>
+      </w:pPr>
+    </w:p>
+    <w:p>
+      <w:pPr>
+        <w:pBdr>
+          <w:top w:val="nil"/>
+          <w:left w:val="nil"/>
+          <w:bottom w:val="nil"/>
+          <w:right w:val="nil"/>
+          <w:between w:val="nil"/>
+        </w:pBdr>
+        <w:jc w:val="both"/>
+        <w:rPr>
+          <w:rFonts w:ascii="Times New Roman" w:eastAsia="Times New Roman" w:hAnsi="Times New Roman" w:cs="Times New Roman"/>
+          <w:sz w:val="24"/>
+          <w:szCs w:val="24"/>
+        </w:rPr>
+      </w:pPr>
+    </w:p>
+    <w:p>
+      <w:pPr>
+        <w:pBdr>
+          <w:top w:val="nil"/>
+          <w:left w:val="nil"/>
+          <w:bottom w:val="nil"/>
+          <w:right w:val="nil"/>
+          <w:between w:val="nil"/>
+        </w:pBdr>
+        <w:jc w:val="both"/>
+        <w:rPr>
+          <w:b/>
+          <w:sz w:val="28"/>
+          <w:szCs w:val="28"/>
+        </w:rPr>
+      </w:pPr>
+      <w:r>
+        <w:rPr>
+          <w:b/>
+          <w:sz w:val="28"/>
+          <w:szCs w:val="28"/>
+        </w:rPr>
+        <w:t>4.2.</w:t>
+      </w:r>
+      <w:r>
+        <w:rPr>
+          <w:b/>
+          <w:sz w:val="28"/>
+          <w:szCs w:val="28"/>
+        </w:rPr>
+        <w:t>4</w:t>
+      </w:r>
+      <w:r>
+        <w:rPr>
+          <w:b/>
+          <w:sz w:val="28"/>
+          <w:szCs w:val="28"/>
+        </w:rPr>
+        <w:t>.- . . . (incluir subapartados si fuera necesario)</w:t>
       </w:r>
     </w:p>
     <w:p>
@@ -1216,7 +4969,6 @@
           <w:sz w:val="36"/>
           <w:szCs w:val="36"/>
         </w:rPr>
-        <w:lastRenderedPageBreak/>
         <w:t>4.3.- Diseño</w:t>
       </w:r>
     </w:p>
@@ -1259,6 +5011,7 @@
           <w:sz w:val="24"/>
           <w:szCs w:val="24"/>
         </w:rPr>
+        <w:lastRenderedPageBreak/>
         <w:t>Este apartado debe contener todos los detalles relativos al diseño de la aplicación, especialmente, los diagramas UML debidamente explicados. Según corresponda en cada caso se deberá incluir:</w:t>
       </w:r>
     </w:p>
@@ -1721,43 +5474,7 @@
           <w:sz w:val="24"/>
           <w:szCs w:val="24"/>
         </w:rPr>
-        <w:t>Capítulo opcional, debería incluirse cuando en la realización del proyecto, para validar la aplicación final, se haya realizado algún tipo de prueba concreta (</w:t>
-      </w:r>
-      <w:proofErr w:type="spellStart"/>
-      <w:r>
-        <w:rPr>
-          <w:rFonts w:ascii="Times New Roman" w:eastAsia="Times New Roman" w:hAnsi="Times New Roman" w:cs="Times New Roman"/>
-          <w:sz w:val="24"/>
-          <w:szCs w:val="24"/>
-        </w:rPr>
-        <w:t>p.e</w:t>
-      </w:r>
-      <w:proofErr w:type="spellEnd"/>
-      <w:r>
-        <w:rPr>
-          <w:rFonts w:ascii="Times New Roman" w:eastAsia="Times New Roman" w:hAnsi="Times New Roman" w:cs="Times New Roman"/>
-          <w:sz w:val="24"/>
-          <w:szCs w:val="24"/>
-        </w:rPr>
-        <w:t xml:space="preserve">.: validación de estándares W3C, pruebas de accesibilidad, </w:t>
-      </w:r>
-      <w:proofErr w:type="gramStart"/>
-      <w:r>
-        <w:rPr>
-          <w:rFonts w:ascii="Times New Roman" w:eastAsia="Times New Roman" w:hAnsi="Times New Roman" w:cs="Times New Roman"/>
-          <w:sz w:val="24"/>
-          <w:szCs w:val="24"/>
-        </w:rPr>
-        <w:t>etc...</w:t>
-      </w:r>
-      <w:proofErr w:type="gramEnd"/>
-      <w:r>
-        <w:rPr>
-          <w:rFonts w:ascii="Times New Roman" w:eastAsia="Times New Roman" w:hAnsi="Times New Roman" w:cs="Times New Roman"/>
-          <w:sz w:val="24"/>
-          <w:szCs w:val="24"/>
-        </w:rPr>
-        <w:t>).</w:t>
+        <w:t>Capítulo opcional, debería incluirse cuando en la realización del proyecto, para validar la aplicación final, se haya realizado algún tipo de prueba concreta (p.e.: validación de estándares W3C, pruebas de accesibilidad, etc...).</w:t>
       </w:r>
     </w:p>
     <w:p>
@@ -2524,6 +6241,25 @@
       <w:szCs w:val="26"/>
     </w:rPr>
   </w:style>
+  <w:style w:type="table" w:styleId="Tablaconcuadrcula">
+    <w:name w:val="Table Grid"/>
+    <w:basedOn w:val="Tablanormal"/>
+    <w:uiPriority w:val="39"/>
+    <w:rsid w:val="009A1488"/>
+    <w:pPr>
+      <w:spacing w:line="240" w:lineRule="auto"/>
+    </w:pPr>
+    <w:tblPr>
+      <w:tblBorders>
+        <w:top w:val="single" w:sz="4" w:space="0" w:color="auto"/>
+        <w:left w:val="single" w:sz="4" w:space="0" w:color="auto"/>
+        <w:bottom w:val="single" w:sz="4" w:space="0" w:color="auto"/>
+        <w:right w:val="single" w:sz="4" w:space="0" w:color="auto"/>
+        <w:insideH w:val="single" w:sz="4" w:space="0" w:color="auto"/>
+        <w:insideV w:val="single" w:sz="4" w:space="0" w:color="auto"/>
+      </w:tblBorders>
+    </w:tblPr>
+  </w:style>
 </w:styles>
 </file>
 

</xml_diff>

<commit_message>
Capitulo 4 updated with application screenshots
</commit_message>
<xml_diff>
--- a/docs/Capítulo 4 - Metodología y resultados.docx
+++ b/docs/Capítulo 4 - Metodología y resultados.docx
@@ -15545,6 +15545,23 @@
           <w:szCs w:val="24"/>
         </w:rPr>
       </w:pPr>
+    </w:p>
+    <w:p>
+      <w:pPr>
+        <w:pBdr>
+          <w:top w:val="nil"/>
+          <w:left w:val="nil"/>
+          <w:bottom w:val="nil"/>
+          <w:right w:val="nil"/>
+          <w:between w:val="nil"/>
+        </w:pBdr>
+        <w:jc w:val="both"/>
+        <w:rPr>
+          <w:rFonts w:ascii="Times New Roman" w:eastAsia="Times New Roman" w:hAnsi="Times New Roman" w:cs="Times New Roman"/>
+          <w:sz w:val="24"/>
+          <w:szCs w:val="24"/>
+        </w:rPr>
+      </w:pPr>
       <w:r>
         <w:rPr>
           <w:rFonts w:ascii="Times New Roman" w:eastAsia="Times New Roman" w:hAnsi="Times New Roman" w:cs="Times New Roman"/>
@@ -16023,27 +16040,201 @@
     </w:p>
     <w:p>
       <w:pPr>
-        <w:pBdr>
-          <w:top w:val="nil"/>
-          <w:left w:val="nil"/>
-          <w:bottom w:val="nil"/>
-          <w:right w:val="nil"/>
-          <w:between w:val="nil"/>
-        </w:pBdr>
-        <w:jc w:val="both"/>
-        <w:rPr>
-          <w:rFonts w:ascii="Times New Roman" w:eastAsia="Times New Roman" w:hAnsi="Times New Roman" w:cs="Times New Roman"/>
-          <w:sz w:val="24"/>
-          <w:szCs w:val="24"/>
-        </w:rPr>
-      </w:pPr>
-      <w:r>
-        <w:rPr>
-          <w:rFonts w:ascii="Times New Roman" w:eastAsia="Times New Roman" w:hAnsi="Times New Roman" w:cs="Times New Roman"/>
-          <w:sz w:val="24"/>
-          <w:szCs w:val="24"/>
-        </w:rPr>
-        <w:t>[Insertar aquí la Figura X. Pantallas de registro e inicio de sesión de CarePet.]</w:t>
+        <w:keepNext/>
+        <w:pBdr>
+          <w:top w:val="nil"/>
+          <w:left w:val="nil"/>
+          <w:bottom w:val="nil"/>
+          <w:right w:val="nil"/>
+          <w:between w:val="nil"/>
+        </w:pBdr>
+        <w:jc w:val="center"/>
+      </w:pPr>
+      <w:r>
+        <w:rPr>
+          <w:rFonts w:ascii="Times New Roman" w:eastAsia="Times New Roman" w:hAnsi="Times New Roman" w:cs="Times New Roman"/>
+          <w:noProof/>
+          <w:sz w:val="24"/>
+          <w:szCs w:val="24"/>
+        </w:rPr>
+        <w:lastRenderedPageBreak/>
+        <w:drawing>
+          <wp:inline distT="0" distB="0" distL="0" distR="0" wp14:anchorId="16B4F077" wp14:editId="0A6ACA76">
+            <wp:extent cx="4362450" cy="2065561"/>
+            <wp:effectExtent l="0" t="0" r="0" b="0"/>
+            <wp:docPr id="1312645114" name="Imagen 1"/>
+            <wp:cNvGraphicFramePr>
+              <a:graphicFrameLocks xmlns:a="http://schemas.openxmlformats.org/drawingml/2006/main" noChangeAspect="1"/>
+            </wp:cNvGraphicFramePr>
+            <a:graphic xmlns:a="http://schemas.openxmlformats.org/drawingml/2006/main">
+              <a:graphicData uri="http://schemas.openxmlformats.org/drawingml/2006/picture">
+                <pic:pic xmlns:pic="http://schemas.openxmlformats.org/drawingml/2006/picture">
+                  <pic:nvPicPr>
+                    <pic:cNvPr id="1312645114" name="Imagen 1312645114"/>
+                    <pic:cNvPicPr/>
+                  </pic:nvPicPr>
+                  <pic:blipFill>
+                    <a:blip r:embed="rId18" cstate="print">
+                      <a:extLst>
+                        <a:ext uri="{28A0092B-C50C-407E-A947-70E740481C1C}">
+                          <a14:useLocalDpi xmlns:a14="http://schemas.microsoft.com/office/drawing/2010/main" val="0"/>
+                        </a:ext>
+                      </a:extLst>
+                    </a:blip>
+                    <a:stretch>
+                      <a:fillRect/>
+                    </a:stretch>
+                  </pic:blipFill>
+                  <pic:spPr>
+                    <a:xfrm>
+                      <a:off x="0" y="0"/>
+                      <a:ext cx="4401881" cy="2084231"/>
+                    </a:xfrm>
+                    <a:prstGeom prst="rect">
+                      <a:avLst/>
+                    </a:prstGeom>
+                  </pic:spPr>
+                </pic:pic>
+              </a:graphicData>
+            </a:graphic>
+          </wp:inline>
+        </w:drawing>
+      </w:r>
+    </w:p>
+    <w:p>
+      <w:pPr>
+        <w:pStyle w:val="Descripcin"/>
+        <w:ind w:firstLine="720"/>
+        <w:jc w:val="both"/>
+        <w:rPr>
+          <w:rFonts w:ascii="Times New Roman" w:eastAsia="Times New Roman" w:hAnsi="Times New Roman" w:cs="Times New Roman"/>
+          <w:sz w:val="24"/>
+          <w:szCs w:val="24"/>
+        </w:rPr>
+      </w:pPr>
+      <w:r>
+        <w:t xml:space="preserve">    Ilustración </w:t>
+      </w:r>
+      <w:fldSimple w:instr=" SEQ Ilustración \* ARABIC ">
+        <w:r>
+          <w:rPr>
+            <w:noProof/>
+          </w:rPr>
+          <w:t>1</w:t>
+        </w:r>
+      </w:fldSimple>
+      <w:r>
+        <w:t xml:space="preserve">: CarePet pantalla </w:t>
+      </w:r>
+      <w:proofErr w:type="spellStart"/>
+      <w:r>
+        <w:t>login</w:t>
+      </w:r>
+      <w:proofErr w:type="spellEnd"/>
+    </w:p>
+    <w:p>
+      <w:pPr>
+        <w:pBdr>
+          <w:top w:val="nil"/>
+          <w:left w:val="nil"/>
+          <w:bottom w:val="nil"/>
+          <w:right w:val="nil"/>
+          <w:between w:val="nil"/>
+        </w:pBdr>
+        <w:jc w:val="both"/>
+        <w:rPr>
+          <w:rFonts w:ascii="Times New Roman" w:eastAsia="Times New Roman" w:hAnsi="Times New Roman" w:cs="Times New Roman"/>
+          <w:sz w:val="24"/>
+          <w:szCs w:val="24"/>
+        </w:rPr>
+      </w:pPr>
+    </w:p>
+    <w:p>
+      <w:pPr>
+        <w:keepNext/>
+        <w:pBdr>
+          <w:top w:val="nil"/>
+          <w:left w:val="nil"/>
+          <w:bottom w:val="nil"/>
+          <w:right w:val="nil"/>
+          <w:between w:val="nil"/>
+        </w:pBdr>
+        <w:jc w:val="center"/>
+      </w:pPr>
+      <w:r>
+        <w:rPr>
+          <w:rFonts w:ascii="Times New Roman" w:eastAsia="Times New Roman" w:hAnsi="Times New Roman" w:cs="Times New Roman"/>
+          <w:noProof/>
+          <w:sz w:val="24"/>
+          <w:szCs w:val="24"/>
+        </w:rPr>
+        <w:drawing>
+          <wp:inline distT="0" distB="0" distL="0" distR="0" wp14:anchorId="4CFCE004" wp14:editId="6AFD1711">
+            <wp:extent cx="4367605" cy="2065020"/>
+            <wp:effectExtent l="0" t="0" r="0" b="0"/>
+            <wp:docPr id="791522054" name="Imagen 2"/>
+            <wp:cNvGraphicFramePr>
+              <a:graphicFrameLocks xmlns:a="http://schemas.openxmlformats.org/drawingml/2006/main" noChangeAspect="1"/>
+            </wp:cNvGraphicFramePr>
+            <a:graphic xmlns:a="http://schemas.openxmlformats.org/drawingml/2006/main">
+              <a:graphicData uri="http://schemas.openxmlformats.org/drawingml/2006/picture">
+                <pic:pic xmlns:pic="http://schemas.openxmlformats.org/drawingml/2006/picture">
+                  <pic:nvPicPr>
+                    <pic:cNvPr id="791522054" name="Imagen 791522054"/>
+                    <pic:cNvPicPr/>
+                  </pic:nvPicPr>
+                  <pic:blipFill>
+                    <a:blip r:embed="rId19" cstate="print">
+                      <a:extLst>
+                        <a:ext uri="{28A0092B-C50C-407E-A947-70E740481C1C}">
+                          <a14:useLocalDpi xmlns:a14="http://schemas.microsoft.com/office/drawing/2010/main" val="0"/>
+                        </a:ext>
+                      </a:extLst>
+                    </a:blip>
+                    <a:stretch>
+                      <a:fillRect/>
+                    </a:stretch>
+                  </pic:blipFill>
+                  <pic:spPr>
+                    <a:xfrm>
+                      <a:off x="0" y="0"/>
+                      <a:ext cx="4392628" cy="2076851"/>
+                    </a:xfrm>
+                    <a:prstGeom prst="rect">
+                      <a:avLst/>
+                    </a:prstGeom>
+                  </pic:spPr>
+                </pic:pic>
+              </a:graphicData>
+            </a:graphic>
+          </wp:inline>
+        </w:drawing>
+      </w:r>
+    </w:p>
+    <w:p>
+      <w:pPr>
+        <w:pStyle w:val="Descripcin"/>
+        <w:ind w:firstLine="720"/>
+        <w:jc w:val="both"/>
+        <w:rPr>
+          <w:rFonts w:ascii="Times New Roman" w:eastAsia="Times New Roman" w:hAnsi="Times New Roman" w:cs="Times New Roman"/>
+          <w:sz w:val="24"/>
+          <w:szCs w:val="24"/>
+        </w:rPr>
+      </w:pPr>
+      <w:r>
+        <w:t xml:space="preserve">    Ilustración </w:t>
+      </w:r>
+      <w:fldSimple w:instr=" SEQ Ilustración \* ARABIC ">
+        <w:r>
+          <w:rPr>
+            <w:noProof/>
+          </w:rPr>
+          <w:t>2</w:t>
+        </w:r>
+      </w:fldSimple>
+      <w:r>
+        <w:t>: CarePet pantalla registro</w:t>
       </w:r>
     </w:p>
     <w:p>
@@ -16104,50 +16295,6 @@
           <w:szCs w:val="24"/>
         </w:rPr>
         <w:t xml:space="preserve"> principal.</w:t>
-      </w:r>
-    </w:p>
-    <w:p>
-      <w:pPr>
-        <w:pBdr>
-          <w:top w:val="nil"/>
-          <w:left w:val="nil"/>
-          <w:bottom w:val="nil"/>
-          <w:right w:val="nil"/>
-          <w:between w:val="nil"/>
-        </w:pBdr>
-        <w:jc w:val="both"/>
-        <w:rPr>
-          <w:rFonts w:ascii="Times New Roman" w:eastAsia="Times New Roman" w:hAnsi="Times New Roman" w:cs="Times New Roman"/>
-          <w:sz w:val="24"/>
-          <w:szCs w:val="24"/>
-        </w:rPr>
-      </w:pPr>
-      <w:r>
-        <w:rPr>
-          <w:rFonts w:ascii="Times New Roman" w:eastAsia="Times New Roman" w:hAnsi="Times New Roman" w:cs="Times New Roman"/>
-          <w:sz w:val="24"/>
-          <w:szCs w:val="24"/>
-        </w:rPr>
-        <w:lastRenderedPageBreak/>
-        <w:t xml:space="preserve">Captura 1: Abre la aplicación sin iniciar sesión. Haz una captura de la pantalla de </w:t>
-      </w:r>
-      <w:proofErr w:type="spellStart"/>
-      <w:r>
-        <w:rPr>
-          <w:rFonts w:ascii="Times New Roman" w:eastAsia="Times New Roman" w:hAnsi="Times New Roman" w:cs="Times New Roman"/>
-          <w:sz w:val="24"/>
-          <w:szCs w:val="24"/>
-        </w:rPr>
-        <w:t>login</w:t>
-      </w:r>
-      <w:proofErr w:type="spellEnd"/>
-      <w:r>
-        <w:rPr>
-          <w:rFonts w:ascii="Times New Roman" w:eastAsia="Times New Roman" w:hAnsi="Times New Roman" w:cs="Times New Roman"/>
-          <w:sz w:val="24"/>
-          <w:szCs w:val="24"/>
-        </w:rPr>
-        <w:t>. Luego pulsa en el enlace de registro y haz una segunda captura del formulario de registro. Si puedes, ponlas juntas en una sola imagen o inclúyelas como dos figuras separadas.</w:t>
       </w:r>
     </w:p>
     <w:p>
@@ -16227,46 +16374,97 @@
     </w:p>
     <w:p>
       <w:pPr>
-        <w:pBdr>
-          <w:top w:val="nil"/>
-          <w:left w:val="nil"/>
-          <w:bottom w:val="nil"/>
-          <w:right w:val="nil"/>
-          <w:between w:val="nil"/>
-        </w:pBdr>
-        <w:jc w:val="both"/>
-        <w:rPr>
-          <w:rFonts w:ascii="Times New Roman" w:eastAsia="Times New Roman" w:hAnsi="Times New Roman" w:cs="Times New Roman"/>
-          <w:sz w:val="24"/>
-          <w:szCs w:val="24"/>
-        </w:rPr>
-      </w:pPr>
-      <w:r>
-        <w:rPr>
-          <w:rFonts w:ascii="Times New Roman" w:eastAsia="Times New Roman" w:hAnsi="Times New Roman" w:cs="Times New Roman"/>
-          <w:sz w:val="24"/>
-          <w:szCs w:val="24"/>
-        </w:rPr>
-        <w:t xml:space="preserve">[Insertar aquí la Figura X. </w:t>
+        <w:keepNext/>
+        <w:pBdr>
+          <w:top w:val="nil"/>
+          <w:left w:val="nil"/>
+          <w:bottom w:val="nil"/>
+          <w:right w:val="nil"/>
+          <w:between w:val="nil"/>
+        </w:pBdr>
+        <w:jc w:val="center"/>
+      </w:pPr>
+      <w:r>
+        <w:rPr>
+          <w:rFonts w:ascii="Times New Roman" w:eastAsia="Times New Roman" w:hAnsi="Times New Roman" w:cs="Times New Roman"/>
+          <w:noProof/>
+          <w:sz w:val="24"/>
+          <w:szCs w:val="24"/>
+        </w:rPr>
+        <w:lastRenderedPageBreak/>
+        <w:drawing>
+          <wp:inline distT="0" distB="0" distL="0" distR="0" wp14:anchorId="123ED6E0" wp14:editId="4B3FD5E2">
+            <wp:extent cx="4366800" cy="2066400"/>
+            <wp:effectExtent l="0" t="0" r="0" b="0"/>
+            <wp:docPr id="415048600" name="Imagen 3"/>
+            <wp:cNvGraphicFramePr>
+              <a:graphicFrameLocks xmlns:a="http://schemas.openxmlformats.org/drawingml/2006/main" noChangeAspect="1"/>
+            </wp:cNvGraphicFramePr>
+            <a:graphic xmlns:a="http://schemas.openxmlformats.org/drawingml/2006/main">
+              <a:graphicData uri="http://schemas.openxmlformats.org/drawingml/2006/picture">
+                <pic:pic xmlns:pic="http://schemas.openxmlformats.org/drawingml/2006/picture">
+                  <pic:nvPicPr>
+                    <pic:cNvPr id="415048600" name="Imagen 415048600"/>
+                    <pic:cNvPicPr/>
+                  </pic:nvPicPr>
+                  <pic:blipFill>
+                    <a:blip r:embed="rId20" cstate="print">
+                      <a:extLst>
+                        <a:ext uri="{28A0092B-C50C-407E-A947-70E740481C1C}">
+                          <a14:useLocalDpi xmlns:a14="http://schemas.microsoft.com/office/drawing/2010/main" val="0"/>
+                        </a:ext>
+                      </a:extLst>
+                    </a:blip>
+                    <a:stretch>
+                      <a:fillRect/>
+                    </a:stretch>
+                  </pic:blipFill>
+                  <pic:spPr>
+                    <a:xfrm>
+                      <a:off x="0" y="0"/>
+                      <a:ext cx="4366800" cy="2066400"/>
+                    </a:xfrm>
+                    <a:prstGeom prst="rect">
+                      <a:avLst/>
+                    </a:prstGeom>
+                  </pic:spPr>
+                </pic:pic>
+              </a:graphicData>
+            </a:graphic>
+          </wp:inline>
+        </w:drawing>
+      </w:r>
+    </w:p>
+    <w:p>
+      <w:pPr>
+        <w:pStyle w:val="Descripcin"/>
+        <w:ind w:firstLine="720"/>
+        <w:jc w:val="both"/>
+        <w:rPr>
+          <w:rFonts w:ascii="Times New Roman" w:eastAsia="Times New Roman" w:hAnsi="Times New Roman" w:cs="Times New Roman"/>
+          <w:sz w:val="24"/>
+          <w:szCs w:val="24"/>
+        </w:rPr>
+      </w:pPr>
+      <w:r>
+        <w:t xml:space="preserve">    Ilustración </w:t>
+      </w:r>
+      <w:fldSimple w:instr=" SEQ Ilustración \* ARABIC ">
+        <w:r>
+          <w:rPr>
+            <w:noProof/>
+          </w:rPr>
+          <w:t>3</w:t>
+        </w:r>
+      </w:fldSimple>
+      <w:r>
+        <w:t xml:space="preserve">: CarePet pantalla </w:t>
       </w:r>
       <w:proofErr w:type="spellStart"/>
       <w:r>
-        <w:rPr>
-          <w:rFonts w:ascii="Times New Roman" w:eastAsia="Times New Roman" w:hAnsi="Times New Roman" w:cs="Times New Roman"/>
-          <w:sz w:val="24"/>
-          <w:szCs w:val="24"/>
-        </w:rPr>
-        <w:t>Dashboard</w:t>
+        <w:t>dashboard</w:t>
       </w:r>
       <w:proofErr w:type="spellEnd"/>
-      <w:r>
-        <w:rPr>
-          <w:rFonts w:ascii="Times New Roman" w:eastAsia="Times New Roman" w:hAnsi="Times New Roman" w:cs="Times New Roman"/>
-          <w:sz w:val="24"/>
-          <w:szCs w:val="24"/>
-        </w:rPr>
-        <w:t xml:space="preserve"> principal de CarePet.]</w:t>
-      </w:r>
     </w:p>
     <w:p>
       <w:pPr>
@@ -16326,66 +16524,6 @@
           <w:szCs w:val="24"/>
         </w:rPr>
         <w:t xml:space="preserve"> es la pantalla de inicio tras autenticarse. Muestra un resumen con el número total de hogares y mascotas del usuario, las mascotas registradas con acceso rápido a sus módulos de cuidado, y un banner de aviso cuando el usuario tiene invitaciones pendientes. La fecha actual se muestra en la parte superior para contextualizar temporalmente la actividad del día.</w:t>
-      </w:r>
-    </w:p>
-    <w:p>
-      <w:pPr>
-        <w:pBdr>
-          <w:top w:val="nil"/>
-          <w:left w:val="nil"/>
-          <w:bottom w:val="nil"/>
-          <w:right w:val="nil"/>
-          <w:between w:val="nil"/>
-        </w:pBdr>
-        <w:jc w:val="both"/>
-        <w:rPr>
-          <w:rFonts w:ascii="Times New Roman" w:eastAsia="Times New Roman" w:hAnsi="Times New Roman" w:cs="Times New Roman"/>
-          <w:sz w:val="24"/>
-          <w:szCs w:val="24"/>
-        </w:rPr>
-      </w:pPr>
-    </w:p>
-    <w:p>
-      <w:pPr>
-        <w:pBdr>
-          <w:top w:val="nil"/>
-          <w:left w:val="nil"/>
-          <w:bottom w:val="nil"/>
-          <w:right w:val="nil"/>
-          <w:between w:val="nil"/>
-        </w:pBdr>
-        <w:jc w:val="both"/>
-        <w:rPr>
-          <w:rFonts w:ascii="Times New Roman" w:eastAsia="Times New Roman" w:hAnsi="Times New Roman" w:cs="Times New Roman"/>
-          <w:sz w:val="24"/>
-          <w:szCs w:val="24"/>
-        </w:rPr>
-      </w:pPr>
-      <w:r>
-        <w:rPr>
-          <w:rFonts w:ascii="Times New Roman" w:eastAsia="Times New Roman" w:hAnsi="Times New Roman" w:cs="Times New Roman"/>
-          <w:sz w:val="24"/>
-          <w:szCs w:val="24"/>
-        </w:rPr>
-        <w:t xml:space="preserve">Captura 2: Inicia sesión y haz una captura del </w:t>
-      </w:r>
-      <w:proofErr w:type="spellStart"/>
-      <w:r>
-        <w:rPr>
-          <w:rFonts w:ascii="Times New Roman" w:eastAsia="Times New Roman" w:hAnsi="Times New Roman" w:cs="Times New Roman"/>
-          <w:sz w:val="24"/>
-          <w:szCs w:val="24"/>
-        </w:rPr>
-        <w:t>dashboard</w:t>
-      </w:r>
-      <w:proofErr w:type="spellEnd"/>
-      <w:r>
-        <w:rPr>
-          <w:rFonts w:ascii="Times New Roman" w:eastAsia="Times New Roman" w:hAnsi="Times New Roman" w:cs="Times New Roman"/>
-          <w:sz w:val="24"/>
-          <w:szCs w:val="24"/>
-        </w:rPr>
-        <w:t xml:space="preserve"> con al menos una mascota visible. Si tienes invitaciones pendientes, mejor aún para que se vea el banner.</w:t>
       </w:r>
     </w:p>
     <w:p>
@@ -16453,27 +16591,283 @@
     </w:p>
     <w:p>
       <w:pPr>
-        <w:pBdr>
-          <w:top w:val="nil"/>
-          <w:left w:val="nil"/>
-          <w:bottom w:val="nil"/>
-          <w:right w:val="nil"/>
-          <w:between w:val="nil"/>
-        </w:pBdr>
-        <w:jc w:val="both"/>
-        <w:rPr>
-          <w:rFonts w:ascii="Times New Roman" w:eastAsia="Times New Roman" w:hAnsi="Times New Roman" w:cs="Times New Roman"/>
-          <w:sz w:val="24"/>
-          <w:szCs w:val="24"/>
-        </w:rPr>
-      </w:pPr>
-      <w:r>
-        <w:rPr>
-          <w:rFonts w:ascii="Times New Roman" w:eastAsia="Times New Roman" w:hAnsi="Times New Roman" w:cs="Times New Roman"/>
-          <w:sz w:val="24"/>
-          <w:szCs w:val="24"/>
-        </w:rPr>
-        <w:t>[Insertar aquí la Figura X. Pantalla de detalle de hogar con miembros e invitaciones.]</w:t>
+        <w:keepNext/>
+        <w:pBdr>
+          <w:top w:val="nil"/>
+          <w:left w:val="nil"/>
+          <w:bottom w:val="nil"/>
+          <w:right w:val="nil"/>
+          <w:between w:val="nil"/>
+        </w:pBdr>
+        <w:jc w:val="center"/>
+      </w:pPr>
+      <w:r>
+        <w:rPr>
+          <w:rFonts w:ascii="Times New Roman" w:eastAsia="Times New Roman" w:hAnsi="Times New Roman" w:cs="Times New Roman"/>
+          <w:noProof/>
+          <w:sz w:val="24"/>
+          <w:szCs w:val="24"/>
+        </w:rPr>
+        <w:drawing>
+          <wp:inline distT="0" distB="0" distL="0" distR="0" wp14:anchorId="71B41D99" wp14:editId="0BE92644">
+            <wp:extent cx="4370400" cy="2066400"/>
+            <wp:effectExtent l="0" t="0" r="0" b="0"/>
+            <wp:docPr id="1820792299" name="Imagen 4"/>
+            <wp:cNvGraphicFramePr>
+              <a:graphicFrameLocks xmlns:a="http://schemas.openxmlformats.org/drawingml/2006/main" noChangeAspect="1"/>
+            </wp:cNvGraphicFramePr>
+            <a:graphic xmlns:a="http://schemas.openxmlformats.org/drawingml/2006/main">
+              <a:graphicData uri="http://schemas.openxmlformats.org/drawingml/2006/picture">
+                <pic:pic xmlns:pic="http://schemas.openxmlformats.org/drawingml/2006/picture">
+                  <pic:nvPicPr>
+                    <pic:cNvPr id="1820792299" name="Imagen 1820792299"/>
+                    <pic:cNvPicPr/>
+                  </pic:nvPicPr>
+                  <pic:blipFill>
+                    <a:blip r:embed="rId21" cstate="print">
+                      <a:extLst>
+                        <a:ext uri="{28A0092B-C50C-407E-A947-70E740481C1C}">
+                          <a14:useLocalDpi xmlns:a14="http://schemas.microsoft.com/office/drawing/2010/main" val="0"/>
+                        </a:ext>
+                      </a:extLst>
+                    </a:blip>
+                    <a:stretch>
+                      <a:fillRect/>
+                    </a:stretch>
+                  </pic:blipFill>
+                  <pic:spPr>
+                    <a:xfrm>
+                      <a:off x="0" y="0"/>
+                      <a:ext cx="4370400" cy="2066400"/>
+                    </a:xfrm>
+                    <a:prstGeom prst="rect">
+                      <a:avLst/>
+                    </a:prstGeom>
+                  </pic:spPr>
+                </pic:pic>
+              </a:graphicData>
+            </a:graphic>
+          </wp:inline>
+        </w:drawing>
+      </w:r>
+    </w:p>
+    <w:p>
+      <w:pPr>
+        <w:pStyle w:val="Descripcin"/>
+        <w:ind w:firstLine="720"/>
+        <w:jc w:val="both"/>
+        <w:rPr>
+          <w:rFonts w:ascii="Times New Roman" w:eastAsia="Times New Roman" w:hAnsi="Times New Roman" w:cs="Times New Roman"/>
+          <w:sz w:val="24"/>
+          <w:szCs w:val="24"/>
+        </w:rPr>
+      </w:pPr>
+      <w:r>
+        <w:t xml:space="preserve">    Ilustración </w:t>
+      </w:r>
+      <w:fldSimple w:instr=" SEQ Ilustración \* ARABIC ">
+        <w:r>
+          <w:rPr>
+            <w:noProof/>
+          </w:rPr>
+          <w:t>4</w:t>
+        </w:r>
+      </w:fldSimple>
+      <w:r>
+        <w:t>: CarePet pantalla hogares</w:t>
+      </w:r>
+    </w:p>
+    <w:p>
+      <w:pPr>
+        <w:keepNext/>
+        <w:pBdr>
+          <w:top w:val="nil"/>
+          <w:left w:val="nil"/>
+          <w:bottom w:val="nil"/>
+          <w:right w:val="nil"/>
+          <w:between w:val="nil"/>
+        </w:pBdr>
+        <w:jc w:val="center"/>
+      </w:pPr>
+      <w:r>
+        <w:rPr>
+          <w:rFonts w:ascii="Times New Roman" w:eastAsia="Times New Roman" w:hAnsi="Times New Roman" w:cs="Times New Roman"/>
+          <w:noProof/>
+          <w:sz w:val="24"/>
+          <w:szCs w:val="24"/>
+        </w:rPr>
+        <w:drawing>
+          <wp:inline distT="0" distB="0" distL="0" distR="0" wp14:anchorId="3DBAA55E" wp14:editId="0C614D8F">
+            <wp:extent cx="4374000" cy="2066400"/>
+            <wp:effectExtent l="0" t="0" r="7620" b="0"/>
+            <wp:docPr id="1203246296" name="Imagen 5"/>
+            <wp:cNvGraphicFramePr>
+              <a:graphicFrameLocks xmlns:a="http://schemas.openxmlformats.org/drawingml/2006/main" noChangeAspect="1"/>
+            </wp:cNvGraphicFramePr>
+            <a:graphic xmlns:a="http://schemas.openxmlformats.org/drawingml/2006/main">
+              <a:graphicData uri="http://schemas.openxmlformats.org/drawingml/2006/picture">
+                <pic:pic xmlns:pic="http://schemas.openxmlformats.org/drawingml/2006/picture">
+                  <pic:nvPicPr>
+                    <pic:cNvPr id="1203246296" name="Imagen 1203246296"/>
+                    <pic:cNvPicPr/>
+                  </pic:nvPicPr>
+                  <pic:blipFill>
+                    <a:blip r:embed="rId22" cstate="print">
+                      <a:extLst>
+                        <a:ext uri="{28A0092B-C50C-407E-A947-70E740481C1C}">
+                          <a14:useLocalDpi xmlns:a14="http://schemas.microsoft.com/office/drawing/2010/main" val="0"/>
+                        </a:ext>
+                      </a:extLst>
+                    </a:blip>
+                    <a:stretch>
+                      <a:fillRect/>
+                    </a:stretch>
+                  </pic:blipFill>
+                  <pic:spPr>
+                    <a:xfrm>
+                      <a:off x="0" y="0"/>
+                      <a:ext cx="4374000" cy="2066400"/>
+                    </a:xfrm>
+                    <a:prstGeom prst="rect">
+                      <a:avLst/>
+                    </a:prstGeom>
+                  </pic:spPr>
+                </pic:pic>
+              </a:graphicData>
+            </a:graphic>
+          </wp:inline>
+        </w:drawing>
+      </w:r>
+    </w:p>
+    <w:p>
+      <w:pPr>
+        <w:pStyle w:val="Descripcin"/>
+        <w:ind w:firstLine="720"/>
+        <w:jc w:val="both"/>
+        <w:rPr>
+          <w:rFonts w:ascii="Times New Roman" w:eastAsia="Times New Roman" w:hAnsi="Times New Roman" w:cs="Times New Roman"/>
+          <w:sz w:val="24"/>
+          <w:szCs w:val="24"/>
+        </w:rPr>
+      </w:pPr>
+      <w:r>
+        <w:t xml:space="preserve">    Ilustración </w:t>
+      </w:r>
+      <w:fldSimple w:instr=" SEQ Ilustración \* ARABIC ">
+        <w:r>
+          <w:rPr>
+            <w:noProof/>
+          </w:rPr>
+          <w:t>5</w:t>
+        </w:r>
+      </w:fldSimple>
+      <w:r>
+        <w:t>: CarePet pantalla detalle hogar</w:t>
+      </w:r>
+    </w:p>
+    <w:p>
+      <w:pPr>
+        <w:pBdr>
+          <w:top w:val="nil"/>
+          <w:left w:val="nil"/>
+          <w:bottom w:val="nil"/>
+          <w:right w:val="nil"/>
+          <w:between w:val="nil"/>
+        </w:pBdr>
+        <w:jc w:val="both"/>
+        <w:rPr>
+          <w:rFonts w:ascii="Times New Roman" w:eastAsia="Times New Roman" w:hAnsi="Times New Roman" w:cs="Times New Roman"/>
+          <w:sz w:val="24"/>
+          <w:szCs w:val="24"/>
+        </w:rPr>
+      </w:pPr>
+    </w:p>
+    <w:p>
+      <w:pPr>
+        <w:keepNext/>
+        <w:pBdr>
+          <w:top w:val="nil"/>
+          <w:left w:val="nil"/>
+          <w:bottom w:val="nil"/>
+          <w:right w:val="nil"/>
+          <w:between w:val="nil"/>
+        </w:pBdr>
+        <w:jc w:val="center"/>
+      </w:pPr>
+      <w:r>
+        <w:rPr>
+          <w:rFonts w:ascii="Times New Roman" w:eastAsia="Times New Roman" w:hAnsi="Times New Roman" w:cs="Times New Roman"/>
+          <w:noProof/>
+          <w:sz w:val="24"/>
+          <w:szCs w:val="24"/>
+        </w:rPr>
+        <w:drawing>
+          <wp:inline distT="0" distB="0" distL="0" distR="0" wp14:anchorId="135561F6" wp14:editId="70231173">
+            <wp:extent cx="4377600" cy="2066400"/>
+            <wp:effectExtent l="0" t="0" r="4445" b="0"/>
+            <wp:docPr id="96775856" name="Imagen 6"/>
+            <wp:cNvGraphicFramePr>
+              <a:graphicFrameLocks xmlns:a="http://schemas.openxmlformats.org/drawingml/2006/main" noChangeAspect="1"/>
+            </wp:cNvGraphicFramePr>
+            <a:graphic xmlns:a="http://schemas.openxmlformats.org/drawingml/2006/main">
+              <a:graphicData uri="http://schemas.openxmlformats.org/drawingml/2006/picture">
+                <pic:pic xmlns:pic="http://schemas.openxmlformats.org/drawingml/2006/picture">
+                  <pic:nvPicPr>
+                    <pic:cNvPr id="96775856" name="Imagen 96775856"/>
+                    <pic:cNvPicPr/>
+                  </pic:nvPicPr>
+                  <pic:blipFill>
+                    <a:blip r:embed="rId23" cstate="print">
+                      <a:extLst>
+                        <a:ext uri="{28A0092B-C50C-407E-A947-70E740481C1C}">
+                          <a14:useLocalDpi xmlns:a14="http://schemas.microsoft.com/office/drawing/2010/main" val="0"/>
+                        </a:ext>
+                      </a:extLst>
+                    </a:blip>
+                    <a:stretch>
+                      <a:fillRect/>
+                    </a:stretch>
+                  </pic:blipFill>
+                  <pic:spPr>
+                    <a:xfrm>
+                      <a:off x="0" y="0"/>
+                      <a:ext cx="4377600" cy="2066400"/>
+                    </a:xfrm>
+                    <a:prstGeom prst="rect">
+                      <a:avLst/>
+                    </a:prstGeom>
+                  </pic:spPr>
+                </pic:pic>
+              </a:graphicData>
+            </a:graphic>
+          </wp:inline>
+        </w:drawing>
+      </w:r>
+    </w:p>
+    <w:p>
+      <w:pPr>
+        <w:pStyle w:val="Descripcin"/>
+        <w:ind w:firstLine="720"/>
+        <w:jc w:val="both"/>
+        <w:rPr>
+          <w:rFonts w:ascii="Times New Roman" w:eastAsia="Times New Roman" w:hAnsi="Times New Roman" w:cs="Times New Roman"/>
+          <w:sz w:val="24"/>
+          <w:szCs w:val="24"/>
+        </w:rPr>
+      </w:pPr>
+      <w:r>
+        <w:t xml:space="preserve">    Ilustración </w:t>
+      </w:r>
+      <w:fldSimple w:instr=" SEQ Ilustración \* ARABIC ">
+        <w:r>
+          <w:rPr>
+            <w:noProof/>
+          </w:rPr>
+          <w:t>6</w:t>
+        </w:r>
+      </w:fldSimple>
+      <w:r>
+        <w:t>: CarePet modal de invitación de un miembro al hogar</w:t>
       </w:r>
     </w:p>
     <w:p>
@@ -16516,48 +16910,6 @@
           <w:szCs w:val="24"/>
         </w:rPr>
         <w:t>La sección de hogares permite al usuario crear nuevos hogares, ver la lista de hogares a los que pertenece y acceder al detalle de cada uno. En la pantalla de detalle se muestran los miembros del hogar con su nombre, email y rol, y las invitaciones pendientes con su estado. Los usuarios con rol OWNER o ADMIN disponen de un botón para invitar a nuevos miembros mediante su dirección de email, pudiendo asignarles el rol de ADMIN o MEMBER y añadir un mensaje personalizado.</w:t>
-      </w:r>
-    </w:p>
-    <w:p>
-      <w:pPr>
-        <w:pBdr>
-          <w:top w:val="nil"/>
-          <w:left w:val="nil"/>
-          <w:bottom w:val="nil"/>
-          <w:right w:val="nil"/>
-          <w:between w:val="nil"/>
-        </w:pBdr>
-        <w:jc w:val="both"/>
-        <w:rPr>
-          <w:rFonts w:ascii="Times New Roman" w:eastAsia="Times New Roman" w:hAnsi="Times New Roman" w:cs="Times New Roman"/>
-          <w:sz w:val="24"/>
-          <w:szCs w:val="24"/>
-        </w:rPr>
-      </w:pPr>
-    </w:p>
-    <w:p>
-      <w:pPr>
-        <w:pBdr>
-          <w:top w:val="nil"/>
-          <w:left w:val="nil"/>
-          <w:bottom w:val="nil"/>
-          <w:right w:val="nil"/>
-          <w:between w:val="nil"/>
-        </w:pBdr>
-        <w:jc w:val="both"/>
-        <w:rPr>
-          <w:rFonts w:ascii="Times New Roman" w:eastAsia="Times New Roman" w:hAnsi="Times New Roman" w:cs="Times New Roman"/>
-          <w:sz w:val="24"/>
-          <w:szCs w:val="24"/>
-        </w:rPr>
-      </w:pPr>
-      <w:r>
-        <w:rPr>
-          <w:rFonts w:ascii="Times New Roman" w:eastAsia="Times New Roman" w:hAnsi="Times New Roman" w:cs="Times New Roman"/>
-          <w:sz w:val="24"/>
-          <w:szCs w:val="24"/>
-        </w:rPr>
-        <w:t>Captura 3: Accede a un hogar y haz una captura de la pantalla de detalle donde se vean los miembros y el botón de invitar. Si puedes, abre también el modal de invitación y haz una segunda captura.</w:t>
       </w:r>
     </w:p>
     <w:p>
@@ -16625,27 +16977,432 @@
     </w:p>
     <w:p>
       <w:pPr>
-        <w:pBdr>
-          <w:top w:val="nil"/>
-          <w:left w:val="nil"/>
-          <w:bottom w:val="nil"/>
-          <w:right w:val="nil"/>
-          <w:between w:val="nil"/>
-        </w:pBdr>
-        <w:jc w:val="both"/>
-        <w:rPr>
-          <w:rFonts w:ascii="Times New Roman" w:eastAsia="Times New Roman" w:hAnsi="Times New Roman" w:cs="Times New Roman"/>
-          <w:sz w:val="24"/>
-          <w:szCs w:val="24"/>
-        </w:rPr>
-      </w:pPr>
-      <w:r>
-        <w:rPr>
-          <w:rFonts w:ascii="Times New Roman" w:eastAsia="Times New Roman" w:hAnsi="Times New Roman" w:cs="Times New Roman"/>
-          <w:sz w:val="24"/>
-          <w:szCs w:val="24"/>
-        </w:rPr>
-        <w:t>[Insertar aquí la Figura X. Lista de mascotas y formulario de registro.]</w:t>
+        <w:keepNext/>
+        <w:pBdr>
+          <w:top w:val="nil"/>
+          <w:left w:val="nil"/>
+          <w:bottom w:val="nil"/>
+          <w:right w:val="nil"/>
+          <w:between w:val="nil"/>
+        </w:pBdr>
+        <w:jc w:val="center"/>
+      </w:pPr>
+      <w:r>
+        <w:rPr>
+          <w:rFonts w:ascii="Times New Roman" w:eastAsia="Times New Roman" w:hAnsi="Times New Roman" w:cs="Times New Roman"/>
+          <w:noProof/>
+          <w:sz w:val="24"/>
+          <w:szCs w:val="24"/>
+        </w:rPr>
+        <w:drawing>
+          <wp:inline distT="0" distB="0" distL="0" distR="0" wp14:anchorId="7B56A92D" wp14:editId="73FDF168">
+            <wp:extent cx="4370400" cy="2066400"/>
+            <wp:effectExtent l="0" t="0" r="0" b="0"/>
+            <wp:docPr id="1721487269" name="Imagen 7"/>
+            <wp:cNvGraphicFramePr>
+              <a:graphicFrameLocks xmlns:a="http://schemas.openxmlformats.org/drawingml/2006/main" noChangeAspect="1"/>
+            </wp:cNvGraphicFramePr>
+            <a:graphic xmlns:a="http://schemas.openxmlformats.org/drawingml/2006/main">
+              <a:graphicData uri="http://schemas.openxmlformats.org/drawingml/2006/picture">
+                <pic:pic xmlns:pic="http://schemas.openxmlformats.org/drawingml/2006/picture">
+                  <pic:nvPicPr>
+                    <pic:cNvPr id="1721487269" name="Imagen 1721487269"/>
+                    <pic:cNvPicPr/>
+                  </pic:nvPicPr>
+                  <pic:blipFill>
+                    <a:blip r:embed="rId24" cstate="print">
+                      <a:extLst>
+                        <a:ext uri="{28A0092B-C50C-407E-A947-70E740481C1C}">
+                          <a14:useLocalDpi xmlns:a14="http://schemas.microsoft.com/office/drawing/2010/main" val="0"/>
+                        </a:ext>
+                      </a:extLst>
+                    </a:blip>
+                    <a:stretch>
+                      <a:fillRect/>
+                    </a:stretch>
+                  </pic:blipFill>
+                  <pic:spPr>
+                    <a:xfrm>
+                      <a:off x="0" y="0"/>
+                      <a:ext cx="4370400" cy="2066400"/>
+                    </a:xfrm>
+                    <a:prstGeom prst="rect">
+                      <a:avLst/>
+                    </a:prstGeom>
+                  </pic:spPr>
+                </pic:pic>
+              </a:graphicData>
+            </a:graphic>
+          </wp:inline>
+        </w:drawing>
+      </w:r>
+    </w:p>
+    <w:p>
+      <w:pPr>
+        <w:pStyle w:val="Descripcin"/>
+        <w:ind w:firstLine="720"/>
+        <w:jc w:val="both"/>
+      </w:pPr>
+      <w:r>
+        <w:t xml:space="preserve">    Ilustración </w:t>
+      </w:r>
+      <w:fldSimple w:instr=" SEQ Ilustración \* ARABIC ">
+        <w:r>
+          <w:rPr>
+            <w:noProof/>
+          </w:rPr>
+          <w:t>7</w:t>
+        </w:r>
+      </w:fldSimple>
+      <w:r>
+        <w:t>: CarePet pantalla mascotas</w:t>
+      </w:r>
+    </w:p>
+    <w:p/>
+    <w:p>
+      <w:pPr>
+        <w:keepNext/>
+        <w:pBdr>
+          <w:top w:val="nil"/>
+          <w:left w:val="nil"/>
+          <w:bottom w:val="nil"/>
+          <w:right w:val="nil"/>
+          <w:between w:val="nil"/>
+        </w:pBdr>
+        <w:jc w:val="center"/>
+      </w:pPr>
+      <w:r>
+        <w:rPr>
+          <w:rFonts w:ascii="Times New Roman" w:eastAsia="Times New Roman" w:hAnsi="Times New Roman" w:cs="Times New Roman"/>
+          <w:noProof/>
+          <w:sz w:val="24"/>
+          <w:szCs w:val="24"/>
+        </w:rPr>
+        <w:lastRenderedPageBreak/>
+        <w:drawing>
+          <wp:inline distT="0" distB="0" distL="0" distR="0" wp14:anchorId="222F5368" wp14:editId="21EBF40A">
+            <wp:extent cx="4370400" cy="2066400"/>
+            <wp:effectExtent l="0" t="0" r="0" b="0"/>
+            <wp:docPr id="1763458286" name="Imagen 8"/>
+            <wp:cNvGraphicFramePr>
+              <a:graphicFrameLocks xmlns:a="http://schemas.openxmlformats.org/drawingml/2006/main" noChangeAspect="1"/>
+            </wp:cNvGraphicFramePr>
+            <a:graphic xmlns:a="http://schemas.openxmlformats.org/drawingml/2006/main">
+              <a:graphicData uri="http://schemas.openxmlformats.org/drawingml/2006/picture">
+                <pic:pic xmlns:pic="http://schemas.openxmlformats.org/drawingml/2006/picture">
+                  <pic:nvPicPr>
+                    <pic:cNvPr id="1763458286" name="Imagen 1763458286"/>
+                    <pic:cNvPicPr/>
+                  </pic:nvPicPr>
+                  <pic:blipFill>
+                    <a:blip r:embed="rId25" cstate="print">
+                      <a:extLst>
+                        <a:ext uri="{28A0092B-C50C-407E-A947-70E740481C1C}">
+                          <a14:useLocalDpi xmlns:a14="http://schemas.microsoft.com/office/drawing/2010/main" val="0"/>
+                        </a:ext>
+                      </a:extLst>
+                    </a:blip>
+                    <a:stretch>
+                      <a:fillRect/>
+                    </a:stretch>
+                  </pic:blipFill>
+                  <pic:spPr>
+                    <a:xfrm>
+                      <a:off x="0" y="0"/>
+                      <a:ext cx="4370400" cy="2066400"/>
+                    </a:xfrm>
+                    <a:prstGeom prst="rect">
+                      <a:avLst/>
+                    </a:prstGeom>
+                  </pic:spPr>
+                </pic:pic>
+              </a:graphicData>
+            </a:graphic>
+          </wp:inline>
+        </w:drawing>
+      </w:r>
+    </w:p>
+    <w:p>
+      <w:pPr>
+        <w:pStyle w:val="Descripcin"/>
+        <w:ind w:firstLine="720"/>
+        <w:jc w:val="both"/>
+      </w:pPr>
+      <w:r>
+        <w:t xml:space="preserve">    Ilustración </w:t>
+      </w:r>
+      <w:fldSimple w:instr=" SEQ Ilustración \* ARABIC ">
+        <w:r>
+          <w:rPr>
+            <w:noProof/>
+          </w:rPr>
+          <w:t>8</w:t>
+        </w:r>
+      </w:fldSimple>
+      <w:r>
+        <w:t>: CarePet formulario creación mascota</w:t>
+      </w:r>
+    </w:p>
+    <w:p/>
+    <w:p>
+      <w:pPr>
+        <w:keepNext/>
+        <w:pBdr>
+          <w:top w:val="nil"/>
+          <w:left w:val="nil"/>
+          <w:bottom w:val="nil"/>
+          <w:right w:val="nil"/>
+          <w:between w:val="nil"/>
+        </w:pBdr>
+        <w:jc w:val="center"/>
+      </w:pPr>
+      <w:r>
+        <w:rPr>
+          <w:rFonts w:ascii="Times New Roman" w:eastAsia="Times New Roman" w:hAnsi="Times New Roman" w:cs="Times New Roman"/>
+          <w:noProof/>
+          <w:sz w:val="24"/>
+          <w:szCs w:val="24"/>
+        </w:rPr>
+        <w:drawing>
+          <wp:inline distT="0" distB="0" distL="0" distR="0" wp14:anchorId="6DDAB263" wp14:editId="18702945">
+            <wp:extent cx="4370400" cy="2066400"/>
+            <wp:effectExtent l="0" t="0" r="0" b="0"/>
+            <wp:docPr id="286047791" name="Imagen 9"/>
+            <wp:cNvGraphicFramePr>
+              <a:graphicFrameLocks xmlns:a="http://schemas.openxmlformats.org/drawingml/2006/main" noChangeAspect="1"/>
+            </wp:cNvGraphicFramePr>
+            <a:graphic xmlns:a="http://schemas.openxmlformats.org/drawingml/2006/main">
+              <a:graphicData uri="http://schemas.openxmlformats.org/drawingml/2006/picture">
+                <pic:pic xmlns:pic="http://schemas.openxmlformats.org/drawingml/2006/picture">
+                  <pic:nvPicPr>
+                    <pic:cNvPr id="286047791" name="Imagen 286047791"/>
+                    <pic:cNvPicPr/>
+                  </pic:nvPicPr>
+                  <pic:blipFill>
+                    <a:blip r:embed="rId26" cstate="print">
+                      <a:extLst>
+                        <a:ext uri="{28A0092B-C50C-407E-A947-70E740481C1C}">
+                          <a14:useLocalDpi xmlns:a14="http://schemas.microsoft.com/office/drawing/2010/main" val="0"/>
+                        </a:ext>
+                      </a:extLst>
+                    </a:blip>
+                    <a:stretch>
+                      <a:fillRect/>
+                    </a:stretch>
+                  </pic:blipFill>
+                  <pic:spPr>
+                    <a:xfrm>
+                      <a:off x="0" y="0"/>
+                      <a:ext cx="4370400" cy="2066400"/>
+                    </a:xfrm>
+                    <a:prstGeom prst="rect">
+                      <a:avLst/>
+                    </a:prstGeom>
+                  </pic:spPr>
+                </pic:pic>
+              </a:graphicData>
+            </a:graphic>
+          </wp:inline>
+        </w:drawing>
+      </w:r>
+    </w:p>
+    <w:p>
+      <w:pPr>
+        <w:pStyle w:val="Descripcin"/>
+        <w:ind w:firstLine="720"/>
+        <w:jc w:val="both"/>
+      </w:pPr>
+      <w:r>
+        <w:t xml:space="preserve">    Ilustración </w:t>
+      </w:r>
+      <w:fldSimple w:instr=" SEQ Ilustración \* ARABIC ">
+        <w:r>
+          <w:rPr>
+            <w:noProof/>
+          </w:rPr>
+          <w:t>9</w:t>
+        </w:r>
+      </w:fldSimple>
+      <w:r>
+        <w:t>: CarePet formulario creación mascota</w:t>
+      </w:r>
+    </w:p>
+    <w:p/>
+    <w:p>
+      <w:pPr>
+        <w:keepNext/>
+        <w:pBdr>
+          <w:top w:val="nil"/>
+          <w:left w:val="nil"/>
+          <w:bottom w:val="nil"/>
+          <w:right w:val="nil"/>
+          <w:between w:val="nil"/>
+        </w:pBdr>
+        <w:jc w:val="center"/>
+      </w:pPr>
+      <w:r>
+        <w:rPr>
+          <w:rFonts w:ascii="Times New Roman" w:eastAsia="Times New Roman" w:hAnsi="Times New Roman" w:cs="Times New Roman"/>
+          <w:noProof/>
+          <w:sz w:val="24"/>
+          <w:szCs w:val="24"/>
+        </w:rPr>
+        <w:drawing>
+          <wp:inline distT="0" distB="0" distL="0" distR="0" wp14:anchorId="0C1ED93B" wp14:editId="74EF3925">
+            <wp:extent cx="4370400" cy="2066400"/>
+            <wp:effectExtent l="0" t="0" r="0" b="0"/>
+            <wp:docPr id="1007274932" name="Imagen 10"/>
+            <wp:cNvGraphicFramePr>
+              <a:graphicFrameLocks xmlns:a="http://schemas.openxmlformats.org/drawingml/2006/main" noChangeAspect="1"/>
+            </wp:cNvGraphicFramePr>
+            <a:graphic xmlns:a="http://schemas.openxmlformats.org/drawingml/2006/main">
+              <a:graphicData uri="http://schemas.openxmlformats.org/drawingml/2006/picture">
+                <pic:pic xmlns:pic="http://schemas.openxmlformats.org/drawingml/2006/picture">
+                  <pic:nvPicPr>
+                    <pic:cNvPr id="1007274932" name="Imagen 1007274932"/>
+                    <pic:cNvPicPr/>
+                  </pic:nvPicPr>
+                  <pic:blipFill>
+                    <a:blip r:embed="rId27" cstate="print">
+                      <a:extLst>
+                        <a:ext uri="{28A0092B-C50C-407E-A947-70E740481C1C}">
+                          <a14:useLocalDpi xmlns:a14="http://schemas.microsoft.com/office/drawing/2010/main" val="0"/>
+                        </a:ext>
+                      </a:extLst>
+                    </a:blip>
+                    <a:stretch>
+                      <a:fillRect/>
+                    </a:stretch>
+                  </pic:blipFill>
+                  <pic:spPr>
+                    <a:xfrm>
+                      <a:off x="0" y="0"/>
+                      <a:ext cx="4370400" cy="2066400"/>
+                    </a:xfrm>
+                    <a:prstGeom prst="rect">
+                      <a:avLst/>
+                    </a:prstGeom>
+                  </pic:spPr>
+                </pic:pic>
+              </a:graphicData>
+            </a:graphic>
+          </wp:inline>
+        </w:drawing>
+      </w:r>
+    </w:p>
+    <w:p>
+      <w:pPr>
+        <w:pStyle w:val="Descripcin"/>
+        <w:ind w:firstLine="720"/>
+        <w:jc w:val="both"/>
+        <w:rPr>
+          <w:rFonts w:ascii="Times New Roman" w:eastAsia="Times New Roman" w:hAnsi="Times New Roman" w:cs="Times New Roman"/>
+          <w:sz w:val="24"/>
+          <w:szCs w:val="24"/>
+        </w:rPr>
+      </w:pPr>
+      <w:r>
+        <w:t xml:space="preserve">    Ilustración </w:t>
+      </w:r>
+      <w:fldSimple w:instr=" SEQ Ilustración \* ARABIC ">
+        <w:r>
+          <w:rPr>
+            <w:noProof/>
+          </w:rPr>
+          <w:t>10</w:t>
+        </w:r>
+      </w:fldSimple>
+      <w:r>
+        <w:t>: CarePet formulario creación mascota</w:t>
+      </w:r>
+    </w:p>
+    <w:p>
+      <w:pPr>
+        <w:keepNext/>
+        <w:pBdr>
+          <w:top w:val="nil"/>
+          <w:left w:val="nil"/>
+          <w:bottom w:val="nil"/>
+          <w:right w:val="nil"/>
+          <w:between w:val="nil"/>
+        </w:pBdr>
+        <w:jc w:val="center"/>
+      </w:pPr>
+      <w:r>
+        <w:rPr>
+          <w:rFonts w:ascii="Times New Roman" w:eastAsia="Times New Roman" w:hAnsi="Times New Roman" w:cs="Times New Roman"/>
+          <w:noProof/>
+          <w:sz w:val="24"/>
+          <w:szCs w:val="24"/>
+        </w:rPr>
+        <w:lastRenderedPageBreak/>
+        <w:drawing>
+          <wp:inline distT="0" distB="0" distL="0" distR="0" wp14:anchorId="621910AC" wp14:editId="71195C1A">
+            <wp:extent cx="4370400" cy="2066400"/>
+            <wp:effectExtent l="0" t="0" r="0" b="0"/>
+            <wp:docPr id="953565253" name="Imagen 11"/>
+            <wp:cNvGraphicFramePr>
+              <a:graphicFrameLocks xmlns:a="http://schemas.openxmlformats.org/drawingml/2006/main" noChangeAspect="1"/>
+            </wp:cNvGraphicFramePr>
+            <a:graphic xmlns:a="http://schemas.openxmlformats.org/drawingml/2006/main">
+              <a:graphicData uri="http://schemas.openxmlformats.org/drawingml/2006/picture">
+                <pic:pic xmlns:pic="http://schemas.openxmlformats.org/drawingml/2006/picture">
+                  <pic:nvPicPr>
+                    <pic:cNvPr id="953565253" name="Imagen 953565253"/>
+                    <pic:cNvPicPr/>
+                  </pic:nvPicPr>
+                  <pic:blipFill>
+                    <a:blip r:embed="rId28" cstate="print">
+                      <a:extLst>
+                        <a:ext uri="{28A0092B-C50C-407E-A947-70E740481C1C}">
+                          <a14:useLocalDpi xmlns:a14="http://schemas.microsoft.com/office/drawing/2010/main" val="0"/>
+                        </a:ext>
+                      </a:extLst>
+                    </a:blip>
+                    <a:stretch>
+                      <a:fillRect/>
+                    </a:stretch>
+                  </pic:blipFill>
+                  <pic:spPr>
+                    <a:xfrm>
+                      <a:off x="0" y="0"/>
+                      <a:ext cx="4370400" cy="2066400"/>
+                    </a:xfrm>
+                    <a:prstGeom prst="rect">
+                      <a:avLst/>
+                    </a:prstGeom>
+                  </pic:spPr>
+                </pic:pic>
+              </a:graphicData>
+            </a:graphic>
+          </wp:inline>
+        </w:drawing>
+      </w:r>
+    </w:p>
+    <w:p>
+      <w:pPr>
+        <w:pStyle w:val="Descripcin"/>
+        <w:ind w:left="720"/>
+        <w:jc w:val="both"/>
+        <w:rPr>
+          <w:rFonts w:ascii="Times New Roman" w:eastAsia="Times New Roman" w:hAnsi="Times New Roman" w:cs="Times New Roman"/>
+          <w:sz w:val="24"/>
+          <w:szCs w:val="24"/>
+        </w:rPr>
+      </w:pPr>
+      <w:r>
+        <w:t xml:space="preserve">    Ilustración </w:t>
+      </w:r>
+      <w:fldSimple w:instr=" SEQ Ilustración \* ARABIC ">
+        <w:r>
+          <w:rPr>
+            <w:noProof/>
+          </w:rPr>
+          <w:t>11</w:t>
+        </w:r>
+      </w:fldSimple>
+      <w:r>
+        <w:t>: CarePet formulario creación mascota</w:t>
       </w:r>
     </w:p>
     <w:p>
@@ -16706,31 +17463,6 @@
           <w:szCs w:val="24"/>
         </w:rPr>
       </w:pPr>
-    </w:p>
-    <w:p>
-      <w:pPr>
-        <w:pBdr>
-          <w:top w:val="nil"/>
-          <w:left w:val="nil"/>
-          <w:bottom w:val="nil"/>
-          <w:right w:val="nil"/>
-          <w:between w:val="nil"/>
-        </w:pBdr>
-        <w:jc w:val="both"/>
-        <w:rPr>
-          <w:rFonts w:ascii="Times New Roman" w:eastAsia="Times New Roman" w:hAnsi="Times New Roman" w:cs="Times New Roman"/>
-          <w:sz w:val="24"/>
-          <w:szCs w:val="24"/>
-        </w:rPr>
-      </w:pPr>
-      <w:r>
-        <w:rPr>
-          <w:rFonts w:ascii="Times New Roman" w:eastAsia="Times New Roman" w:hAnsi="Times New Roman" w:cs="Times New Roman"/>
-          <w:sz w:val="24"/>
-          <w:szCs w:val="24"/>
-        </w:rPr>
-        <w:t>Captura 4: Haz una captura de la lista de mascotas. Luego pulsa en añadir mascota y haz una segunda captura del formulario con la especie y las razas desplegadas.</w:t>
-      </w:r>
     </w:p>
     <w:p>
       <w:pPr>
@@ -16758,50 +17490,289 @@
           <w:sz w:val="24"/>
           <w:szCs w:val="24"/>
         </w:rPr>
+        <w:t>Módulo de medicación</w:t>
+      </w:r>
+    </w:p>
+    <w:p>
+      <w:pPr>
+        <w:pBdr>
+          <w:top w:val="nil"/>
+          <w:left w:val="nil"/>
+          <w:bottom w:val="nil"/>
+          <w:right w:val="nil"/>
+          <w:between w:val="nil"/>
+        </w:pBdr>
+        <w:jc w:val="both"/>
+        <w:rPr>
+          <w:rFonts w:ascii="Times New Roman" w:eastAsia="Times New Roman" w:hAnsi="Times New Roman" w:cs="Times New Roman"/>
+          <w:sz w:val="24"/>
+          <w:szCs w:val="24"/>
+        </w:rPr>
+      </w:pPr>
+    </w:p>
+    <w:p>
+      <w:pPr>
+        <w:keepNext/>
+        <w:pBdr>
+          <w:top w:val="nil"/>
+          <w:left w:val="nil"/>
+          <w:bottom w:val="nil"/>
+          <w:right w:val="nil"/>
+          <w:between w:val="nil"/>
+        </w:pBdr>
+        <w:jc w:val="center"/>
+      </w:pPr>
+      <w:r>
+        <w:rPr>
+          <w:rFonts w:ascii="Times New Roman" w:eastAsia="Times New Roman" w:hAnsi="Times New Roman" w:cs="Times New Roman"/>
+          <w:noProof/>
+          <w:sz w:val="24"/>
+          <w:szCs w:val="24"/>
+        </w:rPr>
+        <w:drawing>
+          <wp:inline distT="0" distB="0" distL="0" distR="0" wp14:anchorId="1DDBBCE3" wp14:editId="6D749072">
+            <wp:extent cx="4377600" cy="2066400"/>
+            <wp:effectExtent l="0" t="0" r="4445" b="0"/>
+            <wp:docPr id="1685904971" name="Imagen 12"/>
+            <wp:cNvGraphicFramePr>
+              <a:graphicFrameLocks xmlns:a="http://schemas.openxmlformats.org/drawingml/2006/main" noChangeAspect="1"/>
+            </wp:cNvGraphicFramePr>
+            <a:graphic xmlns:a="http://schemas.openxmlformats.org/drawingml/2006/main">
+              <a:graphicData uri="http://schemas.openxmlformats.org/drawingml/2006/picture">
+                <pic:pic xmlns:pic="http://schemas.openxmlformats.org/drawingml/2006/picture">
+                  <pic:nvPicPr>
+                    <pic:cNvPr id="1685904971" name="Imagen 1685904971"/>
+                    <pic:cNvPicPr/>
+                  </pic:nvPicPr>
+                  <pic:blipFill>
+                    <a:blip r:embed="rId29" cstate="print">
+                      <a:extLst>
+                        <a:ext uri="{28A0092B-C50C-407E-A947-70E740481C1C}">
+                          <a14:useLocalDpi xmlns:a14="http://schemas.microsoft.com/office/drawing/2010/main" val="0"/>
+                        </a:ext>
+                      </a:extLst>
+                    </a:blip>
+                    <a:stretch>
+                      <a:fillRect/>
+                    </a:stretch>
+                  </pic:blipFill>
+                  <pic:spPr>
+                    <a:xfrm>
+                      <a:off x="0" y="0"/>
+                      <a:ext cx="4377600" cy="2066400"/>
+                    </a:xfrm>
+                    <a:prstGeom prst="rect">
+                      <a:avLst/>
+                    </a:prstGeom>
+                  </pic:spPr>
+                </pic:pic>
+              </a:graphicData>
+            </a:graphic>
+          </wp:inline>
+        </w:drawing>
+      </w:r>
+    </w:p>
+    <w:p>
+      <w:pPr>
+        <w:pStyle w:val="Descripcin"/>
+        <w:ind w:firstLine="720"/>
+        <w:jc w:val="both"/>
+        <w:rPr>
+          <w:rFonts w:ascii="Times New Roman" w:eastAsia="Times New Roman" w:hAnsi="Times New Roman" w:cs="Times New Roman"/>
+          <w:sz w:val="24"/>
+          <w:szCs w:val="24"/>
+        </w:rPr>
+      </w:pPr>
+      <w:r>
+        <w:t xml:space="preserve">    Ilustración </w:t>
+      </w:r>
+      <w:fldSimple w:instr=" SEQ Ilustración \* ARABIC ">
+        <w:r>
+          <w:rPr>
+            <w:noProof/>
+          </w:rPr>
+          <w:t>12</w:t>
+        </w:r>
+      </w:fldSimple>
+      <w:r>
+        <w:t>: CarePet pantalla medicación</w:t>
+      </w:r>
+    </w:p>
+    <w:p>
+      <w:pPr>
+        <w:keepNext/>
+        <w:pBdr>
+          <w:top w:val="nil"/>
+          <w:left w:val="nil"/>
+          <w:bottom w:val="nil"/>
+          <w:right w:val="nil"/>
+          <w:between w:val="nil"/>
+        </w:pBdr>
+        <w:jc w:val="center"/>
+      </w:pPr>
+      <w:r>
+        <w:rPr>
+          <w:rFonts w:ascii="Times New Roman" w:eastAsia="Times New Roman" w:hAnsi="Times New Roman" w:cs="Times New Roman"/>
+          <w:noProof/>
+          <w:sz w:val="24"/>
+          <w:szCs w:val="24"/>
+        </w:rPr>
+        <w:drawing>
+          <wp:inline distT="0" distB="0" distL="0" distR="0" wp14:anchorId="136DBDC6" wp14:editId="5E6F4345">
+            <wp:extent cx="4370400" cy="2066400"/>
+            <wp:effectExtent l="0" t="0" r="0" b="0"/>
+            <wp:docPr id="33054294" name="Imagen 13"/>
+            <wp:cNvGraphicFramePr>
+              <a:graphicFrameLocks xmlns:a="http://schemas.openxmlformats.org/drawingml/2006/main" noChangeAspect="1"/>
+            </wp:cNvGraphicFramePr>
+            <a:graphic xmlns:a="http://schemas.openxmlformats.org/drawingml/2006/main">
+              <a:graphicData uri="http://schemas.openxmlformats.org/drawingml/2006/picture">
+                <pic:pic xmlns:pic="http://schemas.openxmlformats.org/drawingml/2006/picture">
+                  <pic:nvPicPr>
+                    <pic:cNvPr id="33054294" name="Imagen 33054294"/>
+                    <pic:cNvPicPr/>
+                  </pic:nvPicPr>
+                  <pic:blipFill>
+                    <a:blip r:embed="rId30" cstate="print">
+                      <a:extLst>
+                        <a:ext uri="{28A0092B-C50C-407E-A947-70E740481C1C}">
+                          <a14:useLocalDpi xmlns:a14="http://schemas.microsoft.com/office/drawing/2010/main" val="0"/>
+                        </a:ext>
+                      </a:extLst>
+                    </a:blip>
+                    <a:stretch>
+                      <a:fillRect/>
+                    </a:stretch>
+                  </pic:blipFill>
+                  <pic:spPr>
+                    <a:xfrm>
+                      <a:off x="0" y="0"/>
+                      <a:ext cx="4370400" cy="2066400"/>
+                    </a:xfrm>
+                    <a:prstGeom prst="rect">
+                      <a:avLst/>
+                    </a:prstGeom>
+                  </pic:spPr>
+                </pic:pic>
+              </a:graphicData>
+            </a:graphic>
+          </wp:inline>
+        </w:drawing>
+      </w:r>
+    </w:p>
+    <w:p>
+      <w:pPr>
+        <w:pStyle w:val="Descripcin"/>
+        <w:ind w:firstLine="720"/>
+        <w:jc w:val="both"/>
+        <w:rPr>
+          <w:rFonts w:ascii="Times New Roman" w:eastAsia="Times New Roman" w:hAnsi="Times New Roman" w:cs="Times New Roman"/>
+          <w:sz w:val="24"/>
+          <w:szCs w:val="24"/>
+        </w:rPr>
+      </w:pPr>
+      <w:r>
+        <w:t xml:space="preserve">    Ilustración </w:t>
+      </w:r>
+      <w:fldSimple w:instr=" SEQ Ilustración \* ARABIC ">
+        <w:r>
+          <w:rPr>
+            <w:noProof/>
+          </w:rPr>
+          <w:t>13</w:t>
+        </w:r>
+      </w:fldSimple>
+      <w:r>
+        <w:t>: CarePet pantalla detalle medicación</w:t>
+      </w:r>
+    </w:p>
+    <w:p>
+      <w:pPr>
+        <w:keepNext/>
+        <w:pBdr>
+          <w:top w:val="nil"/>
+          <w:left w:val="nil"/>
+          <w:bottom w:val="nil"/>
+          <w:right w:val="nil"/>
+          <w:between w:val="nil"/>
+        </w:pBdr>
+        <w:jc w:val="center"/>
+      </w:pPr>
+      <w:r>
+        <w:rPr>
+          <w:rFonts w:ascii="Times New Roman" w:eastAsia="Times New Roman" w:hAnsi="Times New Roman" w:cs="Times New Roman"/>
+          <w:noProof/>
+          <w:sz w:val="24"/>
+          <w:szCs w:val="24"/>
+        </w:rPr>
         <w:lastRenderedPageBreak/>
-        <w:t>Módulo de medicación</w:t>
-      </w:r>
-    </w:p>
-    <w:p>
-      <w:pPr>
-        <w:pBdr>
-          <w:top w:val="nil"/>
-          <w:left w:val="nil"/>
-          <w:bottom w:val="nil"/>
-          <w:right w:val="nil"/>
-          <w:between w:val="nil"/>
-        </w:pBdr>
-        <w:jc w:val="both"/>
-        <w:rPr>
-          <w:rFonts w:ascii="Times New Roman" w:eastAsia="Times New Roman" w:hAnsi="Times New Roman" w:cs="Times New Roman"/>
-          <w:sz w:val="24"/>
-          <w:szCs w:val="24"/>
-        </w:rPr>
-      </w:pPr>
-    </w:p>
-    <w:p>
-      <w:pPr>
-        <w:pBdr>
-          <w:top w:val="nil"/>
-          <w:left w:val="nil"/>
-          <w:bottom w:val="nil"/>
-          <w:right w:val="nil"/>
-          <w:between w:val="nil"/>
-        </w:pBdr>
-        <w:jc w:val="both"/>
-        <w:rPr>
-          <w:rFonts w:ascii="Times New Roman" w:eastAsia="Times New Roman" w:hAnsi="Times New Roman" w:cs="Times New Roman"/>
-          <w:sz w:val="24"/>
-          <w:szCs w:val="24"/>
-        </w:rPr>
-      </w:pPr>
-      <w:r>
-        <w:rPr>
-          <w:rFonts w:ascii="Times New Roman" w:eastAsia="Times New Roman" w:hAnsi="Times New Roman" w:cs="Times New Roman"/>
-          <w:sz w:val="24"/>
-          <w:szCs w:val="24"/>
-        </w:rPr>
-        <w:t>[Insertar aquí la Figura X. Lista de medicaciones activas e historial de tomas.]</w:t>
+        <w:drawing>
+          <wp:inline distT="0" distB="0" distL="0" distR="0" wp14:anchorId="3F14F5C3" wp14:editId="6769BC72">
+            <wp:extent cx="4384800" cy="2066400"/>
+            <wp:effectExtent l="0" t="0" r="0" b="0"/>
+            <wp:docPr id="209975556" name="Imagen 14"/>
+            <wp:cNvGraphicFramePr>
+              <a:graphicFrameLocks xmlns:a="http://schemas.openxmlformats.org/drawingml/2006/main" noChangeAspect="1"/>
+            </wp:cNvGraphicFramePr>
+            <a:graphic xmlns:a="http://schemas.openxmlformats.org/drawingml/2006/main">
+              <a:graphicData uri="http://schemas.openxmlformats.org/drawingml/2006/picture">
+                <pic:pic xmlns:pic="http://schemas.openxmlformats.org/drawingml/2006/picture">
+                  <pic:nvPicPr>
+                    <pic:cNvPr id="209975556" name="Imagen 209975556"/>
+                    <pic:cNvPicPr/>
+                  </pic:nvPicPr>
+                  <pic:blipFill>
+                    <a:blip r:embed="rId31" cstate="print">
+                      <a:extLst>
+                        <a:ext uri="{28A0092B-C50C-407E-A947-70E740481C1C}">
+                          <a14:useLocalDpi xmlns:a14="http://schemas.microsoft.com/office/drawing/2010/main" val="0"/>
+                        </a:ext>
+                      </a:extLst>
+                    </a:blip>
+                    <a:stretch>
+                      <a:fillRect/>
+                    </a:stretch>
+                  </pic:blipFill>
+                  <pic:spPr>
+                    <a:xfrm>
+                      <a:off x="0" y="0"/>
+                      <a:ext cx="4384800" cy="2066400"/>
+                    </a:xfrm>
+                    <a:prstGeom prst="rect">
+                      <a:avLst/>
+                    </a:prstGeom>
+                  </pic:spPr>
+                </pic:pic>
+              </a:graphicData>
+            </a:graphic>
+          </wp:inline>
+        </w:drawing>
+      </w:r>
+    </w:p>
+    <w:p>
+      <w:pPr>
+        <w:pStyle w:val="Descripcin"/>
+        <w:ind w:firstLine="720"/>
+        <w:jc w:val="both"/>
+        <w:rPr>
+          <w:rFonts w:ascii="Times New Roman" w:eastAsia="Times New Roman" w:hAnsi="Times New Roman" w:cs="Times New Roman"/>
+          <w:sz w:val="24"/>
+          <w:szCs w:val="24"/>
+        </w:rPr>
+      </w:pPr>
+      <w:r>
+        <w:t xml:space="preserve">    Ilustración </w:t>
+      </w:r>
+      <w:fldSimple w:instr=" SEQ Ilustración \* ARABIC ">
+        <w:r>
+          <w:rPr>
+            <w:noProof/>
+          </w:rPr>
+          <w:t>14</w:t>
+        </w:r>
+      </w:fldSimple>
+      <w:r>
+        <w:t>: CarePet intento de administración duplicada de medicación muestra error</w:t>
       </w:r>
     </w:p>
     <w:p>
@@ -16844,56 +17815,6 @@
           <w:szCs w:val="24"/>
         </w:rPr>
         <w:t>El módulo de medicación es el núcleo funcional de CarePet. Muestra las medicaciones activas de cada mascota con su nombre, dosis, frecuencia y horarios configurados. Al acceder al detalle de un medicamento se muestra el historial completo de tomas, indicando para cada una el usuario que la administró y la fecha y hora exacta. El botón de registrar toma abre un modal donde el usuario puede añadir notas opcionales antes de confirmar. Si ya se ha alcanzado el límite de tomas permitidas para ese día, el sistema muestra un mensaje de error informativo en lugar de permitir el registro.</w:t>
-      </w:r>
-    </w:p>
-    <w:p>
-      <w:pPr>
-        <w:pBdr>
-          <w:top w:val="nil"/>
-          <w:left w:val="nil"/>
-          <w:bottom w:val="nil"/>
-          <w:right w:val="nil"/>
-          <w:between w:val="nil"/>
-        </w:pBdr>
-        <w:jc w:val="both"/>
-        <w:rPr>
-          <w:rFonts w:ascii="Times New Roman" w:eastAsia="Times New Roman" w:hAnsi="Times New Roman" w:cs="Times New Roman"/>
-          <w:sz w:val="24"/>
-          <w:szCs w:val="24"/>
-        </w:rPr>
-      </w:pPr>
-    </w:p>
-    <w:p>
-      <w:pPr>
-        <w:pBdr>
-          <w:top w:val="nil"/>
-          <w:left w:val="nil"/>
-          <w:bottom w:val="nil"/>
-          <w:right w:val="nil"/>
-          <w:between w:val="nil"/>
-        </w:pBdr>
-        <w:jc w:val="both"/>
-        <w:rPr>
-          <w:rFonts w:ascii="Times New Roman" w:eastAsia="Times New Roman" w:hAnsi="Times New Roman" w:cs="Times New Roman"/>
-          <w:sz w:val="24"/>
-          <w:szCs w:val="24"/>
-        </w:rPr>
-      </w:pPr>
-      <w:r>
-        <w:rPr>
-          <w:rFonts w:ascii="Times New Roman" w:eastAsia="Times New Roman" w:hAnsi="Times New Roman" w:cs="Times New Roman"/>
-          <w:sz w:val="24"/>
-          <w:szCs w:val="24"/>
-        </w:rPr>
-        <w:t>C</w:t>
-      </w:r>
-      <w:r>
-        <w:rPr>
-          <w:rFonts w:ascii="Times New Roman" w:eastAsia="Times New Roman" w:hAnsi="Times New Roman" w:cs="Times New Roman"/>
-          <w:sz w:val="24"/>
-          <w:szCs w:val="24"/>
-        </w:rPr>
-        <w:t>aptura 5: Haz una captura de la lista de medicaciones de una mascota. Luego entra al detalle de un medicamento y haz una segunda captura donde se vea el historial de tomas y el botón de registrar. Si puedes provocar el error de toma duplicada, haz también una captura del mensaje de error, ya que ilustra perfectamente la funcionalidad principal del proyecto.</w:t>
       </w:r>
     </w:p>
     <w:p>
@@ -16961,27 +17882,175 @@
     </w:p>
     <w:p>
       <w:pPr>
-        <w:pBdr>
-          <w:top w:val="nil"/>
-          <w:left w:val="nil"/>
-          <w:bottom w:val="nil"/>
-          <w:right w:val="nil"/>
-          <w:between w:val="nil"/>
-        </w:pBdr>
-        <w:jc w:val="both"/>
-        <w:rPr>
-          <w:rFonts w:ascii="Times New Roman" w:eastAsia="Times New Roman" w:hAnsi="Times New Roman" w:cs="Times New Roman"/>
-          <w:sz w:val="24"/>
-          <w:szCs w:val="24"/>
-        </w:rPr>
-      </w:pPr>
-      <w:r>
-        <w:rPr>
-          <w:rFonts w:ascii="Times New Roman" w:eastAsia="Times New Roman" w:hAnsi="Times New Roman" w:cs="Times New Roman"/>
-          <w:sz w:val="24"/>
-          <w:szCs w:val="24"/>
-        </w:rPr>
-        <w:t>[Insertar aquí la Figura X. Configuración de rutina de alimentación y registro de tomas.]</w:t>
+        <w:keepNext/>
+        <w:pBdr>
+          <w:top w:val="nil"/>
+          <w:left w:val="nil"/>
+          <w:bottom w:val="nil"/>
+          <w:right w:val="nil"/>
+          <w:between w:val="nil"/>
+        </w:pBdr>
+        <w:jc w:val="center"/>
+      </w:pPr>
+      <w:r>
+        <w:rPr>
+          <w:rFonts w:ascii="Times New Roman" w:eastAsia="Times New Roman" w:hAnsi="Times New Roman" w:cs="Times New Roman"/>
+          <w:noProof/>
+          <w:sz w:val="24"/>
+          <w:szCs w:val="24"/>
+        </w:rPr>
+        <w:drawing>
+          <wp:inline distT="0" distB="0" distL="0" distR="0" wp14:anchorId="20F22E72" wp14:editId="5B22F6FA">
+            <wp:extent cx="4370400" cy="2066400"/>
+            <wp:effectExtent l="0" t="0" r="0" b="0"/>
+            <wp:docPr id="2103515011" name="Imagen 15"/>
+            <wp:cNvGraphicFramePr>
+              <a:graphicFrameLocks xmlns:a="http://schemas.openxmlformats.org/drawingml/2006/main" noChangeAspect="1"/>
+            </wp:cNvGraphicFramePr>
+            <a:graphic xmlns:a="http://schemas.openxmlformats.org/drawingml/2006/main">
+              <a:graphicData uri="http://schemas.openxmlformats.org/drawingml/2006/picture">
+                <pic:pic xmlns:pic="http://schemas.openxmlformats.org/drawingml/2006/picture">
+                  <pic:nvPicPr>
+                    <pic:cNvPr id="2103515011" name="Imagen 2103515011"/>
+                    <pic:cNvPicPr/>
+                  </pic:nvPicPr>
+                  <pic:blipFill>
+                    <a:blip r:embed="rId32" cstate="print">
+                      <a:extLst>
+                        <a:ext uri="{28A0092B-C50C-407E-A947-70E740481C1C}">
+                          <a14:useLocalDpi xmlns:a14="http://schemas.microsoft.com/office/drawing/2010/main" val="0"/>
+                        </a:ext>
+                      </a:extLst>
+                    </a:blip>
+                    <a:stretch>
+                      <a:fillRect/>
+                    </a:stretch>
+                  </pic:blipFill>
+                  <pic:spPr>
+                    <a:xfrm>
+                      <a:off x="0" y="0"/>
+                      <a:ext cx="4370400" cy="2066400"/>
+                    </a:xfrm>
+                    <a:prstGeom prst="rect">
+                      <a:avLst/>
+                    </a:prstGeom>
+                  </pic:spPr>
+                </pic:pic>
+              </a:graphicData>
+            </a:graphic>
+          </wp:inline>
+        </w:drawing>
+      </w:r>
+    </w:p>
+    <w:p>
+      <w:pPr>
+        <w:pStyle w:val="Descripcin"/>
+        <w:ind w:firstLine="720"/>
+        <w:jc w:val="both"/>
+      </w:pPr>
+      <w:r>
+        <w:t xml:space="preserve">    Ilustración </w:t>
+      </w:r>
+      <w:fldSimple w:instr=" SEQ Ilustración \* ARABIC ">
+        <w:r>
+          <w:rPr>
+            <w:noProof/>
+          </w:rPr>
+          <w:t>15</w:t>
+        </w:r>
+      </w:fldSimple>
+      <w:r>
+        <w:t>: CarePet pantalla comidas</w:t>
+      </w:r>
+    </w:p>
+    <w:p/>
+    <w:p>
+      <w:pPr>
+        <w:keepNext/>
+        <w:pBdr>
+          <w:top w:val="nil"/>
+          <w:left w:val="nil"/>
+          <w:bottom w:val="nil"/>
+          <w:right w:val="nil"/>
+          <w:between w:val="nil"/>
+        </w:pBdr>
+        <w:jc w:val="center"/>
+      </w:pPr>
+      <w:r>
+        <w:rPr>
+          <w:rFonts w:ascii="Times New Roman" w:eastAsia="Times New Roman" w:hAnsi="Times New Roman" w:cs="Times New Roman"/>
+          <w:noProof/>
+          <w:sz w:val="24"/>
+          <w:szCs w:val="24"/>
+        </w:rPr>
+        <w:lastRenderedPageBreak/>
+        <w:drawing>
+          <wp:inline distT="0" distB="0" distL="0" distR="0" wp14:anchorId="69EEEA51" wp14:editId="7CEAEA14">
+            <wp:extent cx="4370400" cy="2066400"/>
+            <wp:effectExtent l="0" t="0" r="0" b="0"/>
+            <wp:docPr id="2121408192" name="Imagen 16"/>
+            <wp:cNvGraphicFramePr>
+              <a:graphicFrameLocks xmlns:a="http://schemas.openxmlformats.org/drawingml/2006/main" noChangeAspect="1"/>
+            </wp:cNvGraphicFramePr>
+            <a:graphic xmlns:a="http://schemas.openxmlformats.org/drawingml/2006/main">
+              <a:graphicData uri="http://schemas.openxmlformats.org/drawingml/2006/picture">
+                <pic:pic xmlns:pic="http://schemas.openxmlformats.org/drawingml/2006/picture">
+                  <pic:nvPicPr>
+                    <pic:cNvPr id="2121408192" name="Imagen 2121408192"/>
+                    <pic:cNvPicPr/>
+                  </pic:nvPicPr>
+                  <pic:blipFill>
+                    <a:blip r:embed="rId33" cstate="print">
+                      <a:extLst>
+                        <a:ext uri="{28A0092B-C50C-407E-A947-70E740481C1C}">
+                          <a14:useLocalDpi xmlns:a14="http://schemas.microsoft.com/office/drawing/2010/main" val="0"/>
+                        </a:ext>
+                      </a:extLst>
+                    </a:blip>
+                    <a:stretch>
+                      <a:fillRect/>
+                    </a:stretch>
+                  </pic:blipFill>
+                  <pic:spPr>
+                    <a:xfrm>
+                      <a:off x="0" y="0"/>
+                      <a:ext cx="4370400" cy="2066400"/>
+                    </a:xfrm>
+                    <a:prstGeom prst="rect">
+                      <a:avLst/>
+                    </a:prstGeom>
+                  </pic:spPr>
+                </pic:pic>
+              </a:graphicData>
+            </a:graphic>
+          </wp:inline>
+        </w:drawing>
+      </w:r>
+    </w:p>
+    <w:p>
+      <w:pPr>
+        <w:pStyle w:val="Descripcin"/>
+        <w:ind w:firstLine="720"/>
+        <w:jc w:val="both"/>
+        <w:rPr>
+          <w:rFonts w:ascii="Times New Roman" w:eastAsia="Times New Roman" w:hAnsi="Times New Roman" w:cs="Times New Roman"/>
+          <w:sz w:val="24"/>
+          <w:szCs w:val="24"/>
+        </w:rPr>
+      </w:pPr>
+      <w:r>
+        <w:t xml:space="preserve">    Ilustración </w:t>
+      </w:r>
+      <w:fldSimple w:instr=" SEQ Ilustración \* ARABIC ">
+        <w:r>
+          <w:rPr>
+            <w:noProof/>
+          </w:rPr>
+          <w:t>16</w:t>
+        </w:r>
+      </w:fldSimple>
+      <w:r>
+        <w:t>: CarePet pantalla detalle rutina de comida</w:t>
       </w:r>
     </w:p>
     <w:p>
@@ -17024,48 +18093,6 @@
           <w:szCs w:val="24"/>
         </w:rPr>
         <w:t>El módulo de comidas permite configurar la rutina de alimentación de cada mascota, indicando el número de comidas diarias y los horarios de cada una. Una vez configurada la rutina, los cuidadores pueden registrar cada toma mediante un botón de confirmación. El sistema valida que no se supere el número de comidas configuradas en un mismo día y muestra el historial de tomas con el usuario que las realizó y la marca temporal correspondiente.</w:t>
-      </w:r>
-    </w:p>
-    <w:p>
-      <w:pPr>
-        <w:pBdr>
-          <w:top w:val="nil"/>
-          <w:left w:val="nil"/>
-          <w:bottom w:val="nil"/>
-          <w:right w:val="nil"/>
-          <w:between w:val="nil"/>
-        </w:pBdr>
-        <w:jc w:val="both"/>
-        <w:rPr>
-          <w:rFonts w:ascii="Times New Roman" w:eastAsia="Times New Roman" w:hAnsi="Times New Roman" w:cs="Times New Roman"/>
-          <w:sz w:val="24"/>
-          <w:szCs w:val="24"/>
-        </w:rPr>
-      </w:pPr>
-    </w:p>
-    <w:p>
-      <w:pPr>
-        <w:pBdr>
-          <w:top w:val="nil"/>
-          <w:left w:val="nil"/>
-          <w:bottom w:val="nil"/>
-          <w:right w:val="nil"/>
-          <w:between w:val="nil"/>
-        </w:pBdr>
-        <w:jc w:val="both"/>
-        <w:rPr>
-          <w:rFonts w:ascii="Times New Roman" w:eastAsia="Times New Roman" w:hAnsi="Times New Roman" w:cs="Times New Roman"/>
-          <w:sz w:val="24"/>
-          <w:szCs w:val="24"/>
-        </w:rPr>
-      </w:pPr>
-      <w:r>
-        <w:rPr>
-          <w:rFonts w:ascii="Times New Roman" w:eastAsia="Times New Roman" w:hAnsi="Times New Roman" w:cs="Times New Roman"/>
-          <w:sz w:val="24"/>
-          <w:szCs w:val="24"/>
-        </w:rPr>
-        <w:t>Captura 6: Haz una captura de la pantalla de comidas de una mascota donde se vea la rutina configurada y el historial de tomas.</w:t>
       </w:r>
     </w:p>
     <w:p>
@@ -17133,27 +18160,175 @@
     </w:p>
     <w:p>
       <w:pPr>
-        <w:pBdr>
-          <w:top w:val="nil"/>
-          <w:left w:val="nil"/>
-          <w:bottom w:val="nil"/>
-          <w:right w:val="nil"/>
-          <w:between w:val="nil"/>
-        </w:pBdr>
-        <w:jc w:val="both"/>
-        <w:rPr>
-          <w:rFonts w:ascii="Times New Roman" w:eastAsia="Times New Roman" w:hAnsi="Times New Roman" w:cs="Times New Roman"/>
-          <w:sz w:val="24"/>
-          <w:szCs w:val="24"/>
-        </w:rPr>
-      </w:pPr>
-      <w:r>
-        <w:rPr>
-          <w:rFonts w:ascii="Times New Roman" w:eastAsia="Times New Roman" w:hAnsi="Times New Roman" w:cs="Times New Roman"/>
-          <w:sz w:val="24"/>
-          <w:szCs w:val="24"/>
-        </w:rPr>
-        <w:t>[Insertar aquí la Figura X. Registro e historial de paseos.]</w:t>
+        <w:keepNext/>
+        <w:pBdr>
+          <w:top w:val="nil"/>
+          <w:left w:val="nil"/>
+          <w:bottom w:val="nil"/>
+          <w:right w:val="nil"/>
+          <w:between w:val="nil"/>
+        </w:pBdr>
+        <w:jc w:val="center"/>
+      </w:pPr>
+      <w:r>
+        <w:rPr>
+          <w:rFonts w:ascii="Times New Roman" w:eastAsia="Times New Roman" w:hAnsi="Times New Roman" w:cs="Times New Roman"/>
+          <w:noProof/>
+          <w:sz w:val="24"/>
+          <w:szCs w:val="24"/>
+        </w:rPr>
+        <w:drawing>
+          <wp:inline distT="0" distB="0" distL="0" distR="0" wp14:anchorId="6E571D80" wp14:editId="7BF4E465">
+            <wp:extent cx="4370400" cy="2066400"/>
+            <wp:effectExtent l="0" t="0" r="0" b="0"/>
+            <wp:docPr id="107824394" name="Imagen 17"/>
+            <wp:cNvGraphicFramePr>
+              <a:graphicFrameLocks xmlns:a="http://schemas.openxmlformats.org/drawingml/2006/main" noChangeAspect="1"/>
+            </wp:cNvGraphicFramePr>
+            <a:graphic xmlns:a="http://schemas.openxmlformats.org/drawingml/2006/main">
+              <a:graphicData uri="http://schemas.openxmlformats.org/drawingml/2006/picture">
+                <pic:pic xmlns:pic="http://schemas.openxmlformats.org/drawingml/2006/picture">
+                  <pic:nvPicPr>
+                    <pic:cNvPr id="107824394" name="Imagen 107824394"/>
+                    <pic:cNvPicPr/>
+                  </pic:nvPicPr>
+                  <pic:blipFill>
+                    <a:blip r:embed="rId34" cstate="print">
+                      <a:extLst>
+                        <a:ext uri="{28A0092B-C50C-407E-A947-70E740481C1C}">
+                          <a14:useLocalDpi xmlns:a14="http://schemas.microsoft.com/office/drawing/2010/main" val="0"/>
+                        </a:ext>
+                      </a:extLst>
+                    </a:blip>
+                    <a:stretch>
+                      <a:fillRect/>
+                    </a:stretch>
+                  </pic:blipFill>
+                  <pic:spPr>
+                    <a:xfrm>
+                      <a:off x="0" y="0"/>
+                      <a:ext cx="4370400" cy="2066400"/>
+                    </a:xfrm>
+                    <a:prstGeom prst="rect">
+                      <a:avLst/>
+                    </a:prstGeom>
+                  </pic:spPr>
+                </pic:pic>
+              </a:graphicData>
+            </a:graphic>
+          </wp:inline>
+        </w:drawing>
+      </w:r>
+    </w:p>
+    <w:p>
+      <w:pPr>
+        <w:pStyle w:val="Descripcin"/>
+        <w:ind w:firstLine="720"/>
+        <w:jc w:val="both"/>
+      </w:pPr>
+      <w:r>
+        <w:t xml:space="preserve">    Ilustración </w:t>
+      </w:r>
+      <w:fldSimple w:instr=" SEQ Ilustración \* ARABIC ">
+        <w:r>
+          <w:rPr>
+            <w:noProof/>
+          </w:rPr>
+          <w:t>17</w:t>
+        </w:r>
+      </w:fldSimple>
+      <w:r>
+        <w:t>: CarePet pantalla paseos</w:t>
+      </w:r>
+    </w:p>
+    <w:p/>
+    <w:p>
+      <w:pPr>
+        <w:keepNext/>
+        <w:pBdr>
+          <w:top w:val="nil"/>
+          <w:left w:val="nil"/>
+          <w:bottom w:val="nil"/>
+          <w:right w:val="nil"/>
+          <w:between w:val="nil"/>
+        </w:pBdr>
+        <w:jc w:val="center"/>
+      </w:pPr>
+      <w:r>
+        <w:rPr>
+          <w:rFonts w:ascii="Times New Roman" w:eastAsia="Times New Roman" w:hAnsi="Times New Roman" w:cs="Times New Roman"/>
+          <w:noProof/>
+          <w:sz w:val="24"/>
+          <w:szCs w:val="24"/>
+        </w:rPr>
+        <w:lastRenderedPageBreak/>
+        <w:drawing>
+          <wp:inline distT="0" distB="0" distL="0" distR="0" wp14:anchorId="2EC4E76A" wp14:editId="2FB633FB">
+            <wp:extent cx="4381200" cy="2066400"/>
+            <wp:effectExtent l="0" t="0" r="635" b="0"/>
+            <wp:docPr id="2112099293" name="Imagen 18"/>
+            <wp:cNvGraphicFramePr>
+              <a:graphicFrameLocks xmlns:a="http://schemas.openxmlformats.org/drawingml/2006/main" noChangeAspect="1"/>
+            </wp:cNvGraphicFramePr>
+            <a:graphic xmlns:a="http://schemas.openxmlformats.org/drawingml/2006/main">
+              <a:graphicData uri="http://schemas.openxmlformats.org/drawingml/2006/picture">
+                <pic:pic xmlns:pic="http://schemas.openxmlformats.org/drawingml/2006/picture">
+                  <pic:nvPicPr>
+                    <pic:cNvPr id="2112099293" name="Imagen 2112099293"/>
+                    <pic:cNvPicPr/>
+                  </pic:nvPicPr>
+                  <pic:blipFill>
+                    <a:blip r:embed="rId35" cstate="print">
+                      <a:extLst>
+                        <a:ext uri="{28A0092B-C50C-407E-A947-70E740481C1C}">
+                          <a14:useLocalDpi xmlns:a14="http://schemas.microsoft.com/office/drawing/2010/main" val="0"/>
+                        </a:ext>
+                      </a:extLst>
+                    </a:blip>
+                    <a:stretch>
+                      <a:fillRect/>
+                    </a:stretch>
+                  </pic:blipFill>
+                  <pic:spPr>
+                    <a:xfrm>
+                      <a:off x="0" y="0"/>
+                      <a:ext cx="4381200" cy="2066400"/>
+                    </a:xfrm>
+                    <a:prstGeom prst="rect">
+                      <a:avLst/>
+                    </a:prstGeom>
+                  </pic:spPr>
+                </pic:pic>
+              </a:graphicData>
+            </a:graphic>
+          </wp:inline>
+        </w:drawing>
+      </w:r>
+    </w:p>
+    <w:p>
+      <w:pPr>
+        <w:pStyle w:val="Descripcin"/>
+        <w:ind w:firstLine="720"/>
+        <w:jc w:val="both"/>
+        <w:rPr>
+          <w:rFonts w:ascii="Times New Roman" w:eastAsia="Times New Roman" w:hAnsi="Times New Roman" w:cs="Times New Roman"/>
+          <w:sz w:val="24"/>
+          <w:szCs w:val="24"/>
+        </w:rPr>
+      </w:pPr>
+      <w:r>
+        <w:t xml:space="preserve">    Ilustración </w:t>
+      </w:r>
+      <w:fldSimple w:instr=" SEQ Ilustración \* ARABIC ">
+        <w:r>
+          <w:rPr>
+            <w:noProof/>
+          </w:rPr>
+          <w:t>18</w:t>
+        </w:r>
+      </w:fldSimple>
+      <w:r>
+        <w:t>: CarePet modal registro paseo</w:t>
       </w:r>
     </w:p>
     <w:p>
@@ -17232,49 +18407,6 @@
           <w:szCs w:val="24"/>
         </w:rPr>
       </w:pPr>
-    </w:p>
-    <w:p>
-      <w:pPr>
-        <w:pBdr>
-          <w:top w:val="nil"/>
-          <w:left w:val="nil"/>
-          <w:bottom w:val="nil"/>
-          <w:right w:val="nil"/>
-          <w:between w:val="nil"/>
-        </w:pBdr>
-        <w:jc w:val="both"/>
-        <w:rPr>
-          <w:rFonts w:ascii="Times New Roman" w:eastAsia="Times New Roman" w:hAnsi="Times New Roman" w:cs="Times New Roman"/>
-          <w:sz w:val="24"/>
-          <w:szCs w:val="24"/>
-        </w:rPr>
-      </w:pPr>
-      <w:r>
-        <w:rPr>
-          <w:rFonts w:ascii="Times New Roman" w:eastAsia="Times New Roman" w:hAnsi="Times New Roman" w:cs="Times New Roman"/>
-          <w:sz w:val="24"/>
-          <w:szCs w:val="24"/>
-        </w:rPr>
-        <w:t xml:space="preserve">Captura 7: Haz una captura del historial de paseos de una mascota donde se vean las tarjetas con los </w:t>
-      </w:r>
-      <w:proofErr w:type="spellStart"/>
-      <w:r>
-        <w:rPr>
-          <w:rFonts w:ascii="Times New Roman" w:eastAsia="Times New Roman" w:hAnsi="Times New Roman" w:cs="Times New Roman"/>
-          <w:sz w:val="24"/>
-          <w:szCs w:val="24"/>
-        </w:rPr>
-        <w:t>badges</w:t>
-      </w:r>
-      <w:proofErr w:type="spellEnd"/>
-      <w:r>
-        <w:rPr>
-          <w:rFonts w:ascii="Times New Roman" w:eastAsia="Times New Roman" w:hAnsi="Times New Roman" w:cs="Times New Roman"/>
-          <w:sz w:val="24"/>
-          <w:szCs w:val="24"/>
-        </w:rPr>
-        <w:t xml:space="preserve"> de pipí y caca. Si puedes, abre también el modal de registrar paseo y haz una segunda captura.</w:t>
-      </w:r>
     </w:p>
     <w:p>
       <w:pPr>
@@ -17302,7 +18434,6 @@
           <w:sz w:val="24"/>
           <w:szCs w:val="24"/>
         </w:rPr>
-        <w:lastRenderedPageBreak/>
         <w:t>Perfil de usuario</w:t>
       </w:r>
     </w:p>
@@ -17325,27 +18456,90 @@
     </w:p>
     <w:p>
       <w:pPr>
-        <w:pBdr>
-          <w:top w:val="nil"/>
-          <w:left w:val="nil"/>
-          <w:bottom w:val="nil"/>
-          <w:right w:val="nil"/>
-          <w:between w:val="nil"/>
-        </w:pBdr>
-        <w:jc w:val="both"/>
-        <w:rPr>
-          <w:rFonts w:ascii="Times New Roman" w:eastAsia="Times New Roman" w:hAnsi="Times New Roman" w:cs="Times New Roman"/>
-          <w:sz w:val="24"/>
-          <w:szCs w:val="24"/>
-        </w:rPr>
-      </w:pPr>
-      <w:r>
-        <w:rPr>
-          <w:rFonts w:ascii="Times New Roman" w:eastAsia="Times New Roman" w:hAnsi="Times New Roman" w:cs="Times New Roman"/>
-          <w:sz w:val="24"/>
-          <w:szCs w:val="24"/>
-        </w:rPr>
-        <w:t>[Insertar aquí la Figura X. Pantalla de perfil de usuario.]</w:t>
+        <w:keepNext/>
+        <w:pBdr>
+          <w:top w:val="nil"/>
+          <w:left w:val="nil"/>
+          <w:bottom w:val="nil"/>
+          <w:right w:val="nil"/>
+          <w:between w:val="nil"/>
+        </w:pBdr>
+        <w:jc w:val="center"/>
+      </w:pPr>
+      <w:r>
+        <w:rPr>
+          <w:rFonts w:ascii="Times New Roman" w:eastAsia="Times New Roman" w:hAnsi="Times New Roman" w:cs="Times New Roman"/>
+          <w:noProof/>
+          <w:sz w:val="24"/>
+          <w:szCs w:val="24"/>
+        </w:rPr>
+        <w:drawing>
+          <wp:inline distT="0" distB="0" distL="0" distR="0" wp14:anchorId="7C2A147C" wp14:editId="5D5C0EF2">
+            <wp:extent cx="4370400" cy="2066400"/>
+            <wp:effectExtent l="0" t="0" r="0" b="0"/>
+            <wp:docPr id="1342522872" name="Imagen 19"/>
+            <wp:cNvGraphicFramePr>
+              <a:graphicFrameLocks xmlns:a="http://schemas.openxmlformats.org/drawingml/2006/main" noChangeAspect="1"/>
+            </wp:cNvGraphicFramePr>
+            <a:graphic xmlns:a="http://schemas.openxmlformats.org/drawingml/2006/main">
+              <a:graphicData uri="http://schemas.openxmlformats.org/drawingml/2006/picture">
+                <pic:pic xmlns:pic="http://schemas.openxmlformats.org/drawingml/2006/picture">
+                  <pic:nvPicPr>
+                    <pic:cNvPr id="1342522872" name="Imagen 1342522872"/>
+                    <pic:cNvPicPr/>
+                  </pic:nvPicPr>
+                  <pic:blipFill>
+                    <a:blip r:embed="rId36" cstate="print">
+                      <a:extLst>
+                        <a:ext uri="{28A0092B-C50C-407E-A947-70E740481C1C}">
+                          <a14:useLocalDpi xmlns:a14="http://schemas.microsoft.com/office/drawing/2010/main" val="0"/>
+                        </a:ext>
+                      </a:extLst>
+                    </a:blip>
+                    <a:stretch>
+                      <a:fillRect/>
+                    </a:stretch>
+                  </pic:blipFill>
+                  <pic:spPr>
+                    <a:xfrm>
+                      <a:off x="0" y="0"/>
+                      <a:ext cx="4370400" cy="2066400"/>
+                    </a:xfrm>
+                    <a:prstGeom prst="rect">
+                      <a:avLst/>
+                    </a:prstGeom>
+                  </pic:spPr>
+                </pic:pic>
+              </a:graphicData>
+            </a:graphic>
+          </wp:inline>
+        </w:drawing>
+      </w:r>
+    </w:p>
+    <w:p>
+      <w:pPr>
+        <w:pStyle w:val="Descripcin"/>
+        <w:ind w:firstLine="720"/>
+        <w:jc w:val="both"/>
+        <w:rPr>
+          <w:rFonts w:ascii="Times New Roman" w:eastAsia="Times New Roman" w:hAnsi="Times New Roman" w:cs="Times New Roman"/>
+          <w:sz w:val="24"/>
+          <w:szCs w:val="24"/>
+        </w:rPr>
+      </w:pPr>
+      <w:r>
+        <w:t xml:space="preserve">    Ilustración </w:t>
+      </w:r>
+      <w:fldSimple w:instr=" SEQ Ilustración \* ARABIC ">
+        <w:r>
+          <w:rPr>
+            <w:noProof/>
+          </w:rPr>
+          <w:t>19</w:t>
+        </w:r>
+      </w:fldSimple>
+      <w:r>
+        <w:t>: CarePet pantalla perfil usuario</w:t>
       </w:r>
     </w:p>
     <w:p>
@@ -17388,48 +18582,6 @@
           <w:szCs w:val="24"/>
         </w:rPr>
         <w:t>La sección de perfil muestra la información personal del usuario: nombre, email y fecha de registro. Desde esta pantalla el usuario puede modificar su nombre y cambiar su contraseña, para lo que debe verificar primero la contraseña actual. El sistema valida que la nueva contraseña tenga al menos seis caracteres y que coincida con la confirmación introducida.</w:t>
-      </w:r>
-    </w:p>
-    <w:p>
-      <w:pPr>
-        <w:pBdr>
-          <w:top w:val="nil"/>
-          <w:left w:val="nil"/>
-          <w:bottom w:val="nil"/>
-          <w:right w:val="nil"/>
-          <w:between w:val="nil"/>
-        </w:pBdr>
-        <w:jc w:val="both"/>
-        <w:rPr>
-          <w:rFonts w:ascii="Times New Roman" w:eastAsia="Times New Roman" w:hAnsi="Times New Roman" w:cs="Times New Roman"/>
-          <w:sz w:val="24"/>
-          <w:szCs w:val="24"/>
-        </w:rPr>
-      </w:pPr>
-    </w:p>
-    <w:p>
-      <w:pPr>
-        <w:pBdr>
-          <w:top w:val="nil"/>
-          <w:left w:val="nil"/>
-          <w:bottom w:val="nil"/>
-          <w:right w:val="nil"/>
-          <w:between w:val="nil"/>
-        </w:pBdr>
-        <w:jc w:val="both"/>
-        <w:rPr>
-          <w:rFonts w:ascii="Times New Roman" w:eastAsia="Times New Roman" w:hAnsi="Times New Roman" w:cs="Times New Roman"/>
-          <w:sz w:val="24"/>
-          <w:szCs w:val="24"/>
-        </w:rPr>
-      </w:pPr>
-      <w:r>
-        <w:rPr>
-          <w:rFonts w:ascii="Times New Roman" w:eastAsia="Times New Roman" w:hAnsi="Times New Roman" w:cs="Times New Roman"/>
-          <w:sz w:val="24"/>
-          <w:szCs w:val="24"/>
-        </w:rPr>
-        <w:t>Captura 8: Haz una captura de la pantalla de perfil de usuario.</w:t>
       </w:r>
     </w:p>
     <w:p>
@@ -17497,27 +18649,91 @@
     </w:p>
     <w:p>
       <w:pPr>
-        <w:pBdr>
-          <w:top w:val="nil"/>
-          <w:left w:val="nil"/>
-          <w:bottom w:val="nil"/>
-          <w:right w:val="nil"/>
-          <w:between w:val="nil"/>
-        </w:pBdr>
-        <w:jc w:val="both"/>
-        <w:rPr>
-          <w:rFonts w:ascii="Times New Roman" w:eastAsia="Times New Roman" w:hAnsi="Times New Roman" w:cs="Times New Roman"/>
-          <w:sz w:val="24"/>
-          <w:szCs w:val="24"/>
-        </w:rPr>
-      </w:pPr>
-      <w:r>
-        <w:rPr>
-          <w:rFonts w:ascii="Times New Roman" w:eastAsia="Times New Roman" w:hAnsi="Times New Roman" w:cs="Times New Roman"/>
-          <w:sz w:val="24"/>
-          <w:szCs w:val="24"/>
-        </w:rPr>
-        <w:t>[Insertar aquí la Figura X. Vista de la aplicación en dispositivo móvil con barra de navegación inferior.]</w:t>
+        <w:keepNext/>
+        <w:pBdr>
+          <w:top w:val="nil"/>
+          <w:left w:val="nil"/>
+          <w:bottom w:val="nil"/>
+          <w:right w:val="nil"/>
+          <w:between w:val="nil"/>
+        </w:pBdr>
+        <w:jc w:val="center"/>
+      </w:pPr>
+      <w:r>
+        <w:rPr>
+          <w:rFonts w:ascii="Times New Roman" w:eastAsia="Times New Roman" w:hAnsi="Times New Roman" w:cs="Times New Roman"/>
+          <w:noProof/>
+          <w:sz w:val="24"/>
+          <w:szCs w:val="24"/>
+        </w:rPr>
+        <w:lastRenderedPageBreak/>
+        <w:drawing>
+          <wp:inline distT="0" distB="0" distL="0" distR="0" wp14:anchorId="771DDEDD" wp14:editId="121EC2DE">
+            <wp:extent cx="1523365" cy="3117507"/>
+            <wp:effectExtent l="0" t="0" r="635" b="6985"/>
+            <wp:docPr id="1414046880" name="Imagen 20"/>
+            <wp:cNvGraphicFramePr>
+              <a:graphicFrameLocks xmlns:a="http://schemas.openxmlformats.org/drawingml/2006/main" noChangeAspect="1"/>
+            </wp:cNvGraphicFramePr>
+            <a:graphic xmlns:a="http://schemas.openxmlformats.org/drawingml/2006/main">
+              <a:graphicData uri="http://schemas.openxmlformats.org/drawingml/2006/picture">
+                <pic:pic xmlns:pic="http://schemas.openxmlformats.org/drawingml/2006/picture">
+                  <pic:nvPicPr>
+                    <pic:cNvPr id="1414046880" name="Imagen 1414046880"/>
+                    <pic:cNvPicPr/>
+                  </pic:nvPicPr>
+                  <pic:blipFill>
+                    <a:blip r:embed="rId37" cstate="print">
+                      <a:extLst>
+                        <a:ext uri="{28A0092B-C50C-407E-A947-70E740481C1C}">
+                          <a14:useLocalDpi xmlns:a14="http://schemas.microsoft.com/office/drawing/2010/main" val="0"/>
+                        </a:ext>
+                      </a:extLst>
+                    </a:blip>
+                    <a:stretch>
+                      <a:fillRect/>
+                    </a:stretch>
+                  </pic:blipFill>
+                  <pic:spPr>
+                    <a:xfrm>
+                      <a:off x="0" y="0"/>
+                      <a:ext cx="1537910" cy="3147274"/>
+                    </a:xfrm>
+                    <a:prstGeom prst="rect">
+                      <a:avLst/>
+                    </a:prstGeom>
+                  </pic:spPr>
+                </pic:pic>
+              </a:graphicData>
+            </a:graphic>
+          </wp:inline>
+        </w:drawing>
+      </w:r>
+    </w:p>
+    <w:p>
+      <w:pPr>
+        <w:pStyle w:val="Descripcin"/>
+        <w:ind w:left="2160"/>
+        <w:jc w:val="both"/>
+        <w:rPr>
+          <w:rFonts w:ascii="Times New Roman" w:eastAsia="Times New Roman" w:hAnsi="Times New Roman" w:cs="Times New Roman"/>
+          <w:sz w:val="24"/>
+          <w:szCs w:val="24"/>
+        </w:rPr>
+      </w:pPr>
+      <w:r>
+        <w:t xml:space="preserve">    Ilustración </w:t>
+      </w:r>
+      <w:fldSimple w:instr=" SEQ Ilustración \* ARABIC ">
+        <w:r>
+          <w:rPr>
+            <w:noProof/>
+          </w:rPr>
+          <w:t>20</w:t>
+        </w:r>
+      </w:fldSimple>
+      <w:r>
+        <w:t>: CarePet vista responsive desde móvil</w:t>
       </w:r>
     </w:p>
     <w:p>
@@ -17578,66 +18794,6 @@
           <w:szCs w:val="24"/>
         </w:rPr>
         <w:t xml:space="preserve"> lateral. La aplicación puede instalarse como PWA desde el navegador del móvil, lo que permite acceder a ella directamente desde la pantalla de inicio del dispositivo sin necesidad de descargarla desde ninguna tienda de aplicaciones.</w:t>
-      </w:r>
-    </w:p>
-    <w:p>
-      <w:pPr>
-        <w:pBdr>
-          <w:top w:val="nil"/>
-          <w:left w:val="nil"/>
-          <w:bottom w:val="nil"/>
-          <w:right w:val="nil"/>
-          <w:between w:val="nil"/>
-        </w:pBdr>
-        <w:jc w:val="both"/>
-        <w:rPr>
-          <w:rFonts w:ascii="Times New Roman" w:eastAsia="Times New Roman" w:hAnsi="Times New Roman" w:cs="Times New Roman"/>
-          <w:sz w:val="24"/>
-          <w:szCs w:val="24"/>
-        </w:rPr>
-      </w:pPr>
-    </w:p>
-    <w:p>
-      <w:pPr>
-        <w:pBdr>
-          <w:top w:val="nil"/>
-          <w:left w:val="nil"/>
-          <w:bottom w:val="nil"/>
-          <w:right w:val="nil"/>
-          <w:between w:val="nil"/>
-        </w:pBdr>
-        <w:jc w:val="both"/>
-        <w:rPr>
-          <w:rFonts w:ascii="Times New Roman" w:eastAsia="Times New Roman" w:hAnsi="Times New Roman" w:cs="Times New Roman"/>
-          <w:sz w:val="24"/>
-          <w:szCs w:val="24"/>
-        </w:rPr>
-      </w:pPr>
-      <w:r>
-        <w:rPr>
-          <w:rFonts w:ascii="Times New Roman" w:eastAsia="Times New Roman" w:hAnsi="Times New Roman" w:cs="Times New Roman"/>
-          <w:sz w:val="24"/>
-          <w:szCs w:val="24"/>
-        </w:rPr>
-        <w:t xml:space="preserve">Captura 9: Abre la aplicación desde el navegador del móvil y haz una captura donde se vea la barra de navegación inferior. Si tienes la </w:t>
-      </w:r>
-      <w:proofErr w:type="gramStart"/>
-      <w:r>
-        <w:rPr>
-          <w:rFonts w:ascii="Times New Roman" w:eastAsia="Times New Roman" w:hAnsi="Times New Roman" w:cs="Times New Roman"/>
-          <w:sz w:val="24"/>
-          <w:szCs w:val="24"/>
-        </w:rPr>
-        <w:t>app</w:t>
-      </w:r>
-      <w:proofErr w:type="gramEnd"/>
-      <w:r>
-        <w:rPr>
-          <w:rFonts w:ascii="Times New Roman" w:eastAsia="Times New Roman" w:hAnsi="Times New Roman" w:cs="Times New Roman"/>
-          <w:sz w:val="24"/>
-          <w:szCs w:val="24"/>
-        </w:rPr>
-        <w:t xml:space="preserve"> instalada como PWA, haz también una captura de la pantalla de inicio del móvil donde se vea el icono de CarePet.</w:t>
       </w:r>
     </w:p>
     <w:p>
@@ -17930,8 +19086,16 @@
           <w:sz w:val="24"/>
           <w:szCs w:val="24"/>
         </w:rPr>
+        <w:t xml:space="preserve">Para resolver este problema se actuó en dos niveles. Por un lado, se configuró la funcionalidad de proxy integrada en Vite mediante el archivo vite.config.js, redirigiendo de forma transparente todas las peticiones cuya ruta comienza por /api hacia el servidor backend </w:t>
+      </w:r>
+      <w:r>
+        <w:rPr>
+          <w:rFonts w:ascii="Times New Roman" w:eastAsia="Times New Roman" w:hAnsi="Times New Roman" w:cs="Times New Roman"/>
+          <w:sz w:val="24"/>
+          <w:szCs w:val="24"/>
+        </w:rPr>
         <w:lastRenderedPageBreak/>
-        <w:t>Para resolver este problema se actuó en dos niveles. Por un lado, se configuró la funcionalidad de proxy integrada en Vite mediante el archivo vite.config.js, redirigiendo de forma transparente todas las peticiones cuya ruta comienza por /api hacia el servidor backend en http://localhost:8080. Por otro lado, se habilitó la configuración de CORS en la clase SecurityConfig.java del backend, permitiendo las peticiones procedentes del origen del frontend. De este modo se eliminaron los errores de CORS tanto en el entorno de desarrollo como en producción.</w:t>
+        <w:t>en http://localhost:8080. Por otro lado, se habilitó la configuración de CORS en la clase SecurityConfig.java del backend, permitiendo las peticiones procedentes del origen del frontend. De este modo se eliminaron los errores de CORS tanto en el entorno de desarrollo como en producción.</w:t>
       </w:r>
     </w:p>
     <w:p>
@@ -18653,16 +19817,7 @@
           <w:sz w:val="24"/>
           <w:szCs w:val="24"/>
         </w:rPr>
-        <w:t xml:space="preserve">Se detectó que las medicaciones cuya fecha de fin había sido superada continuaban apareciendo como activas en la interfaz, a pesar de que el sistema debería marcarlas </w:t>
-      </w:r>
-      <w:r>
-        <w:rPr>
-          <w:rFonts w:ascii="Times New Roman" w:eastAsia="Times New Roman" w:hAnsi="Times New Roman" w:cs="Times New Roman"/>
-          <w:sz w:val="24"/>
-          <w:szCs w:val="24"/>
-        </w:rPr>
-        <w:lastRenderedPageBreak/>
-        <w:t xml:space="preserve">automáticamente como finalizadas. El problema tenía dos causas relacionadas. Por un lado, el método </w:t>
+        <w:t xml:space="preserve">Se detectó que las medicaciones cuya fecha de fin había sido superada continuaban apareciendo como activas en la interfaz, a pesar de que el sistema debería marcarlas automáticamente como finalizadas. El problema tenía dos causas relacionadas. Por un lado, el método </w:t>
       </w:r>
       <w:proofErr w:type="spellStart"/>
       <w:r>
@@ -18682,7 +19837,16 @@
           <w:sz w:val="24"/>
           <w:szCs w:val="24"/>
         </w:rPr>
-        <w:t xml:space="preserve"> utilizaba directamente el valor del campo active almacenado en la base de datos, que nunca se actualizaba de forma automática al superar la fecha de fin. Por otro lado, el repositorio utilizaba el método </w:t>
+        <w:t xml:space="preserve"> utilizaba directamente el valor del campo active almacenado en la base de datos, que nunca se actualizaba de forma automática al superar la </w:t>
+      </w:r>
+      <w:r>
+        <w:rPr>
+          <w:rFonts w:ascii="Times New Roman" w:eastAsia="Times New Roman" w:hAnsi="Times New Roman" w:cs="Times New Roman"/>
+          <w:sz w:val="24"/>
+          <w:szCs w:val="24"/>
+        </w:rPr>
+        <w:lastRenderedPageBreak/>
+        <w:t xml:space="preserve">fecha de fin. Por otro lado, el repositorio utilizaba el método </w:t>
       </w:r>
       <w:proofErr w:type="spellStart"/>
       <w:r>
@@ -19312,7 +20476,6 @@
           <w:sz w:val="24"/>
           <w:szCs w:val="24"/>
         </w:rPr>
-        <w:lastRenderedPageBreak/>
         <w:t xml:space="preserve">ALTER TABLE </w:t>
       </w:r>
       <w:proofErr w:type="spellStart"/>
@@ -19463,6 +20626,7 @@
           <w:sz w:val="36"/>
           <w:szCs w:val="36"/>
         </w:rPr>
+        <w:lastRenderedPageBreak/>
         <w:t>4.5.- Pruebas/Implantación</w:t>
       </w:r>
     </w:p>
@@ -21626,6 +22790,25 @@
       <w:contextualSpacing/>
     </w:pPr>
   </w:style>
+  <w:style w:type="paragraph" w:styleId="Descripcin">
+    <w:name w:val="caption"/>
+    <w:basedOn w:val="Normal"/>
+    <w:next w:val="Normal"/>
+    <w:uiPriority w:val="35"/>
+    <w:unhideWhenUsed/>
+    <w:qFormat/>
+    <w:rsid w:val="00E35013"/>
+    <w:pPr>
+      <w:spacing w:after="200" w:line="240" w:lineRule="auto"/>
+    </w:pPr>
+    <w:rPr>
+      <w:i/>
+      <w:iCs/>
+      <w:color w:val="1F497D" w:themeColor="text2"/>
+      <w:sz w:val="18"/>
+      <w:szCs w:val="18"/>
+    </w:rPr>
+  </w:style>
 </w:styles>
 </file>
 

</xml_diff>

<commit_message>
Capitulo 4 updated and gitignore
</commit_message>
<xml_diff>
--- a/docs/Capítulo 4 - Metodología y resultados.docx
+++ b/docs/Capítulo 4 - Metodología y resultados.docx
@@ -15545,6 +15545,23 @@
           <w:szCs w:val="24"/>
         </w:rPr>
       </w:pPr>
+    </w:p>
+    <w:p>
+      <w:pPr>
+        <w:pBdr>
+          <w:top w:val="nil"/>
+          <w:left w:val="nil"/>
+          <w:bottom w:val="nil"/>
+          <w:right w:val="nil"/>
+          <w:between w:val="nil"/>
+        </w:pBdr>
+        <w:jc w:val="both"/>
+        <w:rPr>
+          <w:rFonts w:ascii="Times New Roman" w:eastAsia="Times New Roman" w:hAnsi="Times New Roman" w:cs="Times New Roman"/>
+          <w:sz w:val="24"/>
+          <w:szCs w:val="24"/>
+        </w:rPr>
+      </w:pPr>
       <w:r>
         <w:rPr>
           <w:rFonts w:ascii="Times New Roman" w:eastAsia="Times New Roman" w:hAnsi="Times New Roman" w:cs="Times New Roman"/>
@@ -16023,27 +16040,201 @@
     </w:p>
     <w:p>
       <w:pPr>
-        <w:pBdr>
-          <w:top w:val="nil"/>
-          <w:left w:val="nil"/>
-          <w:bottom w:val="nil"/>
-          <w:right w:val="nil"/>
-          <w:between w:val="nil"/>
-        </w:pBdr>
-        <w:jc w:val="both"/>
-        <w:rPr>
-          <w:rFonts w:ascii="Times New Roman" w:eastAsia="Times New Roman" w:hAnsi="Times New Roman" w:cs="Times New Roman"/>
-          <w:sz w:val="24"/>
-          <w:szCs w:val="24"/>
-        </w:rPr>
-      </w:pPr>
-      <w:r>
-        <w:rPr>
-          <w:rFonts w:ascii="Times New Roman" w:eastAsia="Times New Roman" w:hAnsi="Times New Roman" w:cs="Times New Roman"/>
-          <w:sz w:val="24"/>
-          <w:szCs w:val="24"/>
-        </w:rPr>
-        <w:t>[Insertar aquí la Figura X. Pantallas de registro e inicio de sesión de CarePet.]</w:t>
+        <w:keepNext/>
+        <w:pBdr>
+          <w:top w:val="nil"/>
+          <w:left w:val="nil"/>
+          <w:bottom w:val="nil"/>
+          <w:right w:val="nil"/>
+          <w:between w:val="nil"/>
+        </w:pBdr>
+        <w:jc w:val="center"/>
+      </w:pPr>
+      <w:r>
+        <w:rPr>
+          <w:rFonts w:ascii="Times New Roman" w:eastAsia="Times New Roman" w:hAnsi="Times New Roman" w:cs="Times New Roman"/>
+          <w:noProof/>
+          <w:sz w:val="24"/>
+          <w:szCs w:val="24"/>
+        </w:rPr>
+        <w:lastRenderedPageBreak/>
+        <w:drawing>
+          <wp:inline distT="0" distB="0" distL="0" distR="0" wp14:anchorId="16B4F077" wp14:editId="0A6ACA76">
+            <wp:extent cx="4362450" cy="2065561"/>
+            <wp:effectExtent l="0" t="0" r="0" b="0"/>
+            <wp:docPr id="1312645114" name="Imagen 1"/>
+            <wp:cNvGraphicFramePr>
+              <a:graphicFrameLocks xmlns:a="http://schemas.openxmlformats.org/drawingml/2006/main" noChangeAspect="1"/>
+            </wp:cNvGraphicFramePr>
+            <a:graphic xmlns:a="http://schemas.openxmlformats.org/drawingml/2006/main">
+              <a:graphicData uri="http://schemas.openxmlformats.org/drawingml/2006/picture">
+                <pic:pic xmlns:pic="http://schemas.openxmlformats.org/drawingml/2006/picture">
+                  <pic:nvPicPr>
+                    <pic:cNvPr id="1312645114" name="Imagen 1312645114"/>
+                    <pic:cNvPicPr/>
+                  </pic:nvPicPr>
+                  <pic:blipFill>
+                    <a:blip r:embed="rId18" cstate="print">
+                      <a:extLst>
+                        <a:ext uri="{28A0092B-C50C-407E-A947-70E740481C1C}">
+                          <a14:useLocalDpi xmlns:a14="http://schemas.microsoft.com/office/drawing/2010/main" val="0"/>
+                        </a:ext>
+                      </a:extLst>
+                    </a:blip>
+                    <a:stretch>
+                      <a:fillRect/>
+                    </a:stretch>
+                  </pic:blipFill>
+                  <pic:spPr>
+                    <a:xfrm>
+                      <a:off x="0" y="0"/>
+                      <a:ext cx="4401881" cy="2084231"/>
+                    </a:xfrm>
+                    <a:prstGeom prst="rect">
+                      <a:avLst/>
+                    </a:prstGeom>
+                  </pic:spPr>
+                </pic:pic>
+              </a:graphicData>
+            </a:graphic>
+          </wp:inline>
+        </w:drawing>
+      </w:r>
+    </w:p>
+    <w:p>
+      <w:pPr>
+        <w:pStyle w:val="Descripcin"/>
+        <w:ind w:firstLine="720"/>
+        <w:jc w:val="both"/>
+        <w:rPr>
+          <w:rFonts w:ascii="Times New Roman" w:eastAsia="Times New Roman" w:hAnsi="Times New Roman" w:cs="Times New Roman"/>
+          <w:sz w:val="24"/>
+          <w:szCs w:val="24"/>
+        </w:rPr>
+      </w:pPr>
+      <w:r>
+        <w:t xml:space="preserve">    Ilustración </w:t>
+      </w:r>
+      <w:fldSimple w:instr=" SEQ Ilustración \* ARABIC ">
+        <w:r>
+          <w:rPr>
+            <w:noProof/>
+          </w:rPr>
+          <w:t>1</w:t>
+        </w:r>
+      </w:fldSimple>
+      <w:r>
+        <w:t xml:space="preserve">: CarePet pantalla </w:t>
+      </w:r>
+      <w:proofErr w:type="spellStart"/>
+      <w:r>
+        <w:t>login</w:t>
+      </w:r>
+      <w:proofErr w:type="spellEnd"/>
+    </w:p>
+    <w:p>
+      <w:pPr>
+        <w:pBdr>
+          <w:top w:val="nil"/>
+          <w:left w:val="nil"/>
+          <w:bottom w:val="nil"/>
+          <w:right w:val="nil"/>
+          <w:between w:val="nil"/>
+        </w:pBdr>
+        <w:jc w:val="both"/>
+        <w:rPr>
+          <w:rFonts w:ascii="Times New Roman" w:eastAsia="Times New Roman" w:hAnsi="Times New Roman" w:cs="Times New Roman"/>
+          <w:sz w:val="24"/>
+          <w:szCs w:val="24"/>
+        </w:rPr>
+      </w:pPr>
+    </w:p>
+    <w:p>
+      <w:pPr>
+        <w:keepNext/>
+        <w:pBdr>
+          <w:top w:val="nil"/>
+          <w:left w:val="nil"/>
+          <w:bottom w:val="nil"/>
+          <w:right w:val="nil"/>
+          <w:between w:val="nil"/>
+        </w:pBdr>
+        <w:jc w:val="center"/>
+      </w:pPr>
+      <w:r>
+        <w:rPr>
+          <w:rFonts w:ascii="Times New Roman" w:eastAsia="Times New Roman" w:hAnsi="Times New Roman" w:cs="Times New Roman"/>
+          <w:noProof/>
+          <w:sz w:val="24"/>
+          <w:szCs w:val="24"/>
+        </w:rPr>
+        <w:drawing>
+          <wp:inline distT="0" distB="0" distL="0" distR="0" wp14:anchorId="4CFCE004" wp14:editId="6AFD1711">
+            <wp:extent cx="4367605" cy="2065020"/>
+            <wp:effectExtent l="0" t="0" r="0" b="0"/>
+            <wp:docPr id="791522054" name="Imagen 2"/>
+            <wp:cNvGraphicFramePr>
+              <a:graphicFrameLocks xmlns:a="http://schemas.openxmlformats.org/drawingml/2006/main" noChangeAspect="1"/>
+            </wp:cNvGraphicFramePr>
+            <a:graphic xmlns:a="http://schemas.openxmlformats.org/drawingml/2006/main">
+              <a:graphicData uri="http://schemas.openxmlformats.org/drawingml/2006/picture">
+                <pic:pic xmlns:pic="http://schemas.openxmlformats.org/drawingml/2006/picture">
+                  <pic:nvPicPr>
+                    <pic:cNvPr id="791522054" name="Imagen 791522054"/>
+                    <pic:cNvPicPr/>
+                  </pic:nvPicPr>
+                  <pic:blipFill>
+                    <a:blip r:embed="rId19" cstate="print">
+                      <a:extLst>
+                        <a:ext uri="{28A0092B-C50C-407E-A947-70E740481C1C}">
+                          <a14:useLocalDpi xmlns:a14="http://schemas.microsoft.com/office/drawing/2010/main" val="0"/>
+                        </a:ext>
+                      </a:extLst>
+                    </a:blip>
+                    <a:stretch>
+                      <a:fillRect/>
+                    </a:stretch>
+                  </pic:blipFill>
+                  <pic:spPr>
+                    <a:xfrm>
+                      <a:off x="0" y="0"/>
+                      <a:ext cx="4392628" cy="2076851"/>
+                    </a:xfrm>
+                    <a:prstGeom prst="rect">
+                      <a:avLst/>
+                    </a:prstGeom>
+                  </pic:spPr>
+                </pic:pic>
+              </a:graphicData>
+            </a:graphic>
+          </wp:inline>
+        </w:drawing>
+      </w:r>
+    </w:p>
+    <w:p>
+      <w:pPr>
+        <w:pStyle w:val="Descripcin"/>
+        <w:ind w:firstLine="720"/>
+        <w:jc w:val="both"/>
+        <w:rPr>
+          <w:rFonts w:ascii="Times New Roman" w:eastAsia="Times New Roman" w:hAnsi="Times New Roman" w:cs="Times New Roman"/>
+          <w:sz w:val="24"/>
+          <w:szCs w:val="24"/>
+        </w:rPr>
+      </w:pPr>
+      <w:r>
+        <w:t xml:space="preserve">    Ilustración </w:t>
+      </w:r>
+      <w:fldSimple w:instr=" SEQ Ilustración \* ARABIC ">
+        <w:r>
+          <w:rPr>
+            <w:noProof/>
+          </w:rPr>
+          <w:t>2</w:t>
+        </w:r>
+      </w:fldSimple>
+      <w:r>
+        <w:t>: CarePet pantalla registro</w:t>
       </w:r>
     </w:p>
     <w:p>
@@ -16104,50 +16295,6 @@
           <w:szCs w:val="24"/>
         </w:rPr>
         <w:t xml:space="preserve"> principal.</w:t>
-      </w:r>
-    </w:p>
-    <w:p>
-      <w:pPr>
-        <w:pBdr>
-          <w:top w:val="nil"/>
-          <w:left w:val="nil"/>
-          <w:bottom w:val="nil"/>
-          <w:right w:val="nil"/>
-          <w:between w:val="nil"/>
-        </w:pBdr>
-        <w:jc w:val="both"/>
-        <w:rPr>
-          <w:rFonts w:ascii="Times New Roman" w:eastAsia="Times New Roman" w:hAnsi="Times New Roman" w:cs="Times New Roman"/>
-          <w:sz w:val="24"/>
-          <w:szCs w:val="24"/>
-        </w:rPr>
-      </w:pPr>
-      <w:r>
-        <w:rPr>
-          <w:rFonts w:ascii="Times New Roman" w:eastAsia="Times New Roman" w:hAnsi="Times New Roman" w:cs="Times New Roman"/>
-          <w:sz w:val="24"/>
-          <w:szCs w:val="24"/>
-        </w:rPr>
-        <w:lastRenderedPageBreak/>
-        <w:t xml:space="preserve">Captura 1: Abre la aplicación sin iniciar sesión. Haz una captura de la pantalla de </w:t>
-      </w:r>
-      <w:proofErr w:type="spellStart"/>
-      <w:r>
-        <w:rPr>
-          <w:rFonts w:ascii="Times New Roman" w:eastAsia="Times New Roman" w:hAnsi="Times New Roman" w:cs="Times New Roman"/>
-          <w:sz w:val="24"/>
-          <w:szCs w:val="24"/>
-        </w:rPr>
-        <w:t>login</w:t>
-      </w:r>
-      <w:proofErr w:type="spellEnd"/>
-      <w:r>
-        <w:rPr>
-          <w:rFonts w:ascii="Times New Roman" w:eastAsia="Times New Roman" w:hAnsi="Times New Roman" w:cs="Times New Roman"/>
-          <w:sz w:val="24"/>
-          <w:szCs w:val="24"/>
-        </w:rPr>
-        <w:t>. Luego pulsa en el enlace de registro y haz una segunda captura del formulario de registro. Si puedes, ponlas juntas en una sola imagen o inclúyelas como dos figuras separadas.</w:t>
       </w:r>
     </w:p>
     <w:p>
@@ -16227,46 +16374,97 @@
     </w:p>
     <w:p>
       <w:pPr>
-        <w:pBdr>
-          <w:top w:val="nil"/>
-          <w:left w:val="nil"/>
-          <w:bottom w:val="nil"/>
-          <w:right w:val="nil"/>
-          <w:between w:val="nil"/>
-        </w:pBdr>
-        <w:jc w:val="both"/>
-        <w:rPr>
-          <w:rFonts w:ascii="Times New Roman" w:eastAsia="Times New Roman" w:hAnsi="Times New Roman" w:cs="Times New Roman"/>
-          <w:sz w:val="24"/>
-          <w:szCs w:val="24"/>
-        </w:rPr>
-      </w:pPr>
-      <w:r>
-        <w:rPr>
-          <w:rFonts w:ascii="Times New Roman" w:eastAsia="Times New Roman" w:hAnsi="Times New Roman" w:cs="Times New Roman"/>
-          <w:sz w:val="24"/>
-          <w:szCs w:val="24"/>
-        </w:rPr>
-        <w:t xml:space="preserve">[Insertar aquí la Figura X. </w:t>
+        <w:keepNext/>
+        <w:pBdr>
+          <w:top w:val="nil"/>
+          <w:left w:val="nil"/>
+          <w:bottom w:val="nil"/>
+          <w:right w:val="nil"/>
+          <w:between w:val="nil"/>
+        </w:pBdr>
+        <w:jc w:val="center"/>
+      </w:pPr>
+      <w:r>
+        <w:rPr>
+          <w:rFonts w:ascii="Times New Roman" w:eastAsia="Times New Roman" w:hAnsi="Times New Roman" w:cs="Times New Roman"/>
+          <w:noProof/>
+          <w:sz w:val="24"/>
+          <w:szCs w:val="24"/>
+        </w:rPr>
+        <w:lastRenderedPageBreak/>
+        <w:drawing>
+          <wp:inline distT="0" distB="0" distL="0" distR="0" wp14:anchorId="123ED6E0" wp14:editId="4B3FD5E2">
+            <wp:extent cx="4366800" cy="2066400"/>
+            <wp:effectExtent l="0" t="0" r="0" b="0"/>
+            <wp:docPr id="415048600" name="Imagen 3"/>
+            <wp:cNvGraphicFramePr>
+              <a:graphicFrameLocks xmlns:a="http://schemas.openxmlformats.org/drawingml/2006/main" noChangeAspect="1"/>
+            </wp:cNvGraphicFramePr>
+            <a:graphic xmlns:a="http://schemas.openxmlformats.org/drawingml/2006/main">
+              <a:graphicData uri="http://schemas.openxmlformats.org/drawingml/2006/picture">
+                <pic:pic xmlns:pic="http://schemas.openxmlformats.org/drawingml/2006/picture">
+                  <pic:nvPicPr>
+                    <pic:cNvPr id="415048600" name="Imagen 415048600"/>
+                    <pic:cNvPicPr/>
+                  </pic:nvPicPr>
+                  <pic:blipFill>
+                    <a:blip r:embed="rId20" cstate="print">
+                      <a:extLst>
+                        <a:ext uri="{28A0092B-C50C-407E-A947-70E740481C1C}">
+                          <a14:useLocalDpi xmlns:a14="http://schemas.microsoft.com/office/drawing/2010/main" val="0"/>
+                        </a:ext>
+                      </a:extLst>
+                    </a:blip>
+                    <a:stretch>
+                      <a:fillRect/>
+                    </a:stretch>
+                  </pic:blipFill>
+                  <pic:spPr>
+                    <a:xfrm>
+                      <a:off x="0" y="0"/>
+                      <a:ext cx="4366800" cy="2066400"/>
+                    </a:xfrm>
+                    <a:prstGeom prst="rect">
+                      <a:avLst/>
+                    </a:prstGeom>
+                  </pic:spPr>
+                </pic:pic>
+              </a:graphicData>
+            </a:graphic>
+          </wp:inline>
+        </w:drawing>
+      </w:r>
+    </w:p>
+    <w:p>
+      <w:pPr>
+        <w:pStyle w:val="Descripcin"/>
+        <w:ind w:firstLine="720"/>
+        <w:jc w:val="both"/>
+        <w:rPr>
+          <w:rFonts w:ascii="Times New Roman" w:eastAsia="Times New Roman" w:hAnsi="Times New Roman" w:cs="Times New Roman"/>
+          <w:sz w:val="24"/>
+          <w:szCs w:val="24"/>
+        </w:rPr>
+      </w:pPr>
+      <w:r>
+        <w:t xml:space="preserve">    Ilustración </w:t>
+      </w:r>
+      <w:fldSimple w:instr=" SEQ Ilustración \* ARABIC ">
+        <w:r>
+          <w:rPr>
+            <w:noProof/>
+          </w:rPr>
+          <w:t>3</w:t>
+        </w:r>
+      </w:fldSimple>
+      <w:r>
+        <w:t xml:space="preserve">: CarePet pantalla </w:t>
       </w:r>
       <w:proofErr w:type="spellStart"/>
       <w:r>
-        <w:rPr>
-          <w:rFonts w:ascii="Times New Roman" w:eastAsia="Times New Roman" w:hAnsi="Times New Roman" w:cs="Times New Roman"/>
-          <w:sz w:val="24"/>
-          <w:szCs w:val="24"/>
-        </w:rPr>
-        <w:t>Dashboard</w:t>
+        <w:t>dashboard</w:t>
       </w:r>
       <w:proofErr w:type="spellEnd"/>
-      <w:r>
-        <w:rPr>
-          <w:rFonts w:ascii="Times New Roman" w:eastAsia="Times New Roman" w:hAnsi="Times New Roman" w:cs="Times New Roman"/>
-          <w:sz w:val="24"/>
-          <w:szCs w:val="24"/>
-        </w:rPr>
-        <w:t xml:space="preserve"> principal de CarePet.]</w:t>
-      </w:r>
     </w:p>
     <w:p>
       <w:pPr>
@@ -16326,66 +16524,6 @@
           <w:szCs w:val="24"/>
         </w:rPr>
         <w:t xml:space="preserve"> es la pantalla de inicio tras autenticarse. Muestra un resumen con el número total de hogares y mascotas del usuario, las mascotas registradas con acceso rápido a sus módulos de cuidado, y un banner de aviso cuando el usuario tiene invitaciones pendientes. La fecha actual se muestra en la parte superior para contextualizar temporalmente la actividad del día.</w:t>
-      </w:r>
-    </w:p>
-    <w:p>
-      <w:pPr>
-        <w:pBdr>
-          <w:top w:val="nil"/>
-          <w:left w:val="nil"/>
-          <w:bottom w:val="nil"/>
-          <w:right w:val="nil"/>
-          <w:between w:val="nil"/>
-        </w:pBdr>
-        <w:jc w:val="both"/>
-        <w:rPr>
-          <w:rFonts w:ascii="Times New Roman" w:eastAsia="Times New Roman" w:hAnsi="Times New Roman" w:cs="Times New Roman"/>
-          <w:sz w:val="24"/>
-          <w:szCs w:val="24"/>
-        </w:rPr>
-      </w:pPr>
-    </w:p>
-    <w:p>
-      <w:pPr>
-        <w:pBdr>
-          <w:top w:val="nil"/>
-          <w:left w:val="nil"/>
-          <w:bottom w:val="nil"/>
-          <w:right w:val="nil"/>
-          <w:between w:val="nil"/>
-        </w:pBdr>
-        <w:jc w:val="both"/>
-        <w:rPr>
-          <w:rFonts w:ascii="Times New Roman" w:eastAsia="Times New Roman" w:hAnsi="Times New Roman" w:cs="Times New Roman"/>
-          <w:sz w:val="24"/>
-          <w:szCs w:val="24"/>
-        </w:rPr>
-      </w:pPr>
-      <w:r>
-        <w:rPr>
-          <w:rFonts w:ascii="Times New Roman" w:eastAsia="Times New Roman" w:hAnsi="Times New Roman" w:cs="Times New Roman"/>
-          <w:sz w:val="24"/>
-          <w:szCs w:val="24"/>
-        </w:rPr>
-        <w:t xml:space="preserve">Captura 2: Inicia sesión y haz una captura del </w:t>
-      </w:r>
-      <w:proofErr w:type="spellStart"/>
-      <w:r>
-        <w:rPr>
-          <w:rFonts w:ascii="Times New Roman" w:eastAsia="Times New Roman" w:hAnsi="Times New Roman" w:cs="Times New Roman"/>
-          <w:sz w:val="24"/>
-          <w:szCs w:val="24"/>
-        </w:rPr>
-        <w:t>dashboard</w:t>
-      </w:r>
-      <w:proofErr w:type="spellEnd"/>
-      <w:r>
-        <w:rPr>
-          <w:rFonts w:ascii="Times New Roman" w:eastAsia="Times New Roman" w:hAnsi="Times New Roman" w:cs="Times New Roman"/>
-          <w:sz w:val="24"/>
-          <w:szCs w:val="24"/>
-        </w:rPr>
-        <w:t xml:space="preserve"> con al menos una mascota visible. Si tienes invitaciones pendientes, mejor aún para que se vea el banner.</w:t>
       </w:r>
     </w:p>
     <w:p>
@@ -16453,27 +16591,283 @@
     </w:p>
     <w:p>
       <w:pPr>
-        <w:pBdr>
-          <w:top w:val="nil"/>
-          <w:left w:val="nil"/>
-          <w:bottom w:val="nil"/>
-          <w:right w:val="nil"/>
-          <w:between w:val="nil"/>
-        </w:pBdr>
-        <w:jc w:val="both"/>
-        <w:rPr>
-          <w:rFonts w:ascii="Times New Roman" w:eastAsia="Times New Roman" w:hAnsi="Times New Roman" w:cs="Times New Roman"/>
-          <w:sz w:val="24"/>
-          <w:szCs w:val="24"/>
-        </w:rPr>
-      </w:pPr>
-      <w:r>
-        <w:rPr>
-          <w:rFonts w:ascii="Times New Roman" w:eastAsia="Times New Roman" w:hAnsi="Times New Roman" w:cs="Times New Roman"/>
-          <w:sz w:val="24"/>
-          <w:szCs w:val="24"/>
-        </w:rPr>
-        <w:t>[Insertar aquí la Figura X. Pantalla de detalle de hogar con miembros e invitaciones.]</w:t>
+        <w:keepNext/>
+        <w:pBdr>
+          <w:top w:val="nil"/>
+          <w:left w:val="nil"/>
+          <w:bottom w:val="nil"/>
+          <w:right w:val="nil"/>
+          <w:between w:val="nil"/>
+        </w:pBdr>
+        <w:jc w:val="center"/>
+      </w:pPr>
+      <w:r>
+        <w:rPr>
+          <w:rFonts w:ascii="Times New Roman" w:eastAsia="Times New Roman" w:hAnsi="Times New Roman" w:cs="Times New Roman"/>
+          <w:noProof/>
+          <w:sz w:val="24"/>
+          <w:szCs w:val="24"/>
+        </w:rPr>
+        <w:drawing>
+          <wp:inline distT="0" distB="0" distL="0" distR="0" wp14:anchorId="71B41D99" wp14:editId="0BE92644">
+            <wp:extent cx="4370400" cy="2066400"/>
+            <wp:effectExtent l="0" t="0" r="0" b="0"/>
+            <wp:docPr id="1820792299" name="Imagen 4"/>
+            <wp:cNvGraphicFramePr>
+              <a:graphicFrameLocks xmlns:a="http://schemas.openxmlformats.org/drawingml/2006/main" noChangeAspect="1"/>
+            </wp:cNvGraphicFramePr>
+            <a:graphic xmlns:a="http://schemas.openxmlformats.org/drawingml/2006/main">
+              <a:graphicData uri="http://schemas.openxmlformats.org/drawingml/2006/picture">
+                <pic:pic xmlns:pic="http://schemas.openxmlformats.org/drawingml/2006/picture">
+                  <pic:nvPicPr>
+                    <pic:cNvPr id="1820792299" name="Imagen 1820792299"/>
+                    <pic:cNvPicPr/>
+                  </pic:nvPicPr>
+                  <pic:blipFill>
+                    <a:blip r:embed="rId21" cstate="print">
+                      <a:extLst>
+                        <a:ext uri="{28A0092B-C50C-407E-A947-70E740481C1C}">
+                          <a14:useLocalDpi xmlns:a14="http://schemas.microsoft.com/office/drawing/2010/main" val="0"/>
+                        </a:ext>
+                      </a:extLst>
+                    </a:blip>
+                    <a:stretch>
+                      <a:fillRect/>
+                    </a:stretch>
+                  </pic:blipFill>
+                  <pic:spPr>
+                    <a:xfrm>
+                      <a:off x="0" y="0"/>
+                      <a:ext cx="4370400" cy="2066400"/>
+                    </a:xfrm>
+                    <a:prstGeom prst="rect">
+                      <a:avLst/>
+                    </a:prstGeom>
+                  </pic:spPr>
+                </pic:pic>
+              </a:graphicData>
+            </a:graphic>
+          </wp:inline>
+        </w:drawing>
+      </w:r>
+    </w:p>
+    <w:p>
+      <w:pPr>
+        <w:pStyle w:val="Descripcin"/>
+        <w:ind w:firstLine="720"/>
+        <w:jc w:val="both"/>
+        <w:rPr>
+          <w:rFonts w:ascii="Times New Roman" w:eastAsia="Times New Roman" w:hAnsi="Times New Roman" w:cs="Times New Roman"/>
+          <w:sz w:val="24"/>
+          <w:szCs w:val="24"/>
+        </w:rPr>
+      </w:pPr>
+      <w:r>
+        <w:t xml:space="preserve">    Ilustración </w:t>
+      </w:r>
+      <w:fldSimple w:instr=" SEQ Ilustración \* ARABIC ">
+        <w:r>
+          <w:rPr>
+            <w:noProof/>
+          </w:rPr>
+          <w:t>4</w:t>
+        </w:r>
+      </w:fldSimple>
+      <w:r>
+        <w:t>: CarePet pantalla hogares</w:t>
+      </w:r>
+    </w:p>
+    <w:p>
+      <w:pPr>
+        <w:keepNext/>
+        <w:pBdr>
+          <w:top w:val="nil"/>
+          <w:left w:val="nil"/>
+          <w:bottom w:val="nil"/>
+          <w:right w:val="nil"/>
+          <w:between w:val="nil"/>
+        </w:pBdr>
+        <w:jc w:val="center"/>
+      </w:pPr>
+      <w:r>
+        <w:rPr>
+          <w:rFonts w:ascii="Times New Roman" w:eastAsia="Times New Roman" w:hAnsi="Times New Roman" w:cs="Times New Roman"/>
+          <w:noProof/>
+          <w:sz w:val="24"/>
+          <w:szCs w:val="24"/>
+        </w:rPr>
+        <w:drawing>
+          <wp:inline distT="0" distB="0" distL="0" distR="0" wp14:anchorId="3DBAA55E" wp14:editId="0C614D8F">
+            <wp:extent cx="4374000" cy="2066400"/>
+            <wp:effectExtent l="0" t="0" r="7620" b="0"/>
+            <wp:docPr id="1203246296" name="Imagen 5"/>
+            <wp:cNvGraphicFramePr>
+              <a:graphicFrameLocks xmlns:a="http://schemas.openxmlformats.org/drawingml/2006/main" noChangeAspect="1"/>
+            </wp:cNvGraphicFramePr>
+            <a:graphic xmlns:a="http://schemas.openxmlformats.org/drawingml/2006/main">
+              <a:graphicData uri="http://schemas.openxmlformats.org/drawingml/2006/picture">
+                <pic:pic xmlns:pic="http://schemas.openxmlformats.org/drawingml/2006/picture">
+                  <pic:nvPicPr>
+                    <pic:cNvPr id="1203246296" name="Imagen 1203246296"/>
+                    <pic:cNvPicPr/>
+                  </pic:nvPicPr>
+                  <pic:blipFill>
+                    <a:blip r:embed="rId22" cstate="print">
+                      <a:extLst>
+                        <a:ext uri="{28A0092B-C50C-407E-A947-70E740481C1C}">
+                          <a14:useLocalDpi xmlns:a14="http://schemas.microsoft.com/office/drawing/2010/main" val="0"/>
+                        </a:ext>
+                      </a:extLst>
+                    </a:blip>
+                    <a:stretch>
+                      <a:fillRect/>
+                    </a:stretch>
+                  </pic:blipFill>
+                  <pic:spPr>
+                    <a:xfrm>
+                      <a:off x="0" y="0"/>
+                      <a:ext cx="4374000" cy="2066400"/>
+                    </a:xfrm>
+                    <a:prstGeom prst="rect">
+                      <a:avLst/>
+                    </a:prstGeom>
+                  </pic:spPr>
+                </pic:pic>
+              </a:graphicData>
+            </a:graphic>
+          </wp:inline>
+        </w:drawing>
+      </w:r>
+    </w:p>
+    <w:p>
+      <w:pPr>
+        <w:pStyle w:val="Descripcin"/>
+        <w:ind w:firstLine="720"/>
+        <w:jc w:val="both"/>
+        <w:rPr>
+          <w:rFonts w:ascii="Times New Roman" w:eastAsia="Times New Roman" w:hAnsi="Times New Roman" w:cs="Times New Roman"/>
+          <w:sz w:val="24"/>
+          <w:szCs w:val="24"/>
+        </w:rPr>
+      </w:pPr>
+      <w:r>
+        <w:t xml:space="preserve">    Ilustración </w:t>
+      </w:r>
+      <w:fldSimple w:instr=" SEQ Ilustración \* ARABIC ">
+        <w:r>
+          <w:rPr>
+            <w:noProof/>
+          </w:rPr>
+          <w:t>5</w:t>
+        </w:r>
+      </w:fldSimple>
+      <w:r>
+        <w:t>: CarePet pantalla detalle hogar</w:t>
+      </w:r>
+    </w:p>
+    <w:p>
+      <w:pPr>
+        <w:pBdr>
+          <w:top w:val="nil"/>
+          <w:left w:val="nil"/>
+          <w:bottom w:val="nil"/>
+          <w:right w:val="nil"/>
+          <w:between w:val="nil"/>
+        </w:pBdr>
+        <w:jc w:val="both"/>
+        <w:rPr>
+          <w:rFonts w:ascii="Times New Roman" w:eastAsia="Times New Roman" w:hAnsi="Times New Roman" w:cs="Times New Roman"/>
+          <w:sz w:val="24"/>
+          <w:szCs w:val="24"/>
+        </w:rPr>
+      </w:pPr>
+    </w:p>
+    <w:p>
+      <w:pPr>
+        <w:keepNext/>
+        <w:pBdr>
+          <w:top w:val="nil"/>
+          <w:left w:val="nil"/>
+          <w:bottom w:val="nil"/>
+          <w:right w:val="nil"/>
+          <w:between w:val="nil"/>
+        </w:pBdr>
+        <w:jc w:val="center"/>
+      </w:pPr>
+      <w:r>
+        <w:rPr>
+          <w:rFonts w:ascii="Times New Roman" w:eastAsia="Times New Roman" w:hAnsi="Times New Roman" w:cs="Times New Roman"/>
+          <w:noProof/>
+          <w:sz w:val="24"/>
+          <w:szCs w:val="24"/>
+        </w:rPr>
+        <w:drawing>
+          <wp:inline distT="0" distB="0" distL="0" distR="0" wp14:anchorId="135561F6" wp14:editId="70231173">
+            <wp:extent cx="4377600" cy="2066400"/>
+            <wp:effectExtent l="0" t="0" r="4445" b="0"/>
+            <wp:docPr id="96775856" name="Imagen 6"/>
+            <wp:cNvGraphicFramePr>
+              <a:graphicFrameLocks xmlns:a="http://schemas.openxmlformats.org/drawingml/2006/main" noChangeAspect="1"/>
+            </wp:cNvGraphicFramePr>
+            <a:graphic xmlns:a="http://schemas.openxmlformats.org/drawingml/2006/main">
+              <a:graphicData uri="http://schemas.openxmlformats.org/drawingml/2006/picture">
+                <pic:pic xmlns:pic="http://schemas.openxmlformats.org/drawingml/2006/picture">
+                  <pic:nvPicPr>
+                    <pic:cNvPr id="96775856" name="Imagen 96775856"/>
+                    <pic:cNvPicPr/>
+                  </pic:nvPicPr>
+                  <pic:blipFill>
+                    <a:blip r:embed="rId23" cstate="print">
+                      <a:extLst>
+                        <a:ext uri="{28A0092B-C50C-407E-A947-70E740481C1C}">
+                          <a14:useLocalDpi xmlns:a14="http://schemas.microsoft.com/office/drawing/2010/main" val="0"/>
+                        </a:ext>
+                      </a:extLst>
+                    </a:blip>
+                    <a:stretch>
+                      <a:fillRect/>
+                    </a:stretch>
+                  </pic:blipFill>
+                  <pic:spPr>
+                    <a:xfrm>
+                      <a:off x="0" y="0"/>
+                      <a:ext cx="4377600" cy="2066400"/>
+                    </a:xfrm>
+                    <a:prstGeom prst="rect">
+                      <a:avLst/>
+                    </a:prstGeom>
+                  </pic:spPr>
+                </pic:pic>
+              </a:graphicData>
+            </a:graphic>
+          </wp:inline>
+        </w:drawing>
+      </w:r>
+    </w:p>
+    <w:p>
+      <w:pPr>
+        <w:pStyle w:val="Descripcin"/>
+        <w:ind w:firstLine="720"/>
+        <w:jc w:val="both"/>
+        <w:rPr>
+          <w:rFonts w:ascii="Times New Roman" w:eastAsia="Times New Roman" w:hAnsi="Times New Roman" w:cs="Times New Roman"/>
+          <w:sz w:val="24"/>
+          <w:szCs w:val="24"/>
+        </w:rPr>
+      </w:pPr>
+      <w:r>
+        <w:t xml:space="preserve">    Ilustración </w:t>
+      </w:r>
+      <w:fldSimple w:instr=" SEQ Ilustración \* ARABIC ">
+        <w:r>
+          <w:rPr>
+            <w:noProof/>
+          </w:rPr>
+          <w:t>6</w:t>
+        </w:r>
+      </w:fldSimple>
+      <w:r>
+        <w:t>: CarePet modal de invitación de un miembro al hogar</w:t>
       </w:r>
     </w:p>
     <w:p>
@@ -16516,48 +16910,6 @@
           <w:szCs w:val="24"/>
         </w:rPr>
         <w:t>La sección de hogares permite al usuario crear nuevos hogares, ver la lista de hogares a los que pertenece y acceder al detalle de cada uno. En la pantalla de detalle se muestran los miembros del hogar con su nombre, email y rol, y las invitaciones pendientes con su estado. Los usuarios con rol OWNER o ADMIN disponen de un botón para invitar a nuevos miembros mediante su dirección de email, pudiendo asignarles el rol de ADMIN o MEMBER y añadir un mensaje personalizado.</w:t>
-      </w:r>
-    </w:p>
-    <w:p>
-      <w:pPr>
-        <w:pBdr>
-          <w:top w:val="nil"/>
-          <w:left w:val="nil"/>
-          <w:bottom w:val="nil"/>
-          <w:right w:val="nil"/>
-          <w:between w:val="nil"/>
-        </w:pBdr>
-        <w:jc w:val="both"/>
-        <w:rPr>
-          <w:rFonts w:ascii="Times New Roman" w:eastAsia="Times New Roman" w:hAnsi="Times New Roman" w:cs="Times New Roman"/>
-          <w:sz w:val="24"/>
-          <w:szCs w:val="24"/>
-        </w:rPr>
-      </w:pPr>
-    </w:p>
-    <w:p>
-      <w:pPr>
-        <w:pBdr>
-          <w:top w:val="nil"/>
-          <w:left w:val="nil"/>
-          <w:bottom w:val="nil"/>
-          <w:right w:val="nil"/>
-          <w:between w:val="nil"/>
-        </w:pBdr>
-        <w:jc w:val="both"/>
-        <w:rPr>
-          <w:rFonts w:ascii="Times New Roman" w:eastAsia="Times New Roman" w:hAnsi="Times New Roman" w:cs="Times New Roman"/>
-          <w:sz w:val="24"/>
-          <w:szCs w:val="24"/>
-        </w:rPr>
-      </w:pPr>
-      <w:r>
-        <w:rPr>
-          <w:rFonts w:ascii="Times New Roman" w:eastAsia="Times New Roman" w:hAnsi="Times New Roman" w:cs="Times New Roman"/>
-          <w:sz w:val="24"/>
-          <w:szCs w:val="24"/>
-        </w:rPr>
-        <w:t>Captura 3: Accede a un hogar y haz una captura de la pantalla de detalle donde se vean los miembros y el botón de invitar. Si puedes, abre también el modal de invitación y haz una segunda captura.</w:t>
       </w:r>
     </w:p>
     <w:p>
@@ -16625,27 +16977,432 @@
     </w:p>
     <w:p>
       <w:pPr>
-        <w:pBdr>
-          <w:top w:val="nil"/>
-          <w:left w:val="nil"/>
-          <w:bottom w:val="nil"/>
-          <w:right w:val="nil"/>
-          <w:between w:val="nil"/>
-        </w:pBdr>
-        <w:jc w:val="both"/>
-        <w:rPr>
-          <w:rFonts w:ascii="Times New Roman" w:eastAsia="Times New Roman" w:hAnsi="Times New Roman" w:cs="Times New Roman"/>
-          <w:sz w:val="24"/>
-          <w:szCs w:val="24"/>
-        </w:rPr>
-      </w:pPr>
-      <w:r>
-        <w:rPr>
-          <w:rFonts w:ascii="Times New Roman" w:eastAsia="Times New Roman" w:hAnsi="Times New Roman" w:cs="Times New Roman"/>
-          <w:sz w:val="24"/>
-          <w:szCs w:val="24"/>
-        </w:rPr>
-        <w:t>[Insertar aquí la Figura X. Lista de mascotas y formulario de registro.]</w:t>
+        <w:keepNext/>
+        <w:pBdr>
+          <w:top w:val="nil"/>
+          <w:left w:val="nil"/>
+          <w:bottom w:val="nil"/>
+          <w:right w:val="nil"/>
+          <w:between w:val="nil"/>
+        </w:pBdr>
+        <w:jc w:val="center"/>
+      </w:pPr>
+      <w:r>
+        <w:rPr>
+          <w:rFonts w:ascii="Times New Roman" w:eastAsia="Times New Roman" w:hAnsi="Times New Roman" w:cs="Times New Roman"/>
+          <w:noProof/>
+          <w:sz w:val="24"/>
+          <w:szCs w:val="24"/>
+        </w:rPr>
+        <w:drawing>
+          <wp:inline distT="0" distB="0" distL="0" distR="0" wp14:anchorId="7B56A92D" wp14:editId="73FDF168">
+            <wp:extent cx="4370400" cy="2066400"/>
+            <wp:effectExtent l="0" t="0" r="0" b="0"/>
+            <wp:docPr id="1721487269" name="Imagen 7"/>
+            <wp:cNvGraphicFramePr>
+              <a:graphicFrameLocks xmlns:a="http://schemas.openxmlformats.org/drawingml/2006/main" noChangeAspect="1"/>
+            </wp:cNvGraphicFramePr>
+            <a:graphic xmlns:a="http://schemas.openxmlformats.org/drawingml/2006/main">
+              <a:graphicData uri="http://schemas.openxmlformats.org/drawingml/2006/picture">
+                <pic:pic xmlns:pic="http://schemas.openxmlformats.org/drawingml/2006/picture">
+                  <pic:nvPicPr>
+                    <pic:cNvPr id="1721487269" name="Imagen 1721487269"/>
+                    <pic:cNvPicPr/>
+                  </pic:nvPicPr>
+                  <pic:blipFill>
+                    <a:blip r:embed="rId24" cstate="print">
+                      <a:extLst>
+                        <a:ext uri="{28A0092B-C50C-407E-A947-70E740481C1C}">
+                          <a14:useLocalDpi xmlns:a14="http://schemas.microsoft.com/office/drawing/2010/main" val="0"/>
+                        </a:ext>
+                      </a:extLst>
+                    </a:blip>
+                    <a:stretch>
+                      <a:fillRect/>
+                    </a:stretch>
+                  </pic:blipFill>
+                  <pic:spPr>
+                    <a:xfrm>
+                      <a:off x="0" y="0"/>
+                      <a:ext cx="4370400" cy="2066400"/>
+                    </a:xfrm>
+                    <a:prstGeom prst="rect">
+                      <a:avLst/>
+                    </a:prstGeom>
+                  </pic:spPr>
+                </pic:pic>
+              </a:graphicData>
+            </a:graphic>
+          </wp:inline>
+        </w:drawing>
+      </w:r>
+    </w:p>
+    <w:p>
+      <w:pPr>
+        <w:pStyle w:val="Descripcin"/>
+        <w:ind w:firstLine="720"/>
+        <w:jc w:val="both"/>
+      </w:pPr>
+      <w:r>
+        <w:t xml:space="preserve">    Ilustración </w:t>
+      </w:r>
+      <w:fldSimple w:instr=" SEQ Ilustración \* ARABIC ">
+        <w:r>
+          <w:rPr>
+            <w:noProof/>
+          </w:rPr>
+          <w:t>7</w:t>
+        </w:r>
+      </w:fldSimple>
+      <w:r>
+        <w:t>: CarePet pantalla mascotas</w:t>
+      </w:r>
+    </w:p>
+    <w:p/>
+    <w:p>
+      <w:pPr>
+        <w:keepNext/>
+        <w:pBdr>
+          <w:top w:val="nil"/>
+          <w:left w:val="nil"/>
+          <w:bottom w:val="nil"/>
+          <w:right w:val="nil"/>
+          <w:between w:val="nil"/>
+        </w:pBdr>
+        <w:jc w:val="center"/>
+      </w:pPr>
+      <w:r>
+        <w:rPr>
+          <w:rFonts w:ascii="Times New Roman" w:eastAsia="Times New Roman" w:hAnsi="Times New Roman" w:cs="Times New Roman"/>
+          <w:noProof/>
+          <w:sz w:val="24"/>
+          <w:szCs w:val="24"/>
+        </w:rPr>
+        <w:lastRenderedPageBreak/>
+        <w:drawing>
+          <wp:inline distT="0" distB="0" distL="0" distR="0" wp14:anchorId="222F5368" wp14:editId="21EBF40A">
+            <wp:extent cx="4370400" cy="2066400"/>
+            <wp:effectExtent l="0" t="0" r="0" b="0"/>
+            <wp:docPr id="1763458286" name="Imagen 8"/>
+            <wp:cNvGraphicFramePr>
+              <a:graphicFrameLocks xmlns:a="http://schemas.openxmlformats.org/drawingml/2006/main" noChangeAspect="1"/>
+            </wp:cNvGraphicFramePr>
+            <a:graphic xmlns:a="http://schemas.openxmlformats.org/drawingml/2006/main">
+              <a:graphicData uri="http://schemas.openxmlformats.org/drawingml/2006/picture">
+                <pic:pic xmlns:pic="http://schemas.openxmlformats.org/drawingml/2006/picture">
+                  <pic:nvPicPr>
+                    <pic:cNvPr id="1763458286" name="Imagen 1763458286"/>
+                    <pic:cNvPicPr/>
+                  </pic:nvPicPr>
+                  <pic:blipFill>
+                    <a:blip r:embed="rId25" cstate="print">
+                      <a:extLst>
+                        <a:ext uri="{28A0092B-C50C-407E-A947-70E740481C1C}">
+                          <a14:useLocalDpi xmlns:a14="http://schemas.microsoft.com/office/drawing/2010/main" val="0"/>
+                        </a:ext>
+                      </a:extLst>
+                    </a:blip>
+                    <a:stretch>
+                      <a:fillRect/>
+                    </a:stretch>
+                  </pic:blipFill>
+                  <pic:spPr>
+                    <a:xfrm>
+                      <a:off x="0" y="0"/>
+                      <a:ext cx="4370400" cy="2066400"/>
+                    </a:xfrm>
+                    <a:prstGeom prst="rect">
+                      <a:avLst/>
+                    </a:prstGeom>
+                  </pic:spPr>
+                </pic:pic>
+              </a:graphicData>
+            </a:graphic>
+          </wp:inline>
+        </w:drawing>
+      </w:r>
+    </w:p>
+    <w:p>
+      <w:pPr>
+        <w:pStyle w:val="Descripcin"/>
+        <w:ind w:firstLine="720"/>
+        <w:jc w:val="both"/>
+      </w:pPr>
+      <w:r>
+        <w:t xml:space="preserve">    Ilustración </w:t>
+      </w:r>
+      <w:fldSimple w:instr=" SEQ Ilustración \* ARABIC ">
+        <w:r>
+          <w:rPr>
+            <w:noProof/>
+          </w:rPr>
+          <w:t>8</w:t>
+        </w:r>
+      </w:fldSimple>
+      <w:r>
+        <w:t>: CarePet formulario creación mascota</w:t>
+      </w:r>
+    </w:p>
+    <w:p/>
+    <w:p>
+      <w:pPr>
+        <w:keepNext/>
+        <w:pBdr>
+          <w:top w:val="nil"/>
+          <w:left w:val="nil"/>
+          <w:bottom w:val="nil"/>
+          <w:right w:val="nil"/>
+          <w:between w:val="nil"/>
+        </w:pBdr>
+        <w:jc w:val="center"/>
+      </w:pPr>
+      <w:r>
+        <w:rPr>
+          <w:rFonts w:ascii="Times New Roman" w:eastAsia="Times New Roman" w:hAnsi="Times New Roman" w:cs="Times New Roman"/>
+          <w:noProof/>
+          <w:sz w:val="24"/>
+          <w:szCs w:val="24"/>
+        </w:rPr>
+        <w:drawing>
+          <wp:inline distT="0" distB="0" distL="0" distR="0" wp14:anchorId="6DDAB263" wp14:editId="18702945">
+            <wp:extent cx="4370400" cy="2066400"/>
+            <wp:effectExtent l="0" t="0" r="0" b="0"/>
+            <wp:docPr id="286047791" name="Imagen 9"/>
+            <wp:cNvGraphicFramePr>
+              <a:graphicFrameLocks xmlns:a="http://schemas.openxmlformats.org/drawingml/2006/main" noChangeAspect="1"/>
+            </wp:cNvGraphicFramePr>
+            <a:graphic xmlns:a="http://schemas.openxmlformats.org/drawingml/2006/main">
+              <a:graphicData uri="http://schemas.openxmlformats.org/drawingml/2006/picture">
+                <pic:pic xmlns:pic="http://schemas.openxmlformats.org/drawingml/2006/picture">
+                  <pic:nvPicPr>
+                    <pic:cNvPr id="286047791" name="Imagen 286047791"/>
+                    <pic:cNvPicPr/>
+                  </pic:nvPicPr>
+                  <pic:blipFill>
+                    <a:blip r:embed="rId26" cstate="print">
+                      <a:extLst>
+                        <a:ext uri="{28A0092B-C50C-407E-A947-70E740481C1C}">
+                          <a14:useLocalDpi xmlns:a14="http://schemas.microsoft.com/office/drawing/2010/main" val="0"/>
+                        </a:ext>
+                      </a:extLst>
+                    </a:blip>
+                    <a:stretch>
+                      <a:fillRect/>
+                    </a:stretch>
+                  </pic:blipFill>
+                  <pic:spPr>
+                    <a:xfrm>
+                      <a:off x="0" y="0"/>
+                      <a:ext cx="4370400" cy="2066400"/>
+                    </a:xfrm>
+                    <a:prstGeom prst="rect">
+                      <a:avLst/>
+                    </a:prstGeom>
+                  </pic:spPr>
+                </pic:pic>
+              </a:graphicData>
+            </a:graphic>
+          </wp:inline>
+        </w:drawing>
+      </w:r>
+    </w:p>
+    <w:p>
+      <w:pPr>
+        <w:pStyle w:val="Descripcin"/>
+        <w:ind w:firstLine="720"/>
+        <w:jc w:val="both"/>
+      </w:pPr>
+      <w:r>
+        <w:t xml:space="preserve">    Ilustración </w:t>
+      </w:r>
+      <w:fldSimple w:instr=" SEQ Ilustración \* ARABIC ">
+        <w:r>
+          <w:rPr>
+            <w:noProof/>
+          </w:rPr>
+          <w:t>9</w:t>
+        </w:r>
+      </w:fldSimple>
+      <w:r>
+        <w:t>: CarePet formulario creación mascota</w:t>
+      </w:r>
+    </w:p>
+    <w:p/>
+    <w:p>
+      <w:pPr>
+        <w:keepNext/>
+        <w:pBdr>
+          <w:top w:val="nil"/>
+          <w:left w:val="nil"/>
+          <w:bottom w:val="nil"/>
+          <w:right w:val="nil"/>
+          <w:between w:val="nil"/>
+        </w:pBdr>
+        <w:jc w:val="center"/>
+      </w:pPr>
+      <w:r>
+        <w:rPr>
+          <w:rFonts w:ascii="Times New Roman" w:eastAsia="Times New Roman" w:hAnsi="Times New Roman" w:cs="Times New Roman"/>
+          <w:noProof/>
+          <w:sz w:val="24"/>
+          <w:szCs w:val="24"/>
+        </w:rPr>
+        <w:drawing>
+          <wp:inline distT="0" distB="0" distL="0" distR="0" wp14:anchorId="0C1ED93B" wp14:editId="74EF3925">
+            <wp:extent cx="4370400" cy="2066400"/>
+            <wp:effectExtent l="0" t="0" r="0" b="0"/>
+            <wp:docPr id="1007274932" name="Imagen 10"/>
+            <wp:cNvGraphicFramePr>
+              <a:graphicFrameLocks xmlns:a="http://schemas.openxmlformats.org/drawingml/2006/main" noChangeAspect="1"/>
+            </wp:cNvGraphicFramePr>
+            <a:graphic xmlns:a="http://schemas.openxmlformats.org/drawingml/2006/main">
+              <a:graphicData uri="http://schemas.openxmlformats.org/drawingml/2006/picture">
+                <pic:pic xmlns:pic="http://schemas.openxmlformats.org/drawingml/2006/picture">
+                  <pic:nvPicPr>
+                    <pic:cNvPr id="1007274932" name="Imagen 1007274932"/>
+                    <pic:cNvPicPr/>
+                  </pic:nvPicPr>
+                  <pic:blipFill>
+                    <a:blip r:embed="rId27" cstate="print">
+                      <a:extLst>
+                        <a:ext uri="{28A0092B-C50C-407E-A947-70E740481C1C}">
+                          <a14:useLocalDpi xmlns:a14="http://schemas.microsoft.com/office/drawing/2010/main" val="0"/>
+                        </a:ext>
+                      </a:extLst>
+                    </a:blip>
+                    <a:stretch>
+                      <a:fillRect/>
+                    </a:stretch>
+                  </pic:blipFill>
+                  <pic:spPr>
+                    <a:xfrm>
+                      <a:off x="0" y="0"/>
+                      <a:ext cx="4370400" cy="2066400"/>
+                    </a:xfrm>
+                    <a:prstGeom prst="rect">
+                      <a:avLst/>
+                    </a:prstGeom>
+                  </pic:spPr>
+                </pic:pic>
+              </a:graphicData>
+            </a:graphic>
+          </wp:inline>
+        </w:drawing>
+      </w:r>
+    </w:p>
+    <w:p>
+      <w:pPr>
+        <w:pStyle w:val="Descripcin"/>
+        <w:ind w:firstLine="720"/>
+        <w:jc w:val="both"/>
+        <w:rPr>
+          <w:rFonts w:ascii="Times New Roman" w:eastAsia="Times New Roman" w:hAnsi="Times New Roman" w:cs="Times New Roman"/>
+          <w:sz w:val="24"/>
+          <w:szCs w:val="24"/>
+        </w:rPr>
+      </w:pPr>
+      <w:r>
+        <w:t xml:space="preserve">    Ilustración </w:t>
+      </w:r>
+      <w:fldSimple w:instr=" SEQ Ilustración \* ARABIC ">
+        <w:r>
+          <w:rPr>
+            <w:noProof/>
+          </w:rPr>
+          <w:t>10</w:t>
+        </w:r>
+      </w:fldSimple>
+      <w:r>
+        <w:t>: CarePet formulario creación mascota</w:t>
+      </w:r>
+    </w:p>
+    <w:p>
+      <w:pPr>
+        <w:keepNext/>
+        <w:pBdr>
+          <w:top w:val="nil"/>
+          <w:left w:val="nil"/>
+          <w:bottom w:val="nil"/>
+          <w:right w:val="nil"/>
+          <w:between w:val="nil"/>
+        </w:pBdr>
+        <w:jc w:val="center"/>
+      </w:pPr>
+      <w:r>
+        <w:rPr>
+          <w:rFonts w:ascii="Times New Roman" w:eastAsia="Times New Roman" w:hAnsi="Times New Roman" w:cs="Times New Roman"/>
+          <w:noProof/>
+          <w:sz w:val="24"/>
+          <w:szCs w:val="24"/>
+        </w:rPr>
+        <w:lastRenderedPageBreak/>
+        <w:drawing>
+          <wp:inline distT="0" distB="0" distL="0" distR="0" wp14:anchorId="621910AC" wp14:editId="71195C1A">
+            <wp:extent cx="4370400" cy="2066400"/>
+            <wp:effectExtent l="0" t="0" r="0" b="0"/>
+            <wp:docPr id="953565253" name="Imagen 11"/>
+            <wp:cNvGraphicFramePr>
+              <a:graphicFrameLocks xmlns:a="http://schemas.openxmlformats.org/drawingml/2006/main" noChangeAspect="1"/>
+            </wp:cNvGraphicFramePr>
+            <a:graphic xmlns:a="http://schemas.openxmlformats.org/drawingml/2006/main">
+              <a:graphicData uri="http://schemas.openxmlformats.org/drawingml/2006/picture">
+                <pic:pic xmlns:pic="http://schemas.openxmlformats.org/drawingml/2006/picture">
+                  <pic:nvPicPr>
+                    <pic:cNvPr id="953565253" name="Imagen 953565253"/>
+                    <pic:cNvPicPr/>
+                  </pic:nvPicPr>
+                  <pic:blipFill>
+                    <a:blip r:embed="rId28" cstate="print">
+                      <a:extLst>
+                        <a:ext uri="{28A0092B-C50C-407E-A947-70E740481C1C}">
+                          <a14:useLocalDpi xmlns:a14="http://schemas.microsoft.com/office/drawing/2010/main" val="0"/>
+                        </a:ext>
+                      </a:extLst>
+                    </a:blip>
+                    <a:stretch>
+                      <a:fillRect/>
+                    </a:stretch>
+                  </pic:blipFill>
+                  <pic:spPr>
+                    <a:xfrm>
+                      <a:off x="0" y="0"/>
+                      <a:ext cx="4370400" cy="2066400"/>
+                    </a:xfrm>
+                    <a:prstGeom prst="rect">
+                      <a:avLst/>
+                    </a:prstGeom>
+                  </pic:spPr>
+                </pic:pic>
+              </a:graphicData>
+            </a:graphic>
+          </wp:inline>
+        </w:drawing>
+      </w:r>
+    </w:p>
+    <w:p>
+      <w:pPr>
+        <w:pStyle w:val="Descripcin"/>
+        <w:ind w:left="720"/>
+        <w:jc w:val="both"/>
+        <w:rPr>
+          <w:rFonts w:ascii="Times New Roman" w:eastAsia="Times New Roman" w:hAnsi="Times New Roman" w:cs="Times New Roman"/>
+          <w:sz w:val="24"/>
+          <w:szCs w:val="24"/>
+        </w:rPr>
+      </w:pPr>
+      <w:r>
+        <w:t xml:space="preserve">    Ilustración </w:t>
+      </w:r>
+      <w:fldSimple w:instr=" SEQ Ilustración \* ARABIC ">
+        <w:r>
+          <w:rPr>
+            <w:noProof/>
+          </w:rPr>
+          <w:t>11</w:t>
+        </w:r>
+      </w:fldSimple>
+      <w:r>
+        <w:t>: CarePet formulario creación mascota</w:t>
       </w:r>
     </w:p>
     <w:p>
@@ -16706,31 +17463,6 @@
           <w:szCs w:val="24"/>
         </w:rPr>
       </w:pPr>
-    </w:p>
-    <w:p>
-      <w:pPr>
-        <w:pBdr>
-          <w:top w:val="nil"/>
-          <w:left w:val="nil"/>
-          <w:bottom w:val="nil"/>
-          <w:right w:val="nil"/>
-          <w:between w:val="nil"/>
-        </w:pBdr>
-        <w:jc w:val="both"/>
-        <w:rPr>
-          <w:rFonts w:ascii="Times New Roman" w:eastAsia="Times New Roman" w:hAnsi="Times New Roman" w:cs="Times New Roman"/>
-          <w:sz w:val="24"/>
-          <w:szCs w:val="24"/>
-        </w:rPr>
-      </w:pPr>
-      <w:r>
-        <w:rPr>
-          <w:rFonts w:ascii="Times New Roman" w:eastAsia="Times New Roman" w:hAnsi="Times New Roman" w:cs="Times New Roman"/>
-          <w:sz w:val="24"/>
-          <w:szCs w:val="24"/>
-        </w:rPr>
-        <w:t>Captura 4: Haz una captura de la lista de mascotas. Luego pulsa en añadir mascota y haz una segunda captura del formulario con la especie y las razas desplegadas.</w:t>
-      </w:r>
     </w:p>
     <w:p>
       <w:pPr>
@@ -16758,50 +17490,289 @@
           <w:sz w:val="24"/>
           <w:szCs w:val="24"/>
         </w:rPr>
+        <w:t>Módulo de medicación</w:t>
+      </w:r>
+    </w:p>
+    <w:p>
+      <w:pPr>
+        <w:pBdr>
+          <w:top w:val="nil"/>
+          <w:left w:val="nil"/>
+          <w:bottom w:val="nil"/>
+          <w:right w:val="nil"/>
+          <w:between w:val="nil"/>
+        </w:pBdr>
+        <w:jc w:val="both"/>
+        <w:rPr>
+          <w:rFonts w:ascii="Times New Roman" w:eastAsia="Times New Roman" w:hAnsi="Times New Roman" w:cs="Times New Roman"/>
+          <w:sz w:val="24"/>
+          <w:szCs w:val="24"/>
+        </w:rPr>
+      </w:pPr>
+    </w:p>
+    <w:p>
+      <w:pPr>
+        <w:keepNext/>
+        <w:pBdr>
+          <w:top w:val="nil"/>
+          <w:left w:val="nil"/>
+          <w:bottom w:val="nil"/>
+          <w:right w:val="nil"/>
+          <w:between w:val="nil"/>
+        </w:pBdr>
+        <w:jc w:val="center"/>
+      </w:pPr>
+      <w:r>
+        <w:rPr>
+          <w:rFonts w:ascii="Times New Roman" w:eastAsia="Times New Roman" w:hAnsi="Times New Roman" w:cs="Times New Roman"/>
+          <w:noProof/>
+          <w:sz w:val="24"/>
+          <w:szCs w:val="24"/>
+        </w:rPr>
+        <w:drawing>
+          <wp:inline distT="0" distB="0" distL="0" distR="0" wp14:anchorId="1DDBBCE3" wp14:editId="6D749072">
+            <wp:extent cx="4377600" cy="2066400"/>
+            <wp:effectExtent l="0" t="0" r="4445" b="0"/>
+            <wp:docPr id="1685904971" name="Imagen 12"/>
+            <wp:cNvGraphicFramePr>
+              <a:graphicFrameLocks xmlns:a="http://schemas.openxmlformats.org/drawingml/2006/main" noChangeAspect="1"/>
+            </wp:cNvGraphicFramePr>
+            <a:graphic xmlns:a="http://schemas.openxmlformats.org/drawingml/2006/main">
+              <a:graphicData uri="http://schemas.openxmlformats.org/drawingml/2006/picture">
+                <pic:pic xmlns:pic="http://schemas.openxmlformats.org/drawingml/2006/picture">
+                  <pic:nvPicPr>
+                    <pic:cNvPr id="1685904971" name="Imagen 1685904971"/>
+                    <pic:cNvPicPr/>
+                  </pic:nvPicPr>
+                  <pic:blipFill>
+                    <a:blip r:embed="rId29" cstate="print">
+                      <a:extLst>
+                        <a:ext uri="{28A0092B-C50C-407E-A947-70E740481C1C}">
+                          <a14:useLocalDpi xmlns:a14="http://schemas.microsoft.com/office/drawing/2010/main" val="0"/>
+                        </a:ext>
+                      </a:extLst>
+                    </a:blip>
+                    <a:stretch>
+                      <a:fillRect/>
+                    </a:stretch>
+                  </pic:blipFill>
+                  <pic:spPr>
+                    <a:xfrm>
+                      <a:off x="0" y="0"/>
+                      <a:ext cx="4377600" cy="2066400"/>
+                    </a:xfrm>
+                    <a:prstGeom prst="rect">
+                      <a:avLst/>
+                    </a:prstGeom>
+                  </pic:spPr>
+                </pic:pic>
+              </a:graphicData>
+            </a:graphic>
+          </wp:inline>
+        </w:drawing>
+      </w:r>
+    </w:p>
+    <w:p>
+      <w:pPr>
+        <w:pStyle w:val="Descripcin"/>
+        <w:ind w:firstLine="720"/>
+        <w:jc w:val="both"/>
+        <w:rPr>
+          <w:rFonts w:ascii="Times New Roman" w:eastAsia="Times New Roman" w:hAnsi="Times New Roman" w:cs="Times New Roman"/>
+          <w:sz w:val="24"/>
+          <w:szCs w:val="24"/>
+        </w:rPr>
+      </w:pPr>
+      <w:r>
+        <w:t xml:space="preserve">    Ilustración </w:t>
+      </w:r>
+      <w:fldSimple w:instr=" SEQ Ilustración \* ARABIC ">
+        <w:r>
+          <w:rPr>
+            <w:noProof/>
+          </w:rPr>
+          <w:t>12</w:t>
+        </w:r>
+      </w:fldSimple>
+      <w:r>
+        <w:t>: CarePet pantalla medicación</w:t>
+      </w:r>
+    </w:p>
+    <w:p>
+      <w:pPr>
+        <w:keepNext/>
+        <w:pBdr>
+          <w:top w:val="nil"/>
+          <w:left w:val="nil"/>
+          <w:bottom w:val="nil"/>
+          <w:right w:val="nil"/>
+          <w:between w:val="nil"/>
+        </w:pBdr>
+        <w:jc w:val="center"/>
+      </w:pPr>
+      <w:r>
+        <w:rPr>
+          <w:rFonts w:ascii="Times New Roman" w:eastAsia="Times New Roman" w:hAnsi="Times New Roman" w:cs="Times New Roman"/>
+          <w:noProof/>
+          <w:sz w:val="24"/>
+          <w:szCs w:val="24"/>
+        </w:rPr>
+        <w:drawing>
+          <wp:inline distT="0" distB="0" distL="0" distR="0" wp14:anchorId="136DBDC6" wp14:editId="5E6F4345">
+            <wp:extent cx="4370400" cy="2066400"/>
+            <wp:effectExtent l="0" t="0" r="0" b="0"/>
+            <wp:docPr id="33054294" name="Imagen 13"/>
+            <wp:cNvGraphicFramePr>
+              <a:graphicFrameLocks xmlns:a="http://schemas.openxmlformats.org/drawingml/2006/main" noChangeAspect="1"/>
+            </wp:cNvGraphicFramePr>
+            <a:graphic xmlns:a="http://schemas.openxmlformats.org/drawingml/2006/main">
+              <a:graphicData uri="http://schemas.openxmlformats.org/drawingml/2006/picture">
+                <pic:pic xmlns:pic="http://schemas.openxmlformats.org/drawingml/2006/picture">
+                  <pic:nvPicPr>
+                    <pic:cNvPr id="33054294" name="Imagen 33054294"/>
+                    <pic:cNvPicPr/>
+                  </pic:nvPicPr>
+                  <pic:blipFill>
+                    <a:blip r:embed="rId30" cstate="print">
+                      <a:extLst>
+                        <a:ext uri="{28A0092B-C50C-407E-A947-70E740481C1C}">
+                          <a14:useLocalDpi xmlns:a14="http://schemas.microsoft.com/office/drawing/2010/main" val="0"/>
+                        </a:ext>
+                      </a:extLst>
+                    </a:blip>
+                    <a:stretch>
+                      <a:fillRect/>
+                    </a:stretch>
+                  </pic:blipFill>
+                  <pic:spPr>
+                    <a:xfrm>
+                      <a:off x="0" y="0"/>
+                      <a:ext cx="4370400" cy="2066400"/>
+                    </a:xfrm>
+                    <a:prstGeom prst="rect">
+                      <a:avLst/>
+                    </a:prstGeom>
+                  </pic:spPr>
+                </pic:pic>
+              </a:graphicData>
+            </a:graphic>
+          </wp:inline>
+        </w:drawing>
+      </w:r>
+    </w:p>
+    <w:p>
+      <w:pPr>
+        <w:pStyle w:val="Descripcin"/>
+        <w:ind w:firstLine="720"/>
+        <w:jc w:val="both"/>
+        <w:rPr>
+          <w:rFonts w:ascii="Times New Roman" w:eastAsia="Times New Roman" w:hAnsi="Times New Roman" w:cs="Times New Roman"/>
+          <w:sz w:val="24"/>
+          <w:szCs w:val="24"/>
+        </w:rPr>
+      </w:pPr>
+      <w:r>
+        <w:t xml:space="preserve">    Ilustración </w:t>
+      </w:r>
+      <w:fldSimple w:instr=" SEQ Ilustración \* ARABIC ">
+        <w:r>
+          <w:rPr>
+            <w:noProof/>
+          </w:rPr>
+          <w:t>13</w:t>
+        </w:r>
+      </w:fldSimple>
+      <w:r>
+        <w:t>: CarePet pantalla detalle medicación</w:t>
+      </w:r>
+    </w:p>
+    <w:p>
+      <w:pPr>
+        <w:keepNext/>
+        <w:pBdr>
+          <w:top w:val="nil"/>
+          <w:left w:val="nil"/>
+          <w:bottom w:val="nil"/>
+          <w:right w:val="nil"/>
+          <w:between w:val="nil"/>
+        </w:pBdr>
+        <w:jc w:val="center"/>
+      </w:pPr>
+      <w:r>
+        <w:rPr>
+          <w:rFonts w:ascii="Times New Roman" w:eastAsia="Times New Roman" w:hAnsi="Times New Roman" w:cs="Times New Roman"/>
+          <w:noProof/>
+          <w:sz w:val="24"/>
+          <w:szCs w:val="24"/>
+        </w:rPr>
         <w:lastRenderedPageBreak/>
-        <w:t>Módulo de medicación</w:t>
-      </w:r>
-    </w:p>
-    <w:p>
-      <w:pPr>
-        <w:pBdr>
-          <w:top w:val="nil"/>
-          <w:left w:val="nil"/>
-          <w:bottom w:val="nil"/>
-          <w:right w:val="nil"/>
-          <w:between w:val="nil"/>
-        </w:pBdr>
-        <w:jc w:val="both"/>
-        <w:rPr>
-          <w:rFonts w:ascii="Times New Roman" w:eastAsia="Times New Roman" w:hAnsi="Times New Roman" w:cs="Times New Roman"/>
-          <w:sz w:val="24"/>
-          <w:szCs w:val="24"/>
-        </w:rPr>
-      </w:pPr>
-    </w:p>
-    <w:p>
-      <w:pPr>
-        <w:pBdr>
-          <w:top w:val="nil"/>
-          <w:left w:val="nil"/>
-          <w:bottom w:val="nil"/>
-          <w:right w:val="nil"/>
-          <w:between w:val="nil"/>
-        </w:pBdr>
-        <w:jc w:val="both"/>
-        <w:rPr>
-          <w:rFonts w:ascii="Times New Roman" w:eastAsia="Times New Roman" w:hAnsi="Times New Roman" w:cs="Times New Roman"/>
-          <w:sz w:val="24"/>
-          <w:szCs w:val="24"/>
-        </w:rPr>
-      </w:pPr>
-      <w:r>
-        <w:rPr>
-          <w:rFonts w:ascii="Times New Roman" w:eastAsia="Times New Roman" w:hAnsi="Times New Roman" w:cs="Times New Roman"/>
-          <w:sz w:val="24"/>
-          <w:szCs w:val="24"/>
-        </w:rPr>
-        <w:t>[Insertar aquí la Figura X. Lista de medicaciones activas e historial de tomas.]</w:t>
+        <w:drawing>
+          <wp:inline distT="0" distB="0" distL="0" distR="0" wp14:anchorId="3F14F5C3" wp14:editId="6769BC72">
+            <wp:extent cx="4384800" cy="2066400"/>
+            <wp:effectExtent l="0" t="0" r="0" b="0"/>
+            <wp:docPr id="209975556" name="Imagen 14"/>
+            <wp:cNvGraphicFramePr>
+              <a:graphicFrameLocks xmlns:a="http://schemas.openxmlformats.org/drawingml/2006/main" noChangeAspect="1"/>
+            </wp:cNvGraphicFramePr>
+            <a:graphic xmlns:a="http://schemas.openxmlformats.org/drawingml/2006/main">
+              <a:graphicData uri="http://schemas.openxmlformats.org/drawingml/2006/picture">
+                <pic:pic xmlns:pic="http://schemas.openxmlformats.org/drawingml/2006/picture">
+                  <pic:nvPicPr>
+                    <pic:cNvPr id="209975556" name="Imagen 209975556"/>
+                    <pic:cNvPicPr/>
+                  </pic:nvPicPr>
+                  <pic:blipFill>
+                    <a:blip r:embed="rId31" cstate="print">
+                      <a:extLst>
+                        <a:ext uri="{28A0092B-C50C-407E-A947-70E740481C1C}">
+                          <a14:useLocalDpi xmlns:a14="http://schemas.microsoft.com/office/drawing/2010/main" val="0"/>
+                        </a:ext>
+                      </a:extLst>
+                    </a:blip>
+                    <a:stretch>
+                      <a:fillRect/>
+                    </a:stretch>
+                  </pic:blipFill>
+                  <pic:spPr>
+                    <a:xfrm>
+                      <a:off x="0" y="0"/>
+                      <a:ext cx="4384800" cy="2066400"/>
+                    </a:xfrm>
+                    <a:prstGeom prst="rect">
+                      <a:avLst/>
+                    </a:prstGeom>
+                  </pic:spPr>
+                </pic:pic>
+              </a:graphicData>
+            </a:graphic>
+          </wp:inline>
+        </w:drawing>
+      </w:r>
+    </w:p>
+    <w:p>
+      <w:pPr>
+        <w:pStyle w:val="Descripcin"/>
+        <w:ind w:firstLine="720"/>
+        <w:jc w:val="both"/>
+        <w:rPr>
+          <w:rFonts w:ascii="Times New Roman" w:eastAsia="Times New Roman" w:hAnsi="Times New Roman" w:cs="Times New Roman"/>
+          <w:sz w:val="24"/>
+          <w:szCs w:val="24"/>
+        </w:rPr>
+      </w:pPr>
+      <w:r>
+        <w:t xml:space="preserve">    Ilustración </w:t>
+      </w:r>
+      <w:fldSimple w:instr=" SEQ Ilustración \* ARABIC ">
+        <w:r>
+          <w:rPr>
+            <w:noProof/>
+          </w:rPr>
+          <w:t>14</w:t>
+        </w:r>
+      </w:fldSimple>
+      <w:r>
+        <w:t>: CarePet intento de administración duplicada de medicación muestra error</w:t>
       </w:r>
     </w:p>
     <w:p>
@@ -16844,56 +17815,6 @@
           <w:szCs w:val="24"/>
         </w:rPr>
         <w:t>El módulo de medicación es el núcleo funcional de CarePet. Muestra las medicaciones activas de cada mascota con su nombre, dosis, frecuencia y horarios configurados. Al acceder al detalle de un medicamento se muestra el historial completo de tomas, indicando para cada una el usuario que la administró y la fecha y hora exacta. El botón de registrar toma abre un modal donde el usuario puede añadir notas opcionales antes de confirmar. Si ya se ha alcanzado el límite de tomas permitidas para ese día, el sistema muestra un mensaje de error informativo en lugar de permitir el registro.</w:t>
-      </w:r>
-    </w:p>
-    <w:p>
-      <w:pPr>
-        <w:pBdr>
-          <w:top w:val="nil"/>
-          <w:left w:val="nil"/>
-          <w:bottom w:val="nil"/>
-          <w:right w:val="nil"/>
-          <w:between w:val="nil"/>
-        </w:pBdr>
-        <w:jc w:val="both"/>
-        <w:rPr>
-          <w:rFonts w:ascii="Times New Roman" w:eastAsia="Times New Roman" w:hAnsi="Times New Roman" w:cs="Times New Roman"/>
-          <w:sz w:val="24"/>
-          <w:szCs w:val="24"/>
-        </w:rPr>
-      </w:pPr>
-    </w:p>
-    <w:p>
-      <w:pPr>
-        <w:pBdr>
-          <w:top w:val="nil"/>
-          <w:left w:val="nil"/>
-          <w:bottom w:val="nil"/>
-          <w:right w:val="nil"/>
-          <w:between w:val="nil"/>
-        </w:pBdr>
-        <w:jc w:val="both"/>
-        <w:rPr>
-          <w:rFonts w:ascii="Times New Roman" w:eastAsia="Times New Roman" w:hAnsi="Times New Roman" w:cs="Times New Roman"/>
-          <w:sz w:val="24"/>
-          <w:szCs w:val="24"/>
-        </w:rPr>
-      </w:pPr>
-      <w:r>
-        <w:rPr>
-          <w:rFonts w:ascii="Times New Roman" w:eastAsia="Times New Roman" w:hAnsi="Times New Roman" w:cs="Times New Roman"/>
-          <w:sz w:val="24"/>
-          <w:szCs w:val="24"/>
-        </w:rPr>
-        <w:t>C</w:t>
-      </w:r>
-      <w:r>
-        <w:rPr>
-          <w:rFonts w:ascii="Times New Roman" w:eastAsia="Times New Roman" w:hAnsi="Times New Roman" w:cs="Times New Roman"/>
-          <w:sz w:val="24"/>
-          <w:szCs w:val="24"/>
-        </w:rPr>
-        <w:t>aptura 5: Haz una captura de la lista de medicaciones de una mascota. Luego entra al detalle de un medicamento y haz una segunda captura donde se vea el historial de tomas y el botón de registrar. Si puedes provocar el error de toma duplicada, haz también una captura del mensaje de error, ya que ilustra perfectamente la funcionalidad principal del proyecto.</w:t>
       </w:r>
     </w:p>
     <w:p>
@@ -16961,27 +17882,175 @@
     </w:p>
     <w:p>
       <w:pPr>
-        <w:pBdr>
-          <w:top w:val="nil"/>
-          <w:left w:val="nil"/>
-          <w:bottom w:val="nil"/>
-          <w:right w:val="nil"/>
-          <w:between w:val="nil"/>
-        </w:pBdr>
-        <w:jc w:val="both"/>
-        <w:rPr>
-          <w:rFonts w:ascii="Times New Roman" w:eastAsia="Times New Roman" w:hAnsi="Times New Roman" w:cs="Times New Roman"/>
-          <w:sz w:val="24"/>
-          <w:szCs w:val="24"/>
-        </w:rPr>
-      </w:pPr>
-      <w:r>
-        <w:rPr>
-          <w:rFonts w:ascii="Times New Roman" w:eastAsia="Times New Roman" w:hAnsi="Times New Roman" w:cs="Times New Roman"/>
-          <w:sz w:val="24"/>
-          <w:szCs w:val="24"/>
-        </w:rPr>
-        <w:t>[Insertar aquí la Figura X. Configuración de rutina de alimentación y registro de tomas.]</w:t>
+        <w:keepNext/>
+        <w:pBdr>
+          <w:top w:val="nil"/>
+          <w:left w:val="nil"/>
+          <w:bottom w:val="nil"/>
+          <w:right w:val="nil"/>
+          <w:between w:val="nil"/>
+        </w:pBdr>
+        <w:jc w:val="center"/>
+      </w:pPr>
+      <w:r>
+        <w:rPr>
+          <w:rFonts w:ascii="Times New Roman" w:eastAsia="Times New Roman" w:hAnsi="Times New Roman" w:cs="Times New Roman"/>
+          <w:noProof/>
+          <w:sz w:val="24"/>
+          <w:szCs w:val="24"/>
+        </w:rPr>
+        <w:drawing>
+          <wp:inline distT="0" distB="0" distL="0" distR="0" wp14:anchorId="20F22E72" wp14:editId="5B22F6FA">
+            <wp:extent cx="4370400" cy="2066400"/>
+            <wp:effectExtent l="0" t="0" r="0" b="0"/>
+            <wp:docPr id="2103515011" name="Imagen 15"/>
+            <wp:cNvGraphicFramePr>
+              <a:graphicFrameLocks xmlns:a="http://schemas.openxmlformats.org/drawingml/2006/main" noChangeAspect="1"/>
+            </wp:cNvGraphicFramePr>
+            <a:graphic xmlns:a="http://schemas.openxmlformats.org/drawingml/2006/main">
+              <a:graphicData uri="http://schemas.openxmlformats.org/drawingml/2006/picture">
+                <pic:pic xmlns:pic="http://schemas.openxmlformats.org/drawingml/2006/picture">
+                  <pic:nvPicPr>
+                    <pic:cNvPr id="2103515011" name="Imagen 2103515011"/>
+                    <pic:cNvPicPr/>
+                  </pic:nvPicPr>
+                  <pic:blipFill>
+                    <a:blip r:embed="rId32" cstate="print">
+                      <a:extLst>
+                        <a:ext uri="{28A0092B-C50C-407E-A947-70E740481C1C}">
+                          <a14:useLocalDpi xmlns:a14="http://schemas.microsoft.com/office/drawing/2010/main" val="0"/>
+                        </a:ext>
+                      </a:extLst>
+                    </a:blip>
+                    <a:stretch>
+                      <a:fillRect/>
+                    </a:stretch>
+                  </pic:blipFill>
+                  <pic:spPr>
+                    <a:xfrm>
+                      <a:off x="0" y="0"/>
+                      <a:ext cx="4370400" cy="2066400"/>
+                    </a:xfrm>
+                    <a:prstGeom prst="rect">
+                      <a:avLst/>
+                    </a:prstGeom>
+                  </pic:spPr>
+                </pic:pic>
+              </a:graphicData>
+            </a:graphic>
+          </wp:inline>
+        </w:drawing>
+      </w:r>
+    </w:p>
+    <w:p>
+      <w:pPr>
+        <w:pStyle w:val="Descripcin"/>
+        <w:ind w:firstLine="720"/>
+        <w:jc w:val="both"/>
+      </w:pPr>
+      <w:r>
+        <w:t xml:space="preserve">    Ilustración </w:t>
+      </w:r>
+      <w:fldSimple w:instr=" SEQ Ilustración \* ARABIC ">
+        <w:r>
+          <w:rPr>
+            <w:noProof/>
+          </w:rPr>
+          <w:t>15</w:t>
+        </w:r>
+      </w:fldSimple>
+      <w:r>
+        <w:t>: CarePet pantalla comidas</w:t>
+      </w:r>
+    </w:p>
+    <w:p/>
+    <w:p>
+      <w:pPr>
+        <w:keepNext/>
+        <w:pBdr>
+          <w:top w:val="nil"/>
+          <w:left w:val="nil"/>
+          <w:bottom w:val="nil"/>
+          <w:right w:val="nil"/>
+          <w:between w:val="nil"/>
+        </w:pBdr>
+        <w:jc w:val="center"/>
+      </w:pPr>
+      <w:r>
+        <w:rPr>
+          <w:rFonts w:ascii="Times New Roman" w:eastAsia="Times New Roman" w:hAnsi="Times New Roman" w:cs="Times New Roman"/>
+          <w:noProof/>
+          <w:sz w:val="24"/>
+          <w:szCs w:val="24"/>
+        </w:rPr>
+        <w:lastRenderedPageBreak/>
+        <w:drawing>
+          <wp:inline distT="0" distB="0" distL="0" distR="0" wp14:anchorId="69EEEA51" wp14:editId="7CEAEA14">
+            <wp:extent cx="4370400" cy="2066400"/>
+            <wp:effectExtent l="0" t="0" r="0" b="0"/>
+            <wp:docPr id="2121408192" name="Imagen 16"/>
+            <wp:cNvGraphicFramePr>
+              <a:graphicFrameLocks xmlns:a="http://schemas.openxmlformats.org/drawingml/2006/main" noChangeAspect="1"/>
+            </wp:cNvGraphicFramePr>
+            <a:graphic xmlns:a="http://schemas.openxmlformats.org/drawingml/2006/main">
+              <a:graphicData uri="http://schemas.openxmlformats.org/drawingml/2006/picture">
+                <pic:pic xmlns:pic="http://schemas.openxmlformats.org/drawingml/2006/picture">
+                  <pic:nvPicPr>
+                    <pic:cNvPr id="2121408192" name="Imagen 2121408192"/>
+                    <pic:cNvPicPr/>
+                  </pic:nvPicPr>
+                  <pic:blipFill>
+                    <a:blip r:embed="rId33" cstate="print">
+                      <a:extLst>
+                        <a:ext uri="{28A0092B-C50C-407E-A947-70E740481C1C}">
+                          <a14:useLocalDpi xmlns:a14="http://schemas.microsoft.com/office/drawing/2010/main" val="0"/>
+                        </a:ext>
+                      </a:extLst>
+                    </a:blip>
+                    <a:stretch>
+                      <a:fillRect/>
+                    </a:stretch>
+                  </pic:blipFill>
+                  <pic:spPr>
+                    <a:xfrm>
+                      <a:off x="0" y="0"/>
+                      <a:ext cx="4370400" cy="2066400"/>
+                    </a:xfrm>
+                    <a:prstGeom prst="rect">
+                      <a:avLst/>
+                    </a:prstGeom>
+                  </pic:spPr>
+                </pic:pic>
+              </a:graphicData>
+            </a:graphic>
+          </wp:inline>
+        </w:drawing>
+      </w:r>
+    </w:p>
+    <w:p>
+      <w:pPr>
+        <w:pStyle w:val="Descripcin"/>
+        <w:ind w:firstLine="720"/>
+        <w:jc w:val="both"/>
+        <w:rPr>
+          <w:rFonts w:ascii="Times New Roman" w:eastAsia="Times New Roman" w:hAnsi="Times New Roman" w:cs="Times New Roman"/>
+          <w:sz w:val="24"/>
+          <w:szCs w:val="24"/>
+        </w:rPr>
+      </w:pPr>
+      <w:r>
+        <w:t xml:space="preserve">    Ilustración </w:t>
+      </w:r>
+      <w:fldSimple w:instr=" SEQ Ilustración \* ARABIC ">
+        <w:r>
+          <w:rPr>
+            <w:noProof/>
+          </w:rPr>
+          <w:t>16</w:t>
+        </w:r>
+      </w:fldSimple>
+      <w:r>
+        <w:t>: CarePet pantalla detalle rutina de comida</w:t>
       </w:r>
     </w:p>
     <w:p>
@@ -17024,48 +18093,6 @@
           <w:szCs w:val="24"/>
         </w:rPr>
         <w:t>El módulo de comidas permite configurar la rutina de alimentación de cada mascota, indicando el número de comidas diarias y los horarios de cada una. Una vez configurada la rutina, los cuidadores pueden registrar cada toma mediante un botón de confirmación. El sistema valida que no se supere el número de comidas configuradas en un mismo día y muestra el historial de tomas con el usuario que las realizó y la marca temporal correspondiente.</w:t>
-      </w:r>
-    </w:p>
-    <w:p>
-      <w:pPr>
-        <w:pBdr>
-          <w:top w:val="nil"/>
-          <w:left w:val="nil"/>
-          <w:bottom w:val="nil"/>
-          <w:right w:val="nil"/>
-          <w:between w:val="nil"/>
-        </w:pBdr>
-        <w:jc w:val="both"/>
-        <w:rPr>
-          <w:rFonts w:ascii="Times New Roman" w:eastAsia="Times New Roman" w:hAnsi="Times New Roman" w:cs="Times New Roman"/>
-          <w:sz w:val="24"/>
-          <w:szCs w:val="24"/>
-        </w:rPr>
-      </w:pPr>
-    </w:p>
-    <w:p>
-      <w:pPr>
-        <w:pBdr>
-          <w:top w:val="nil"/>
-          <w:left w:val="nil"/>
-          <w:bottom w:val="nil"/>
-          <w:right w:val="nil"/>
-          <w:between w:val="nil"/>
-        </w:pBdr>
-        <w:jc w:val="both"/>
-        <w:rPr>
-          <w:rFonts w:ascii="Times New Roman" w:eastAsia="Times New Roman" w:hAnsi="Times New Roman" w:cs="Times New Roman"/>
-          <w:sz w:val="24"/>
-          <w:szCs w:val="24"/>
-        </w:rPr>
-      </w:pPr>
-      <w:r>
-        <w:rPr>
-          <w:rFonts w:ascii="Times New Roman" w:eastAsia="Times New Roman" w:hAnsi="Times New Roman" w:cs="Times New Roman"/>
-          <w:sz w:val="24"/>
-          <w:szCs w:val="24"/>
-        </w:rPr>
-        <w:t>Captura 6: Haz una captura de la pantalla de comidas de una mascota donde se vea la rutina configurada y el historial de tomas.</w:t>
       </w:r>
     </w:p>
     <w:p>
@@ -17133,27 +18160,175 @@
     </w:p>
     <w:p>
       <w:pPr>
-        <w:pBdr>
-          <w:top w:val="nil"/>
-          <w:left w:val="nil"/>
-          <w:bottom w:val="nil"/>
-          <w:right w:val="nil"/>
-          <w:between w:val="nil"/>
-        </w:pBdr>
-        <w:jc w:val="both"/>
-        <w:rPr>
-          <w:rFonts w:ascii="Times New Roman" w:eastAsia="Times New Roman" w:hAnsi="Times New Roman" w:cs="Times New Roman"/>
-          <w:sz w:val="24"/>
-          <w:szCs w:val="24"/>
-        </w:rPr>
-      </w:pPr>
-      <w:r>
-        <w:rPr>
-          <w:rFonts w:ascii="Times New Roman" w:eastAsia="Times New Roman" w:hAnsi="Times New Roman" w:cs="Times New Roman"/>
-          <w:sz w:val="24"/>
-          <w:szCs w:val="24"/>
-        </w:rPr>
-        <w:t>[Insertar aquí la Figura X. Registro e historial de paseos.]</w:t>
+        <w:keepNext/>
+        <w:pBdr>
+          <w:top w:val="nil"/>
+          <w:left w:val="nil"/>
+          <w:bottom w:val="nil"/>
+          <w:right w:val="nil"/>
+          <w:between w:val="nil"/>
+        </w:pBdr>
+        <w:jc w:val="center"/>
+      </w:pPr>
+      <w:r>
+        <w:rPr>
+          <w:rFonts w:ascii="Times New Roman" w:eastAsia="Times New Roman" w:hAnsi="Times New Roman" w:cs="Times New Roman"/>
+          <w:noProof/>
+          <w:sz w:val="24"/>
+          <w:szCs w:val="24"/>
+        </w:rPr>
+        <w:drawing>
+          <wp:inline distT="0" distB="0" distL="0" distR="0" wp14:anchorId="6E571D80" wp14:editId="7BF4E465">
+            <wp:extent cx="4370400" cy="2066400"/>
+            <wp:effectExtent l="0" t="0" r="0" b="0"/>
+            <wp:docPr id="107824394" name="Imagen 17"/>
+            <wp:cNvGraphicFramePr>
+              <a:graphicFrameLocks xmlns:a="http://schemas.openxmlformats.org/drawingml/2006/main" noChangeAspect="1"/>
+            </wp:cNvGraphicFramePr>
+            <a:graphic xmlns:a="http://schemas.openxmlformats.org/drawingml/2006/main">
+              <a:graphicData uri="http://schemas.openxmlformats.org/drawingml/2006/picture">
+                <pic:pic xmlns:pic="http://schemas.openxmlformats.org/drawingml/2006/picture">
+                  <pic:nvPicPr>
+                    <pic:cNvPr id="107824394" name="Imagen 107824394"/>
+                    <pic:cNvPicPr/>
+                  </pic:nvPicPr>
+                  <pic:blipFill>
+                    <a:blip r:embed="rId34" cstate="print">
+                      <a:extLst>
+                        <a:ext uri="{28A0092B-C50C-407E-A947-70E740481C1C}">
+                          <a14:useLocalDpi xmlns:a14="http://schemas.microsoft.com/office/drawing/2010/main" val="0"/>
+                        </a:ext>
+                      </a:extLst>
+                    </a:blip>
+                    <a:stretch>
+                      <a:fillRect/>
+                    </a:stretch>
+                  </pic:blipFill>
+                  <pic:spPr>
+                    <a:xfrm>
+                      <a:off x="0" y="0"/>
+                      <a:ext cx="4370400" cy="2066400"/>
+                    </a:xfrm>
+                    <a:prstGeom prst="rect">
+                      <a:avLst/>
+                    </a:prstGeom>
+                  </pic:spPr>
+                </pic:pic>
+              </a:graphicData>
+            </a:graphic>
+          </wp:inline>
+        </w:drawing>
+      </w:r>
+    </w:p>
+    <w:p>
+      <w:pPr>
+        <w:pStyle w:val="Descripcin"/>
+        <w:ind w:firstLine="720"/>
+        <w:jc w:val="both"/>
+      </w:pPr>
+      <w:r>
+        <w:t xml:space="preserve">    Ilustración </w:t>
+      </w:r>
+      <w:fldSimple w:instr=" SEQ Ilustración \* ARABIC ">
+        <w:r>
+          <w:rPr>
+            <w:noProof/>
+          </w:rPr>
+          <w:t>17</w:t>
+        </w:r>
+      </w:fldSimple>
+      <w:r>
+        <w:t>: CarePet pantalla paseos</w:t>
+      </w:r>
+    </w:p>
+    <w:p/>
+    <w:p>
+      <w:pPr>
+        <w:keepNext/>
+        <w:pBdr>
+          <w:top w:val="nil"/>
+          <w:left w:val="nil"/>
+          <w:bottom w:val="nil"/>
+          <w:right w:val="nil"/>
+          <w:between w:val="nil"/>
+        </w:pBdr>
+        <w:jc w:val="center"/>
+      </w:pPr>
+      <w:r>
+        <w:rPr>
+          <w:rFonts w:ascii="Times New Roman" w:eastAsia="Times New Roman" w:hAnsi="Times New Roman" w:cs="Times New Roman"/>
+          <w:noProof/>
+          <w:sz w:val="24"/>
+          <w:szCs w:val="24"/>
+        </w:rPr>
+        <w:lastRenderedPageBreak/>
+        <w:drawing>
+          <wp:inline distT="0" distB="0" distL="0" distR="0" wp14:anchorId="2EC4E76A" wp14:editId="2FB633FB">
+            <wp:extent cx="4381200" cy="2066400"/>
+            <wp:effectExtent l="0" t="0" r="635" b="0"/>
+            <wp:docPr id="2112099293" name="Imagen 18"/>
+            <wp:cNvGraphicFramePr>
+              <a:graphicFrameLocks xmlns:a="http://schemas.openxmlformats.org/drawingml/2006/main" noChangeAspect="1"/>
+            </wp:cNvGraphicFramePr>
+            <a:graphic xmlns:a="http://schemas.openxmlformats.org/drawingml/2006/main">
+              <a:graphicData uri="http://schemas.openxmlformats.org/drawingml/2006/picture">
+                <pic:pic xmlns:pic="http://schemas.openxmlformats.org/drawingml/2006/picture">
+                  <pic:nvPicPr>
+                    <pic:cNvPr id="2112099293" name="Imagen 2112099293"/>
+                    <pic:cNvPicPr/>
+                  </pic:nvPicPr>
+                  <pic:blipFill>
+                    <a:blip r:embed="rId35" cstate="print">
+                      <a:extLst>
+                        <a:ext uri="{28A0092B-C50C-407E-A947-70E740481C1C}">
+                          <a14:useLocalDpi xmlns:a14="http://schemas.microsoft.com/office/drawing/2010/main" val="0"/>
+                        </a:ext>
+                      </a:extLst>
+                    </a:blip>
+                    <a:stretch>
+                      <a:fillRect/>
+                    </a:stretch>
+                  </pic:blipFill>
+                  <pic:spPr>
+                    <a:xfrm>
+                      <a:off x="0" y="0"/>
+                      <a:ext cx="4381200" cy="2066400"/>
+                    </a:xfrm>
+                    <a:prstGeom prst="rect">
+                      <a:avLst/>
+                    </a:prstGeom>
+                  </pic:spPr>
+                </pic:pic>
+              </a:graphicData>
+            </a:graphic>
+          </wp:inline>
+        </w:drawing>
+      </w:r>
+    </w:p>
+    <w:p>
+      <w:pPr>
+        <w:pStyle w:val="Descripcin"/>
+        <w:ind w:firstLine="720"/>
+        <w:jc w:val="both"/>
+        <w:rPr>
+          <w:rFonts w:ascii="Times New Roman" w:eastAsia="Times New Roman" w:hAnsi="Times New Roman" w:cs="Times New Roman"/>
+          <w:sz w:val="24"/>
+          <w:szCs w:val="24"/>
+        </w:rPr>
+      </w:pPr>
+      <w:r>
+        <w:t xml:space="preserve">    Ilustración </w:t>
+      </w:r>
+      <w:fldSimple w:instr=" SEQ Ilustración \* ARABIC ">
+        <w:r>
+          <w:rPr>
+            <w:noProof/>
+          </w:rPr>
+          <w:t>18</w:t>
+        </w:r>
+      </w:fldSimple>
+      <w:r>
+        <w:t>: CarePet modal registro paseo</w:t>
       </w:r>
     </w:p>
     <w:p>
@@ -17232,49 +18407,6 @@
           <w:szCs w:val="24"/>
         </w:rPr>
       </w:pPr>
-    </w:p>
-    <w:p>
-      <w:pPr>
-        <w:pBdr>
-          <w:top w:val="nil"/>
-          <w:left w:val="nil"/>
-          <w:bottom w:val="nil"/>
-          <w:right w:val="nil"/>
-          <w:between w:val="nil"/>
-        </w:pBdr>
-        <w:jc w:val="both"/>
-        <w:rPr>
-          <w:rFonts w:ascii="Times New Roman" w:eastAsia="Times New Roman" w:hAnsi="Times New Roman" w:cs="Times New Roman"/>
-          <w:sz w:val="24"/>
-          <w:szCs w:val="24"/>
-        </w:rPr>
-      </w:pPr>
-      <w:r>
-        <w:rPr>
-          <w:rFonts w:ascii="Times New Roman" w:eastAsia="Times New Roman" w:hAnsi="Times New Roman" w:cs="Times New Roman"/>
-          <w:sz w:val="24"/>
-          <w:szCs w:val="24"/>
-        </w:rPr>
-        <w:t xml:space="preserve">Captura 7: Haz una captura del historial de paseos de una mascota donde se vean las tarjetas con los </w:t>
-      </w:r>
-      <w:proofErr w:type="spellStart"/>
-      <w:r>
-        <w:rPr>
-          <w:rFonts w:ascii="Times New Roman" w:eastAsia="Times New Roman" w:hAnsi="Times New Roman" w:cs="Times New Roman"/>
-          <w:sz w:val="24"/>
-          <w:szCs w:val="24"/>
-        </w:rPr>
-        <w:t>badges</w:t>
-      </w:r>
-      <w:proofErr w:type="spellEnd"/>
-      <w:r>
-        <w:rPr>
-          <w:rFonts w:ascii="Times New Roman" w:eastAsia="Times New Roman" w:hAnsi="Times New Roman" w:cs="Times New Roman"/>
-          <w:sz w:val="24"/>
-          <w:szCs w:val="24"/>
-        </w:rPr>
-        <w:t xml:space="preserve"> de pipí y caca. Si puedes, abre también el modal de registrar paseo y haz una segunda captura.</w:t>
-      </w:r>
     </w:p>
     <w:p>
       <w:pPr>
@@ -17302,7 +18434,6 @@
           <w:sz w:val="24"/>
           <w:szCs w:val="24"/>
         </w:rPr>
-        <w:lastRenderedPageBreak/>
         <w:t>Perfil de usuario</w:t>
       </w:r>
     </w:p>
@@ -17325,27 +18456,90 @@
     </w:p>
     <w:p>
       <w:pPr>
-        <w:pBdr>
-          <w:top w:val="nil"/>
-          <w:left w:val="nil"/>
-          <w:bottom w:val="nil"/>
-          <w:right w:val="nil"/>
-          <w:between w:val="nil"/>
-        </w:pBdr>
-        <w:jc w:val="both"/>
-        <w:rPr>
-          <w:rFonts w:ascii="Times New Roman" w:eastAsia="Times New Roman" w:hAnsi="Times New Roman" w:cs="Times New Roman"/>
-          <w:sz w:val="24"/>
-          <w:szCs w:val="24"/>
-        </w:rPr>
-      </w:pPr>
-      <w:r>
-        <w:rPr>
-          <w:rFonts w:ascii="Times New Roman" w:eastAsia="Times New Roman" w:hAnsi="Times New Roman" w:cs="Times New Roman"/>
-          <w:sz w:val="24"/>
-          <w:szCs w:val="24"/>
-        </w:rPr>
-        <w:t>[Insertar aquí la Figura X. Pantalla de perfil de usuario.]</w:t>
+        <w:keepNext/>
+        <w:pBdr>
+          <w:top w:val="nil"/>
+          <w:left w:val="nil"/>
+          <w:bottom w:val="nil"/>
+          <w:right w:val="nil"/>
+          <w:between w:val="nil"/>
+        </w:pBdr>
+        <w:jc w:val="center"/>
+      </w:pPr>
+      <w:r>
+        <w:rPr>
+          <w:rFonts w:ascii="Times New Roman" w:eastAsia="Times New Roman" w:hAnsi="Times New Roman" w:cs="Times New Roman"/>
+          <w:noProof/>
+          <w:sz w:val="24"/>
+          <w:szCs w:val="24"/>
+        </w:rPr>
+        <w:drawing>
+          <wp:inline distT="0" distB="0" distL="0" distR="0" wp14:anchorId="7C2A147C" wp14:editId="5D5C0EF2">
+            <wp:extent cx="4370400" cy="2066400"/>
+            <wp:effectExtent l="0" t="0" r="0" b="0"/>
+            <wp:docPr id="1342522872" name="Imagen 19"/>
+            <wp:cNvGraphicFramePr>
+              <a:graphicFrameLocks xmlns:a="http://schemas.openxmlformats.org/drawingml/2006/main" noChangeAspect="1"/>
+            </wp:cNvGraphicFramePr>
+            <a:graphic xmlns:a="http://schemas.openxmlformats.org/drawingml/2006/main">
+              <a:graphicData uri="http://schemas.openxmlformats.org/drawingml/2006/picture">
+                <pic:pic xmlns:pic="http://schemas.openxmlformats.org/drawingml/2006/picture">
+                  <pic:nvPicPr>
+                    <pic:cNvPr id="1342522872" name="Imagen 1342522872"/>
+                    <pic:cNvPicPr/>
+                  </pic:nvPicPr>
+                  <pic:blipFill>
+                    <a:blip r:embed="rId36" cstate="print">
+                      <a:extLst>
+                        <a:ext uri="{28A0092B-C50C-407E-A947-70E740481C1C}">
+                          <a14:useLocalDpi xmlns:a14="http://schemas.microsoft.com/office/drawing/2010/main" val="0"/>
+                        </a:ext>
+                      </a:extLst>
+                    </a:blip>
+                    <a:stretch>
+                      <a:fillRect/>
+                    </a:stretch>
+                  </pic:blipFill>
+                  <pic:spPr>
+                    <a:xfrm>
+                      <a:off x="0" y="0"/>
+                      <a:ext cx="4370400" cy="2066400"/>
+                    </a:xfrm>
+                    <a:prstGeom prst="rect">
+                      <a:avLst/>
+                    </a:prstGeom>
+                  </pic:spPr>
+                </pic:pic>
+              </a:graphicData>
+            </a:graphic>
+          </wp:inline>
+        </w:drawing>
+      </w:r>
+    </w:p>
+    <w:p>
+      <w:pPr>
+        <w:pStyle w:val="Descripcin"/>
+        <w:ind w:firstLine="720"/>
+        <w:jc w:val="both"/>
+        <w:rPr>
+          <w:rFonts w:ascii="Times New Roman" w:eastAsia="Times New Roman" w:hAnsi="Times New Roman" w:cs="Times New Roman"/>
+          <w:sz w:val="24"/>
+          <w:szCs w:val="24"/>
+        </w:rPr>
+      </w:pPr>
+      <w:r>
+        <w:t xml:space="preserve">    Ilustración </w:t>
+      </w:r>
+      <w:fldSimple w:instr=" SEQ Ilustración \* ARABIC ">
+        <w:r>
+          <w:rPr>
+            <w:noProof/>
+          </w:rPr>
+          <w:t>19</w:t>
+        </w:r>
+      </w:fldSimple>
+      <w:r>
+        <w:t>: CarePet pantalla perfil usuario</w:t>
       </w:r>
     </w:p>
     <w:p>
@@ -17388,48 +18582,6 @@
           <w:szCs w:val="24"/>
         </w:rPr>
         <w:t>La sección de perfil muestra la información personal del usuario: nombre, email y fecha de registro. Desde esta pantalla el usuario puede modificar su nombre y cambiar su contraseña, para lo que debe verificar primero la contraseña actual. El sistema valida que la nueva contraseña tenga al menos seis caracteres y que coincida con la confirmación introducida.</w:t>
-      </w:r>
-    </w:p>
-    <w:p>
-      <w:pPr>
-        <w:pBdr>
-          <w:top w:val="nil"/>
-          <w:left w:val="nil"/>
-          <w:bottom w:val="nil"/>
-          <w:right w:val="nil"/>
-          <w:between w:val="nil"/>
-        </w:pBdr>
-        <w:jc w:val="both"/>
-        <w:rPr>
-          <w:rFonts w:ascii="Times New Roman" w:eastAsia="Times New Roman" w:hAnsi="Times New Roman" w:cs="Times New Roman"/>
-          <w:sz w:val="24"/>
-          <w:szCs w:val="24"/>
-        </w:rPr>
-      </w:pPr>
-    </w:p>
-    <w:p>
-      <w:pPr>
-        <w:pBdr>
-          <w:top w:val="nil"/>
-          <w:left w:val="nil"/>
-          <w:bottom w:val="nil"/>
-          <w:right w:val="nil"/>
-          <w:between w:val="nil"/>
-        </w:pBdr>
-        <w:jc w:val="both"/>
-        <w:rPr>
-          <w:rFonts w:ascii="Times New Roman" w:eastAsia="Times New Roman" w:hAnsi="Times New Roman" w:cs="Times New Roman"/>
-          <w:sz w:val="24"/>
-          <w:szCs w:val="24"/>
-        </w:rPr>
-      </w:pPr>
-      <w:r>
-        <w:rPr>
-          <w:rFonts w:ascii="Times New Roman" w:eastAsia="Times New Roman" w:hAnsi="Times New Roman" w:cs="Times New Roman"/>
-          <w:sz w:val="24"/>
-          <w:szCs w:val="24"/>
-        </w:rPr>
-        <w:t>Captura 8: Haz una captura de la pantalla de perfil de usuario.</w:t>
       </w:r>
     </w:p>
     <w:p>
@@ -17497,27 +18649,91 @@
     </w:p>
     <w:p>
       <w:pPr>
-        <w:pBdr>
-          <w:top w:val="nil"/>
-          <w:left w:val="nil"/>
-          <w:bottom w:val="nil"/>
-          <w:right w:val="nil"/>
-          <w:between w:val="nil"/>
-        </w:pBdr>
-        <w:jc w:val="both"/>
-        <w:rPr>
-          <w:rFonts w:ascii="Times New Roman" w:eastAsia="Times New Roman" w:hAnsi="Times New Roman" w:cs="Times New Roman"/>
-          <w:sz w:val="24"/>
-          <w:szCs w:val="24"/>
-        </w:rPr>
-      </w:pPr>
-      <w:r>
-        <w:rPr>
-          <w:rFonts w:ascii="Times New Roman" w:eastAsia="Times New Roman" w:hAnsi="Times New Roman" w:cs="Times New Roman"/>
-          <w:sz w:val="24"/>
-          <w:szCs w:val="24"/>
-        </w:rPr>
-        <w:t>[Insertar aquí la Figura X. Vista de la aplicación en dispositivo móvil con barra de navegación inferior.]</w:t>
+        <w:keepNext/>
+        <w:pBdr>
+          <w:top w:val="nil"/>
+          <w:left w:val="nil"/>
+          <w:bottom w:val="nil"/>
+          <w:right w:val="nil"/>
+          <w:between w:val="nil"/>
+        </w:pBdr>
+        <w:jc w:val="center"/>
+      </w:pPr>
+      <w:r>
+        <w:rPr>
+          <w:rFonts w:ascii="Times New Roman" w:eastAsia="Times New Roman" w:hAnsi="Times New Roman" w:cs="Times New Roman"/>
+          <w:noProof/>
+          <w:sz w:val="24"/>
+          <w:szCs w:val="24"/>
+        </w:rPr>
+        <w:lastRenderedPageBreak/>
+        <w:drawing>
+          <wp:inline distT="0" distB="0" distL="0" distR="0" wp14:anchorId="771DDEDD" wp14:editId="121EC2DE">
+            <wp:extent cx="1523365" cy="3117507"/>
+            <wp:effectExtent l="0" t="0" r="635" b="6985"/>
+            <wp:docPr id="1414046880" name="Imagen 20"/>
+            <wp:cNvGraphicFramePr>
+              <a:graphicFrameLocks xmlns:a="http://schemas.openxmlformats.org/drawingml/2006/main" noChangeAspect="1"/>
+            </wp:cNvGraphicFramePr>
+            <a:graphic xmlns:a="http://schemas.openxmlformats.org/drawingml/2006/main">
+              <a:graphicData uri="http://schemas.openxmlformats.org/drawingml/2006/picture">
+                <pic:pic xmlns:pic="http://schemas.openxmlformats.org/drawingml/2006/picture">
+                  <pic:nvPicPr>
+                    <pic:cNvPr id="1414046880" name="Imagen 1414046880"/>
+                    <pic:cNvPicPr/>
+                  </pic:nvPicPr>
+                  <pic:blipFill>
+                    <a:blip r:embed="rId37" cstate="print">
+                      <a:extLst>
+                        <a:ext uri="{28A0092B-C50C-407E-A947-70E740481C1C}">
+                          <a14:useLocalDpi xmlns:a14="http://schemas.microsoft.com/office/drawing/2010/main" val="0"/>
+                        </a:ext>
+                      </a:extLst>
+                    </a:blip>
+                    <a:stretch>
+                      <a:fillRect/>
+                    </a:stretch>
+                  </pic:blipFill>
+                  <pic:spPr>
+                    <a:xfrm>
+                      <a:off x="0" y="0"/>
+                      <a:ext cx="1537910" cy="3147274"/>
+                    </a:xfrm>
+                    <a:prstGeom prst="rect">
+                      <a:avLst/>
+                    </a:prstGeom>
+                  </pic:spPr>
+                </pic:pic>
+              </a:graphicData>
+            </a:graphic>
+          </wp:inline>
+        </w:drawing>
+      </w:r>
+    </w:p>
+    <w:p>
+      <w:pPr>
+        <w:pStyle w:val="Descripcin"/>
+        <w:ind w:left="2160"/>
+        <w:jc w:val="both"/>
+        <w:rPr>
+          <w:rFonts w:ascii="Times New Roman" w:eastAsia="Times New Roman" w:hAnsi="Times New Roman" w:cs="Times New Roman"/>
+          <w:sz w:val="24"/>
+          <w:szCs w:val="24"/>
+        </w:rPr>
+      </w:pPr>
+      <w:r>
+        <w:t xml:space="preserve">    Ilustración </w:t>
+      </w:r>
+      <w:fldSimple w:instr=" SEQ Ilustración \* ARABIC ">
+        <w:r>
+          <w:rPr>
+            <w:noProof/>
+          </w:rPr>
+          <w:t>20</w:t>
+        </w:r>
+      </w:fldSimple>
+      <w:r>
+        <w:t>: CarePet vista responsive desde móvil</w:t>
       </w:r>
     </w:p>
     <w:p>
@@ -17578,66 +18794,6 @@
           <w:szCs w:val="24"/>
         </w:rPr>
         <w:t xml:space="preserve"> lateral. La aplicación puede instalarse como PWA desde el navegador del móvil, lo que permite acceder a ella directamente desde la pantalla de inicio del dispositivo sin necesidad de descargarla desde ninguna tienda de aplicaciones.</w:t>
-      </w:r>
-    </w:p>
-    <w:p>
-      <w:pPr>
-        <w:pBdr>
-          <w:top w:val="nil"/>
-          <w:left w:val="nil"/>
-          <w:bottom w:val="nil"/>
-          <w:right w:val="nil"/>
-          <w:between w:val="nil"/>
-        </w:pBdr>
-        <w:jc w:val="both"/>
-        <w:rPr>
-          <w:rFonts w:ascii="Times New Roman" w:eastAsia="Times New Roman" w:hAnsi="Times New Roman" w:cs="Times New Roman"/>
-          <w:sz w:val="24"/>
-          <w:szCs w:val="24"/>
-        </w:rPr>
-      </w:pPr>
-    </w:p>
-    <w:p>
-      <w:pPr>
-        <w:pBdr>
-          <w:top w:val="nil"/>
-          <w:left w:val="nil"/>
-          <w:bottom w:val="nil"/>
-          <w:right w:val="nil"/>
-          <w:between w:val="nil"/>
-        </w:pBdr>
-        <w:jc w:val="both"/>
-        <w:rPr>
-          <w:rFonts w:ascii="Times New Roman" w:eastAsia="Times New Roman" w:hAnsi="Times New Roman" w:cs="Times New Roman"/>
-          <w:sz w:val="24"/>
-          <w:szCs w:val="24"/>
-        </w:rPr>
-      </w:pPr>
-      <w:r>
-        <w:rPr>
-          <w:rFonts w:ascii="Times New Roman" w:eastAsia="Times New Roman" w:hAnsi="Times New Roman" w:cs="Times New Roman"/>
-          <w:sz w:val="24"/>
-          <w:szCs w:val="24"/>
-        </w:rPr>
-        <w:t xml:space="preserve">Captura 9: Abre la aplicación desde el navegador del móvil y haz una captura donde se vea la barra de navegación inferior. Si tienes la </w:t>
-      </w:r>
-      <w:proofErr w:type="gramStart"/>
-      <w:r>
-        <w:rPr>
-          <w:rFonts w:ascii="Times New Roman" w:eastAsia="Times New Roman" w:hAnsi="Times New Roman" w:cs="Times New Roman"/>
-          <w:sz w:val="24"/>
-          <w:szCs w:val="24"/>
-        </w:rPr>
-        <w:t>app</w:t>
-      </w:r>
-      <w:proofErr w:type="gramEnd"/>
-      <w:r>
-        <w:rPr>
-          <w:rFonts w:ascii="Times New Roman" w:eastAsia="Times New Roman" w:hAnsi="Times New Roman" w:cs="Times New Roman"/>
-          <w:sz w:val="24"/>
-          <w:szCs w:val="24"/>
-        </w:rPr>
-        <w:t xml:space="preserve"> instalada como PWA, haz también una captura de la pantalla de inicio del móvil donde se vea el icono de CarePet.</w:t>
       </w:r>
     </w:p>
     <w:p>
@@ -17930,8 +19086,16 @@
           <w:sz w:val="24"/>
           <w:szCs w:val="24"/>
         </w:rPr>
+        <w:t xml:space="preserve">Para resolver este problema se actuó en dos niveles. Por un lado, se configuró la funcionalidad de proxy integrada en Vite mediante el archivo vite.config.js, redirigiendo de forma transparente todas las peticiones cuya ruta comienza por /api hacia el servidor backend </w:t>
+      </w:r>
+      <w:r>
+        <w:rPr>
+          <w:rFonts w:ascii="Times New Roman" w:eastAsia="Times New Roman" w:hAnsi="Times New Roman" w:cs="Times New Roman"/>
+          <w:sz w:val="24"/>
+          <w:szCs w:val="24"/>
+        </w:rPr>
         <w:lastRenderedPageBreak/>
-        <w:t>Para resolver este problema se actuó en dos niveles. Por un lado, se configuró la funcionalidad de proxy integrada en Vite mediante el archivo vite.config.js, redirigiendo de forma transparente todas las peticiones cuya ruta comienza por /api hacia el servidor backend en http://localhost:8080. Por otro lado, se habilitó la configuración de CORS en la clase SecurityConfig.java del backend, permitiendo las peticiones procedentes del origen del frontend. De este modo se eliminaron los errores de CORS tanto en el entorno de desarrollo como en producción.</w:t>
+        <w:t>en http://localhost:8080. Por otro lado, se habilitó la configuración de CORS en la clase SecurityConfig.java del backend, permitiendo las peticiones procedentes del origen del frontend. De este modo se eliminaron los errores de CORS tanto en el entorno de desarrollo como en producción.</w:t>
       </w:r>
     </w:p>
     <w:p>
@@ -18653,16 +19817,7 @@
           <w:sz w:val="24"/>
           <w:szCs w:val="24"/>
         </w:rPr>
-        <w:t xml:space="preserve">Se detectó que las medicaciones cuya fecha de fin había sido superada continuaban apareciendo como activas en la interfaz, a pesar de que el sistema debería marcarlas </w:t>
-      </w:r>
-      <w:r>
-        <w:rPr>
-          <w:rFonts w:ascii="Times New Roman" w:eastAsia="Times New Roman" w:hAnsi="Times New Roman" w:cs="Times New Roman"/>
-          <w:sz w:val="24"/>
-          <w:szCs w:val="24"/>
-        </w:rPr>
-        <w:lastRenderedPageBreak/>
-        <w:t xml:space="preserve">automáticamente como finalizadas. El problema tenía dos causas relacionadas. Por un lado, el método </w:t>
+        <w:t xml:space="preserve">Se detectó que las medicaciones cuya fecha de fin había sido superada continuaban apareciendo como activas en la interfaz, a pesar de que el sistema debería marcarlas automáticamente como finalizadas. El problema tenía dos causas relacionadas. Por un lado, el método </w:t>
       </w:r>
       <w:proofErr w:type="spellStart"/>
       <w:r>
@@ -18682,7 +19837,16 @@
           <w:sz w:val="24"/>
           <w:szCs w:val="24"/>
         </w:rPr>
-        <w:t xml:space="preserve"> utilizaba directamente el valor del campo active almacenado en la base de datos, que nunca se actualizaba de forma automática al superar la fecha de fin. Por otro lado, el repositorio utilizaba el método </w:t>
+        <w:t xml:space="preserve"> utilizaba directamente el valor del campo active almacenado en la base de datos, que nunca se actualizaba de forma automática al superar la </w:t>
+      </w:r>
+      <w:r>
+        <w:rPr>
+          <w:rFonts w:ascii="Times New Roman" w:eastAsia="Times New Roman" w:hAnsi="Times New Roman" w:cs="Times New Roman"/>
+          <w:sz w:val="24"/>
+          <w:szCs w:val="24"/>
+        </w:rPr>
+        <w:lastRenderedPageBreak/>
+        <w:t xml:space="preserve">fecha de fin. Por otro lado, el repositorio utilizaba el método </w:t>
       </w:r>
       <w:proofErr w:type="spellStart"/>
       <w:r>
@@ -19312,7 +20476,6 @@
           <w:sz w:val="24"/>
           <w:szCs w:val="24"/>
         </w:rPr>
-        <w:lastRenderedPageBreak/>
         <w:t xml:space="preserve">ALTER TABLE </w:t>
       </w:r>
       <w:proofErr w:type="spellStart"/>
@@ -19463,6 +20626,7 @@
           <w:sz w:val="36"/>
           <w:szCs w:val="36"/>
         </w:rPr>
+        <w:lastRenderedPageBreak/>
         <w:t>4.5.- Pruebas/Implantación</w:t>
       </w:r>
     </w:p>
@@ -21626,6 +22790,25 @@
       <w:contextualSpacing/>
     </w:pPr>
   </w:style>
+  <w:style w:type="paragraph" w:styleId="Descripcin">
+    <w:name w:val="caption"/>
+    <w:basedOn w:val="Normal"/>
+    <w:next w:val="Normal"/>
+    <w:uiPriority w:val="35"/>
+    <w:unhideWhenUsed/>
+    <w:qFormat/>
+    <w:rsid w:val="00E35013"/>
+    <w:pPr>
+      <w:spacing w:after="200" w:line="240" w:lineRule="auto"/>
+    </w:pPr>
+    <w:rPr>
+      <w:i/>
+      <w:iCs/>
+      <w:color w:val="1F497D" w:themeColor="text2"/>
+      <w:sz w:val="18"/>
+      <w:szCs w:val="18"/>
+    </w:rPr>
+  </w:style>
 </w:styles>
 </file>
 

</xml_diff>

<commit_message>
Capítulo 4 updated with all the necessary screenshots
</commit_message>
<xml_diff>
--- a/docs/Capítulo 4 - Metodología y resultados.docx
+++ b/docs/Capítulo 4 - Metodología y resultados.docx
@@ -20869,332 +20869,301 @@
     </w:p>
     <w:p>
       <w:pPr>
-        <w:pBdr>
-          <w:top w:val="nil"/>
-          <w:left w:val="nil"/>
-          <w:bottom w:val="nil"/>
-          <w:right w:val="nil"/>
-          <w:between w:val="nil"/>
-        </w:pBdr>
-        <w:jc w:val="both"/>
-        <w:rPr>
-          <w:rFonts w:ascii="Times New Roman" w:eastAsia="Times New Roman" w:hAnsi="Times New Roman" w:cs="Times New Roman"/>
-          <w:sz w:val="24"/>
-          <w:szCs w:val="24"/>
-        </w:rPr>
-      </w:pPr>
-      <w:r>
-        <w:rPr>
-          <w:rFonts w:ascii="Times New Roman" w:eastAsia="Times New Roman" w:hAnsi="Times New Roman" w:cs="Times New Roman"/>
-          <w:sz w:val="24"/>
-          <w:szCs w:val="24"/>
-        </w:rPr>
-        <w:t>Captura 1 — Login con JWT</w:t>
-      </w:r>
-    </w:p>
-    <w:p>
-      <w:pPr>
-        <w:pBdr>
-          <w:top w:val="nil"/>
-          <w:left w:val="nil"/>
-          <w:bottom w:val="nil"/>
-          <w:right w:val="nil"/>
-          <w:between w:val="nil"/>
-        </w:pBdr>
-        <w:jc w:val="both"/>
-        <w:rPr>
-          <w:rFonts w:ascii="Times New Roman" w:eastAsia="Times New Roman" w:hAnsi="Times New Roman" w:cs="Times New Roman"/>
-          <w:sz w:val="24"/>
-          <w:szCs w:val="24"/>
-        </w:rPr>
-      </w:pPr>
-      <w:r>
-        <w:rPr>
-          <w:rFonts w:ascii="Times New Roman" w:eastAsia="Times New Roman" w:hAnsi="Times New Roman" w:cs="Times New Roman"/>
-          <w:sz w:val="24"/>
-          <w:szCs w:val="24"/>
-        </w:rPr>
-        <w:t>Haz una petición POST a /api/</w:t>
-      </w:r>
-      <w:proofErr w:type="spellStart"/>
-      <w:r>
-        <w:rPr>
-          <w:rFonts w:ascii="Times New Roman" w:eastAsia="Times New Roman" w:hAnsi="Times New Roman" w:cs="Times New Roman"/>
-          <w:sz w:val="24"/>
-          <w:szCs w:val="24"/>
-        </w:rPr>
-        <w:t>auth</w:t>
-      </w:r>
-      <w:proofErr w:type="spellEnd"/>
-      <w:r>
-        <w:rPr>
-          <w:rFonts w:ascii="Times New Roman" w:eastAsia="Times New Roman" w:hAnsi="Times New Roman" w:cs="Times New Roman"/>
-          <w:sz w:val="24"/>
-          <w:szCs w:val="24"/>
-        </w:rPr>
-        <w:t>/</w:t>
-      </w:r>
-      <w:proofErr w:type="spellStart"/>
-      <w:r>
-        <w:rPr>
-          <w:rFonts w:ascii="Times New Roman" w:eastAsia="Times New Roman" w:hAnsi="Times New Roman" w:cs="Times New Roman"/>
-          <w:sz w:val="24"/>
-          <w:szCs w:val="24"/>
-        </w:rPr>
-        <w:t>login</w:t>
-      </w:r>
-      <w:proofErr w:type="spellEnd"/>
-      <w:r>
-        <w:rPr>
-          <w:rFonts w:ascii="Times New Roman" w:eastAsia="Times New Roman" w:hAnsi="Times New Roman" w:cs="Times New Roman"/>
-          <w:sz w:val="24"/>
-          <w:szCs w:val="24"/>
-        </w:rPr>
-        <w:t xml:space="preserve"> con el </w:t>
-      </w:r>
-      <w:proofErr w:type="spellStart"/>
-      <w:r>
-        <w:rPr>
-          <w:rFonts w:ascii="Times New Roman" w:eastAsia="Times New Roman" w:hAnsi="Times New Roman" w:cs="Times New Roman"/>
-          <w:sz w:val="24"/>
-          <w:szCs w:val="24"/>
-        </w:rPr>
-        <w:t>body</w:t>
-      </w:r>
-      <w:proofErr w:type="spellEnd"/>
-      <w:r>
-        <w:rPr>
-          <w:rFonts w:ascii="Times New Roman" w:eastAsia="Times New Roman" w:hAnsi="Times New Roman" w:cs="Times New Roman"/>
-          <w:sz w:val="24"/>
-          <w:szCs w:val="24"/>
-        </w:rPr>
-        <w:t xml:space="preserve"> {"email": "...", "</w:t>
-      </w:r>
-      <w:proofErr w:type="spellStart"/>
-      <w:proofErr w:type="gramStart"/>
-      <w:r>
-        <w:rPr>
-          <w:rFonts w:ascii="Times New Roman" w:eastAsia="Times New Roman" w:hAnsi="Times New Roman" w:cs="Times New Roman"/>
-          <w:sz w:val="24"/>
-          <w:szCs w:val="24"/>
-        </w:rPr>
-        <w:t>password</w:t>
-      </w:r>
-      <w:proofErr w:type="spellEnd"/>
-      <w:proofErr w:type="gramEnd"/>
-      <w:r>
-        <w:rPr>
-          <w:rFonts w:ascii="Times New Roman" w:eastAsia="Times New Roman" w:hAnsi="Times New Roman" w:cs="Times New Roman"/>
-          <w:sz w:val="24"/>
-          <w:szCs w:val="24"/>
-        </w:rPr>
-        <w:t>": "..."} y haz captura de la respuesta donde se vea el token JWT generado. Esta es la más importante porque ilustra el sistema de autenticación.</w:t>
-      </w:r>
-    </w:p>
-    <w:p>
-      <w:pPr>
-        <w:pBdr>
-          <w:top w:val="nil"/>
-          <w:left w:val="nil"/>
-          <w:bottom w:val="nil"/>
-          <w:right w:val="nil"/>
-          <w:between w:val="nil"/>
-        </w:pBdr>
-        <w:jc w:val="both"/>
-        <w:rPr>
-          <w:rFonts w:ascii="Times New Roman" w:eastAsia="Times New Roman" w:hAnsi="Times New Roman" w:cs="Times New Roman"/>
-          <w:sz w:val="24"/>
-          <w:szCs w:val="24"/>
-        </w:rPr>
-      </w:pPr>
-    </w:p>
-    <w:p>
-      <w:pPr>
-        <w:pBdr>
-          <w:top w:val="nil"/>
-          <w:left w:val="nil"/>
-          <w:bottom w:val="nil"/>
-          <w:right w:val="nil"/>
-          <w:between w:val="nil"/>
-        </w:pBdr>
-        <w:jc w:val="both"/>
-        <w:rPr>
-          <w:rFonts w:ascii="Times New Roman" w:eastAsia="Times New Roman" w:hAnsi="Times New Roman" w:cs="Times New Roman"/>
-          <w:sz w:val="24"/>
-          <w:szCs w:val="24"/>
-        </w:rPr>
-      </w:pPr>
-      <w:r>
-        <w:rPr>
-          <w:rFonts w:ascii="Times New Roman" w:eastAsia="Times New Roman" w:hAnsi="Times New Roman" w:cs="Times New Roman"/>
-          <w:sz w:val="24"/>
-          <w:szCs w:val="24"/>
-        </w:rPr>
-        <w:t>Captura 2 — Registrar toma de medicamento (éxito)</w:t>
-      </w:r>
-    </w:p>
-    <w:p>
-      <w:pPr>
-        <w:pBdr>
-          <w:top w:val="nil"/>
-          <w:left w:val="nil"/>
-          <w:bottom w:val="nil"/>
-          <w:right w:val="nil"/>
-          <w:between w:val="nil"/>
-        </w:pBdr>
-        <w:jc w:val="both"/>
-        <w:rPr>
-          <w:rFonts w:ascii="Times New Roman" w:eastAsia="Times New Roman" w:hAnsi="Times New Roman" w:cs="Times New Roman"/>
-          <w:sz w:val="24"/>
-          <w:szCs w:val="24"/>
-        </w:rPr>
-      </w:pPr>
-      <w:r>
-        <w:rPr>
-          <w:rFonts w:ascii="Times New Roman" w:eastAsia="Times New Roman" w:hAnsi="Times New Roman" w:cs="Times New Roman"/>
-          <w:sz w:val="24"/>
-          <w:szCs w:val="24"/>
-        </w:rPr>
-        <w:t>Haz una petición POST a /api/</w:t>
-      </w:r>
-      <w:proofErr w:type="spellStart"/>
-      <w:r>
-        <w:rPr>
-          <w:rFonts w:ascii="Times New Roman" w:eastAsia="Times New Roman" w:hAnsi="Times New Roman" w:cs="Times New Roman"/>
-          <w:sz w:val="24"/>
-          <w:szCs w:val="24"/>
-        </w:rPr>
-        <w:t>medications</w:t>
-      </w:r>
-      <w:proofErr w:type="spellEnd"/>
-      <w:r>
-        <w:rPr>
-          <w:rFonts w:ascii="Times New Roman" w:eastAsia="Times New Roman" w:hAnsi="Times New Roman" w:cs="Times New Roman"/>
-          <w:sz w:val="24"/>
-          <w:szCs w:val="24"/>
-        </w:rPr>
-        <w:t xml:space="preserve">/{id}/log con el token JWT en la cabecera de autorización y haz captura de la respuesta 201 </w:t>
-      </w:r>
-      <w:proofErr w:type="spellStart"/>
-      <w:r>
-        <w:rPr>
-          <w:rFonts w:ascii="Times New Roman" w:eastAsia="Times New Roman" w:hAnsi="Times New Roman" w:cs="Times New Roman"/>
-          <w:sz w:val="24"/>
-          <w:szCs w:val="24"/>
-        </w:rPr>
-        <w:t>Created</w:t>
-      </w:r>
-      <w:proofErr w:type="spellEnd"/>
-      <w:r>
-        <w:rPr>
-          <w:rFonts w:ascii="Times New Roman" w:eastAsia="Times New Roman" w:hAnsi="Times New Roman" w:cs="Times New Roman"/>
-          <w:sz w:val="24"/>
-          <w:szCs w:val="24"/>
-        </w:rPr>
-        <w:t>. Esta ilustra la funcionalidad principal del proyecto.</w:t>
-      </w:r>
-    </w:p>
-    <w:p>
-      <w:pPr>
-        <w:pBdr>
-          <w:top w:val="nil"/>
-          <w:left w:val="nil"/>
-          <w:bottom w:val="nil"/>
-          <w:right w:val="nil"/>
-          <w:between w:val="nil"/>
-        </w:pBdr>
-        <w:jc w:val="both"/>
-        <w:rPr>
-          <w:rFonts w:ascii="Times New Roman" w:eastAsia="Times New Roman" w:hAnsi="Times New Roman" w:cs="Times New Roman"/>
-          <w:sz w:val="24"/>
-          <w:szCs w:val="24"/>
-        </w:rPr>
-      </w:pPr>
-    </w:p>
-    <w:p>
-      <w:pPr>
-        <w:pBdr>
-          <w:top w:val="nil"/>
-          <w:left w:val="nil"/>
-          <w:bottom w:val="nil"/>
-          <w:right w:val="nil"/>
-          <w:between w:val="nil"/>
-        </w:pBdr>
-        <w:jc w:val="both"/>
-        <w:rPr>
-          <w:rFonts w:ascii="Times New Roman" w:eastAsia="Times New Roman" w:hAnsi="Times New Roman" w:cs="Times New Roman"/>
-          <w:sz w:val="24"/>
-          <w:szCs w:val="24"/>
-        </w:rPr>
-      </w:pPr>
-      <w:r>
-        <w:rPr>
-          <w:rFonts w:ascii="Times New Roman" w:eastAsia="Times New Roman" w:hAnsi="Times New Roman" w:cs="Times New Roman"/>
-          <w:sz w:val="24"/>
-          <w:szCs w:val="24"/>
-        </w:rPr>
-        <w:t>Captura 3 — Registrar toma duplicada (error)</w:t>
-      </w:r>
-    </w:p>
-    <w:p>
-      <w:pPr>
-        <w:pBdr>
-          <w:top w:val="nil"/>
-          <w:left w:val="nil"/>
-          <w:bottom w:val="nil"/>
-          <w:right w:val="nil"/>
-          <w:between w:val="nil"/>
-        </w:pBdr>
-        <w:jc w:val="both"/>
-        <w:rPr>
-          <w:rFonts w:ascii="Times New Roman" w:eastAsia="Times New Roman" w:hAnsi="Times New Roman" w:cs="Times New Roman"/>
-          <w:sz w:val="24"/>
-          <w:szCs w:val="24"/>
-        </w:rPr>
-      </w:pPr>
-      <w:r>
-        <w:rPr>
-          <w:rFonts w:ascii="Times New Roman" w:eastAsia="Times New Roman" w:hAnsi="Times New Roman" w:cs="Times New Roman"/>
-          <w:sz w:val="24"/>
-          <w:szCs w:val="24"/>
-        </w:rPr>
-        <w:t xml:space="preserve">Repite la misma petición anterior y haz captura de la respuesta 409 </w:t>
-      </w:r>
-      <w:proofErr w:type="spellStart"/>
-      <w:r>
-        <w:rPr>
-          <w:rFonts w:ascii="Times New Roman" w:eastAsia="Times New Roman" w:hAnsi="Times New Roman" w:cs="Times New Roman"/>
-          <w:sz w:val="24"/>
-          <w:szCs w:val="24"/>
-        </w:rPr>
-        <w:t>Conflict</w:t>
-      </w:r>
-      <w:proofErr w:type="spellEnd"/>
-      <w:r>
-        <w:rPr>
-          <w:rFonts w:ascii="Times New Roman" w:eastAsia="Times New Roman" w:hAnsi="Times New Roman" w:cs="Times New Roman"/>
-          <w:sz w:val="24"/>
-          <w:szCs w:val="24"/>
-        </w:rPr>
-        <w:t xml:space="preserve"> con el mensaje de error. Esta ilustra perfectamente la validación </w:t>
-      </w:r>
-      <w:proofErr w:type="spellStart"/>
-      <w:r>
-        <w:rPr>
-          <w:rFonts w:ascii="Times New Roman" w:eastAsia="Times New Roman" w:hAnsi="Times New Roman" w:cs="Times New Roman"/>
-          <w:sz w:val="24"/>
-          <w:szCs w:val="24"/>
-        </w:rPr>
-        <w:t>anti-duplicados</w:t>
-      </w:r>
-      <w:proofErr w:type="spellEnd"/>
-      <w:r>
-        <w:rPr>
-          <w:rFonts w:ascii="Times New Roman" w:eastAsia="Times New Roman" w:hAnsi="Times New Roman" w:cs="Times New Roman"/>
-          <w:sz w:val="24"/>
-          <w:szCs w:val="24"/>
-        </w:rPr>
-        <w:t>, que es el elemento técnico más diferenciador del proyecto.</w:t>
+        <w:keepNext/>
+        <w:pBdr>
+          <w:top w:val="nil"/>
+          <w:left w:val="nil"/>
+          <w:bottom w:val="nil"/>
+          <w:right w:val="nil"/>
+          <w:between w:val="nil"/>
+        </w:pBdr>
+        <w:jc w:val="center"/>
+      </w:pPr>
+      <w:r>
+        <w:rPr>
+          <w:rFonts w:ascii="Times New Roman" w:eastAsia="Times New Roman" w:hAnsi="Times New Roman" w:cs="Times New Roman"/>
+          <w:noProof/>
+          <w:sz w:val="24"/>
+          <w:szCs w:val="24"/>
+        </w:rPr>
+        <w:drawing>
+          <wp:inline distT="0" distB="0" distL="0" distR="0" wp14:anchorId="26C8F22A" wp14:editId="786217FA">
+            <wp:extent cx="3884400" cy="2066400"/>
+            <wp:effectExtent l="0" t="0" r="1905" b="0"/>
+            <wp:docPr id="1007648268" name="Imagen 21"/>
+            <wp:cNvGraphicFramePr>
+              <a:graphicFrameLocks xmlns:a="http://schemas.openxmlformats.org/drawingml/2006/main" noChangeAspect="1"/>
+            </wp:cNvGraphicFramePr>
+            <a:graphic xmlns:a="http://schemas.openxmlformats.org/drawingml/2006/main">
+              <a:graphicData uri="http://schemas.openxmlformats.org/drawingml/2006/picture">
+                <pic:pic xmlns:pic="http://schemas.openxmlformats.org/drawingml/2006/picture">
+                  <pic:nvPicPr>
+                    <pic:cNvPr id="1007648268" name="Imagen 1007648268"/>
+                    <pic:cNvPicPr/>
+                  </pic:nvPicPr>
+                  <pic:blipFill>
+                    <a:blip r:embed="rId38" cstate="print">
+                      <a:extLst>
+                        <a:ext uri="{28A0092B-C50C-407E-A947-70E740481C1C}">
+                          <a14:useLocalDpi xmlns:a14="http://schemas.microsoft.com/office/drawing/2010/main" val="0"/>
+                        </a:ext>
+                      </a:extLst>
+                    </a:blip>
+                    <a:stretch>
+                      <a:fillRect/>
+                    </a:stretch>
+                  </pic:blipFill>
+                  <pic:spPr>
+                    <a:xfrm>
+                      <a:off x="0" y="0"/>
+                      <a:ext cx="3884400" cy="2066400"/>
+                    </a:xfrm>
+                    <a:prstGeom prst="rect">
+                      <a:avLst/>
+                    </a:prstGeom>
+                  </pic:spPr>
+                </pic:pic>
+              </a:graphicData>
+            </a:graphic>
+          </wp:inline>
+        </w:drawing>
+      </w:r>
+    </w:p>
+    <w:p>
+      <w:pPr>
+        <w:pStyle w:val="Descripcin"/>
+        <w:ind w:left="720"/>
+        <w:jc w:val="both"/>
+        <w:rPr>
+          <w:rFonts w:ascii="Times New Roman" w:eastAsia="Times New Roman" w:hAnsi="Times New Roman" w:cs="Times New Roman"/>
+          <w:sz w:val="24"/>
+          <w:szCs w:val="24"/>
+        </w:rPr>
+      </w:pPr>
+      <w:r>
+        <w:t xml:space="preserve">             Ilustración </w:t>
+      </w:r>
+      <w:fldSimple w:instr=" SEQ Ilustración \* ARABIC ">
+        <w:r>
+          <w:rPr>
+            <w:noProof/>
+          </w:rPr>
+          <w:t>21</w:t>
+        </w:r>
+      </w:fldSimple>
+      <w:r>
+        <w:t>: Login con JWT</w:t>
+      </w:r>
+    </w:p>
+    <w:p>
+      <w:pPr>
+        <w:pBdr>
+          <w:top w:val="nil"/>
+          <w:left w:val="nil"/>
+          <w:bottom w:val="nil"/>
+          <w:right w:val="nil"/>
+          <w:between w:val="nil"/>
+        </w:pBdr>
+        <w:jc w:val="both"/>
+        <w:rPr>
+          <w:rFonts w:ascii="Times New Roman" w:eastAsia="Times New Roman" w:hAnsi="Times New Roman" w:cs="Times New Roman"/>
+          <w:sz w:val="24"/>
+          <w:szCs w:val="24"/>
+        </w:rPr>
+      </w:pPr>
+    </w:p>
+    <w:p>
+      <w:pPr>
+        <w:keepNext/>
+        <w:pBdr>
+          <w:top w:val="nil"/>
+          <w:left w:val="nil"/>
+          <w:bottom w:val="nil"/>
+          <w:right w:val="nil"/>
+          <w:between w:val="nil"/>
+        </w:pBdr>
+        <w:jc w:val="center"/>
+      </w:pPr>
+      <w:r>
+        <w:rPr>
+          <w:rFonts w:ascii="Times New Roman" w:eastAsia="Times New Roman" w:hAnsi="Times New Roman" w:cs="Times New Roman"/>
+          <w:noProof/>
+          <w:sz w:val="24"/>
+          <w:szCs w:val="24"/>
+        </w:rPr>
+        <w:drawing>
+          <wp:inline distT="0" distB="0" distL="0" distR="0" wp14:anchorId="5D776ABE" wp14:editId="60109CF4">
+            <wp:extent cx="3884400" cy="2066400"/>
+            <wp:effectExtent l="0" t="0" r="1905" b="0"/>
+            <wp:docPr id="835204010" name="Imagen 22"/>
+            <wp:cNvGraphicFramePr>
+              <a:graphicFrameLocks xmlns:a="http://schemas.openxmlformats.org/drawingml/2006/main" noChangeAspect="1"/>
+            </wp:cNvGraphicFramePr>
+            <a:graphic xmlns:a="http://schemas.openxmlformats.org/drawingml/2006/main">
+              <a:graphicData uri="http://schemas.openxmlformats.org/drawingml/2006/picture">
+                <pic:pic xmlns:pic="http://schemas.openxmlformats.org/drawingml/2006/picture">
+                  <pic:nvPicPr>
+                    <pic:cNvPr id="835204010" name="Imagen 835204010"/>
+                    <pic:cNvPicPr/>
+                  </pic:nvPicPr>
+                  <pic:blipFill>
+                    <a:blip r:embed="rId39" cstate="print">
+                      <a:extLst>
+                        <a:ext uri="{28A0092B-C50C-407E-A947-70E740481C1C}">
+                          <a14:useLocalDpi xmlns:a14="http://schemas.microsoft.com/office/drawing/2010/main" val="0"/>
+                        </a:ext>
+                      </a:extLst>
+                    </a:blip>
+                    <a:stretch>
+                      <a:fillRect/>
+                    </a:stretch>
+                  </pic:blipFill>
+                  <pic:spPr>
+                    <a:xfrm>
+                      <a:off x="0" y="0"/>
+                      <a:ext cx="3884400" cy="2066400"/>
+                    </a:xfrm>
+                    <a:prstGeom prst="rect">
+                      <a:avLst/>
+                    </a:prstGeom>
+                  </pic:spPr>
+                </pic:pic>
+              </a:graphicData>
+            </a:graphic>
+          </wp:inline>
+        </w:drawing>
+      </w:r>
+    </w:p>
+    <w:p>
+      <w:pPr>
+        <w:pStyle w:val="Descripcin"/>
+        <w:ind w:left="720"/>
+        <w:jc w:val="both"/>
+        <w:rPr>
+          <w:rFonts w:ascii="Times New Roman" w:eastAsia="Times New Roman" w:hAnsi="Times New Roman" w:cs="Times New Roman"/>
+          <w:sz w:val="24"/>
+          <w:szCs w:val="24"/>
+        </w:rPr>
+      </w:pPr>
+      <w:r>
+        <w:t xml:space="preserve">             Ilustración </w:t>
+      </w:r>
+      <w:fldSimple w:instr=" SEQ Ilustración \* ARABIC ">
+        <w:r>
+          <w:rPr>
+            <w:noProof/>
+          </w:rPr>
+          <w:t>22</w:t>
+        </w:r>
+      </w:fldSimple>
+      <w:r>
+        <w:t>: Registrar toma de medicamento (éxito)</w:t>
+      </w:r>
+    </w:p>
+    <w:p>
+      <w:pPr>
+        <w:pBdr>
+          <w:top w:val="nil"/>
+          <w:left w:val="nil"/>
+          <w:bottom w:val="nil"/>
+          <w:right w:val="nil"/>
+          <w:between w:val="nil"/>
+        </w:pBdr>
+        <w:jc w:val="both"/>
+        <w:rPr>
+          <w:rFonts w:ascii="Times New Roman" w:eastAsia="Times New Roman" w:hAnsi="Times New Roman" w:cs="Times New Roman"/>
+          <w:sz w:val="24"/>
+          <w:szCs w:val="24"/>
+        </w:rPr>
+      </w:pPr>
+    </w:p>
+    <w:p>
+      <w:pPr>
+        <w:keepNext/>
+        <w:pBdr>
+          <w:top w:val="nil"/>
+          <w:left w:val="nil"/>
+          <w:bottom w:val="nil"/>
+          <w:right w:val="nil"/>
+          <w:between w:val="nil"/>
+        </w:pBdr>
+        <w:jc w:val="center"/>
+      </w:pPr>
+      <w:r>
+        <w:rPr>
+          <w:rFonts w:ascii="Times New Roman" w:eastAsia="Times New Roman" w:hAnsi="Times New Roman" w:cs="Times New Roman"/>
+          <w:noProof/>
+          <w:sz w:val="24"/>
+          <w:szCs w:val="24"/>
+        </w:rPr>
+        <w:lastRenderedPageBreak/>
+        <w:drawing>
+          <wp:inline distT="0" distB="0" distL="0" distR="0" wp14:anchorId="4E2B3835" wp14:editId="67A92C2D">
+            <wp:extent cx="3884400" cy="2066400"/>
+            <wp:effectExtent l="0" t="0" r="1905" b="0"/>
+            <wp:docPr id="1187607172" name="Imagen 23"/>
+            <wp:cNvGraphicFramePr>
+              <a:graphicFrameLocks xmlns:a="http://schemas.openxmlformats.org/drawingml/2006/main" noChangeAspect="1"/>
+            </wp:cNvGraphicFramePr>
+            <a:graphic xmlns:a="http://schemas.openxmlformats.org/drawingml/2006/main">
+              <a:graphicData uri="http://schemas.openxmlformats.org/drawingml/2006/picture">
+                <pic:pic xmlns:pic="http://schemas.openxmlformats.org/drawingml/2006/picture">
+                  <pic:nvPicPr>
+                    <pic:cNvPr id="1187607172" name="Imagen 1187607172"/>
+                    <pic:cNvPicPr/>
+                  </pic:nvPicPr>
+                  <pic:blipFill>
+                    <a:blip r:embed="rId40" cstate="print">
+                      <a:extLst>
+                        <a:ext uri="{28A0092B-C50C-407E-A947-70E740481C1C}">
+                          <a14:useLocalDpi xmlns:a14="http://schemas.microsoft.com/office/drawing/2010/main" val="0"/>
+                        </a:ext>
+                      </a:extLst>
+                    </a:blip>
+                    <a:stretch>
+                      <a:fillRect/>
+                    </a:stretch>
+                  </pic:blipFill>
+                  <pic:spPr>
+                    <a:xfrm>
+                      <a:off x="0" y="0"/>
+                      <a:ext cx="3884400" cy="2066400"/>
+                    </a:xfrm>
+                    <a:prstGeom prst="rect">
+                      <a:avLst/>
+                    </a:prstGeom>
+                  </pic:spPr>
+                </pic:pic>
+              </a:graphicData>
+            </a:graphic>
+          </wp:inline>
+        </w:drawing>
+      </w:r>
+    </w:p>
+    <w:p>
+      <w:pPr>
+        <w:pStyle w:val="Descripcin"/>
+        <w:ind w:firstLine="720"/>
+        <w:jc w:val="both"/>
+        <w:rPr>
+          <w:rFonts w:ascii="Times New Roman" w:eastAsia="Times New Roman" w:hAnsi="Times New Roman" w:cs="Times New Roman"/>
+          <w:sz w:val="24"/>
+          <w:szCs w:val="24"/>
+        </w:rPr>
+      </w:pPr>
+      <w:r>
+        <w:t xml:space="preserve">             Ilustración </w:t>
+      </w:r>
+      <w:fldSimple w:instr=" SEQ Ilustración \* ARABIC ">
+        <w:r>
+          <w:rPr>
+            <w:noProof/>
+          </w:rPr>
+          <w:t>23</w:t>
+        </w:r>
+      </w:fldSimple>
+      <w:r>
+        <w:t>: Registrar toma duplicada (error)</w:t>
       </w:r>
     </w:p>
     <w:p>
@@ -21320,6 +21289,40 @@
         </w:rPr>
         <w:t>, donde las variables de entorno sensibles como las credenciales de la base de datos y la clave de firma de los tokens JWT se configuran de forma segura a través del panel de la plataforma, sin incluirlas en el repositorio de código.</w:t>
       </w:r>
+    </w:p>
+    <w:p>
+      <w:pPr>
+        <w:pBdr>
+          <w:top w:val="nil"/>
+          <w:left w:val="nil"/>
+          <w:bottom w:val="nil"/>
+          <w:right w:val="nil"/>
+          <w:between w:val="nil"/>
+        </w:pBdr>
+        <w:jc w:val="both"/>
+        <w:rPr>
+          <w:rFonts w:ascii="Times New Roman" w:eastAsia="Times New Roman" w:hAnsi="Times New Roman" w:cs="Times New Roman"/>
+          <w:sz w:val="24"/>
+          <w:szCs w:val="24"/>
+        </w:rPr>
+      </w:pPr>
+    </w:p>
+    <w:p>
+      <w:pPr>
+        <w:pBdr>
+          <w:top w:val="nil"/>
+          <w:left w:val="nil"/>
+          <w:bottom w:val="nil"/>
+          <w:right w:val="nil"/>
+          <w:between w:val="nil"/>
+        </w:pBdr>
+        <w:jc w:val="both"/>
+        <w:rPr>
+          <w:rFonts w:ascii="Times New Roman" w:eastAsia="Times New Roman" w:hAnsi="Times New Roman" w:cs="Times New Roman"/>
+          <w:sz w:val="24"/>
+          <w:szCs w:val="24"/>
+        </w:rPr>
+      </w:pPr>
     </w:p>
     <w:sectPr>
       <w:pgSz w:w="11906" w:h="16838"/>

</xml_diff>